<commit_message>
formatação inicial da documentação
</commit_message>
<xml_diff>
--- a/Documentação/ALittlePieceOfMySoul.docx
+++ b/Documentação/ALittlePieceOfMySoul.docx
@@ -378,7 +378,733 @@
         <w:t>2025</w:t>
       </w:r>
     </w:p>
-    <w:p/>
+    <w:p>
+      <w:pPr>
+        <w:spacing w:before="280" w:line="240" w:lineRule="auto"/>
+        <w:jc w:val="center"/>
+        <w:rPr>
+          <w:rFonts w:ascii="Arial" w:eastAsia="Arial" w:hAnsi="Arial" w:cs="Arial"/>
+          <w:b/>
+          <w:sz w:val="24"/>
+          <w:szCs w:val="24"/>
+        </w:rPr>
+      </w:pPr>
+    </w:p>
+    <w:p>
+      <w:pPr>
+        <w:spacing w:before="280" w:line="240" w:lineRule="auto"/>
+        <w:jc w:val="center"/>
+        <w:rPr>
+          <w:rFonts w:ascii="Arial" w:eastAsia="Arial" w:hAnsi="Arial" w:cs="Arial"/>
+          <w:b/>
+          <w:sz w:val="24"/>
+          <w:szCs w:val="24"/>
+        </w:rPr>
+      </w:pPr>
+      <w:r>
+        <w:rPr>
+          <w:rFonts w:ascii="Arial" w:eastAsia="Arial" w:hAnsi="Arial" w:cs="Arial"/>
+          <w:b/>
+          <w:sz w:val="24"/>
+          <w:szCs w:val="24"/>
+        </w:rPr>
+        <w:lastRenderedPageBreak/>
+        <w:t>Folha de Sumário</w:t>
+      </w:r>
+    </w:p>
+    <w:p>
+      <w:pPr>
+        <w:spacing w:before="280" w:line="240" w:lineRule="auto"/>
+        <w:jc w:val="center"/>
+        <w:rPr>
+          <w:rFonts w:ascii="Arial" w:eastAsia="Arial" w:hAnsi="Arial" w:cs="Arial"/>
+          <w:b/>
+          <w:sz w:val="24"/>
+          <w:szCs w:val="24"/>
+        </w:rPr>
+      </w:pPr>
+    </w:p>
+    <w:p>
+      <w:pPr>
+        <w:spacing w:before="280" w:line="240" w:lineRule="auto"/>
+        <w:jc w:val="center"/>
+        <w:rPr>
+          <w:rFonts w:ascii="Arial" w:eastAsia="Arial" w:hAnsi="Arial" w:cs="Arial"/>
+          <w:b/>
+          <w:sz w:val="24"/>
+          <w:szCs w:val="24"/>
+        </w:rPr>
+      </w:pPr>
+    </w:p>
+    <w:p>
+      <w:pPr>
+        <w:spacing w:before="280" w:line="240" w:lineRule="auto"/>
+        <w:jc w:val="center"/>
+        <w:rPr>
+          <w:rFonts w:ascii="Arial" w:eastAsia="Arial" w:hAnsi="Arial" w:cs="Arial"/>
+          <w:b/>
+          <w:sz w:val="24"/>
+          <w:szCs w:val="24"/>
+        </w:rPr>
+      </w:pPr>
+    </w:p>
+    <w:p>
+      <w:pPr>
+        <w:spacing w:before="280" w:line="240" w:lineRule="auto"/>
+        <w:jc w:val="center"/>
+        <w:rPr>
+          <w:rFonts w:ascii="Arial" w:eastAsia="Arial" w:hAnsi="Arial" w:cs="Arial"/>
+          <w:b/>
+          <w:sz w:val="24"/>
+          <w:szCs w:val="24"/>
+        </w:rPr>
+      </w:pPr>
+    </w:p>
+    <w:p>
+      <w:pPr>
+        <w:spacing w:before="280" w:line="240" w:lineRule="auto"/>
+        <w:jc w:val="center"/>
+        <w:rPr>
+          <w:rFonts w:ascii="Arial" w:eastAsia="Arial" w:hAnsi="Arial" w:cs="Arial"/>
+          <w:b/>
+          <w:sz w:val="24"/>
+          <w:szCs w:val="24"/>
+        </w:rPr>
+      </w:pPr>
+    </w:p>
+    <w:p>
+      <w:pPr>
+        <w:spacing w:before="280" w:line="240" w:lineRule="auto"/>
+        <w:jc w:val="center"/>
+        <w:rPr>
+          <w:rFonts w:ascii="Arial" w:eastAsia="Arial" w:hAnsi="Arial" w:cs="Arial"/>
+          <w:b/>
+          <w:sz w:val="24"/>
+          <w:szCs w:val="24"/>
+        </w:rPr>
+      </w:pPr>
+    </w:p>
+    <w:p>
+      <w:pPr>
+        <w:spacing w:before="280" w:line="240" w:lineRule="auto"/>
+        <w:jc w:val="center"/>
+        <w:rPr>
+          <w:rFonts w:ascii="Arial" w:eastAsia="Arial" w:hAnsi="Arial" w:cs="Arial"/>
+          <w:b/>
+          <w:sz w:val="24"/>
+          <w:szCs w:val="24"/>
+        </w:rPr>
+      </w:pPr>
+    </w:p>
+    <w:p>
+      <w:pPr>
+        <w:spacing w:before="280" w:line="240" w:lineRule="auto"/>
+        <w:jc w:val="center"/>
+        <w:rPr>
+          <w:rFonts w:ascii="Arial" w:eastAsia="Arial" w:hAnsi="Arial" w:cs="Arial"/>
+          <w:b/>
+          <w:sz w:val="24"/>
+          <w:szCs w:val="24"/>
+        </w:rPr>
+      </w:pPr>
+    </w:p>
+    <w:p>
+      <w:pPr>
+        <w:spacing w:before="280" w:line="240" w:lineRule="auto"/>
+        <w:jc w:val="center"/>
+        <w:rPr>
+          <w:rFonts w:ascii="Arial" w:eastAsia="Arial" w:hAnsi="Arial" w:cs="Arial"/>
+          <w:b/>
+          <w:sz w:val="24"/>
+          <w:szCs w:val="24"/>
+        </w:rPr>
+      </w:pPr>
+    </w:p>
+    <w:p>
+      <w:pPr>
+        <w:spacing w:before="280" w:line="240" w:lineRule="auto"/>
+        <w:jc w:val="center"/>
+        <w:rPr>
+          <w:rFonts w:ascii="Arial" w:eastAsia="Arial" w:hAnsi="Arial" w:cs="Arial"/>
+          <w:b/>
+          <w:sz w:val="24"/>
+          <w:szCs w:val="24"/>
+        </w:rPr>
+      </w:pPr>
+    </w:p>
+    <w:p>
+      <w:pPr>
+        <w:spacing w:before="280" w:line="240" w:lineRule="auto"/>
+        <w:jc w:val="center"/>
+        <w:rPr>
+          <w:rFonts w:ascii="Arial" w:eastAsia="Arial" w:hAnsi="Arial" w:cs="Arial"/>
+          <w:b/>
+          <w:sz w:val="24"/>
+          <w:szCs w:val="24"/>
+        </w:rPr>
+      </w:pPr>
+    </w:p>
+    <w:p>
+      <w:pPr>
+        <w:spacing w:before="280" w:line="240" w:lineRule="auto"/>
+        <w:jc w:val="center"/>
+        <w:rPr>
+          <w:rFonts w:ascii="Arial" w:eastAsia="Arial" w:hAnsi="Arial" w:cs="Arial"/>
+          <w:b/>
+          <w:sz w:val="24"/>
+          <w:szCs w:val="24"/>
+        </w:rPr>
+      </w:pPr>
+    </w:p>
+    <w:p>
+      <w:pPr>
+        <w:spacing w:before="280" w:line="240" w:lineRule="auto"/>
+        <w:jc w:val="center"/>
+        <w:rPr>
+          <w:rFonts w:ascii="Arial" w:eastAsia="Arial" w:hAnsi="Arial" w:cs="Arial"/>
+          <w:b/>
+          <w:sz w:val="24"/>
+          <w:szCs w:val="24"/>
+        </w:rPr>
+      </w:pPr>
+    </w:p>
+    <w:p>
+      <w:pPr>
+        <w:spacing w:before="280" w:line="240" w:lineRule="auto"/>
+        <w:jc w:val="center"/>
+        <w:rPr>
+          <w:rFonts w:ascii="Arial" w:eastAsia="Arial" w:hAnsi="Arial" w:cs="Arial"/>
+          <w:b/>
+          <w:sz w:val="24"/>
+          <w:szCs w:val="24"/>
+        </w:rPr>
+      </w:pPr>
+    </w:p>
+    <w:p>
+      <w:pPr>
+        <w:spacing w:before="280" w:line="240" w:lineRule="auto"/>
+        <w:jc w:val="center"/>
+        <w:rPr>
+          <w:rFonts w:ascii="Arial" w:eastAsia="Arial" w:hAnsi="Arial" w:cs="Arial"/>
+          <w:b/>
+          <w:sz w:val="24"/>
+          <w:szCs w:val="24"/>
+        </w:rPr>
+      </w:pPr>
+    </w:p>
+    <w:p>
+      <w:pPr>
+        <w:spacing w:before="280" w:line="240" w:lineRule="auto"/>
+        <w:jc w:val="center"/>
+        <w:rPr>
+          <w:rFonts w:ascii="Arial" w:eastAsia="Arial" w:hAnsi="Arial" w:cs="Arial"/>
+          <w:b/>
+          <w:sz w:val="24"/>
+          <w:szCs w:val="24"/>
+        </w:rPr>
+      </w:pPr>
+    </w:p>
+    <w:p>
+      <w:pPr>
+        <w:spacing w:before="280" w:line="240" w:lineRule="auto"/>
+        <w:jc w:val="center"/>
+        <w:rPr>
+          <w:rFonts w:ascii="Arial" w:eastAsia="Arial" w:hAnsi="Arial" w:cs="Arial"/>
+          <w:b/>
+          <w:sz w:val="24"/>
+          <w:szCs w:val="24"/>
+        </w:rPr>
+      </w:pPr>
+    </w:p>
+    <w:p>
+      <w:pPr>
+        <w:spacing w:before="280" w:line="240" w:lineRule="auto"/>
+        <w:jc w:val="center"/>
+        <w:rPr>
+          <w:rFonts w:ascii="Arial" w:eastAsia="Arial" w:hAnsi="Arial" w:cs="Arial"/>
+          <w:b/>
+          <w:sz w:val="24"/>
+          <w:szCs w:val="24"/>
+        </w:rPr>
+      </w:pPr>
+    </w:p>
+    <w:p>
+      <w:pPr>
+        <w:spacing w:before="280" w:line="240" w:lineRule="auto"/>
+        <w:jc w:val="center"/>
+        <w:rPr>
+          <w:rFonts w:ascii="Arial" w:eastAsia="Arial" w:hAnsi="Arial" w:cs="Arial"/>
+          <w:b/>
+          <w:sz w:val="24"/>
+          <w:szCs w:val="24"/>
+        </w:rPr>
+      </w:pPr>
+    </w:p>
+    <w:p>
+      <w:pPr>
+        <w:spacing w:before="280" w:line="240" w:lineRule="auto"/>
+        <w:jc w:val="center"/>
+        <w:rPr>
+          <w:rFonts w:ascii="Arial" w:eastAsia="Arial" w:hAnsi="Arial" w:cs="Arial"/>
+          <w:b/>
+          <w:sz w:val="24"/>
+          <w:szCs w:val="24"/>
+        </w:rPr>
+      </w:pPr>
+    </w:p>
+    <w:p>
+      <w:pPr>
+        <w:spacing w:before="280" w:line="240" w:lineRule="auto"/>
+        <w:jc w:val="center"/>
+        <w:rPr>
+          <w:rFonts w:ascii="Arial" w:eastAsia="Arial" w:hAnsi="Arial" w:cs="Arial"/>
+          <w:b/>
+          <w:sz w:val="24"/>
+          <w:szCs w:val="24"/>
+        </w:rPr>
+      </w:pPr>
+    </w:p>
+    <w:p>
+      <w:pPr>
+        <w:spacing w:before="280" w:line="240" w:lineRule="auto"/>
+        <w:jc w:val="center"/>
+        <w:rPr>
+          <w:rFonts w:ascii="Arial" w:eastAsia="Arial" w:hAnsi="Arial" w:cs="Arial"/>
+          <w:b/>
+          <w:sz w:val="24"/>
+          <w:szCs w:val="24"/>
+        </w:rPr>
+      </w:pPr>
+    </w:p>
+    <w:p>
+      <w:pPr>
+        <w:spacing w:before="280" w:line="240" w:lineRule="auto"/>
+        <w:jc w:val="center"/>
+        <w:rPr>
+          <w:rFonts w:ascii="Arial" w:eastAsia="Arial" w:hAnsi="Arial" w:cs="Arial"/>
+          <w:b/>
+          <w:sz w:val="24"/>
+          <w:szCs w:val="24"/>
+        </w:rPr>
+      </w:pPr>
+    </w:p>
+    <w:p>
+      <w:pPr>
+        <w:spacing w:before="280" w:line="240" w:lineRule="auto"/>
+        <w:jc w:val="center"/>
+        <w:rPr>
+          <w:rFonts w:ascii="Arial" w:eastAsia="Arial" w:hAnsi="Arial" w:cs="Arial"/>
+          <w:b/>
+          <w:sz w:val="24"/>
+          <w:szCs w:val="24"/>
+        </w:rPr>
+      </w:pPr>
+    </w:p>
+    <w:p>
+      <w:pPr>
+        <w:spacing w:before="280" w:line="240" w:lineRule="auto"/>
+        <w:jc w:val="center"/>
+        <w:rPr>
+          <w:rFonts w:ascii="Arial" w:eastAsia="Arial" w:hAnsi="Arial" w:cs="Arial"/>
+          <w:b/>
+          <w:sz w:val="24"/>
+          <w:szCs w:val="24"/>
+        </w:rPr>
+      </w:pPr>
+      <w:r>
+        <w:rPr>
+          <w:rFonts w:ascii="Arial" w:eastAsia="Arial" w:hAnsi="Arial" w:cs="Arial"/>
+          <w:b/>
+          <w:sz w:val="24"/>
+          <w:szCs w:val="24"/>
+        </w:rPr>
+        <w:lastRenderedPageBreak/>
+        <w:t>Lista de Figura</w:t>
+      </w:r>
+      <w:r>
+        <w:rPr>
+          <w:rFonts w:ascii="Arial" w:eastAsia="Arial" w:hAnsi="Arial" w:cs="Arial"/>
+          <w:b/>
+          <w:sz w:val="24"/>
+          <w:szCs w:val="24"/>
+        </w:rPr>
+        <w:t>s</w:t>
+      </w:r>
+    </w:p>
+    <w:p>
+      <w:pPr>
+        <w:spacing w:before="280" w:line="240" w:lineRule="auto"/>
+        <w:jc w:val="center"/>
+        <w:rPr>
+          <w:rFonts w:ascii="Arial" w:eastAsia="Arial" w:hAnsi="Arial" w:cs="Arial"/>
+          <w:b/>
+          <w:sz w:val="24"/>
+          <w:szCs w:val="24"/>
+        </w:rPr>
+      </w:pPr>
+    </w:p>
+    <w:p>
+      <w:pPr>
+        <w:spacing w:before="280" w:line="240" w:lineRule="auto"/>
+        <w:jc w:val="center"/>
+        <w:rPr>
+          <w:rFonts w:ascii="Arial" w:eastAsia="Arial" w:hAnsi="Arial" w:cs="Arial"/>
+          <w:b/>
+          <w:sz w:val="24"/>
+          <w:szCs w:val="24"/>
+        </w:rPr>
+      </w:pPr>
+    </w:p>
+    <w:p>
+      <w:pPr>
+        <w:spacing w:before="280" w:line="240" w:lineRule="auto"/>
+        <w:jc w:val="center"/>
+        <w:rPr>
+          <w:rFonts w:ascii="Arial" w:eastAsia="Arial" w:hAnsi="Arial" w:cs="Arial"/>
+          <w:b/>
+          <w:sz w:val="24"/>
+          <w:szCs w:val="24"/>
+        </w:rPr>
+      </w:pPr>
+    </w:p>
+    <w:p>
+      <w:pPr>
+        <w:spacing w:before="280" w:line="240" w:lineRule="auto"/>
+        <w:jc w:val="center"/>
+        <w:rPr>
+          <w:rFonts w:ascii="Arial" w:eastAsia="Arial" w:hAnsi="Arial" w:cs="Arial"/>
+          <w:b/>
+          <w:sz w:val="24"/>
+          <w:szCs w:val="24"/>
+        </w:rPr>
+      </w:pPr>
+    </w:p>
+    <w:p>
+      <w:pPr>
+        <w:spacing w:before="280" w:line="240" w:lineRule="auto"/>
+        <w:jc w:val="center"/>
+        <w:rPr>
+          <w:rFonts w:ascii="Arial" w:eastAsia="Arial" w:hAnsi="Arial" w:cs="Arial"/>
+          <w:b/>
+          <w:sz w:val="24"/>
+          <w:szCs w:val="24"/>
+        </w:rPr>
+      </w:pPr>
+    </w:p>
+    <w:p>
+      <w:pPr>
+        <w:spacing w:before="280" w:line="240" w:lineRule="auto"/>
+        <w:jc w:val="center"/>
+        <w:rPr>
+          <w:rFonts w:ascii="Arial" w:eastAsia="Arial" w:hAnsi="Arial" w:cs="Arial"/>
+          <w:b/>
+          <w:sz w:val="24"/>
+          <w:szCs w:val="24"/>
+        </w:rPr>
+      </w:pPr>
+    </w:p>
+    <w:p>
+      <w:pPr>
+        <w:spacing w:before="280" w:line="240" w:lineRule="auto"/>
+        <w:jc w:val="center"/>
+        <w:rPr>
+          <w:rFonts w:ascii="Arial" w:eastAsia="Arial" w:hAnsi="Arial" w:cs="Arial"/>
+          <w:b/>
+          <w:sz w:val="24"/>
+          <w:szCs w:val="24"/>
+        </w:rPr>
+      </w:pPr>
+    </w:p>
+    <w:p>
+      <w:pPr>
+        <w:spacing w:before="280" w:line="240" w:lineRule="auto"/>
+        <w:jc w:val="center"/>
+        <w:rPr>
+          <w:rFonts w:ascii="Arial" w:eastAsia="Arial" w:hAnsi="Arial" w:cs="Arial"/>
+          <w:b/>
+          <w:sz w:val="24"/>
+          <w:szCs w:val="24"/>
+        </w:rPr>
+      </w:pPr>
+    </w:p>
+    <w:p>
+      <w:pPr>
+        <w:spacing w:before="280" w:line="240" w:lineRule="auto"/>
+        <w:jc w:val="center"/>
+        <w:rPr>
+          <w:rFonts w:ascii="Arial" w:eastAsia="Arial" w:hAnsi="Arial" w:cs="Arial"/>
+          <w:b/>
+          <w:sz w:val="24"/>
+          <w:szCs w:val="24"/>
+        </w:rPr>
+      </w:pPr>
+    </w:p>
+    <w:p>
+      <w:pPr>
+        <w:spacing w:before="280" w:line="240" w:lineRule="auto"/>
+        <w:jc w:val="center"/>
+        <w:rPr>
+          <w:rFonts w:ascii="Arial" w:eastAsia="Arial" w:hAnsi="Arial" w:cs="Arial"/>
+          <w:b/>
+          <w:sz w:val="24"/>
+          <w:szCs w:val="24"/>
+        </w:rPr>
+      </w:pPr>
+    </w:p>
+    <w:p>
+      <w:pPr>
+        <w:spacing w:before="280" w:line="240" w:lineRule="auto"/>
+        <w:jc w:val="center"/>
+        <w:rPr>
+          <w:rFonts w:ascii="Arial" w:eastAsia="Arial" w:hAnsi="Arial" w:cs="Arial"/>
+          <w:b/>
+          <w:sz w:val="24"/>
+          <w:szCs w:val="24"/>
+        </w:rPr>
+      </w:pPr>
+    </w:p>
+    <w:p>
+      <w:pPr>
+        <w:spacing w:before="280" w:line="240" w:lineRule="auto"/>
+        <w:jc w:val="center"/>
+        <w:rPr>
+          <w:rFonts w:ascii="Arial" w:eastAsia="Arial" w:hAnsi="Arial" w:cs="Arial"/>
+          <w:b/>
+          <w:sz w:val="24"/>
+          <w:szCs w:val="24"/>
+        </w:rPr>
+      </w:pPr>
+    </w:p>
+    <w:p>
+      <w:pPr>
+        <w:spacing w:before="280" w:line="240" w:lineRule="auto"/>
+        <w:jc w:val="center"/>
+        <w:rPr>
+          <w:rFonts w:ascii="Arial" w:eastAsia="Arial" w:hAnsi="Arial" w:cs="Arial"/>
+          <w:b/>
+          <w:sz w:val="24"/>
+          <w:szCs w:val="24"/>
+        </w:rPr>
+      </w:pPr>
+    </w:p>
+    <w:p>
+      <w:pPr>
+        <w:spacing w:before="280" w:line="240" w:lineRule="auto"/>
+        <w:jc w:val="center"/>
+        <w:rPr>
+          <w:rFonts w:ascii="Arial" w:eastAsia="Arial" w:hAnsi="Arial" w:cs="Arial"/>
+          <w:b/>
+          <w:sz w:val="24"/>
+          <w:szCs w:val="24"/>
+        </w:rPr>
+      </w:pPr>
+    </w:p>
+    <w:p>
+      <w:pPr>
+        <w:spacing w:before="280" w:line="240" w:lineRule="auto"/>
+        <w:jc w:val="center"/>
+        <w:rPr>
+          <w:rFonts w:ascii="Arial" w:eastAsia="Arial" w:hAnsi="Arial" w:cs="Arial"/>
+          <w:b/>
+          <w:sz w:val="24"/>
+          <w:szCs w:val="24"/>
+        </w:rPr>
+      </w:pPr>
+    </w:p>
+    <w:p>
+      <w:pPr>
+        <w:spacing w:before="280" w:line="240" w:lineRule="auto"/>
+        <w:jc w:val="center"/>
+        <w:rPr>
+          <w:rFonts w:ascii="Arial" w:eastAsia="Arial" w:hAnsi="Arial" w:cs="Arial"/>
+          <w:b/>
+          <w:sz w:val="24"/>
+          <w:szCs w:val="24"/>
+        </w:rPr>
+      </w:pPr>
+    </w:p>
+    <w:p>
+      <w:pPr>
+        <w:spacing w:before="280" w:line="240" w:lineRule="auto"/>
+        <w:jc w:val="center"/>
+        <w:rPr>
+          <w:rFonts w:ascii="Arial" w:eastAsia="Arial" w:hAnsi="Arial" w:cs="Arial"/>
+          <w:b/>
+          <w:sz w:val="24"/>
+          <w:szCs w:val="24"/>
+        </w:rPr>
+      </w:pPr>
+    </w:p>
+    <w:p>
+      <w:pPr>
+        <w:spacing w:before="280" w:line="240" w:lineRule="auto"/>
+        <w:jc w:val="center"/>
+        <w:rPr>
+          <w:rFonts w:ascii="Arial" w:eastAsia="Arial" w:hAnsi="Arial" w:cs="Arial"/>
+          <w:b/>
+          <w:sz w:val="24"/>
+          <w:szCs w:val="24"/>
+        </w:rPr>
+      </w:pPr>
+    </w:p>
+    <w:p>
+      <w:pPr>
+        <w:spacing w:before="280" w:line="240" w:lineRule="auto"/>
+        <w:jc w:val="center"/>
+        <w:rPr>
+          <w:rFonts w:ascii="Arial" w:eastAsia="Arial" w:hAnsi="Arial" w:cs="Arial"/>
+          <w:b/>
+          <w:sz w:val="24"/>
+          <w:szCs w:val="24"/>
+        </w:rPr>
+      </w:pPr>
+    </w:p>
+    <w:p>
+      <w:pPr>
+        <w:spacing w:before="280" w:line="240" w:lineRule="auto"/>
+        <w:jc w:val="center"/>
+        <w:rPr>
+          <w:rFonts w:ascii="Arial" w:eastAsia="Arial" w:hAnsi="Arial" w:cs="Arial"/>
+          <w:b/>
+          <w:sz w:val="24"/>
+          <w:szCs w:val="24"/>
+        </w:rPr>
+      </w:pPr>
+    </w:p>
+    <w:p>
+      <w:pPr>
+        <w:spacing w:before="280" w:line="240" w:lineRule="auto"/>
+        <w:jc w:val="center"/>
+        <w:rPr>
+          <w:rFonts w:ascii="Arial" w:eastAsia="Arial" w:hAnsi="Arial" w:cs="Arial"/>
+          <w:b/>
+          <w:sz w:val="24"/>
+          <w:szCs w:val="24"/>
+        </w:rPr>
+      </w:pPr>
+    </w:p>
+    <w:p>
+      <w:pPr>
+        <w:spacing w:before="280" w:line="240" w:lineRule="auto"/>
+        <w:jc w:val="center"/>
+        <w:rPr>
+          <w:rFonts w:ascii="Arial" w:eastAsia="Arial" w:hAnsi="Arial" w:cs="Arial"/>
+          <w:b/>
+          <w:sz w:val="24"/>
+          <w:szCs w:val="24"/>
+        </w:rPr>
+      </w:pPr>
+    </w:p>
+    <w:p>
+      <w:pPr>
+        <w:spacing w:before="280" w:line="240" w:lineRule="auto"/>
+        <w:jc w:val="center"/>
+        <w:rPr>
+          <w:rFonts w:ascii="Arial" w:eastAsia="Arial" w:hAnsi="Arial" w:cs="Arial"/>
+          <w:b/>
+          <w:sz w:val="24"/>
+          <w:szCs w:val="24"/>
+        </w:rPr>
+      </w:pPr>
+    </w:p>
+    <w:p>
+      <w:pPr>
+        <w:spacing w:before="280" w:line="240" w:lineRule="auto"/>
+        <w:jc w:val="center"/>
+        <w:rPr>
+          <w:rFonts w:ascii="Arial" w:eastAsia="Arial" w:hAnsi="Arial" w:cs="Arial"/>
+          <w:b/>
+          <w:sz w:val="24"/>
+          <w:szCs w:val="24"/>
+        </w:rPr>
+      </w:pPr>
+    </w:p>
+    <w:p>
+      <w:pPr>
+        <w:pStyle w:val="Ttulo1"/>
+      </w:pPr>
+      <w:r>
+        <w:lastRenderedPageBreak/>
+        <w:t>CONTEXTO</w:t>
+      </w:r>
+    </w:p>
+    <w:p>
+      <w:pPr>
+        <w:rPr>
+          <w:lang w:eastAsia="en-US"/>
+        </w:rPr>
+      </w:pPr>
+    </w:p>
+    <w:p>
+      <w:pPr>
+        <w:pStyle w:val="Ttulo1"/>
+      </w:pPr>
+      <w:r>
+        <w:t>OBJETIVOS</w:t>
+      </w:r>
+    </w:p>
+    <w:p>
+      <w:pPr>
+        <w:rPr>
+          <w:lang w:eastAsia="en-US"/>
+        </w:rPr>
+      </w:pPr>
+    </w:p>
+    <w:p>
+      <w:pPr>
+        <w:pStyle w:val="Ttulo1"/>
+      </w:pPr>
+      <w:r>
+        <w:t>JUSTIFICATIVA</w:t>
+      </w:r>
+    </w:p>
+    <w:p>
+      <w:pPr>
+        <w:rPr>
+          <w:lang w:eastAsia="en-US"/>
+        </w:rPr>
+      </w:pPr>
+    </w:p>
+    <w:p>
+      <w:pPr>
+        <w:pStyle w:val="Ttulo1"/>
+      </w:pPr>
+      <w:r>
+        <w:t>ESCOPO</w:t>
+      </w:r>
+    </w:p>
+    <w:p>
+      <w:pPr>
+        <w:pStyle w:val="Ttulo2"/>
+      </w:pPr>
+      <w:r>
+        <w:t>Descrição</w:t>
+      </w:r>
+    </w:p>
+    <w:p>
+      <w:pPr>
+        <w:pStyle w:val="Ttulo2"/>
+      </w:pPr>
+      <w:r>
+        <w:t>Resultados Esperados</w:t>
+      </w:r>
+    </w:p>
+    <w:p>
+      <w:pPr>
+        <w:pStyle w:val="Ttulo3"/>
+      </w:pPr>
+      <w:r>
+        <w:t>Requisitos</w:t>
+      </w:r>
+    </w:p>
+    <w:p>
+      <w:pPr>
+        <w:pStyle w:val="Ttulo2"/>
+      </w:pPr>
+      <w:r>
+        <w:t>Limites e Exclusões</w:t>
+      </w:r>
+    </w:p>
     <w:sectPr>
       <w:pgSz w:w="11906" w:h="16838"/>
       <w:pgMar w:top="1417" w:right="1701" w:bottom="1417" w:left="1701" w:header="708" w:footer="708" w:gutter="0"/>
@@ -809,7 +1535,7 @@
     <w:link w:val="Ttulo1Char"/>
     <w:uiPriority w:val="9"/>
     <w:qFormat/>
-    <w:rsid w:val="00E27F5D"/>
+    <w:rsid w:val="009651CC"/>
     <w:pPr>
       <w:keepNext/>
       <w:keepLines/>
@@ -817,10 +1543,11 @@
       <w:outlineLvl w:val="0"/>
     </w:pPr>
     <w:rPr>
-      <w:rFonts w:asciiTheme="majorHAnsi" w:eastAsiaTheme="majorEastAsia" w:hAnsiTheme="majorHAnsi" w:cstheme="majorBidi"/>
-      <w:color w:val="0F4761" w:themeColor="accent1" w:themeShade="BF"/>
+      <w:rFonts w:ascii="Arial" w:eastAsiaTheme="majorEastAsia" w:hAnsi="Arial" w:cstheme="majorBidi"/>
+      <w:b/>
+      <w:color w:val="000000" w:themeColor="text1"/>
       <w:kern w:val="2"/>
-      <w:sz w:val="40"/>
+      <w:sz w:val="32"/>
       <w:szCs w:val="40"/>
       <w:lang w:eastAsia="en-US"/>
       <w14:ligatures w14:val="standardContextual"/>
@@ -832,10 +1559,9 @@
     <w:next w:val="Normal"/>
     <w:link w:val="Ttulo2Char"/>
     <w:uiPriority w:val="9"/>
-    <w:semiHidden/>
     <w:unhideWhenUsed/>
     <w:qFormat/>
-    <w:rsid w:val="00E27F5D"/>
+    <w:rsid w:val="00E8035B"/>
     <w:pPr>
       <w:keepNext/>
       <w:keepLines/>
@@ -843,10 +1569,11 @@
       <w:outlineLvl w:val="1"/>
     </w:pPr>
     <w:rPr>
-      <w:rFonts w:asciiTheme="majorHAnsi" w:eastAsiaTheme="majorEastAsia" w:hAnsiTheme="majorHAnsi" w:cstheme="majorBidi"/>
-      <w:color w:val="0F4761" w:themeColor="accent1" w:themeShade="BF"/>
+      <w:rFonts w:ascii="Arial" w:eastAsiaTheme="majorEastAsia" w:hAnsi="Arial" w:cstheme="majorBidi"/>
+      <w:b/>
+      <w:color w:val="000000" w:themeColor="text1"/>
       <w:kern w:val="2"/>
-      <w:sz w:val="32"/>
+      <w:sz w:val="28"/>
       <w:szCs w:val="32"/>
       <w:lang w:eastAsia="en-US"/>
       <w14:ligatures w14:val="standardContextual"/>
@@ -858,10 +1585,9 @@
     <w:next w:val="Normal"/>
     <w:link w:val="Ttulo3Char"/>
     <w:uiPriority w:val="9"/>
-    <w:semiHidden/>
     <w:unhideWhenUsed/>
     <w:qFormat/>
-    <w:rsid w:val="00E27F5D"/>
+    <w:rsid w:val="00E8035B"/>
     <w:pPr>
       <w:keepNext/>
       <w:keepLines/>
@@ -869,10 +1595,11 @@
       <w:outlineLvl w:val="2"/>
     </w:pPr>
     <w:rPr>
-      <w:rFonts w:asciiTheme="minorHAnsi" w:eastAsiaTheme="majorEastAsia" w:hAnsiTheme="minorHAnsi" w:cstheme="majorBidi"/>
-      <w:color w:val="0F4761" w:themeColor="accent1" w:themeShade="BF"/>
+      <w:rFonts w:ascii="Arial" w:eastAsiaTheme="majorEastAsia" w:hAnsi="Arial" w:cstheme="majorBidi"/>
+      <w:b/>
+      <w:color w:val="000000" w:themeColor="text1"/>
       <w:kern w:val="2"/>
-      <w:sz w:val="28"/>
+      <w:sz w:val="24"/>
       <w:szCs w:val="28"/>
       <w:lang w:eastAsia="en-US"/>
       <w14:ligatures w14:val="standardContextual"/>
@@ -1072,11 +1799,12 @@
     <w:basedOn w:val="Fontepargpadro"/>
     <w:link w:val="Ttulo1"/>
     <w:uiPriority w:val="9"/>
-    <w:rsid w:val="00E27F5D"/>
-    <w:rPr>
-      <w:rFonts w:asciiTheme="majorHAnsi" w:eastAsiaTheme="majorEastAsia" w:hAnsiTheme="majorHAnsi" w:cstheme="majorBidi"/>
-      <w:color w:val="0F4761" w:themeColor="accent1" w:themeShade="BF"/>
-      <w:sz w:val="40"/>
+    <w:rsid w:val="009651CC"/>
+    <w:rPr>
+      <w:rFonts w:ascii="Arial" w:eastAsiaTheme="majorEastAsia" w:hAnsi="Arial" w:cstheme="majorBidi"/>
+      <w:b/>
+      <w:color w:val="000000" w:themeColor="text1"/>
+      <w:sz w:val="32"/>
       <w:szCs w:val="40"/>
     </w:rPr>
   </w:style>
@@ -1085,12 +1813,12 @@
     <w:basedOn w:val="Fontepargpadro"/>
     <w:link w:val="Ttulo2"/>
     <w:uiPriority w:val="9"/>
-    <w:semiHidden/>
-    <w:rsid w:val="00E27F5D"/>
-    <w:rPr>
-      <w:rFonts w:asciiTheme="majorHAnsi" w:eastAsiaTheme="majorEastAsia" w:hAnsiTheme="majorHAnsi" w:cstheme="majorBidi"/>
-      <w:color w:val="0F4761" w:themeColor="accent1" w:themeShade="BF"/>
-      <w:sz w:val="32"/>
+    <w:rsid w:val="00E8035B"/>
+    <w:rPr>
+      <w:rFonts w:ascii="Arial" w:eastAsiaTheme="majorEastAsia" w:hAnsi="Arial" w:cstheme="majorBidi"/>
+      <w:b/>
+      <w:color w:val="000000" w:themeColor="text1"/>
+      <w:sz w:val="28"/>
       <w:szCs w:val="32"/>
     </w:rPr>
   </w:style>
@@ -1099,12 +1827,11 @@
     <w:basedOn w:val="Fontepargpadro"/>
     <w:link w:val="Ttulo3"/>
     <w:uiPriority w:val="9"/>
-    <w:semiHidden/>
-    <w:rsid w:val="00E27F5D"/>
-    <w:rPr>
-      <w:rFonts w:eastAsiaTheme="majorEastAsia" w:cstheme="majorBidi"/>
-      <w:color w:val="0F4761" w:themeColor="accent1" w:themeShade="BF"/>
-      <w:sz w:val="28"/>
+    <w:rsid w:val="00E8035B"/>
+    <w:rPr>
+      <w:rFonts w:ascii="Arial" w:eastAsiaTheme="majorEastAsia" w:hAnsi="Arial" w:cstheme="majorBidi"/>
+      <w:b/>
+      <w:color w:val="000000" w:themeColor="text1"/>
       <w:szCs w:val="28"/>
     </w:rPr>
   </w:style>

</xml_diff>

<commit_message>
especificação dos requisitos na documentação
</commit_message>
<xml_diff>
--- a/Documentação/ALittlePieceOfMySoul.docx
+++ b/Documentação/ALittlePieceOfMySoul.docx
@@ -1,6 +1,6 @@
 
 <file path=word/document.xml><?xml version="1.0" encoding="utf-8"?>
-<w:document xmlns:wpc="http://schemas.microsoft.com/office/word/2010/wordprocessingCanvas" xmlns:cx="http://schemas.microsoft.com/office/drawing/2014/chartex" xmlns:cx1="http://schemas.microsoft.com/office/drawing/2015/9/8/chartex" xmlns:cx2="http://schemas.microsoft.com/office/drawing/2015/10/21/chartex" xmlns:cx3="http://schemas.microsoft.com/office/drawing/2016/5/9/chartex" xmlns:cx4="http://schemas.microsoft.com/office/drawing/2016/5/10/chartex" xmlns:cx5="http://schemas.microsoft.com/office/drawing/2016/5/11/chartex" xmlns:cx6="http://schemas.microsoft.com/office/drawing/2016/5/12/chartex" xmlns:cx7="http://schemas.microsoft.com/office/drawing/2016/5/13/chartex" xmlns:cx8="http://schemas.microsoft.com/office/drawing/2016/5/14/chartex" xmlns:mc="http://schemas.openxmlformats.org/markup-compatibility/2006" xmlns:aink="http://schemas.microsoft.com/office/drawing/2016/ink" xmlns:am3d="http://schemas.microsoft.com/office/drawing/2017/model3d" xmlns:o="urn:schemas-microsoft-com:office:office" xmlns:oel="http://schemas.microsoft.com/office/2019/extlst" xmlns:r="http://schemas.openxmlformats.org/officeDocument/2006/relationships" xmlns:m="http://schemas.openxmlformats.org/officeDocument/2006/math" xmlns:v="urn:schemas-microsoft-com:vml" xmlns:wp14="http://schemas.microsoft.com/office/word/2010/wordprocessingDrawing" xmlns:wp="http://schemas.openxmlformats.org/drawingml/2006/wordprocessingDrawing" xmlns:w10="urn:schemas-microsoft-com:office:word" xmlns:w="http://schemas.openxmlformats.org/wordprocessingml/2006/main" xmlns:w14="http://schemas.microsoft.com/office/word/2010/wordml" xmlns:w15="http://schemas.microsoft.com/office/word/2012/wordml" xmlns:w16cex="http://schemas.microsoft.com/office/word/2018/wordml/cex" xmlns:w16cid="http://schemas.microsoft.com/office/word/2016/wordml/cid" xmlns:w16="http://schemas.microsoft.com/office/word/2018/wordml" xmlns:w16du="http://schemas.microsoft.com/office/word/2023/wordml/word16du" xmlns:w16sdtdh="http://schemas.microsoft.com/office/word/2020/wordml/sdtdatahash" xmlns:w16sdtfl="http://schemas.microsoft.com/office/word/2024/wordml/sdtformatlock" xmlns:w16se="http://schemas.microsoft.com/office/word/2015/wordml/symex" xmlns:wpg="http://schemas.microsoft.com/office/word/2010/wordprocessingGroup" xmlns:wpi="http://schemas.microsoft.com/office/word/2010/wordprocessingInk" xmlns:wne="http://schemas.microsoft.com/office/word/2006/wordml" xmlns:wps="http://schemas.microsoft.com/office/word/2010/wordprocessingShape" mc:Ignorable="w14 w15 w16se w16cid w16 w16cex w16sdtdh w16sdtfl w16du wp14">
+<w:document xmlns:wpc="http://schemas.microsoft.com/office/word/2010/wordprocessingCanvas" xmlns:cx="http://schemas.microsoft.com/office/drawing/2014/chartex" xmlns:cx1="http://schemas.microsoft.com/office/drawing/2015/9/8/chartex" xmlns:cx2="http://schemas.microsoft.com/office/drawing/2015/10/21/chartex" xmlns:cx3="http://schemas.microsoft.com/office/drawing/2016/5/9/chartex" xmlns:cx4="http://schemas.microsoft.com/office/drawing/2016/5/10/chartex" xmlns:cx5="http://schemas.microsoft.com/office/drawing/2016/5/11/chartex" xmlns:cx6="http://schemas.microsoft.com/office/drawing/2016/5/12/chartex" xmlns:cx7="http://schemas.microsoft.com/office/drawing/2016/5/13/chartex" xmlns:cx8="http://schemas.microsoft.com/office/drawing/2016/5/14/chartex" xmlns:mc="http://schemas.openxmlformats.org/markup-compatibility/2006" xmlns:aink="http://schemas.microsoft.com/office/drawing/2016/ink" xmlns:am3d="http://schemas.microsoft.com/office/drawing/2017/model3d" xmlns:o="urn:schemas-microsoft-com:office:office" xmlns:oel="http://schemas.microsoft.com/office/2019/extlst" xmlns:r="http://schemas.openxmlformats.org/officeDocument/2006/relationships" xmlns:m="http://schemas.openxmlformats.org/officeDocument/2006/math" xmlns:v="urn:schemas-microsoft-com:vml" xmlns:wp14="http://schemas.microsoft.com/office/word/2010/wordprocessingDrawing" xmlns:wp="http://schemas.openxmlformats.org/drawingml/2006/wordprocessingDrawing" xmlns:w10="urn:schemas-microsoft-com:office:word" xmlns:w="http://schemas.openxmlformats.org/wordprocessingml/2006/main" xmlns:w14="http://schemas.microsoft.com/office/word/2010/wordml" xmlns:w15="http://schemas.microsoft.com/office/word/2012/wordml" xmlns:w16cex="http://schemas.microsoft.com/office/word/2018/wordml/cex" xmlns:w16cid="http://schemas.microsoft.com/office/word/2016/wordml/cid" xmlns:w16="http://schemas.microsoft.com/office/word/2018/wordml" xmlns:w16sdtdh="http://schemas.microsoft.com/office/word/2020/wordml/sdtdatahash" xmlns:w16se="http://schemas.microsoft.com/office/word/2015/wordml/symex" xmlns:wpg="http://schemas.microsoft.com/office/word/2010/wordprocessingGroup" xmlns:wpi="http://schemas.microsoft.com/office/word/2010/wordprocessingInk" xmlns:wne="http://schemas.microsoft.com/office/word/2006/wordml" xmlns:wps="http://schemas.microsoft.com/office/word/2010/wordprocessingShape" mc:Ignorable="w14 w15 w16se w16cid w16 w16cex w16sdtdh wp14">
   <w:body>
     <w:p>
       <w:pPr>
@@ -29,7 +29,7 @@
                     </pic:cNvPicPr>
                   </pic:nvPicPr>
                   <pic:blipFill>
-                    <a:blip r:embed="rId4" cstate="print">
+                    <a:blip r:embed="rId5" cstate="print">
                       <a:extLst>
                         <a:ext uri="{28A0092B-C50C-407E-A947-70E740481C1C}">
                           <a14:useLocalDpi xmlns:a14="http://schemas.microsoft.com/office/drawing/2010/main" val="0"/>
@@ -166,6 +166,7 @@
           <w:b/>
           <w:sz w:val="28"/>
           <w:szCs w:val="28"/>
+          <w:lang w:val="en-US"/>
         </w:rPr>
       </w:pPr>
       <w:r>
@@ -174,6 +175,7 @@
           <w:b/>
           <w:sz w:val="28"/>
           <w:szCs w:val="28"/>
+          <w:lang w:val="en-US"/>
         </w:rPr>
         <w:t>A LITTLE PIECE OF MY SOUL</w:t>
       </w:r>
@@ -250,7 +252,7 @@
               </wp:inline>
             </w:drawing>
           </mc:Choice>
-          <mc:Fallback>
+          <mc:Fallback xmlns:w16sdtfl="http://schemas.microsoft.com/office/word/2024/wordml/sdtformatlock" xmlns:w16du="http://schemas.microsoft.com/office/word/2023/wordml/word16du">
             <w:pict>
               <v:rect w14:anchorId="72F8005B" id="Retângulo 1" o:spid="_x0000_s1026" alt="logo" style="width:24pt;height:24pt;visibility:visible;mso-wrap-style:square;mso-left-percent:-10001;mso-top-percent:-10001;mso-position-horizontal:absolute;mso-position-horizontal-relative:char;mso-position-vertical:absolute;mso-position-vertical-relative:line;mso-left-percent:-10001;mso-top-percent:-10001;v-text-anchor:top" o:gfxdata="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" filled="f" stroked="f">
                 <o:lock v:ext="edit" aspectratio="t"/>
@@ -285,7 +287,7 @@
                     <pic:cNvPicPr/>
                   </pic:nvPicPr>
                   <pic:blipFill>
-                    <a:blip r:embed="rId5" cstate="print">
+                    <a:blip r:embed="rId6" cstate="print">
                       <a:extLst>
                         <a:ext uri="{28A0092B-C50C-407E-A947-70E740481C1C}">
                           <a14:useLocalDpi xmlns:a14="http://schemas.microsoft.com/office/drawing/2010/main" val="0"/>
@@ -1034,6 +1036,12 @@
           <w:lang w:eastAsia="en-US"/>
         </w:rPr>
       </w:pPr>
+      <w:r>
+        <w:rPr>
+          <w:lang w:eastAsia="en-US"/>
+        </w:rPr>
+        <w:t xml:space="preserve">A subcultura gótica </w:t>
+      </w:r>
     </w:p>
     <w:p>
       <w:pPr>
@@ -1045,10 +1053,165 @@
     </w:p>
     <w:p>
       <w:pPr>
-        <w:rPr>
+        <w:ind w:firstLine="432"/>
+        <w:jc w:val="both"/>
+        <w:rPr>
+          <w:rFonts w:ascii="Arial" w:hAnsi="Arial" w:cs="Arial"/>
+          <w:sz w:val="24"/>
+          <w:szCs w:val="24"/>
           <w:lang w:eastAsia="en-US"/>
         </w:rPr>
       </w:pPr>
+      <w:r>
+        <w:rPr>
+          <w:rFonts w:ascii="Arial" w:hAnsi="Arial" w:cs="Arial"/>
+          <w:sz w:val="24"/>
+          <w:szCs w:val="24"/>
+          <w:lang w:eastAsia="en-US"/>
+        </w:rPr>
+        <w:t>Desenvolver um site sobre a história da subcultura gótica na arte, cinema, com ênfase nos gêneros de música gótica e principais bandas.</w:t>
+      </w:r>
+    </w:p>
+    <w:p>
+      <w:pPr>
+        <w:ind w:firstLine="432"/>
+        <w:jc w:val="both"/>
+        <w:rPr>
+          <w:rFonts w:ascii="Arial" w:hAnsi="Arial" w:cs="Arial"/>
+          <w:sz w:val="24"/>
+          <w:szCs w:val="24"/>
+          <w:lang w:eastAsia="en-US"/>
+        </w:rPr>
+      </w:pPr>
+      <w:r>
+        <w:rPr>
+          <w:rFonts w:ascii="Arial" w:hAnsi="Arial" w:cs="Arial"/>
+          <w:sz w:val="24"/>
+          <w:szCs w:val="24"/>
+          <w:lang w:eastAsia="en-US"/>
+        </w:rPr>
+        <w:t xml:space="preserve">O site terá </w:t>
+      </w:r>
+      <w:r>
+        <w:rPr>
+          <w:rFonts w:ascii="Arial" w:hAnsi="Arial" w:cs="Arial"/>
+          <w:sz w:val="24"/>
+          <w:szCs w:val="24"/>
+          <w:lang w:eastAsia="en-US"/>
+        </w:rPr>
+        <w:t>uma página sobre mim, criador do projeto,</w:t>
+      </w:r>
+      <w:r>
+        <w:rPr>
+          <w:rFonts w:ascii="Arial" w:hAnsi="Arial" w:cs="Arial"/>
+          <w:sz w:val="24"/>
+          <w:szCs w:val="24"/>
+          <w:lang w:eastAsia="en-US"/>
+        </w:rPr>
+        <w:t xml:space="preserve"> contando sobre minha trajetória, alguns shows góticos que já fui e locais que frequentei</w:t>
+      </w:r>
+      <w:r>
+        <w:rPr>
+          <w:rFonts w:ascii="Arial" w:hAnsi="Arial" w:cs="Arial"/>
+          <w:sz w:val="24"/>
+          <w:szCs w:val="24"/>
+          <w:lang w:eastAsia="en-US"/>
+        </w:rPr>
+        <w:t xml:space="preserve"> uma </w:t>
+      </w:r>
+      <w:r>
+        <w:rPr>
+          <w:rFonts w:ascii="Arial" w:hAnsi="Arial" w:cs="Arial"/>
+          <w:sz w:val="24"/>
+          <w:szCs w:val="24"/>
+          <w:lang w:eastAsia="en-US"/>
+        </w:rPr>
+        <w:t xml:space="preserve">da subcultura, uma de bandas, uma de principais locais na região metropolitana de São Paulo que valorizam a subcultura, </w:t>
+      </w:r>
+      <w:r>
+        <w:rPr>
+          <w:rFonts w:ascii="Arial" w:hAnsi="Arial" w:cs="Arial"/>
+          <w:sz w:val="24"/>
+          <w:szCs w:val="24"/>
+          <w:lang w:eastAsia="en-US"/>
+        </w:rPr>
+        <w:t>uma tela para informar seus dados para prosseguir para um quiz, no qual através de algumas perguntas, o algoritmo analisará qual banda gótica mais representa sua personalidade</w:t>
+      </w:r>
+      <w:r>
+        <w:rPr>
+          <w:rFonts w:ascii="Arial" w:hAnsi="Arial" w:cs="Arial"/>
+          <w:sz w:val="24"/>
+          <w:szCs w:val="24"/>
+          <w:lang w:eastAsia="en-US"/>
+        </w:rPr>
+        <w:t>, e por último, uma dashboard, para conferir quantas pessoas se cadastraram</w:t>
+      </w:r>
+      <w:r>
+        <w:rPr>
+          <w:rFonts w:ascii="Arial" w:hAnsi="Arial" w:cs="Arial"/>
+          <w:sz w:val="24"/>
+          <w:szCs w:val="24"/>
+          <w:lang w:eastAsia="en-US"/>
+        </w:rPr>
+        <w:t>, quantas bandas foram identificadas pelos usuários e qual banda menos selecionada.</w:t>
+      </w:r>
+    </w:p>
+    <w:p>
+      <w:pPr>
+        <w:ind w:firstLine="432"/>
+        <w:jc w:val="both"/>
+        <w:rPr>
+          <w:rFonts w:ascii="Arial" w:hAnsi="Arial" w:cs="Arial"/>
+          <w:sz w:val="24"/>
+          <w:szCs w:val="24"/>
+          <w:lang w:eastAsia="en-US"/>
+        </w:rPr>
+      </w:pPr>
+      <w:r>
+        <w:rPr>
+          <w:rFonts w:ascii="Arial" w:hAnsi="Arial" w:cs="Arial"/>
+          <w:sz w:val="24"/>
+          <w:szCs w:val="24"/>
+          <w:lang w:eastAsia="en-US"/>
+        </w:rPr>
+        <w:t>Todos os dados informados no quiz ser</w:t>
+      </w:r>
+      <w:r>
+        <w:rPr>
+          <w:rFonts w:ascii="Arial" w:hAnsi="Arial" w:cs="Arial"/>
+          <w:sz w:val="24"/>
+          <w:szCs w:val="24"/>
+          <w:lang w:eastAsia="en-US"/>
+        </w:rPr>
+        <w:t xml:space="preserve">ão </w:t>
+      </w:r>
+      <w:r>
+        <w:rPr>
+          <w:rFonts w:ascii="Arial" w:hAnsi="Arial" w:cs="Arial"/>
+          <w:sz w:val="24"/>
+          <w:szCs w:val="24"/>
+          <w:lang w:eastAsia="en-US"/>
+        </w:rPr>
+        <w:t>integrado</w:t>
+      </w:r>
+      <w:r>
+        <w:rPr>
+          <w:rFonts w:ascii="Arial" w:hAnsi="Arial" w:cs="Arial"/>
+          <w:sz w:val="24"/>
+          <w:szCs w:val="24"/>
+          <w:lang w:eastAsia="en-US"/>
+        </w:rPr>
+        <w:t xml:space="preserve">s </w:t>
+      </w:r>
+      <w:r>
+        <w:rPr>
+          <w:rFonts w:ascii="Arial" w:hAnsi="Arial" w:cs="Arial"/>
+          <w:sz w:val="24"/>
+          <w:szCs w:val="24"/>
+          <w:lang w:eastAsia="en-US"/>
+        </w:rPr>
+        <w:t>com um banco de dados.</w:t>
+      </w:r>
     </w:p>
     <w:p>
       <w:pPr>
@@ -1115,8 +1278,111 @@
 </w:document>
 </file>
 
+<file path=word/numbering.xml><?xml version="1.0" encoding="utf-8"?>
+<w:numbering xmlns:wpc="http://schemas.microsoft.com/office/word/2010/wordprocessingCanvas" xmlns:cx="http://schemas.microsoft.com/office/drawing/2014/chartex" xmlns:cx1="http://schemas.microsoft.com/office/drawing/2015/9/8/chartex" xmlns:cx2="http://schemas.microsoft.com/office/drawing/2015/10/21/chartex" xmlns:cx3="http://schemas.microsoft.com/office/drawing/2016/5/9/chartex" xmlns:cx4="http://schemas.microsoft.com/office/drawing/2016/5/10/chartex" xmlns:cx5="http://schemas.microsoft.com/office/drawing/2016/5/11/chartex" xmlns:cx6="http://schemas.microsoft.com/office/drawing/2016/5/12/chartex" xmlns:cx7="http://schemas.microsoft.com/office/drawing/2016/5/13/chartex" xmlns:cx8="http://schemas.microsoft.com/office/drawing/2016/5/14/chartex" xmlns:mc="http://schemas.openxmlformats.org/markup-compatibility/2006" xmlns:aink="http://schemas.microsoft.com/office/drawing/2016/ink" xmlns:am3d="http://schemas.microsoft.com/office/drawing/2017/model3d" xmlns:o="urn:schemas-microsoft-com:office:office" xmlns:oel="http://schemas.microsoft.com/office/2019/extlst" xmlns:r="http://schemas.openxmlformats.org/officeDocument/2006/relationships" xmlns:m="http://schemas.openxmlformats.org/officeDocument/2006/math" xmlns:v="urn:schemas-microsoft-com:vml" xmlns:wp14="http://schemas.microsoft.com/office/word/2010/wordprocessingDrawing" xmlns:wp="http://schemas.openxmlformats.org/drawingml/2006/wordprocessingDrawing" xmlns:w10="urn:schemas-microsoft-com:office:word" xmlns:w="http://schemas.openxmlformats.org/wordprocessingml/2006/main" xmlns:w14="http://schemas.microsoft.com/office/word/2010/wordml" xmlns:w15="http://schemas.microsoft.com/office/word/2012/wordml" xmlns:w16cex="http://schemas.microsoft.com/office/word/2018/wordml/cex" xmlns:w16cid="http://schemas.microsoft.com/office/word/2016/wordml/cid" xmlns:w16="http://schemas.microsoft.com/office/word/2018/wordml" xmlns:w16sdtdh="http://schemas.microsoft.com/office/word/2020/wordml/sdtdatahash" xmlns:w16se="http://schemas.microsoft.com/office/word/2015/wordml/symex" xmlns:wpg="http://schemas.microsoft.com/office/word/2010/wordprocessingGroup" xmlns:wpi="http://schemas.microsoft.com/office/word/2010/wordprocessingInk" xmlns:wne="http://schemas.microsoft.com/office/word/2006/wordml" xmlns:wps="http://schemas.microsoft.com/office/word/2010/wordprocessingShape" mc:Ignorable="w14 w15 w16se w16cid w16 w16cex w16sdtdh wp14">
+  <w:abstractNum w:abstractNumId="0" w15:restartNumberingAfterBreak="0">
+    <w:nsid w:val="32D9745D"/>
+    <w:multiLevelType w:val="multilevel"/>
+    <w:tmpl w:val="04160025"/>
+    <w:lvl w:ilvl="0">
+      <w:start w:val="1"/>
+      <w:numFmt w:val="decimal"/>
+      <w:pStyle w:val="Ttulo1"/>
+      <w:lvlText w:val="%1"/>
+      <w:lvlJc w:val="left"/>
+      <w:pPr>
+        <w:ind w:left="432" w:hanging="432"/>
+      </w:pPr>
+    </w:lvl>
+    <w:lvl w:ilvl="1">
+      <w:start w:val="1"/>
+      <w:numFmt w:val="decimal"/>
+      <w:pStyle w:val="Ttulo2"/>
+      <w:lvlText w:val="%1.%2"/>
+      <w:lvlJc w:val="left"/>
+      <w:pPr>
+        <w:ind w:left="576" w:hanging="576"/>
+      </w:pPr>
+    </w:lvl>
+    <w:lvl w:ilvl="2">
+      <w:start w:val="1"/>
+      <w:numFmt w:val="decimal"/>
+      <w:pStyle w:val="Ttulo3"/>
+      <w:lvlText w:val="%1.%2.%3"/>
+      <w:lvlJc w:val="left"/>
+      <w:pPr>
+        <w:ind w:left="720" w:hanging="720"/>
+      </w:pPr>
+    </w:lvl>
+    <w:lvl w:ilvl="3">
+      <w:start w:val="1"/>
+      <w:numFmt w:val="decimal"/>
+      <w:pStyle w:val="Ttulo4"/>
+      <w:lvlText w:val="%1.%2.%3.%4"/>
+      <w:lvlJc w:val="left"/>
+      <w:pPr>
+        <w:ind w:left="864" w:hanging="864"/>
+      </w:pPr>
+    </w:lvl>
+    <w:lvl w:ilvl="4">
+      <w:start w:val="1"/>
+      <w:numFmt w:val="decimal"/>
+      <w:pStyle w:val="Ttulo5"/>
+      <w:lvlText w:val="%1.%2.%3.%4.%5"/>
+      <w:lvlJc w:val="left"/>
+      <w:pPr>
+        <w:ind w:left="1008" w:hanging="1008"/>
+      </w:pPr>
+    </w:lvl>
+    <w:lvl w:ilvl="5">
+      <w:start w:val="1"/>
+      <w:numFmt w:val="decimal"/>
+      <w:pStyle w:val="Ttulo6"/>
+      <w:lvlText w:val="%1.%2.%3.%4.%5.%6"/>
+      <w:lvlJc w:val="left"/>
+      <w:pPr>
+        <w:ind w:left="1152" w:hanging="1152"/>
+      </w:pPr>
+    </w:lvl>
+    <w:lvl w:ilvl="6">
+      <w:start w:val="1"/>
+      <w:numFmt w:val="decimal"/>
+      <w:pStyle w:val="Ttulo7"/>
+      <w:lvlText w:val="%1.%2.%3.%4.%5.%6.%7"/>
+      <w:lvlJc w:val="left"/>
+      <w:pPr>
+        <w:ind w:left="1296" w:hanging="1296"/>
+      </w:pPr>
+    </w:lvl>
+    <w:lvl w:ilvl="7">
+      <w:start w:val="1"/>
+      <w:numFmt w:val="decimal"/>
+      <w:pStyle w:val="Ttulo8"/>
+      <w:lvlText w:val="%1.%2.%3.%4.%5.%6.%7.%8"/>
+      <w:lvlJc w:val="left"/>
+      <w:pPr>
+        <w:ind w:left="1440" w:hanging="1440"/>
+      </w:pPr>
+    </w:lvl>
+    <w:lvl w:ilvl="8">
+      <w:start w:val="1"/>
+      <w:numFmt w:val="decimal"/>
+      <w:pStyle w:val="Ttulo9"/>
+      <w:lvlText w:val="%1.%2.%3.%4.%5.%6.%7.%8.%9"/>
+      <w:lvlJc w:val="left"/>
+      <w:pPr>
+        <w:ind w:left="1584" w:hanging="1584"/>
+      </w:pPr>
+    </w:lvl>
+  </w:abstractNum>
+  <w:num w:numId="1" w16cid:durableId="2099134409">
+    <w:abstractNumId w:val="0"/>
+  </w:num>
+</w:numbering>
+</file>
+
 <file path=word/styles.xml><?xml version="1.0" encoding="utf-8"?>
-<w:styles xmlns:mc="http://schemas.openxmlformats.org/markup-compatibility/2006" xmlns:r="http://schemas.openxmlformats.org/officeDocument/2006/relationships" xmlns:w="http://schemas.openxmlformats.org/wordprocessingml/2006/main" xmlns:w14="http://schemas.microsoft.com/office/word/2010/wordml" xmlns:w15="http://schemas.microsoft.com/office/word/2012/wordml" xmlns:w16cex="http://schemas.microsoft.com/office/word/2018/wordml/cex" xmlns:w16cid="http://schemas.microsoft.com/office/word/2016/wordml/cid" xmlns:w16="http://schemas.microsoft.com/office/word/2018/wordml" xmlns:w16du="http://schemas.microsoft.com/office/word/2023/wordml/word16du" xmlns:w16sdtdh="http://schemas.microsoft.com/office/word/2020/wordml/sdtdatahash" xmlns:w16sdtfl="http://schemas.microsoft.com/office/word/2024/wordml/sdtformatlock" xmlns:w16se="http://schemas.microsoft.com/office/word/2015/wordml/symex" mc:Ignorable="w14 w15 w16se w16cid w16 w16cex w16sdtdh w16sdtfl w16du">
+<w:styles xmlns:mc="http://schemas.openxmlformats.org/markup-compatibility/2006" xmlns:r="http://schemas.openxmlformats.org/officeDocument/2006/relationships" xmlns:w="http://schemas.openxmlformats.org/wordprocessingml/2006/main" xmlns:w14="http://schemas.microsoft.com/office/word/2010/wordml" xmlns:w15="http://schemas.microsoft.com/office/word/2012/wordml" xmlns:w16cex="http://schemas.microsoft.com/office/word/2018/wordml/cex" xmlns:w16cid="http://schemas.microsoft.com/office/word/2016/wordml/cid" xmlns:w16="http://schemas.microsoft.com/office/word/2018/wordml" xmlns:w16sdtdh="http://schemas.microsoft.com/office/word/2020/wordml/sdtdatahash" xmlns:w16se="http://schemas.microsoft.com/office/word/2015/wordml/symex" mc:Ignorable="w14 w15 w16se w16cid w16 w16cex w16sdtdh">
   <w:docDefaults>
     <w:rPrDefault>
       <w:rPr>
@@ -1539,6 +1805,9 @@
     <w:pPr>
       <w:keepNext/>
       <w:keepLines/>
+      <w:numPr>
+        <w:numId w:val="1"/>
+      </w:numPr>
       <w:spacing w:before="360" w:after="80" w:line="278" w:lineRule="auto"/>
       <w:outlineLvl w:val="0"/>
     </w:pPr>
@@ -1565,6 +1834,10 @@
     <w:pPr>
       <w:keepNext/>
       <w:keepLines/>
+      <w:numPr>
+        <w:ilvl w:val="1"/>
+        <w:numId w:val="1"/>
+      </w:numPr>
       <w:spacing w:before="160" w:after="80" w:line="278" w:lineRule="auto"/>
       <w:outlineLvl w:val="1"/>
     </w:pPr>
@@ -1591,6 +1864,10 @@
     <w:pPr>
       <w:keepNext/>
       <w:keepLines/>
+      <w:numPr>
+        <w:ilvl w:val="2"/>
+        <w:numId w:val="1"/>
+      </w:numPr>
       <w:spacing w:before="160" w:after="80" w:line="278" w:lineRule="auto"/>
       <w:outlineLvl w:val="2"/>
     </w:pPr>
@@ -1618,6 +1895,10 @@
     <w:pPr>
       <w:keepNext/>
       <w:keepLines/>
+      <w:numPr>
+        <w:ilvl w:val="3"/>
+        <w:numId w:val="1"/>
+      </w:numPr>
       <w:spacing w:before="80" w:after="40" w:line="278" w:lineRule="auto"/>
       <w:outlineLvl w:val="3"/>
     </w:pPr>
@@ -1646,6 +1927,10 @@
     <w:pPr>
       <w:keepNext/>
       <w:keepLines/>
+      <w:numPr>
+        <w:ilvl w:val="4"/>
+        <w:numId w:val="1"/>
+      </w:numPr>
       <w:spacing w:before="80" w:after="40" w:line="278" w:lineRule="auto"/>
       <w:outlineLvl w:val="4"/>
     </w:pPr>
@@ -1672,6 +1957,10 @@
     <w:pPr>
       <w:keepNext/>
       <w:keepLines/>
+      <w:numPr>
+        <w:ilvl w:val="5"/>
+        <w:numId w:val="1"/>
+      </w:numPr>
       <w:spacing w:before="40" w:after="0" w:line="278" w:lineRule="auto"/>
       <w:outlineLvl w:val="5"/>
     </w:pPr>
@@ -1700,6 +1989,10 @@
     <w:pPr>
       <w:keepNext/>
       <w:keepLines/>
+      <w:numPr>
+        <w:ilvl w:val="6"/>
+        <w:numId w:val="1"/>
+      </w:numPr>
       <w:spacing w:before="40" w:after="0" w:line="278" w:lineRule="auto"/>
       <w:outlineLvl w:val="6"/>
     </w:pPr>
@@ -1726,6 +2019,10 @@
     <w:pPr>
       <w:keepNext/>
       <w:keepLines/>
+      <w:numPr>
+        <w:ilvl w:val="7"/>
+        <w:numId w:val="1"/>
+      </w:numPr>
       <w:spacing w:after="0" w:line="278" w:lineRule="auto"/>
       <w:outlineLvl w:val="7"/>
     </w:pPr>
@@ -1754,6 +2051,10 @@
     <w:pPr>
       <w:keepNext/>
       <w:keepLines/>
+      <w:numPr>
+        <w:ilvl w:val="8"/>
+        <w:numId w:val="1"/>
+      </w:numPr>
       <w:spacing w:after="0" w:line="278" w:lineRule="auto"/>
       <w:outlineLvl w:val="8"/>
     </w:pPr>

</xml_diff>

<commit_message>
deixei a documentação com a página preta e exportei ela para PDF
</commit_message>
<xml_diff>
--- a/Documentação/ALittlePieceOfMySoul.docx
+++ b/Documentação/ALittlePieceOfMySoul.docx
@@ -1,15 +1,20 @@
 
 <file path=word/document.xml><?xml version="1.0" encoding="utf-8"?>
 <w:document xmlns:wpc="http://schemas.microsoft.com/office/word/2010/wordprocessingCanvas" xmlns:cx="http://schemas.microsoft.com/office/drawing/2014/chartex" xmlns:cx1="http://schemas.microsoft.com/office/drawing/2015/9/8/chartex" xmlns:cx2="http://schemas.microsoft.com/office/drawing/2015/10/21/chartex" xmlns:cx3="http://schemas.microsoft.com/office/drawing/2016/5/9/chartex" xmlns:cx4="http://schemas.microsoft.com/office/drawing/2016/5/10/chartex" xmlns:cx5="http://schemas.microsoft.com/office/drawing/2016/5/11/chartex" xmlns:cx6="http://schemas.microsoft.com/office/drawing/2016/5/12/chartex" xmlns:cx7="http://schemas.microsoft.com/office/drawing/2016/5/13/chartex" xmlns:cx8="http://schemas.microsoft.com/office/drawing/2016/5/14/chartex" xmlns:mc="http://schemas.openxmlformats.org/markup-compatibility/2006" xmlns:aink="http://schemas.microsoft.com/office/drawing/2016/ink" xmlns:am3d="http://schemas.microsoft.com/office/drawing/2017/model3d" xmlns:o="urn:schemas-microsoft-com:office:office" xmlns:oel="http://schemas.microsoft.com/office/2019/extlst" xmlns:r="http://schemas.openxmlformats.org/officeDocument/2006/relationships" xmlns:m="http://schemas.openxmlformats.org/officeDocument/2006/math" xmlns:v="urn:schemas-microsoft-com:vml" xmlns:wp14="http://schemas.microsoft.com/office/word/2010/wordprocessingDrawing" xmlns:wp="http://schemas.openxmlformats.org/drawingml/2006/wordprocessingDrawing" xmlns:w10="urn:schemas-microsoft-com:office:word" xmlns:w="http://schemas.openxmlformats.org/wordprocessingml/2006/main" xmlns:w14="http://schemas.microsoft.com/office/word/2010/wordml" xmlns:w15="http://schemas.microsoft.com/office/word/2012/wordml" xmlns:w16cex="http://schemas.microsoft.com/office/word/2018/wordml/cex" xmlns:w16cid="http://schemas.microsoft.com/office/word/2016/wordml/cid" xmlns:w16="http://schemas.microsoft.com/office/word/2018/wordml" xmlns:w16sdtdh="http://schemas.microsoft.com/office/word/2020/wordml/sdtdatahash" xmlns:w16se="http://schemas.microsoft.com/office/word/2015/wordml/symex" xmlns:wpg="http://schemas.microsoft.com/office/word/2010/wordprocessingGroup" xmlns:wpi="http://schemas.microsoft.com/office/word/2010/wordprocessingInk" xmlns:wne="http://schemas.microsoft.com/office/word/2006/wordml" xmlns:wps="http://schemas.microsoft.com/office/word/2010/wordprocessingShape" mc:Ignorable="w14 w15 w16se w16cid w16 w16cex w16sdtdh wp14">
+  <w:background w:color="000000" w:themeColor="text1"/>
   <w:body>
     <w:p>
       <w:pPr>
         <w:spacing w:line="360" w:lineRule="auto"/>
         <w:jc w:val="center"/>
+        <w:rPr>
+          <w:color w:val="FFFFFF" w:themeColor="background1"/>
+        </w:rPr>
       </w:pPr>
       <w:r>
         <w:rPr>
           <w:noProof/>
+          <w:color w:val="FFFFFF" w:themeColor="background1"/>
         </w:rPr>
         <w:drawing>
           <wp:inline distT="0" distB="0" distL="0" distR="0" wp14:anchorId="1DCDE7AA" wp14:editId="7F3D1AC7">
@@ -69,6 +74,7 @@
           <w:rFonts w:ascii="Arial" w:hAnsi="Arial" w:cs="Arial"/>
           <w:b/>
           <w:bCs/>
+          <w:color w:val="FFFFFF" w:themeColor="background1"/>
           <w:sz w:val="24"/>
           <w:szCs w:val="24"/>
         </w:rPr>
@@ -78,6 +84,7 @@
           <w:rFonts w:ascii="Arial" w:hAnsi="Arial" w:cs="Arial"/>
           <w:b/>
           <w:bCs/>
+          <w:color w:val="FFFFFF" w:themeColor="background1"/>
           <w:sz w:val="24"/>
           <w:szCs w:val="24"/>
         </w:rPr>
@@ -92,6 +99,7 @@
           <w:rFonts w:ascii="Arial" w:hAnsi="Arial" w:cs="Arial"/>
           <w:b/>
           <w:bCs/>
+          <w:color w:val="FFFFFF" w:themeColor="background1"/>
           <w:sz w:val="24"/>
           <w:szCs w:val="24"/>
         </w:rPr>
@@ -101,6 +109,7 @@
           <w:rFonts w:ascii="Arial" w:hAnsi="Arial" w:cs="Arial"/>
           <w:b/>
           <w:bCs/>
+          <w:color w:val="FFFFFF" w:themeColor="background1"/>
           <w:sz w:val="24"/>
           <w:szCs w:val="24"/>
         </w:rPr>
@@ -115,6 +124,7 @@
           <w:rFonts w:ascii="Arial" w:hAnsi="Arial" w:cs="Arial"/>
           <w:b/>
           <w:bCs/>
+          <w:color w:val="FFFFFF" w:themeColor="background1"/>
           <w:sz w:val="24"/>
           <w:szCs w:val="24"/>
         </w:rPr>
@@ -124,6 +134,7 @@
           <w:rFonts w:ascii="Arial" w:hAnsi="Arial" w:cs="Arial"/>
           <w:b/>
           <w:bCs/>
+          <w:color w:val="FFFFFF" w:themeColor="background1"/>
           <w:sz w:val="24"/>
           <w:szCs w:val="24"/>
         </w:rPr>
@@ -134,6 +145,9 @@
       <w:pPr>
         <w:spacing w:before="280" w:line="360" w:lineRule="auto"/>
         <w:jc w:val="center"/>
+        <w:rPr>
+          <w:color w:val="FFFFFF" w:themeColor="background1"/>
+        </w:rPr>
       </w:pPr>
     </w:p>
     <w:p>
@@ -143,6 +157,7 @@
         <w:rPr>
           <w:rFonts w:ascii="Arial" w:eastAsia="Arial" w:hAnsi="Arial" w:cs="Arial"/>
           <w:b/>
+          <w:color w:val="FFFFFF" w:themeColor="background1"/>
           <w:sz w:val="28"/>
           <w:szCs w:val="28"/>
         </w:rPr>
@@ -151,6 +166,7 @@
         <w:rPr>
           <w:rFonts w:ascii="Arial" w:eastAsia="Arial" w:hAnsi="Arial" w:cs="Arial"/>
           <w:b/>
+          <w:color w:val="FFFFFF" w:themeColor="background1"/>
           <w:sz w:val="28"/>
           <w:szCs w:val="28"/>
         </w:rPr>
@@ -164,6 +180,7 @@
         <w:rPr>
           <w:rFonts w:ascii="Arial" w:eastAsia="Arial" w:hAnsi="Arial" w:cs="Arial"/>
           <w:b/>
+          <w:color w:val="FFFFFF" w:themeColor="background1"/>
           <w:sz w:val="28"/>
           <w:szCs w:val="28"/>
           <w:lang w:val="en-US"/>
@@ -173,6 +190,7 @@
         <w:rPr>
           <w:rFonts w:ascii="Arial" w:eastAsia="Arial" w:hAnsi="Arial" w:cs="Arial"/>
           <w:b/>
+          <w:color w:val="FFFFFF" w:themeColor="background1"/>
           <w:sz w:val="28"/>
           <w:szCs w:val="28"/>
           <w:lang w:val="en-US"/>
@@ -187,6 +205,7 @@
         <w:rPr>
           <w:rFonts w:ascii="Arial" w:eastAsia="Arial" w:hAnsi="Arial" w:cs="Arial"/>
           <w:b/>
+          <w:color w:val="FFFFFF" w:themeColor="background1"/>
           <w:sz w:val="28"/>
           <w:szCs w:val="28"/>
         </w:rPr>
@@ -194,6 +213,7 @@
       <w:r>
         <w:rPr>
           <w:noProof/>
+          <w:color w:val="FFFFFF" w:themeColor="background1"/>
         </w:rPr>
         <mc:AlternateContent>
           <mc:Choice Requires="wps">
@@ -267,6 +287,7 @@
           <w:rFonts w:ascii="Arial" w:eastAsia="Arial" w:hAnsi="Arial" w:cs="Arial"/>
           <w:b/>
           <w:noProof/>
+          <w:color w:val="FFFFFF" w:themeColor="background1"/>
           <w:sz w:val="28"/>
           <w:szCs w:val="28"/>
           <w14:ligatures w14:val="standardContextual"/>
@@ -321,6 +342,7 @@
         <w:rPr>
           <w:rFonts w:ascii="Arial" w:eastAsia="Arial" w:hAnsi="Arial" w:cs="Arial"/>
           <w:b/>
+          <w:color w:val="FFFFFF" w:themeColor="background1"/>
           <w:sz w:val="28"/>
           <w:szCs w:val="28"/>
         </w:rPr>
@@ -336,6 +358,7 @@
         <w:rPr>
           <w:rFonts w:ascii="Arial" w:eastAsia="Arial" w:hAnsi="Arial" w:cs="Arial"/>
           <w:b/>
+          <w:color w:val="FFFFFF" w:themeColor="background1"/>
           <w:sz w:val="28"/>
           <w:szCs w:val="28"/>
         </w:rPr>
@@ -344,6 +367,7 @@
         <w:rPr>
           <w:rFonts w:ascii="Arial" w:eastAsia="Arial" w:hAnsi="Arial" w:cs="Arial"/>
           <w:b/>
+          <w:color w:val="FFFFFF" w:themeColor="background1"/>
           <w:sz w:val="28"/>
           <w:szCs w:val="28"/>
         </w:rPr>
@@ -353,6 +377,7 @@
         <w:rPr>
           <w:rFonts w:ascii="Arial" w:eastAsia="Arial" w:hAnsi="Arial" w:cs="Arial"/>
           <w:b/>
+          <w:color w:val="FFFFFF" w:themeColor="background1"/>
           <w:sz w:val="24"/>
           <w:szCs w:val="24"/>
         </w:rPr>
@@ -366,6 +391,7 @@
         <w:rPr>
           <w:rFonts w:ascii="Arial" w:eastAsia="Arial" w:hAnsi="Arial" w:cs="Arial"/>
           <w:b/>
+          <w:color w:val="FFFFFF" w:themeColor="background1"/>
           <w:sz w:val="24"/>
           <w:szCs w:val="24"/>
         </w:rPr>
@@ -374,6 +400,7 @@
         <w:rPr>
           <w:rFonts w:ascii="Arial" w:eastAsia="Arial" w:hAnsi="Arial" w:cs="Arial"/>
           <w:b/>
+          <w:color w:val="FFFFFF" w:themeColor="background1"/>
           <w:sz w:val="24"/>
           <w:szCs w:val="24"/>
         </w:rPr>
@@ -382,6 +409,12 @@
     </w:p>
     <w:sdt>
       <w:sdtPr>
+        <w:rPr>
+          <w:rFonts w:ascii="Calibri" w:eastAsia="Calibri" w:hAnsi="Calibri" w:cs="Calibri"/>
+          <w:color w:val="FFFFFF" w:themeColor="background1"/>
+          <w:sz w:val="22"/>
+          <w:szCs w:val="22"/>
+        </w:rPr>
         <w:id w:val="74331643"/>
         <w:docPartObj>
           <w:docPartGallery w:val="Table of Contents"/>
@@ -390,12 +423,8 @@
       </w:sdtPr>
       <w:sdtEndPr>
         <w:rPr>
-          <w:rFonts w:ascii="Calibri" w:eastAsia="Calibri" w:hAnsi="Calibri" w:cs="Calibri"/>
           <w:b/>
           <w:bCs/>
-          <w:color w:val="auto"/>
-          <w:sz w:val="22"/>
-          <w:szCs w:val="22"/>
         </w:rPr>
       </w:sdtEndPr>
       <w:sdtContent>
@@ -407,7 +436,7 @@
               <w:rFonts w:ascii="Arial" w:hAnsi="Arial" w:cs="Arial"/>
               <w:b/>
               <w:bCs/>
-              <w:color w:val="auto"/>
+              <w:color w:val="FFFFFF" w:themeColor="background1"/>
             </w:rPr>
           </w:pPr>
           <w:r>
@@ -415,7 +444,7 @@
               <w:rFonts w:ascii="Arial" w:hAnsi="Arial" w:cs="Arial"/>
               <w:b/>
               <w:bCs/>
-              <w:color w:val="auto"/>
+              <w:color w:val="FFFFFF" w:themeColor="background1"/>
             </w:rPr>
             <w:t>SUMÁRIO</w:t>
           </w:r>
@@ -430,6 +459,7 @@
             <w:rPr>
               <w:rFonts w:asciiTheme="minorHAnsi" w:eastAsiaTheme="minorEastAsia" w:hAnsiTheme="minorHAnsi" w:cstheme="minorBidi"/>
               <w:noProof/>
+              <w:color w:val="FFFFFF" w:themeColor="background1"/>
               <w:kern w:val="2"/>
               <w:sz w:val="24"/>
               <w:szCs w:val="24"/>
@@ -437,12 +467,21 @@
             </w:rPr>
           </w:pPr>
           <w:r>
+            <w:rPr>
+              <w:color w:val="FFFFFF" w:themeColor="background1"/>
+            </w:rPr>
             <w:fldChar w:fldCharType="begin"/>
           </w:r>
           <w:r>
+            <w:rPr>
+              <w:color w:val="FFFFFF" w:themeColor="background1"/>
+            </w:rPr>
             <w:instrText xml:space="preserve"> TOC \o "1-3" \h \z \u </w:instrText>
           </w:r>
           <w:r>
+            <w:rPr>
+              <w:color w:val="FFFFFF" w:themeColor="background1"/>
+            </w:rPr>
             <w:fldChar w:fldCharType="separate"/>
           </w:r>
           <w:hyperlink w:anchor="_Toc213512450" w:history="1">
@@ -450,6 +489,7 @@
               <w:rPr>
                 <w:rStyle w:val="Hyperlink"/>
                 <w:noProof/>
+                <w:color w:val="FFFFFF" w:themeColor="background1"/>
               </w:rPr>
               <w:t>1</w:t>
             </w:r>
@@ -457,6 +497,7 @@
               <w:rPr>
                 <w:rFonts w:asciiTheme="minorHAnsi" w:eastAsiaTheme="minorEastAsia" w:hAnsiTheme="minorHAnsi" w:cstheme="minorBidi"/>
                 <w:noProof/>
+                <w:color w:val="FFFFFF" w:themeColor="background1"/>
                 <w:kern w:val="2"/>
                 <w:sz w:val="24"/>
                 <w:szCs w:val="24"/>
@@ -468,6 +509,7 @@
               <w:rPr>
                 <w:rStyle w:val="Hyperlink"/>
                 <w:noProof/>
+                <w:color w:val="FFFFFF" w:themeColor="background1"/>
               </w:rPr>
               <w:t>CONTEXTO</w:t>
             </w:r>
@@ -475,6 +517,7 @@
               <w:rPr>
                 <w:noProof/>
                 <w:webHidden/>
+                <w:color w:val="FFFFFF" w:themeColor="background1"/>
               </w:rPr>
               <w:tab/>
             </w:r>
@@ -482,6 +525,7 @@
               <w:rPr>
                 <w:noProof/>
                 <w:webHidden/>
+                <w:color w:val="FFFFFF" w:themeColor="background1"/>
               </w:rPr>
               <w:fldChar w:fldCharType="begin"/>
             </w:r>
@@ -489,6 +533,7 @@
               <w:rPr>
                 <w:noProof/>
                 <w:webHidden/>
+                <w:color w:val="FFFFFF" w:themeColor="background1"/>
               </w:rPr>
               <w:instrText xml:space="preserve"> PAGEREF _Toc213512450 \h </w:instrText>
             </w:r>
@@ -496,12 +541,14 @@
               <w:rPr>
                 <w:noProof/>
                 <w:webHidden/>
-              </w:rPr>
-            </w:r>
-            <w:r>
-              <w:rPr>
-                <w:noProof/>
-                <w:webHidden/>
+                <w:color w:val="FFFFFF" w:themeColor="background1"/>
+              </w:rPr>
+            </w:r>
+            <w:r>
+              <w:rPr>
+                <w:noProof/>
+                <w:webHidden/>
+                <w:color w:val="FFFFFF" w:themeColor="background1"/>
               </w:rPr>
               <w:fldChar w:fldCharType="separate"/>
             </w:r>
@@ -509,6 +556,7 @@
               <w:rPr>
                 <w:noProof/>
                 <w:webHidden/>
+                <w:color w:val="FFFFFF" w:themeColor="background1"/>
               </w:rPr>
               <w:t>3</w:t>
             </w:r>
@@ -516,6 +564,7 @@
               <w:rPr>
                 <w:noProof/>
                 <w:webHidden/>
+                <w:color w:val="FFFFFF" w:themeColor="background1"/>
               </w:rPr>
               <w:fldChar w:fldCharType="end"/>
             </w:r>
@@ -531,6 +580,7 @@
             <w:rPr>
               <w:rFonts w:asciiTheme="minorHAnsi" w:eastAsiaTheme="minorEastAsia" w:hAnsiTheme="minorHAnsi" w:cstheme="minorBidi"/>
               <w:noProof/>
+              <w:color w:val="FFFFFF" w:themeColor="background1"/>
               <w:kern w:val="2"/>
               <w:sz w:val="24"/>
               <w:szCs w:val="24"/>
@@ -542,6 +592,7 @@
               <w:rPr>
                 <w:rStyle w:val="Hyperlink"/>
                 <w:noProof/>
+                <w:color w:val="FFFFFF" w:themeColor="background1"/>
               </w:rPr>
               <w:t>1.1</w:t>
             </w:r>
@@ -549,6 +600,7 @@
               <w:rPr>
                 <w:rFonts w:asciiTheme="minorHAnsi" w:eastAsiaTheme="minorEastAsia" w:hAnsiTheme="minorHAnsi" w:cstheme="minorBidi"/>
                 <w:noProof/>
+                <w:color w:val="FFFFFF" w:themeColor="background1"/>
                 <w:kern w:val="2"/>
                 <w:sz w:val="24"/>
                 <w:szCs w:val="24"/>
@@ -560,6 +612,7 @@
               <w:rPr>
                 <w:rStyle w:val="Hyperlink"/>
                 <w:noProof/>
+                <w:color w:val="FFFFFF" w:themeColor="background1"/>
               </w:rPr>
               <w:t>Origem e Pilares</w:t>
             </w:r>
@@ -567,6 +620,7 @@
               <w:rPr>
                 <w:noProof/>
                 <w:webHidden/>
+                <w:color w:val="FFFFFF" w:themeColor="background1"/>
               </w:rPr>
               <w:tab/>
             </w:r>
@@ -574,6 +628,7 @@
               <w:rPr>
                 <w:noProof/>
                 <w:webHidden/>
+                <w:color w:val="FFFFFF" w:themeColor="background1"/>
               </w:rPr>
               <w:fldChar w:fldCharType="begin"/>
             </w:r>
@@ -581,6 +636,7 @@
               <w:rPr>
                 <w:noProof/>
                 <w:webHidden/>
+                <w:color w:val="FFFFFF" w:themeColor="background1"/>
               </w:rPr>
               <w:instrText xml:space="preserve"> PAGEREF _Toc213512451 \h </w:instrText>
             </w:r>
@@ -588,12 +644,14 @@
               <w:rPr>
                 <w:noProof/>
                 <w:webHidden/>
-              </w:rPr>
-            </w:r>
-            <w:r>
-              <w:rPr>
-                <w:noProof/>
-                <w:webHidden/>
+                <w:color w:val="FFFFFF" w:themeColor="background1"/>
+              </w:rPr>
+            </w:r>
+            <w:r>
+              <w:rPr>
+                <w:noProof/>
+                <w:webHidden/>
+                <w:color w:val="FFFFFF" w:themeColor="background1"/>
               </w:rPr>
               <w:fldChar w:fldCharType="separate"/>
             </w:r>
@@ -601,6 +659,7 @@
               <w:rPr>
                 <w:noProof/>
                 <w:webHidden/>
+                <w:color w:val="FFFFFF" w:themeColor="background1"/>
               </w:rPr>
               <w:t>3</w:t>
             </w:r>
@@ -608,6 +667,7 @@
               <w:rPr>
                 <w:noProof/>
                 <w:webHidden/>
+                <w:color w:val="FFFFFF" w:themeColor="background1"/>
               </w:rPr>
               <w:fldChar w:fldCharType="end"/>
             </w:r>
@@ -623,6 +683,7 @@
             <w:rPr>
               <w:rFonts w:asciiTheme="minorHAnsi" w:eastAsiaTheme="minorEastAsia" w:hAnsiTheme="minorHAnsi" w:cstheme="minorBidi"/>
               <w:noProof/>
+              <w:color w:val="FFFFFF" w:themeColor="background1"/>
               <w:kern w:val="2"/>
               <w:sz w:val="24"/>
               <w:szCs w:val="24"/>
@@ -634,6 +695,7 @@
               <w:rPr>
                 <w:rStyle w:val="Hyperlink"/>
                 <w:noProof/>
+                <w:color w:val="FFFFFF" w:themeColor="background1"/>
               </w:rPr>
               <w:t>1.2</w:t>
             </w:r>
@@ -641,6 +703,7 @@
               <w:rPr>
                 <w:rFonts w:asciiTheme="minorHAnsi" w:eastAsiaTheme="minorEastAsia" w:hAnsiTheme="minorHAnsi" w:cstheme="minorBidi"/>
                 <w:noProof/>
+                <w:color w:val="FFFFFF" w:themeColor="background1"/>
                 <w:kern w:val="2"/>
                 <w:sz w:val="24"/>
                 <w:szCs w:val="24"/>
@@ -652,6 +715,7 @@
               <w:rPr>
                 <w:rStyle w:val="Hyperlink"/>
                 <w:noProof/>
+                <w:color w:val="FFFFFF" w:themeColor="background1"/>
               </w:rPr>
               <w:t>Estética e Vestimenta</w:t>
             </w:r>
@@ -659,6 +723,7 @@
               <w:rPr>
                 <w:noProof/>
                 <w:webHidden/>
+                <w:color w:val="FFFFFF" w:themeColor="background1"/>
               </w:rPr>
               <w:tab/>
             </w:r>
@@ -666,6 +731,7 @@
               <w:rPr>
                 <w:noProof/>
                 <w:webHidden/>
+                <w:color w:val="FFFFFF" w:themeColor="background1"/>
               </w:rPr>
               <w:fldChar w:fldCharType="begin"/>
             </w:r>
@@ -673,6 +739,7 @@
               <w:rPr>
                 <w:noProof/>
                 <w:webHidden/>
+                <w:color w:val="FFFFFF" w:themeColor="background1"/>
               </w:rPr>
               <w:instrText xml:space="preserve"> PAGEREF _Toc213512452 \h </w:instrText>
             </w:r>
@@ -680,12 +747,14 @@
               <w:rPr>
                 <w:noProof/>
                 <w:webHidden/>
-              </w:rPr>
-            </w:r>
-            <w:r>
-              <w:rPr>
-                <w:noProof/>
-                <w:webHidden/>
+                <w:color w:val="FFFFFF" w:themeColor="background1"/>
+              </w:rPr>
+            </w:r>
+            <w:r>
+              <w:rPr>
+                <w:noProof/>
+                <w:webHidden/>
+                <w:color w:val="FFFFFF" w:themeColor="background1"/>
               </w:rPr>
               <w:fldChar w:fldCharType="separate"/>
             </w:r>
@@ -693,6 +762,7 @@
               <w:rPr>
                 <w:noProof/>
                 <w:webHidden/>
+                <w:color w:val="FFFFFF" w:themeColor="background1"/>
               </w:rPr>
               <w:t>3</w:t>
             </w:r>
@@ -700,6 +770,7 @@
               <w:rPr>
                 <w:noProof/>
                 <w:webHidden/>
+                <w:color w:val="FFFFFF" w:themeColor="background1"/>
               </w:rPr>
               <w:fldChar w:fldCharType="end"/>
             </w:r>
@@ -715,6 +786,7 @@
             <w:rPr>
               <w:rFonts w:asciiTheme="minorHAnsi" w:eastAsiaTheme="minorEastAsia" w:hAnsiTheme="minorHAnsi" w:cstheme="minorBidi"/>
               <w:noProof/>
+              <w:color w:val="FFFFFF" w:themeColor="background1"/>
               <w:kern w:val="2"/>
               <w:sz w:val="24"/>
               <w:szCs w:val="24"/>
@@ -726,6 +798,7 @@
               <w:rPr>
                 <w:rStyle w:val="Hyperlink"/>
                 <w:noProof/>
+                <w:color w:val="FFFFFF" w:themeColor="background1"/>
               </w:rPr>
               <w:t>1.3</w:t>
             </w:r>
@@ -733,6 +806,7 @@
               <w:rPr>
                 <w:rFonts w:asciiTheme="minorHAnsi" w:eastAsiaTheme="minorEastAsia" w:hAnsiTheme="minorHAnsi" w:cstheme="minorBidi"/>
                 <w:noProof/>
+                <w:color w:val="FFFFFF" w:themeColor="background1"/>
                 <w:kern w:val="2"/>
                 <w:sz w:val="24"/>
                 <w:szCs w:val="24"/>
@@ -744,6 +818,7 @@
               <w:rPr>
                 <w:rStyle w:val="Hyperlink"/>
                 <w:noProof/>
+                <w:color w:val="FFFFFF" w:themeColor="background1"/>
               </w:rPr>
               <w:t>Cinema e Arte Gótica</w:t>
             </w:r>
@@ -751,6 +826,7 @@
               <w:rPr>
                 <w:noProof/>
                 <w:webHidden/>
+                <w:color w:val="FFFFFF" w:themeColor="background1"/>
               </w:rPr>
               <w:tab/>
             </w:r>
@@ -758,6 +834,7 @@
               <w:rPr>
                 <w:noProof/>
                 <w:webHidden/>
+                <w:color w:val="FFFFFF" w:themeColor="background1"/>
               </w:rPr>
               <w:fldChar w:fldCharType="begin"/>
             </w:r>
@@ -765,6 +842,7 @@
               <w:rPr>
                 <w:noProof/>
                 <w:webHidden/>
+                <w:color w:val="FFFFFF" w:themeColor="background1"/>
               </w:rPr>
               <w:instrText xml:space="preserve"> PAGEREF _Toc213512453 \h </w:instrText>
             </w:r>
@@ -772,12 +850,14 @@
               <w:rPr>
                 <w:noProof/>
                 <w:webHidden/>
-              </w:rPr>
-            </w:r>
-            <w:r>
-              <w:rPr>
-                <w:noProof/>
-                <w:webHidden/>
+                <w:color w:val="FFFFFF" w:themeColor="background1"/>
+              </w:rPr>
+            </w:r>
+            <w:r>
+              <w:rPr>
+                <w:noProof/>
+                <w:webHidden/>
+                <w:color w:val="FFFFFF" w:themeColor="background1"/>
               </w:rPr>
               <w:fldChar w:fldCharType="separate"/>
             </w:r>
@@ -785,6 +865,7 @@
               <w:rPr>
                 <w:noProof/>
                 <w:webHidden/>
+                <w:color w:val="FFFFFF" w:themeColor="background1"/>
               </w:rPr>
               <w:t>4</w:t>
             </w:r>
@@ -792,6 +873,7 @@
               <w:rPr>
                 <w:noProof/>
                 <w:webHidden/>
+                <w:color w:val="FFFFFF" w:themeColor="background1"/>
               </w:rPr>
               <w:fldChar w:fldCharType="end"/>
             </w:r>
@@ -807,6 +889,7 @@
             <w:rPr>
               <w:rFonts w:asciiTheme="minorHAnsi" w:eastAsiaTheme="minorEastAsia" w:hAnsiTheme="minorHAnsi" w:cstheme="minorBidi"/>
               <w:noProof/>
+              <w:color w:val="FFFFFF" w:themeColor="background1"/>
               <w:kern w:val="2"/>
               <w:sz w:val="24"/>
               <w:szCs w:val="24"/>
@@ -818,6 +901,7 @@
               <w:rPr>
                 <w:rStyle w:val="Hyperlink"/>
                 <w:noProof/>
+                <w:color w:val="FFFFFF" w:themeColor="background1"/>
               </w:rPr>
               <w:t>1.4</w:t>
             </w:r>
@@ -825,6 +909,7 @@
               <w:rPr>
                 <w:rFonts w:asciiTheme="minorHAnsi" w:eastAsiaTheme="minorEastAsia" w:hAnsiTheme="minorHAnsi" w:cstheme="minorBidi"/>
                 <w:noProof/>
+                <w:color w:val="FFFFFF" w:themeColor="background1"/>
                 <w:kern w:val="2"/>
                 <w:sz w:val="24"/>
                 <w:szCs w:val="24"/>
@@ -836,6 +921,7 @@
               <w:rPr>
                 <w:rStyle w:val="Hyperlink"/>
                 <w:noProof/>
+                <w:color w:val="FFFFFF" w:themeColor="background1"/>
               </w:rPr>
               <w:t>Música</w:t>
             </w:r>
@@ -843,6 +929,7 @@
               <w:rPr>
                 <w:noProof/>
                 <w:webHidden/>
+                <w:color w:val="FFFFFF" w:themeColor="background1"/>
               </w:rPr>
               <w:tab/>
             </w:r>
@@ -850,6 +937,7 @@
               <w:rPr>
                 <w:noProof/>
                 <w:webHidden/>
+                <w:color w:val="FFFFFF" w:themeColor="background1"/>
               </w:rPr>
               <w:fldChar w:fldCharType="begin"/>
             </w:r>
@@ -857,6 +945,7 @@
               <w:rPr>
                 <w:noProof/>
                 <w:webHidden/>
+                <w:color w:val="FFFFFF" w:themeColor="background1"/>
               </w:rPr>
               <w:instrText xml:space="preserve"> PAGEREF _Toc213512454 \h </w:instrText>
             </w:r>
@@ -864,12 +953,14 @@
               <w:rPr>
                 <w:noProof/>
                 <w:webHidden/>
-              </w:rPr>
-            </w:r>
-            <w:r>
-              <w:rPr>
-                <w:noProof/>
-                <w:webHidden/>
+                <w:color w:val="FFFFFF" w:themeColor="background1"/>
+              </w:rPr>
+            </w:r>
+            <w:r>
+              <w:rPr>
+                <w:noProof/>
+                <w:webHidden/>
+                <w:color w:val="FFFFFF" w:themeColor="background1"/>
               </w:rPr>
               <w:fldChar w:fldCharType="separate"/>
             </w:r>
@@ -877,6 +968,7 @@
               <w:rPr>
                 <w:noProof/>
                 <w:webHidden/>
+                <w:color w:val="FFFFFF" w:themeColor="background1"/>
               </w:rPr>
               <w:t>5</w:t>
             </w:r>
@@ -884,6 +976,7 @@
               <w:rPr>
                 <w:noProof/>
                 <w:webHidden/>
+                <w:color w:val="FFFFFF" w:themeColor="background1"/>
               </w:rPr>
               <w:fldChar w:fldCharType="end"/>
             </w:r>
@@ -899,6 +992,7 @@
             <w:rPr>
               <w:rFonts w:asciiTheme="minorHAnsi" w:eastAsiaTheme="minorEastAsia" w:hAnsiTheme="minorHAnsi" w:cstheme="minorBidi"/>
               <w:noProof/>
+              <w:color w:val="FFFFFF" w:themeColor="background1"/>
               <w:kern w:val="2"/>
               <w:sz w:val="24"/>
               <w:szCs w:val="24"/>
@@ -910,6 +1004,7 @@
               <w:rPr>
                 <w:rStyle w:val="Hyperlink"/>
                 <w:noProof/>
+                <w:color w:val="FFFFFF" w:themeColor="background1"/>
               </w:rPr>
               <w:t>2</w:t>
             </w:r>
@@ -917,6 +1012,7 @@
               <w:rPr>
                 <w:rFonts w:asciiTheme="minorHAnsi" w:eastAsiaTheme="minorEastAsia" w:hAnsiTheme="minorHAnsi" w:cstheme="minorBidi"/>
                 <w:noProof/>
+                <w:color w:val="FFFFFF" w:themeColor="background1"/>
                 <w:kern w:val="2"/>
                 <w:sz w:val="24"/>
                 <w:szCs w:val="24"/>
@@ -928,6 +1024,7 @@
               <w:rPr>
                 <w:rStyle w:val="Hyperlink"/>
                 <w:noProof/>
+                <w:color w:val="FFFFFF" w:themeColor="background1"/>
               </w:rPr>
               <w:t>OBJETIVOS</w:t>
             </w:r>
@@ -935,6 +1032,7 @@
               <w:rPr>
                 <w:noProof/>
                 <w:webHidden/>
+                <w:color w:val="FFFFFF" w:themeColor="background1"/>
               </w:rPr>
               <w:tab/>
             </w:r>
@@ -942,6 +1040,7 @@
               <w:rPr>
                 <w:noProof/>
                 <w:webHidden/>
+                <w:color w:val="FFFFFF" w:themeColor="background1"/>
               </w:rPr>
               <w:fldChar w:fldCharType="begin"/>
             </w:r>
@@ -949,6 +1048,7 @@
               <w:rPr>
                 <w:noProof/>
                 <w:webHidden/>
+                <w:color w:val="FFFFFF" w:themeColor="background1"/>
               </w:rPr>
               <w:instrText xml:space="preserve"> PAGEREF _Toc213512455 \h </w:instrText>
             </w:r>
@@ -956,12 +1056,14 @@
               <w:rPr>
                 <w:noProof/>
                 <w:webHidden/>
-              </w:rPr>
-            </w:r>
-            <w:r>
-              <w:rPr>
-                <w:noProof/>
-                <w:webHidden/>
+                <w:color w:val="FFFFFF" w:themeColor="background1"/>
+              </w:rPr>
+            </w:r>
+            <w:r>
+              <w:rPr>
+                <w:noProof/>
+                <w:webHidden/>
+                <w:color w:val="FFFFFF" w:themeColor="background1"/>
               </w:rPr>
               <w:fldChar w:fldCharType="separate"/>
             </w:r>
@@ -969,6 +1071,7 @@
               <w:rPr>
                 <w:noProof/>
                 <w:webHidden/>
+                <w:color w:val="FFFFFF" w:themeColor="background1"/>
               </w:rPr>
               <w:t>7</w:t>
             </w:r>
@@ -976,6 +1079,7 @@
               <w:rPr>
                 <w:noProof/>
                 <w:webHidden/>
+                <w:color w:val="FFFFFF" w:themeColor="background1"/>
               </w:rPr>
               <w:fldChar w:fldCharType="end"/>
             </w:r>
@@ -991,6 +1095,7 @@
             <w:rPr>
               <w:rFonts w:asciiTheme="minorHAnsi" w:eastAsiaTheme="minorEastAsia" w:hAnsiTheme="minorHAnsi" w:cstheme="minorBidi"/>
               <w:noProof/>
+              <w:color w:val="FFFFFF" w:themeColor="background1"/>
               <w:kern w:val="2"/>
               <w:sz w:val="24"/>
               <w:szCs w:val="24"/>
@@ -1002,6 +1107,7 @@
               <w:rPr>
                 <w:rStyle w:val="Hyperlink"/>
                 <w:noProof/>
+                <w:color w:val="FFFFFF" w:themeColor="background1"/>
               </w:rPr>
               <w:t>3</w:t>
             </w:r>
@@ -1009,6 +1115,7 @@
               <w:rPr>
                 <w:rFonts w:asciiTheme="minorHAnsi" w:eastAsiaTheme="minorEastAsia" w:hAnsiTheme="minorHAnsi" w:cstheme="minorBidi"/>
                 <w:noProof/>
+                <w:color w:val="FFFFFF" w:themeColor="background1"/>
                 <w:kern w:val="2"/>
                 <w:sz w:val="24"/>
                 <w:szCs w:val="24"/>
@@ -1020,6 +1127,7 @@
               <w:rPr>
                 <w:rStyle w:val="Hyperlink"/>
                 <w:noProof/>
+                <w:color w:val="FFFFFF" w:themeColor="background1"/>
               </w:rPr>
               <w:t>JUSTIFICATIVA</w:t>
             </w:r>
@@ -1027,6 +1135,7 @@
               <w:rPr>
                 <w:noProof/>
                 <w:webHidden/>
+                <w:color w:val="FFFFFF" w:themeColor="background1"/>
               </w:rPr>
               <w:tab/>
             </w:r>
@@ -1034,6 +1143,7 @@
               <w:rPr>
                 <w:noProof/>
                 <w:webHidden/>
+                <w:color w:val="FFFFFF" w:themeColor="background1"/>
               </w:rPr>
               <w:fldChar w:fldCharType="begin"/>
             </w:r>
@@ -1041,6 +1151,7 @@
               <w:rPr>
                 <w:noProof/>
                 <w:webHidden/>
+                <w:color w:val="FFFFFF" w:themeColor="background1"/>
               </w:rPr>
               <w:instrText xml:space="preserve"> PAGEREF _Toc213512456 \h </w:instrText>
             </w:r>
@@ -1048,12 +1159,14 @@
               <w:rPr>
                 <w:noProof/>
                 <w:webHidden/>
-              </w:rPr>
-            </w:r>
-            <w:r>
-              <w:rPr>
-                <w:noProof/>
-                <w:webHidden/>
+                <w:color w:val="FFFFFF" w:themeColor="background1"/>
+              </w:rPr>
+            </w:r>
+            <w:r>
+              <w:rPr>
+                <w:noProof/>
+                <w:webHidden/>
+                <w:color w:val="FFFFFF" w:themeColor="background1"/>
               </w:rPr>
               <w:fldChar w:fldCharType="separate"/>
             </w:r>
@@ -1061,6 +1174,7 @@
               <w:rPr>
                 <w:noProof/>
                 <w:webHidden/>
+                <w:color w:val="FFFFFF" w:themeColor="background1"/>
               </w:rPr>
               <w:t>7</w:t>
             </w:r>
@@ -1068,6 +1182,7 @@
               <w:rPr>
                 <w:noProof/>
                 <w:webHidden/>
+                <w:color w:val="FFFFFF" w:themeColor="background1"/>
               </w:rPr>
               <w:fldChar w:fldCharType="end"/>
             </w:r>
@@ -1083,6 +1198,7 @@
             <w:rPr>
               <w:rFonts w:asciiTheme="minorHAnsi" w:eastAsiaTheme="minorEastAsia" w:hAnsiTheme="minorHAnsi" w:cstheme="minorBidi"/>
               <w:noProof/>
+              <w:color w:val="FFFFFF" w:themeColor="background1"/>
               <w:kern w:val="2"/>
               <w:sz w:val="24"/>
               <w:szCs w:val="24"/>
@@ -1094,6 +1210,7 @@
               <w:rPr>
                 <w:rStyle w:val="Hyperlink"/>
                 <w:noProof/>
+                <w:color w:val="FFFFFF" w:themeColor="background1"/>
               </w:rPr>
               <w:t>4</w:t>
             </w:r>
@@ -1101,6 +1218,7 @@
               <w:rPr>
                 <w:rFonts w:asciiTheme="minorHAnsi" w:eastAsiaTheme="minorEastAsia" w:hAnsiTheme="minorHAnsi" w:cstheme="minorBidi"/>
                 <w:noProof/>
+                <w:color w:val="FFFFFF" w:themeColor="background1"/>
                 <w:kern w:val="2"/>
                 <w:sz w:val="24"/>
                 <w:szCs w:val="24"/>
@@ -1112,6 +1230,7 @@
               <w:rPr>
                 <w:rStyle w:val="Hyperlink"/>
                 <w:noProof/>
+                <w:color w:val="FFFFFF" w:themeColor="background1"/>
               </w:rPr>
               <w:t>ESCOPO</w:t>
             </w:r>
@@ -1119,6 +1238,7 @@
               <w:rPr>
                 <w:noProof/>
                 <w:webHidden/>
+                <w:color w:val="FFFFFF" w:themeColor="background1"/>
               </w:rPr>
               <w:tab/>
             </w:r>
@@ -1126,6 +1246,7 @@
               <w:rPr>
                 <w:noProof/>
                 <w:webHidden/>
+                <w:color w:val="FFFFFF" w:themeColor="background1"/>
               </w:rPr>
               <w:fldChar w:fldCharType="begin"/>
             </w:r>
@@ -1133,6 +1254,7 @@
               <w:rPr>
                 <w:noProof/>
                 <w:webHidden/>
+                <w:color w:val="FFFFFF" w:themeColor="background1"/>
               </w:rPr>
               <w:instrText xml:space="preserve"> PAGEREF _Toc213512457 \h </w:instrText>
             </w:r>
@@ -1140,12 +1262,14 @@
               <w:rPr>
                 <w:noProof/>
                 <w:webHidden/>
-              </w:rPr>
-            </w:r>
-            <w:r>
-              <w:rPr>
-                <w:noProof/>
-                <w:webHidden/>
+                <w:color w:val="FFFFFF" w:themeColor="background1"/>
+              </w:rPr>
+            </w:r>
+            <w:r>
+              <w:rPr>
+                <w:noProof/>
+                <w:webHidden/>
+                <w:color w:val="FFFFFF" w:themeColor="background1"/>
               </w:rPr>
               <w:fldChar w:fldCharType="separate"/>
             </w:r>
@@ -1153,6 +1277,7 @@
               <w:rPr>
                 <w:noProof/>
                 <w:webHidden/>
+                <w:color w:val="FFFFFF" w:themeColor="background1"/>
               </w:rPr>
               <w:t>8</w:t>
             </w:r>
@@ -1160,6 +1285,7 @@
               <w:rPr>
                 <w:noProof/>
                 <w:webHidden/>
+                <w:color w:val="FFFFFF" w:themeColor="background1"/>
               </w:rPr>
               <w:fldChar w:fldCharType="end"/>
             </w:r>
@@ -1175,6 +1301,7 @@
             <w:rPr>
               <w:rFonts w:asciiTheme="minorHAnsi" w:eastAsiaTheme="minorEastAsia" w:hAnsiTheme="minorHAnsi" w:cstheme="minorBidi"/>
               <w:noProof/>
+              <w:color w:val="FFFFFF" w:themeColor="background1"/>
               <w:kern w:val="2"/>
               <w:sz w:val="24"/>
               <w:szCs w:val="24"/>
@@ -1186,6 +1313,7 @@
               <w:rPr>
                 <w:rStyle w:val="Hyperlink"/>
                 <w:noProof/>
+                <w:color w:val="FFFFFF" w:themeColor="background1"/>
               </w:rPr>
               <w:t>4.1</w:t>
             </w:r>
@@ -1193,6 +1321,7 @@
               <w:rPr>
                 <w:rFonts w:asciiTheme="minorHAnsi" w:eastAsiaTheme="minorEastAsia" w:hAnsiTheme="minorHAnsi" w:cstheme="minorBidi"/>
                 <w:noProof/>
+                <w:color w:val="FFFFFF" w:themeColor="background1"/>
                 <w:kern w:val="2"/>
                 <w:sz w:val="24"/>
                 <w:szCs w:val="24"/>
@@ -1204,6 +1333,7 @@
               <w:rPr>
                 <w:rStyle w:val="Hyperlink"/>
                 <w:noProof/>
+                <w:color w:val="FFFFFF" w:themeColor="background1"/>
               </w:rPr>
               <w:t>Descrição</w:t>
             </w:r>
@@ -1211,6 +1341,7 @@
               <w:rPr>
                 <w:noProof/>
                 <w:webHidden/>
+                <w:color w:val="FFFFFF" w:themeColor="background1"/>
               </w:rPr>
               <w:tab/>
             </w:r>
@@ -1218,6 +1349,7 @@
               <w:rPr>
                 <w:noProof/>
                 <w:webHidden/>
+                <w:color w:val="FFFFFF" w:themeColor="background1"/>
               </w:rPr>
               <w:fldChar w:fldCharType="begin"/>
             </w:r>
@@ -1225,6 +1357,7 @@
               <w:rPr>
                 <w:noProof/>
                 <w:webHidden/>
+                <w:color w:val="FFFFFF" w:themeColor="background1"/>
               </w:rPr>
               <w:instrText xml:space="preserve"> PAGEREF _Toc213512458 \h </w:instrText>
             </w:r>
@@ -1232,12 +1365,14 @@
               <w:rPr>
                 <w:noProof/>
                 <w:webHidden/>
-              </w:rPr>
-            </w:r>
-            <w:r>
-              <w:rPr>
-                <w:noProof/>
-                <w:webHidden/>
+                <w:color w:val="FFFFFF" w:themeColor="background1"/>
+              </w:rPr>
+            </w:r>
+            <w:r>
+              <w:rPr>
+                <w:noProof/>
+                <w:webHidden/>
+                <w:color w:val="FFFFFF" w:themeColor="background1"/>
               </w:rPr>
               <w:fldChar w:fldCharType="separate"/>
             </w:r>
@@ -1245,6 +1380,7 @@
               <w:rPr>
                 <w:noProof/>
                 <w:webHidden/>
+                <w:color w:val="FFFFFF" w:themeColor="background1"/>
               </w:rPr>
               <w:t>8</w:t>
             </w:r>
@@ -1252,6 +1388,7 @@
               <w:rPr>
                 <w:noProof/>
                 <w:webHidden/>
+                <w:color w:val="FFFFFF" w:themeColor="background1"/>
               </w:rPr>
               <w:fldChar w:fldCharType="end"/>
             </w:r>
@@ -1267,6 +1404,7 @@
             <w:rPr>
               <w:rFonts w:asciiTheme="minorHAnsi" w:eastAsiaTheme="minorEastAsia" w:hAnsiTheme="minorHAnsi" w:cstheme="minorBidi"/>
               <w:noProof/>
+              <w:color w:val="FFFFFF" w:themeColor="background1"/>
               <w:kern w:val="2"/>
               <w:sz w:val="24"/>
               <w:szCs w:val="24"/>
@@ -1278,6 +1416,7 @@
               <w:rPr>
                 <w:rStyle w:val="Hyperlink"/>
                 <w:noProof/>
+                <w:color w:val="FFFFFF" w:themeColor="background1"/>
               </w:rPr>
               <w:t>4.2</w:t>
             </w:r>
@@ -1285,6 +1424,7 @@
               <w:rPr>
                 <w:rFonts w:asciiTheme="minorHAnsi" w:eastAsiaTheme="minorEastAsia" w:hAnsiTheme="minorHAnsi" w:cstheme="minorBidi"/>
                 <w:noProof/>
+                <w:color w:val="FFFFFF" w:themeColor="background1"/>
                 <w:kern w:val="2"/>
                 <w:sz w:val="24"/>
                 <w:szCs w:val="24"/>
@@ -1296,6 +1436,7 @@
               <w:rPr>
                 <w:rStyle w:val="Hyperlink"/>
                 <w:noProof/>
+                <w:color w:val="FFFFFF" w:themeColor="background1"/>
               </w:rPr>
               <w:t>Resultados Esperados</w:t>
             </w:r>
@@ -1303,6 +1444,7 @@
               <w:rPr>
                 <w:noProof/>
                 <w:webHidden/>
+                <w:color w:val="FFFFFF" w:themeColor="background1"/>
               </w:rPr>
               <w:tab/>
             </w:r>
@@ -1310,6 +1452,7 @@
               <w:rPr>
                 <w:noProof/>
                 <w:webHidden/>
+                <w:color w:val="FFFFFF" w:themeColor="background1"/>
               </w:rPr>
               <w:fldChar w:fldCharType="begin"/>
             </w:r>
@@ -1317,6 +1460,7 @@
               <w:rPr>
                 <w:noProof/>
                 <w:webHidden/>
+                <w:color w:val="FFFFFF" w:themeColor="background1"/>
               </w:rPr>
               <w:instrText xml:space="preserve"> PAGEREF _Toc213512459 \h </w:instrText>
             </w:r>
@@ -1324,12 +1468,14 @@
               <w:rPr>
                 <w:noProof/>
                 <w:webHidden/>
-              </w:rPr>
-            </w:r>
-            <w:r>
-              <w:rPr>
-                <w:noProof/>
-                <w:webHidden/>
+                <w:color w:val="FFFFFF" w:themeColor="background1"/>
+              </w:rPr>
+            </w:r>
+            <w:r>
+              <w:rPr>
+                <w:noProof/>
+                <w:webHidden/>
+                <w:color w:val="FFFFFF" w:themeColor="background1"/>
               </w:rPr>
               <w:fldChar w:fldCharType="separate"/>
             </w:r>
@@ -1337,6 +1483,7 @@
               <w:rPr>
                 <w:noProof/>
                 <w:webHidden/>
+                <w:color w:val="FFFFFF" w:themeColor="background1"/>
               </w:rPr>
               <w:t>8</w:t>
             </w:r>
@@ -1344,6 +1491,7 @@
               <w:rPr>
                 <w:noProof/>
                 <w:webHidden/>
+                <w:color w:val="FFFFFF" w:themeColor="background1"/>
               </w:rPr>
               <w:fldChar w:fldCharType="end"/>
             </w:r>
@@ -1359,6 +1507,7 @@
             <w:rPr>
               <w:rFonts w:asciiTheme="minorHAnsi" w:eastAsiaTheme="minorEastAsia" w:hAnsiTheme="minorHAnsi" w:cstheme="minorBidi"/>
               <w:noProof/>
+              <w:color w:val="FFFFFF" w:themeColor="background1"/>
               <w:kern w:val="2"/>
               <w:sz w:val="24"/>
               <w:szCs w:val="24"/>
@@ -1370,6 +1519,7 @@
               <w:rPr>
                 <w:rStyle w:val="Hyperlink"/>
                 <w:noProof/>
+                <w:color w:val="FFFFFF" w:themeColor="background1"/>
               </w:rPr>
               <w:t>4.2.1</w:t>
             </w:r>
@@ -1377,6 +1527,7 @@
               <w:rPr>
                 <w:rFonts w:asciiTheme="minorHAnsi" w:eastAsiaTheme="minorEastAsia" w:hAnsiTheme="minorHAnsi" w:cstheme="minorBidi"/>
                 <w:noProof/>
+                <w:color w:val="FFFFFF" w:themeColor="background1"/>
                 <w:kern w:val="2"/>
                 <w:sz w:val="24"/>
                 <w:szCs w:val="24"/>
@@ -1388,6 +1539,7 @@
               <w:rPr>
                 <w:rStyle w:val="Hyperlink"/>
                 <w:noProof/>
+                <w:color w:val="FFFFFF" w:themeColor="background1"/>
               </w:rPr>
               <w:t>Requisitos</w:t>
             </w:r>
@@ -1395,6 +1547,7 @@
               <w:rPr>
                 <w:noProof/>
                 <w:webHidden/>
+                <w:color w:val="FFFFFF" w:themeColor="background1"/>
               </w:rPr>
               <w:tab/>
             </w:r>
@@ -1402,6 +1555,7 @@
               <w:rPr>
                 <w:noProof/>
                 <w:webHidden/>
+                <w:color w:val="FFFFFF" w:themeColor="background1"/>
               </w:rPr>
               <w:fldChar w:fldCharType="begin"/>
             </w:r>
@@ -1409,6 +1563,7 @@
               <w:rPr>
                 <w:noProof/>
                 <w:webHidden/>
+                <w:color w:val="FFFFFF" w:themeColor="background1"/>
               </w:rPr>
               <w:instrText xml:space="preserve"> PAGEREF _Toc213512460 \h </w:instrText>
             </w:r>
@@ -1416,12 +1571,14 @@
               <w:rPr>
                 <w:noProof/>
                 <w:webHidden/>
-              </w:rPr>
-            </w:r>
-            <w:r>
-              <w:rPr>
-                <w:noProof/>
-                <w:webHidden/>
+                <w:color w:val="FFFFFF" w:themeColor="background1"/>
+              </w:rPr>
+            </w:r>
+            <w:r>
+              <w:rPr>
+                <w:noProof/>
+                <w:webHidden/>
+                <w:color w:val="FFFFFF" w:themeColor="background1"/>
               </w:rPr>
               <w:fldChar w:fldCharType="separate"/>
             </w:r>
@@ -1429,6 +1586,7 @@
               <w:rPr>
                 <w:noProof/>
                 <w:webHidden/>
+                <w:color w:val="FFFFFF" w:themeColor="background1"/>
               </w:rPr>
               <w:t>8</w:t>
             </w:r>
@@ -1436,6 +1594,7 @@
               <w:rPr>
                 <w:noProof/>
                 <w:webHidden/>
+                <w:color w:val="FFFFFF" w:themeColor="background1"/>
               </w:rPr>
               <w:fldChar w:fldCharType="end"/>
             </w:r>
@@ -1451,6 +1610,7 @@
             <w:rPr>
               <w:rFonts w:asciiTheme="minorHAnsi" w:eastAsiaTheme="minorEastAsia" w:hAnsiTheme="minorHAnsi" w:cstheme="minorBidi"/>
               <w:noProof/>
+              <w:color w:val="FFFFFF" w:themeColor="background1"/>
               <w:kern w:val="2"/>
               <w:sz w:val="24"/>
               <w:szCs w:val="24"/>
@@ -1462,6 +1622,7 @@
               <w:rPr>
                 <w:rStyle w:val="Hyperlink"/>
                 <w:noProof/>
+                <w:color w:val="FFFFFF" w:themeColor="background1"/>
               </w:rPr>
               <w:t>4.3</w:t>
             </w:r>
@@ -1469,6 +1630,7 @@
               <w:rPr>
                 <w:rFonts w:asciiTheme="minorHAnsi" w:eastAsiaTheme="minorEastAsia" w:hAnsiTheme="minorHAnsi" w:cstheme="minorBidi"/>
                 <w:noProof/>
+                <w:color w:val="FFFFFF" w:themeColor="background1"/>
                 <w:kern w:val="2"/>
                 <w:sz w:val="24"/>
                 <w:szCs w:val="24"/>
@@ -1480,6 +1642,7 @@
               <w:rPr>
                 <w:rStyle w:val="Hyperlink"/>
                 <w:noProof/>
+                <w:color w:val="FFFFFF" w:themeColor="background1"/>
               </w:rPr>
               <w:t>Premissas</w:t>
             </w:r>
@@ -1487,6 +1650,7 @@
               <w:rPr>
                 <w:noProof/>
                 <w:webHidden/>
+                <w:color w:val="FFFFFF" w:themeColor="background1"/>
               </w:rPr>
               <w:tab/>
             </w:r>
@@ -1494,6 +1658,7 @@
               <w:rPr>
                 <w:noProof/>
                 <w:webHidden/>
+                <w:color w:val="FFFFFF" w:themeColor="background1"/>
               </w:rPr>
               <w:fldChar w:fldCharType="begin"/>
             </w:r>
@@ -1501,6 +1666,7 @@
               <w:rPr>
                 <w:noProof/>
                 <w:webHidden/>
+                <w:color w:val="FFFFFF" w:themeColor="background1"/>
               </w:rPr>
               <w:instrText xml:space="preserve"> PAGEREF _Toc213512461 \h </w:instrText>
             </w:r>
@@ -1508,12 +1674,14 @@
               <w:rPr>
                 <w:noProof/>
                 <w:webHidden/>
-              </w:rPr>
-            </w:r>
-            <w:r>
-              <w:rPr>
-                <w:noProof/>
-                <w:webHidden/>
+                <w:color w:val="FFFFFF" w:themeColor="background1"/>
+              </w:rPr>
+            </w:r>
+            <w:r>
+              <w:rPr>
+                <w:noProof/>
+                <w:webHidden/>
+                <w:color w:val="FFFFFF" w:themeColor="background1"/>
               </w:rPr>
               <w:fldChar w:fldCharType="separate"/>
             </w:r>
@@ -1521,6 +1689,7 @@
               <w:rPr>
                 <w:noProof/>
                 <w:webHidden/>
+                <w:color w:val="FFFFFF" w:themeColor="background1"/>
               </w:rPr>
               <w:t>8</w:t>
             </w:r>
@@ -1528,6 +1697,7 @@
               <w:rPr>
                 <w:noProof/>
                 <w:webHidden/>
+                <w:color w:val="FFFFFF" w:themeColor="background1"/>
               </w:rPr>
               <w:fldChar w:fldCharType="end"/>
             </w:r>
@@ -1543,6 +1713,7 @@
             <w:rPr>
               <w:rFonts w:asciiTheme="minorHAnsi" w:eastAsiaTheme="minorEastAsia" w:hAnsiTheme="minorHAnsi" w:cstheme="minorBidi"/>
               <w:noProof/>
+              <w:color w:val="FFFFFF" w:themeColor="background1"/>
               <w:kern w:val="2"/>
               <w:sz w:val="24"/>
               <w:szCs w:val="24"/>
@@ -1554,6 +1725,7 @@
               <w:rPr>
                 <w:rStyle w:val="Hyperlink"/>
                 <w:noProof/>
+                <w:color w:val="FFFFFF" w:themeColor="background1"/>
               </w:rPr>
               <w:t>4.4</w:t>
             </w:r>
@@ -1561,6 +1733,7 @@
               <w:rPr>
                 <w:rFonts w:asciiTheme="minorHAnsi" w:eastAsiaTheme="minorEastAsia" w:hAnsiTheme="minorHAnsi" w:cstheme="minorBidi"/>
                 <w:noProof/>
+                <w:color w:val="FFFFFF" w:themeColor="background1"/>
                 <w:kern w:val="2"/>
                 <w:sz w:val="24"/>
                 <w:szCs w:val="24"/>
@@ -1572,6 +1745,7 @@
               <w:rPr>
                 <w:rStyle w:val="Hyperlink"/>
                 <w:noProof/>
+                <w:color w:val="FFFFFF" w:themeColor="background1"/>
               </w:rPr>
               <w:t>Limites e Exclusões</w:t>
             </w:r>
@@ -1579,6 +1753,7 @@
               <w:rPr>
                 <w:noProof/>
                 <w:webHidden/>
+                <w:color w:val="FFFFFF" w:themeColor="background1"/>
               </w:rPr>
               <w:tab/>
             </w:r>
@@ -1586,6 +1761,7 @@
               <w:rPr>
                 <w:noProof/>
                 <w:webHidden/>
+                <w:color w:val="FFFFFF" w:themeColor="background1"/>
               </w:rPr>
               <w:fldChar w:fldCharType="begin"/>
             </w:r>
@@ -1593,6 +1769,7 @@
               <w:rPr>
                 <w:noProof/>
                 <w:webHidden/>
+                <w:color w:val="FFFFFF" w:themeColor="background1"/>
               </w:rPr>
               <w:instrText xml:space="preserve"> PAGEREF _Toc213512462 \h </w:instrText>
             </w:r>
@@ -1600,12 +1777,14 @@
               <w:rPr>
                 <w:noProof/>
                 <w:webHidden/>
-              </w:rPr>
-            </w:r>
-            <w:r>
-              <w:rPr>
-                <w:noProof/>
-                <w:webHidden/>
+                <w:color w:val="FFFFFF" w:themeColor="background1"/>
+              </w:rPr>
+            </w:r>
+            <w:r>
+              <w:rPr>
+                <w:noProof/>
+                <w:webHidden/>
+                <w:color w:val="FFFFFF" w:themeColor="background1"/>
               </w:rPr>
               <w:fldChar w:fldCharType="separate"/>
             </w:r>
@@ -1613,6 +1792,7 @@
               <w:rPr>
                 <w:noProof/>
                 <w:webHidden/>
+                <w:color w:val="FFFFFF" w:themeColor="background1"/>
               </w:rPr>
               <w:t>9</w:t>
             </w:r>
@@ -1620,16 +1800,23 @@
               <w:rPr>
                 <w:noProof/>
                 <w:webHidden/>
+                <w:color w:val="FFFFFF" w:themeColor="background1"/>
               </w:rPr>
               <w:fldChar w:fldCharType="end"/>
             </w:r>
           </w:hyperlink>
         </w:p>
         <w:p>
+          <w:pPr>
+            <w:rPr>
+              <w:color w:val="FFFFFF" w:themeColor="background1"/>
+            </w:rPr>
+          </w:pPr>
           <w:r>
             <w:rPr>
               <w:b/>
               <w:bCs/>
+              <w:color w:val="FFFFFF" w:themeColor="background1"/>
             </w:rPr>
             <w:fldChar w:fldCharType="end"/>
           </w:r>
@@ -1643,6 +1830,7 @@
         <w:rPr>
           <w:rFonts w:ascii="Arial" w:eastAsia="Arial" w:hAnsi="Arial" w:cs="Arial"/>
           <w:b/>
+          <w:color w:val="FFFFFF" w:themeColor="background1"/>
           <w:sz w:val="24"/>
           <w:szCs w:val="24"/>
         </w:rPr>
@@ -1655,6 +1843,7 @@
         <w:rPr>
           <w:rFonts w:ascii="Arial" w:eastAsia="Arial" w:hAnsi="Arial" w:cs="Arial"/>
           <w:b/>
+          <w:color w:val="FFFFFF" w:themeColor="background1"/>
           <w:sz w:val="24"/>
           <w:szCs w:val="24"/>
         </w:rPr>
@@ -1667,6 +1856,7 @@
         <w:rPr>
           <w:rFonts w:ascii="Arial" w:eastAsia="Arial" w:hAnsi="Arial" w:cs="Arial"/>
           <w:b/>
+          <w:color w:val="FFFFFF" w:themeColor="background1"/>
           <w:sz w:val="24"/>
           <w:szCs w:val="24"/>
         </w:rPr>
@@ -1679,6 +1869,7 @@
         <w:rPr>
           <w:rFonts w:ascii="Arial" w:eastAsia="Arial" w:hAnsi="Arial" w:cs="Arial"/>
           <w:b/>
+          <w:color w:val="FFFFFF" w:themeColor="background1"/>
           <w:sz w:val="24"/>
           <w:szCs w:val="24"/>
         </w:rPr>
@@ -1691,6 +1882,7 @@
         <w:rPr>
           <w:rFonts w:ascii="Arial" w:eastAsia="Arial" w:hAnsi="Arial" w:cs="Arial"/>
           <w:b/>
+          <w:color w:val="FFFFFF" w:themeColor="background1"/>
           <w:sz w:val="24"/>
           <w:szCs w:val="24"/>
         </w:rPr>
@@ -1703,6 +1895,7 @@
         <w:rPr>
           <w:rFonts w:ascii="Arial" w:eastAsia="Arial" w:hAnsi="Arial" w:cs="Arial"/>
           <w:b/>
+          <w:color w:val="FFFFFF" w:themeColor="background1"/>
           <w:sz w:val="24"/>
           <w:szCs w:val="24"/>
         </w:rPr>
@@ -1715,6 +1908,7 @@
         <w:rPr>
           <w:rFonts w:ascii="Arial" w:eastAsia="Arial" w:hAnsi="Arial" w:cs="Arial"/>
           <w:b/>
+          <w:color w:val="FFFFFF" w:themeColor="background1"/>
           <w:sz w:val="24"/>
           <w:szCs w:val="24"/>
         </w:rPr>
@@ -1727,6 +1921,7 @@
         <w:rPr>
           <w:rFonts w:ascii="Arial" w:eastAsia="Arial" w:hAnsi="Arial" w:cs="Arial"/>
           <w:b/>
+          <w:color w:val="FFFFFF" w:themeColor="background1"/>
           <w:sz w:val="24"/>
           <w:szCs w:val="24"/>
         </w:rPr>
@@ -1739,6 +1934,7 @@
         <w:rPr>
           <w:rFonts w:ascii="Arial" w:eastAsia="Arial" w:hAnsi="Arial" w:cs="Arial"/>
           <w:b/>
+          <w:color w:val="FFFFFF" w:themeColor="background1"/>
           <w:sz w:val="24"/>
           <w:szCs w:val="24"/>
         </w:rPr>
@@ -1751,6 +1947,7 @@
         <w:rPr>
           <w:rFonts w:ascii="Arial" w:eastAsia="Arial" w:hAnsi="Arial" w:cs="Arial"/>
           <w:b/>
+          <w:color w:val="FFFFFF" w:themeColor="background1"/>
           <w:sz w:val="24"/>
           <w:szCs w:val="24"/>
         </w:rPr>
@@ -1763,6 +1960,7 @@
         <w:rPr>
           <w:rFonts w:ascii="Arial" w:eastAsia="Arial" w:hAnsi="Arial" w:cs="Arial"/>
           <w:b/>
+          <w:color w:val="FFFFFF" w:themeColor="background1"/>
           <w:sz w:val="24"/>
           <w:szCs w:val="24"/>
         </w:rPr>
@@ -1775,6 +1973,7 @@
         <w:rPr>
           <w:rFonts w:ascii="Arial" w:eastAsia="Arial" w:hAnsi="Arial" w:cs="Arial"/>
           <w:b/>
+          <w:color w:val="FFFFFF" w:themeColor="background1"/>
           <w:sz w:val="24"/>
           <w:szCs w:val="24"/>
         </w:rPr>
@@ -1787,6 +1986,7 @@
         <w:rPr>
           <w:rFonts w:ascii="Arial" w:eastAsia="Arial" w:hAnsi="Arial" w:cs="Arial"/>
           <w:b/>
+          <w:color w:val="FFFFFF" w:themeColor="background1"/>
           <w:sz w:val="24"/>
           <w:szCs w:val="24"/>
         </w:rPr>
@@ -1798,6 +1998,7 @@
         <w:rPr>
           <w:rFonts w:ascii="Arial" w:eastAsia="Arial" w:hAnsi="Arial" w:cs="Arial"/>
           <w:b/>
+          <w:color w:val="FFFFFF" w:themeColor="background1"/>
           <w:sz w:val="24"/>
           <w:szCs w:val="24"/>
         </w:rPr>
@@ -1813,9 +2014,15 @@
     <w:p>
       <w:pPr>
         <w:pStyle w:val="Ttulo1"/>
+        <w:rPr>
+          <w:color w:val="FFFFFF" w:themeColor="background1"/>
+        </w:rPr>
       </w:pPr>
       <w:bookmarkStart w:id="0" w:name="_Toc213512450"/>
       <w:r>
+        <w:rPr>
+          <w:color w:val="FFFFFF" w:themeColor="background1"/>
+        </w:rPr>
         <w:lastRenderedPageBreak/>
         <w:t>CONTEXTO</w:t>
       </w:r>
@@ -1824,9 +2031,15 @@
     <w:p>
       <w:pPr>
         <w:pStyle w:val="Ttulo2"/>
+        <w:rPr>
+          <w:color w:val="FFFFFF" w:themeColor="background1"/>
+        </w:rPr>
       </w:pPr>
       <w:bookmarkStart w:id="1" w:name="_Toc213512451"/>
       <w:r>
+        <w:rPr>
+          <w:color w:val="FFFFFF" w:themeColor="background1"/>
+        </w:rPr>
         <w:t>Origem e Pilares</w:t>
       </w:r>
       <w:bookmarkEnd w:id="1"/>
@@ -1837,14 +2050,16 @@
         <w:jc w:val="both"/>
         <w:rPr>
           <w:rFonts w:ascii="Arial" w:hAnsi="Arial" w:cs="Arial"/>
-          <w:sz w:val="24"/>
-          <w:szCs w:val="24"/>
-          <w:lang w:eastAsia="en-US"/>
-        </w:rPr>
-      </w:pPr>
-      <w:r>
-        <w:rPr>
-          <w:rFonts w:ascii="Arial" w:hAnsi="Arial" w:cs="Arial"/>
+          <w:color w:val="FFFFFF" w:themeColor="background1"/>
+          <w:sz w:val="24"/>
+          <w:szCs w:val="24"/>
+          <w:lang w:eastAsia="en-US"/>
+        </w:rPr>
+      </w:pPr>
+      <w:r>
+        <w:rPr>
+          <w:rFonts w:ascii="Arial" w:hAnsi="Arial" w:cs="Arial"/>
+          <w:color w:val="FFFFFF" w:themeColor="background1"/>
           <w:sz w:val="24"/>
           <w:szCs w:val="24"/>
           <w:lang w:eastAsia="en-US"/>
@@ -1858,37 +2073,21 @@
         <w:jc w:val="both"/>
         <w:rPr>
           <w:rFonts w:ascii="Arial" w:hAnsi="Arial" w:cs="Arial"/>
-          <w:sz w:val="24"/>
-          <w:szCs w:val="24"/>
-          <w:lang w:eastAsia="en-US"/>
-        </w:rPr>
-      </w:pPr>
-      <w:r>
-        <w:rPr>
-          <w:rFonts w:ascii="Arial" w:hAnsi="Arial" w:cs="Arial"/>
-          <w:sz w:val="24"/>
-          <w:szCs w:val="24"/>
-          <w:lang w:eastAsia="en-US"/>
-        </w:rPr>
-        <w:t>Ela é caracterizada pela estética sombria, mas vai muito além disso, representa a expressão artística e um</w:t>
-      </w:r>
-      <w:r>
-        <w:rPr>
-          <w:rFonts w:ascii="Arial" w:hAnsi="Arial" w:cs="Arial"/>
-          <w:sz w:val="24"/>
-          <w:szCs w:val="24"/>
-          <w:lang w:eastAsia="en-US"/>
-        </w:rPr>
-        <w:t xml:space="preserve"> estilo de vida</w:t>
-      </w:r>
-      <w:r>
-        <w:rPr>
-          <w:rFonts w:ascii="Arial" w:hAnsi="Arial" w:cs="Arial"/>
-          <w:sz w:val="24"/>
-          <w:szCs w:val="24"/>
-          <w:lang w:eastAsia="en-US"/>
-        </w:rPr>
-        <w:t>, baseada na introspecção, romantismo, melancolia e principalmente a beleza na melancolia, na tristeza, o que as pessoas de forma geral têm dificuldade em perceber.</w:t>
+          <w:color w:val="FFFFFF" w:themeColor="background1"/>
+          <w:sz w:val="24"/>
+          <w:szCs w:val="24"/>
+          <w:lang w:eastAsia="en-US"/>
+        </w:rPr>
+      </w:pPr>
+      <w:r>
+        <w:rPr>
+          <w:rFonts w:ascii="Arial" w:hAnsi="Arial" w:cs="Arial"/>
+          <w:color w:val="FFFFFF" w:themeColor="background1"/>
+          <w:sz w:val="24"/>
+          <w:szCs w:val="24"/>
+          <w:lang w:eastAsia="en-US"/>
+        </w:rPr>
+        <w:t>Ela é caracterizada pela estética sombria, mas vai muito além disso, representa a expressão artística e um estilo de vida, baseada na introspecção, romantismo, melancolia e principalmente a beleza na melancolia, na tristeza, o que as pessoas de forma geral têm dificuldade em perceber.</w:t>
       </w:r>
     </w:p>
     <w:p>
@@ -1897,14 +2096,16 @@
         <w:jc w:val="both"/>
         <w:rPr>
           <w:rFonts w:ascii="Arial" w:hAnsi="Arial" w:cs="Arial"/>
-          <w:sz w:val="24"/>
-          <w:szCs w:val="24"/>
-          <w:lang w:eastAsia="en-US"/>
-        </w:rPr>
-      </w:pPr>
-      <w:r>
-        <w:rPr>
-          <w:rFonts w:ascii="Arial" w:hAnsi="Arial" w:cs="Arial"/>
+          <w:color w:val="FFFFFF" w:themeColor="background1"/>
+          <w:sz w:val="24"/>
+          <w:szCs w:val="24"/>
+          <w:lang w:eastAsia="en-US"/>
+        </w:rPr>
+      </w:pPr>
+      <w:r>
+        <w:rPr>
+          <w:rFonts w:ascii="Arial" w:hAnsi="Arial" w:cs="Arial"/>
+          <w:color w:val="FFFFFF" w:themeColor="background1"/>
           <w:sz w:val="24"/>
           <w:szCs w:val="24"/>
           <w:lang w:eastAsia="en-US"/>
@@ -1918,14 +2119,16 @@
         <w:jc w:val="both"/>
         <w:rPr>
           <w:rFonts w:ascii="Arial" w:hAnsi="Arial" w:cs="Arial"/>
-          <w:sz w:val="24"/>
-          <w:szCs w:val="24"/>
-          <w:lang w:eastAsia="en-US"/>
-        </w:rPr>
-      </w:pPr>
-      <w:r>
-        <w:rPr>
-          <w:rFonts w:ascii="Arial" w:hAnsi="Arial" w:cs="Arial"/>
+          <w:color w:val="FFFFFF" w:themeColor="background1"/>
+          <w:sz w:val="24"/>
+          <w:szCs w:val="24"/>
+          <w:lang w:eastAsia="en-US"/>
+        </w:rPr>
+      </w:pPr>
+      <w:r>
+        <w:rPr>
+          <w:rFonts w:ascii="Arial" w:hAnsi="Arial" w:cs="Arial"/>
+          <w:color w:val="FFFFFF" w:themeColor="background1"/>
           <w:sz w:val="24"/>
           <w:szCs w:val="24"/>
           <w:lang w:eastAsia="en-US"/>
@@ -1936,6 +2139,7 @@
     <w:p>
       <w:pPr>
         <w:rPr>
+          <w:color w:val="FFFFFF" w:themeColor="background1"/>
           <w:lang w:eastAsia="en-US"/>
         </w:rPr>
       </w:pPr>
@@ -1943,9 +2147,15 @@
     <w:p>
       <w:pPr>
         <w:pStyle w:val="Ttulo2"/>
+        <w:rPr>
+          <w:color w:val="FFFFFF" w:themeColor="background1"/>
+        </w:rPr>
       </w:pPr>
       <w:bookmarkStart w:id="2" w:name="_Toc213512452"/>
       <w:r>
+        <w:rPr>
+          <w:color w:val="FFFFFF" w:themeColor="background1"/>
+        </w:rPr>
         <w:t>Estética e Vestimenta</w:t>
       </w:r>
       <w:bookmarkEnd w:id="2"/>
@@ -1956,14 +2166,16 @@
         <w:jc w:val="both"/>
         <w:rPr>
           <w:rFonts w:ascii="Arial" w:hAnsi="Arial" w:cs="Arial"/>
-          <w:sz w:val="24"/>
-          <w:szCs w:val="24"/>
-          <w:lang w:eastAsia="en-US"/>
-        </w:rPr>
-      </w:pPr>
-      <w:r>
-        <w:rPr>
-          <w:rFonts w:ascii="Arial" w:hAnsi="Arial" w:cs="Arial"/>
+          <w:color w:val="FFFFFF" w:themeColor="background1"/>
+          <w:sz w:val="24"/>
+          <w:szCs w:val="24"/>
+          <w:lang w:eastAsia="en-US"/>
+        </w:rPr>
+      </w:pPr>
+      <w:r>
+        <w:rPr>
+          <w:rFonts w:ascii="Arial" w:hAnsi="Arial" w:cs="Arial"/>
+          <w:color w:val="FFFFFF" w:themeColor="background1"/>
           <w:sz w:val="24"/>
           <w:szCs w:val="24"/>
           <w:lang w:eastAsia="en-US"/>
@@ -1977,14 +2189,16 @@
         <w:jc w:val="both"/>
         <w:rPr>
           <w:rFonts w:ascii="Arial" w:hAnsi="Arial" w:cs="Arial"/>
-          <w:sz w:val="24"/>
-          <w:szCs w:val="24"/>
-          <w:lang w:eastAsia="en-US"/>
-        </w:rPr>
-      </w:pPr>
-      <w:r>
-        <w:rPr>
-          <w:rFonts w:ascii="Arial" w:hAnsi="Arial" w:cs="Arial"/>
+          <w:color w:val="FFFFFF" w:themeColor="background1"/>
+          <w:sz w:val="24"/>
+          <w:szCs w:val="24"/>
+          <w:lang w:eastAsia="en-US"/>
+        </w:rPr>
+      </w:pPr>
+      <w:r>
+        <w:rPr>
+          <w:rFonts w:ascii="Arial" w:hAnsi="Arial" w:cs="Arial"/>
+          <w:color w:val="FFFFFF" w:themeColor="background1"/>
           <w:sz w:val="24"/>
           <w:szCs w:val="24"/>
           <w:lang w:eastAsia="en-US"/>
@@ -1998,14 +2212,16 @@
         <w:jc w:val="both"/>
         <w:rPr>
           <w:rFonts w:ascii="Arial" w:hAnsi="Arial" w:cs="Arial"/>
-          <w:sz w:val="24"/>
-          <w:szCs w:val="24"/>
-          <w:lang w:eastAsia="en-US"/>
-        </w:rPr>
-      </w:pPr>
-      <w:r>
-        <w:rPr>
-          <w:rFonts w:ascii="Arial" w:hAnsi="Arial" w:cs="Arial"/>
+          <w:color w:val="FFFFFF" w:themeColor="background1"/>
+          <w:sz w:val="24"/>
+          <w:szCs w:val="24"/>
+          <w:lang w:eastAsia="en-US"/>
+        </w:rPr>
+      </w:pPr>
+      <w:r>
+        <w:rPr>
+          <w:rFonts w:ascii="Arial" w:hAnsi="Arial" w:cs="Arial"/>
+          <w:color w:val="FFFFFF" w:themeColor="background1"/>
           <w:sz w:val="24"/>
           <w:szCs w:val="24"/>
           <w:lang w:eastAsia="en-US"/>
@@ -2019,14 +2235,16 @@
         <w:jc w:val="both"/>
         <w:rPr>
           <w:rFonts w:ascii="Arial" w:hAnsi="Arial" w:cs="Arial"/>
-          <w:sz w:val="24"/>
-          <w:szCs w:val="24"/>
-          <w:lang w:eastAsia="en-US"/>
-        </w:rPr>
-      </w:pPr>
-      <w:r>
-        <w:rPr>
-          <w:rFonts w:ascii="Arial" w:hAnsi="Arial" w:cs="Arial"/>
+          <w:color w:val="FFFFFF" w:themeColor="background1"/>
+          <w:sz w:val="24"/>
+          <w:szCs w:val="24"/>
+          <w:lang w:eastAsia="en-US"/>
+        </w:rPr>
+      </w:pPr>
+      <w:r>
+        <w:rPr>
+          <w:rFonts w:ascii="Arial" w:hAnsi="Arial" w:cs="Arial"/>
+          <w:color w:val="FFFFFF" w:themeColor="background1"/>
           <w:sz w:val="24"/>
           <w:szCs w:val="24"/>
           <w:lang w:eastAsia="en-US"/>
@@ -2037,6 +2255,7 @@
       <w:r>
         <w:rPr>
           <w:rFonts w:ascii="Arial" w:hAnsi="Arial" w:cs="Arial"/>
+          <w:color w:val="FFFFFF" w:themeColor="background1"/>
           <w:sz w:val="24"/>
           <w:szCs w:val="24"/>
           <w:lang w:eastAsia="en-US"/>
@@ -2047,6 +2266,7 @@
       <w:r>
         <w:rPr>
           <w:rFonts w:ascii="Arial" w:hAnsi="Arial" w:cs="Arial"/>
+          <w:color w:val="FFFFFF" w:themeColor="background1"/>
           <w:sz w:val="24"/>
           <w:szCs w:val="24"/>
           <w:lang w:eastAsia="en-US"/>
@@ -2057,6 +2277,7 @@
       <w:r>
         <w:rPr>
           <w:rFonts w:ascii="Arial" w:hAnsi="Arial" w:cs="Arial"/>
+          <w:color w:val="FFFFFF" w:themeColor="background1"/>
           <w:sz w:val="24"/>
           <w:szCs w:val="24"/>
           <w:lang w:eastAsia="en-US"/>
@@ -2067,6 +2288,7 @@
       <w:r>
         <w:rPr>
           <w:rFonts w:ascii="Arial" w:hAnsi="Arial" w:cs="Arial"/>
+          <w:color w:val="FFFFFF" w:themeColor="background1"/>
           <w:sz w:val="24"/>
           <w:szCs w:val="24"/>
           <w:lang w:eastAsia="en-US"/>
@@ -2077,6 +2299,7 @@
       <w:r>
         <w:rPr>
           <w:rFonts w:ascii="Arial" w:hAnsi="Arial" w:cs="Arial"/>
+          <w:color w:val="FFFFFF" w:themeColor="background1"/>
           <w:sz w:val="24"/>
           <w:szCs w:val="24"/>
           <w:lang w:eastAsia="en-US"/>
@@ -2087,6 +2310,7 @@
       <w:r>
         <w:rPr>
           <w:rFonts w:ascii="Arial" w:hAnsi="Arial" w:cs="Arial"/>
+          <w:color w:val="FFFFFF" w:themeColor="background1"/>
           <w:sz w:val="24"/>
           <w:szCs w:val="24"/>
           <w:lang w:eastAsia="en-US"/>
@@ -2098,14 +2322,18 @@
       <w:pPr>
         <w:keepNext/>
         <w:jc w:val="center"/>
+        <w:rPr>
+          <w:color w:val="FFFFFF" w:themeColor="background1"/>
+        </w:rPr>
       </w:pPr>
       <w:r>
         <w:rPr>
           <w:noProof/>
+          <w:color w:val="FFFFFF" w:themeColor="background1"/>
         </w:rPr>
         <w:lastRenderedPageBreak/>
         <w:drawing>
-          <wp:inline distT="0" distB="0" distL="0" distR="0" wp14:anchorId="258DA283" wp14:editId="6F85C137">
+          <wp:inline distT="0" distB="0" distL="0" distR="0" wp14:anchorId="258DA283" wp14:editId="220BCBA6">
             <wp:extent cx="2417197" cy="2582629"/>
             <wp:effectExtent l="0" t="0" r="2540" b="8255"/>
             <wp:docPr id="1" name="Imagem 1" descr="O que vcs acham de Siouxsie and the banshees? : r/MusicaBR"/>
@@ -2162,7 +2390,7 @@
           <w:rFonts w:ascii="Arial" w:hAnsi="Arial" w:cs="Arial"/>
           <w:b/>
           <w:bCs/>
-          <w:color w:val="auto"/>
+          <w:color w:val="FFFFFF" w:themeColor="background1"/>
         </w:rPr>
       </w:pPr>
       <w:r>
@@ -2170,7 +2398,7 @@
           <w:rFonts w:ascii="Arial" w:hAnsi="Arial" w:cs="Arial"/>
           <w:b/>
           <w:bCs/>
-          <w:color w:val="auto"/>
+          <w:color w:val="FFFFFF" w:themeColor="background1"/>
         </w:rPr>
         <w:t xml:space="preserve">Figura </w:t>
       </w:r>
@@ -2179,7 +2407,7 @@
           <w:rFonts w:ascii="Arial" w:hAnsi="Arial" w:cs="Arial"/>
           <w:b/>
           <w:bCs/>
-          <w:color w:val="auto"/>
+          <w:color w:val="FFFFFF" w:themeColor="background1"/>
         </w:rPr>
         <w:fldChar w:fldCharType="begin"/>
       </w:r>
@@ -2188,7 +2416,7 @@
           <w:rFonts w:ascii="Arial" w:hAnsi="Arial" w:cs="Arial"/>
           <w:b/>
           <w:bCs/>
-          <w:color w:val="auto"/>
+          <w:color w:val="FFFFFF" w:themeColor="background1"/>
         </w:rPr>
         <w:instrText xml:space="preserve"> SEQ Figura \* ARABIC </w:instrText>
       </w:r>
@@ -2197,7 +2425,7 @@
           <w:rFonts w:ascii="Arial" w:hAnsi="Arial" w:cs="Arial"/>
           <w:b/>
           <w:bCs/>
-          <w:color w:val="auto"/>
+          <w:color w:val="FFFFFF" w:themeColor="background1"/>
         </w:rPr>
         <w:fldChar w:fldCharType="separate"/>
       </w:r>
@@ -2207,7 +2435,7 @@
           <w:b/>
           <w:bCs/>
           <w:noProof/>
-          <w:color w:val="auto"/>
+          <w:color w:val="FFFFFF" w:themeColor="background1"/>
         </w:rPr>
         <w:t>1</w:t>
       </w:r>
@@ -2216,7 +2444,7 @@
           <w:rFonts w:ascii="Arial" w:hAnsi="Arial" w:cs="Arial"/>
           <w:b/>
           <w:bCs/>
-          <w:color w:val="auto"/>
+          <w:color w:val="FFFFFF" w:themeColor="background1"/>
         </w:rPr>
         <w:fldChar w:fldCharType="end"/>
       </w:r>
@@ -2225,7 +2453,7 @@
           <w:rFonts w:ascii="Arial" w:hAnsi="Arial" w:cs="Arial"/>
           <w:b/>
           <w:bCs/>
-          <w:color w:val="auto"/>
+          <w:color w:val="FFFFFF" w:themeColor="background1"/>
         </w:rPr>
         <w:t>: Siouxsie Sioux</w:t>
       </w:r>
@@ -2233,9 +2461,15 @@
     <w:p>
       <w:pPr>
         <w:pStyle w:val="Ttulo2"/>
+        <w:rPr>
+          <w:color w:val="FFFFFF" w:themeColor="background1"/>
+        </w:rPr>
       </w:pPr>
       <w:bookmarkStart w:id="3" w:name="_Toc213512453"/>
       <w:r>
+        <w:rPr>
+          <w:color w:val="FFFFFF" w:themeColor="background1"/>
+        </w:rPr>
         <w:t>Cinema e Arte Gótica</w:t>
       </w:r>
       <w:bookmarkEnd w:id="3"/>
@@ -2246,14 +2480,16 @@
         <w:jc w:val="both"/>
         <w:rPr>
           <w:rFonts w:ascii="Arial" w:hAnsi="Arial" w:cs="Arial"/>
-          <w:sz w:val="24"/>
-          <w:szCs w:val="24"/>
-          <w:lang w:eastAsia="en-US"/>
-        </w:rPr>
-      </w:pPr>
-      <w:r>
-        <w:rPr>
-          <w:rFonts w:ascii="Arial" w:hAnsi="Arial" w:cs="Arial"/>
+          <w:color w:val="FFFFFF" w:themeColor="background1"/>
+          <w:sz w:val="24"/>
+          <w:szCs w:val="24"/>
+          <w:lang w:eastAsia="en-US"/>
+        </w:rPr>
+      </w:pPr>
+      <w:r>
+        <w:rPr>
+          <w:rFonts w:ascii="Arial" w:hAnsi="Arial" w:cs="Arial"/>
+          <w:color w:val="FFFFFF" w:themeColor="background1"/>
           <w:sz w:val="24"/>
           <w:szCs w:val="24"/>
           <w:lang w:eastAsia="en-US"/>
@@ -2267,14 +2503,16 @@
         <w:jc w:val="both"/>
         <w:rPr>
           <w:rFonts w:ascii="Arial" w:hAnsi="Arial" w:cs="Arial"/>
-          <w:sz w:val="24"/>
-          <w:szCs w:val="24"/>
-          <w:lang w:eastAsia="en-US"/>
-        </w:rPr>
-      </w:pPr>
-      <w:r>
-        <w:rPr>
-          <w:rFonts w:ascii="Arial" w:hAnsi="Arial" w:cs="Arial"/>
+          <w:color w:val="FFFFFF" w:themeColor="background1"/>
+          <w:sz w:val="24"/>
+          <w:szCs w:val="24"/>
+          <w:lang w:eastAsia="en-US"/>
+        </w:rPr>
+      </w:pPr>
+      <w:r>
+        <w:rPr>
+          <w:rFonts w:ascii="Arial" w:hAnsi="Arial" w:cs="Arial"/>
+          <w:color w:val="FFFFFF" w:themeColor="background1"/>
           <w:sz w:val="24"/>
           <w:szCs w:val="24"/>
           <w:lang w:eastAsia="en-US"/>
@@ -2288,14 +2526,16 @@
         <w:jc w:val="both"/>
         <w:rPr>
           <w:rFonts w:ascii="Arial" w:hAnsi="Arial" w:cs="Arial"/>
-          <w:sz w:val="24"/>
-          <w:szCs w:val="24"/>
-          <w:lang w:eastAsia="en-US"/>
-        </w:rPr>
-      </w:pPr>
-      <w:r>
-        <w:rPr>
-          <w:rFonts w:ascii="Arial" w:hAnsi="Arial" w:cs="Arial"/>
+          <w:color w:val="FFFFFF" w:themeColor="background1"/>
+          <w:sz w:val="24"/>
+          <w:szCs w:val="24"/>
+          <w:lang w:eastAsia="en-US"/>
+        </w:rPr>
+      </w:pPr>
+      <w:r>
+        <w:rPr>
+          <w:rFonts w:ascii="Arial" w:hAnsi="Arial" w:cs="Arial"/>
+          <w:color w:val="FFFFFF" w:themeColor="background1"/>
           <w:sz w:val="24"/>
           <w:szCs w:val="24"/>
           <w:lang w:eastAsia="en-US"/>
@@ -2306,6 +2546,7 @@
       <w:r>
         <w:rPr>
           <w:rFonts w:ascii="Arial" w:hAnsi="Arial" w:cs="Arial"/>
+          <w:color w:val="FFFFFF" w:themeColor="background1"/>
           <w:sz w:val="24"/>
           <w:szCs w:val="24"/>
           <w:lang w:eastAsia="en-US"/>
@@ -2316,6 +2557,7 @@
       <w:r>
         <w:rPr>
           <w:rFonts w:ascii="Arial" w:hAnsi="Arial" w:cs="Arial"/>
+          <w:color w:val="FFFFFF" w:themeColor="background1"/>
           <w:sz w:val="24"/>
           <w:szCs w:val="24"/>
           <w:lang w:eastAsia="en-US"/>
@@ -2326,6 +2568,7 @@
       <w:r>
         <w:rPr>
           <w:rFonts w:ascii="Arial" w:hAnsi="Arial" w:cs="Arial"/>
+          <w:color w:val="FFFFFF" w:themeColor="background1"/>
           <w:sz w:val="24"/>
           <w:szCs w:val="24"/>
           <w:lang w:eastAsia="en-US"/>
@@ -2336,6 +2579,7 @@
       <w:r>
         <w:rPr>
           <w:rFonts w:ascii="Arial" w:hAnsi="Arial" w:cs="Arial"/>
+          <w:color w:val="FFFFFF" w:themeColor="background1"/>
           <w:sz w:val="24"/>
           <w:szCs w:val="24"/>
           <w:lang w:eastAsia="en-US"/>
@@ -2348,6 +2592,7 @@
           <w:rFonts w:ascii="Arial" w:hAnsi="Arial" w:cs="Arial"/>
           <w:i/>
           <w:iCs/>
+          <w:color w:val="FFFFFF" w:themeColor="background1"/>
           <w:sz w:val="24"/>
           <w:szCs w:val="24"/>
           <w:lang w:eastAsia="en-US"/>
@@ -2358,6 +2603,7 @@
       <w:r>
         <w:rPr>
           <w:rFonts w:ascii="Arial" w:hAnsi="Arial" w:cs="Arial"/>
+          <w:color w:val="FFFFFF" w:themeColor="background1"/>
           <w:sz w:val="24"/>
           <w:szCs w:val="24"/>
           <w:lang w:eastAsia="en-US"/>
@@ -2368,15 +2614,19 @@
     <w:p>
       <w:pPr>
         <w:keepNext/>
+        <w:rPr>
+          <w:color w:val="FFFFFF" w:themeColor="background1"/>
+        </w:rPr>
       </w:pPr>
       <w:r>
         <w:rPr>
           <w:noProof/>
+          <w:color w:val="FFFFFF" w:themeColor="background1"/>
         </w:rPr>
         <mc:AlternateContent>
           <mc:Choice Requires="wps">
             <w:drawing>
-              <wp:anchor distT="0" distB="0" distL="114300" distR="114300" simplePos="0" relativeHeight="251662336" behindDoc="0" locked="0" layoutInCell="1" allowOverlap="1" wp14:anchorId="3247F6A7" wp14:editId="0DCE3106">
+              <wp:anchor distT="0" distB="0" distL="114300" distR="114300" simplePos="0" relativeHeight="251662336" behindDoc="0" locked="0" layoutInCell="1" allowOverlap="1" wp14:anchorId="3247F6A7" wp14:editId="6843F647">
                 <wp:simplePos x="0" y="0"/>
                 <wp:positionH relativeFrom="column">
                   <wp:posOffset>2632710</wp:posOffset>
@@ -2385,7 +2635,7 @@
                   <wp:posOffset>2777490</wp:posOffset>
                 </wp:positionV>
                 <wp:extent cx="2822575" cy="635"/>
-                <wp:effectExtent l="0" t="0" r="0" b="0"/>
+                <wp:effectExtent l="0" t="0" r="0" b="8255"/>
                 <wp:wrapNone/>
                 <wp:docPr id="8" name="Caixa de Texto 8"/>
                 <wp:cNvGraphicFramePr/>
@@ -2402,7 +2652,7 @@
                           <a:avLst/>
                         </a:prstGeom>
                         <a:solidFill>
-                          <a:prstClr val="white"/>
+                          <a:schemeClr val="tx1"/>
                         </a:solidFill>
                         <a:ln>
                           <a:noFill/>
@@ -2418,7 +2668,7 @@
                                 <w:b/>
                                 <w:bCs/>
                                 <w:noProof/>
-                                <w:color w:val="auto"/>
+                                <w:color w:val="FFFFFF" w:themeColor="background1"/>
                                 <w:sz w:val="22"/>
                                 <w:szCs w:val="22"/>
                               </w:rPr>
@@ -2428,7 +2678,7 @@
                                 <w:rFonts w:ascii="Arial" w:hAnsi="Arial" w:cs="Arial"/>
                                 <w:b/>
                                 <w:bCs/>
-                                <w:color w:val="auto"/>
+                                <w:color w:val="FFFFFF" w:themeColor="background1"/>
                               </w:rPr>
                               <w:t xml:space="preserve">Figura 3: London </w:t>
                             </w:r>
@@ -2438,7 +2688,7 @@
                                 <w:rFonts w:ascii="Arial" w:hAnsi="Arial" w:cs="Arial"/>
                                 <w:b/>
                                 <w:bCs/>
-                                <w:color w:val="auto"/>
+                                <w:color w:val="FFFFFF" w:themeColor="background1"/>
                               </w:rPr>
                               <w:t>After</w:t>
                             </w:r>
@@ -2448,7 +2698,7 @@
                                 <w:rFonts w:ascii="Arial" w:hAnsi="Arial" w:cs="Arial"/>
                                 <w:b/>
                                 <w:bCs/>
-                                <w:color w:val="auto"/>
+                                <w:color w:val="FFFFFF" w:themeColor="background1"/>
                               </w:rPr>
                               <w:t xml:space="preserve"> Midnight (1927)</w:t>
                             </w:r>
@@ -2473,7 +2723,7 @@
                 <v:stroke joinstyle="miter"/>
                 <v:path gradientshapeok="t" o:connecttype="rect"/>
               </v:shapetype>
-              <v:shape id="Caixa de Texto 8" o:spid="_x0000_s1026" type="#_x0000_t202" style="position:absolute;margin-left:207.3pt;margin-top:218.7pt;width:222.25pt;height:.05pt;z-index:251662336;visibility:visible;mso-wrap-style:square;mso-wrap-distance-left:9pt;mso-wrap-distance-top:0;mso-wrap-distance-right:9pt;mso-wrap-distance-bottom:0;mso-position-horizontal:absolute;mso-position-horizontal-relative:text;mso-position-vertical:absolute;mso-position-vertical-relative:text;v-text-anchor:top" o:gfxdata="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" stroked="f">
+              <v:shape id="Caixa de Texto 8" o:spid="_x0000_s1026" type="#_x0000_t202" style="position:absolute;margin-left:207.3pt;margin-top:218.7pt;width:222.25pt;height:.05pt;z-index:251662336;visibility:visible;mso-wrap-style:square;mso-wrap-distance-left:9pt;mso-wrap-distance-top:0;mso-wrap-distance-right:9pt;mso-wrap-distance-bottom:0;mso-position-horizontal:absolute;mso-position-horizontal-relative:text;mso-position-vertical:absolute;mso-position-vertical-relative:text;v-text-anchor:top" o:gfxdata="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" fillcolor="black [3213]" stroked="f">
                 <v:textbox style="mso-fit-shape-to-text:t" inset="0,0,0,0">
                   <w:txbxContent>
                     <w:p>
@@ -2484,7 +2734,7 @@
                           <w:b/>
                           <w:bCs/>
                           <w:noProof/>
-                          <w:color w:val="auto"/>
+                          <w:color w:val="FFFFFF" w:themeColor="background1"/>
                           <w:sz w:val="22"/>
                           <w:szCs w:val="22"/>
                         </w:rPr>
@@ -2494,7 +2744,7 @@
                           <w:rFonts w:ascii="Arial" w:hAnsi="Arial" w:cs="Arial"/>
                           <w:b/>
                           <w:bCs/>
-                          <w:color w:val="auto"/>
+                          <w:color w:val="FFFFFF" w:themeColor="background1"/>
                         </w:rPr>
                         <w:t xml:space="preserve">Figura 3: London </w:t>
                       </w:r>
@@ -2504,7 +2754,7 @@
                           <w:rFonts w:ascii="Arial" w:hAnsi="Arial" w:cs="Arial"/>
                           <w:b/>
                           <w:bCs/>
-                          <w:color w:val="auto"/>
+                          <w:color w:val="FFFFFF" w:themeColor="background1"/>
                         </w:rPr>
                         <w:t>After</w:t>
                       </w:r>
@@ -2514,7 +2764,7 @@
                           <w:rFonts w:ascii="Arial" w:hAnsi="Arial" w:cs="Arial"/>
                           <w:b/>
                           <w:bCs/>
-                          <w:color w:val="auto"/>
+                          <w:color w:val="FFFFFF" w:themeColor="background1"/>
                         </w:rPr>
                         <w:t xml:space="preserve"> Midnight (1927)</w:t>
                       </w:r>
@@ -2529,6 +2779,7 @@
       <w:r>
         <w:rPr>
           <w:noProof/>
+          <w:color w:val="FFFFFF" w:themeColor="background1"/>
         </w:rPr>
         <w:drawing>
           <wp:anchor distT="0" distB="0" distL="114300" distR="114300" simplePos="0" relativeHeight="251661312" behindDoc="0" locked="0" layoutInCell="1" allowOverlap="1" wp14:anchorId="3A3B6A2E" wp14:editId="146526A1">
@@ -2596,6 +2847,7 @@
       <w:r>
         <w:rPr>
           <w:noProof/>
+          <w:color w:val="FFFFFF" w:themeColor="background1"/>
         </w:rPr>
         <w:drawing>
           <wp:inline distT="0" distB="0" distL="0" distR="0" wp14:anchorId="07879FA5" wp14:editId="79043669">
@@ -2654,7 +2906,7 @@
           <w:rFonts w:ascii="Arial" w:hAnsi="Arial" w:cs="Arial"/>
           <w:b/>
           <w:bCs/>
-          <w:color w:val="auto"/>
+          <w:color w:val="FFFFFF" w:themeColor="background1"/>
           <w:lang w:eastAsia="en-US"/>
         </w:rPr>
       </w:pPr>
@@ -2663,7 +2915,7 @@
           <w:rFonts w:ascii="Arial" w:hAnsi="Arial" w:cs="Arial"/>
           <w:b/>
           <w:bCs/>
-          <w:color w:val="auto"/>
+          <w:color w:val="FFFFFF" w:themeColor="background1"/>
         </w:rPr>
         <w:t xml:space="preserve">Figura 2: </w:t>
       </w:r>
@@ -2673,7 +2925,7 @@
           <w:rFonts w:ascii="Arial" w:hAnsi="Arial" w:cs="Arial"/>
           <w:b/>
           <w:bCs/>
-          <w:color w:val="auto"/>
+          <w:color w:val="FFFFFF" w:themeColor="background1"/>
         </w:rPr>
         <w:t>Nosferatu</w:t>
       </w:r>
@@ -2683,7 +2935,7 @@
           <w:rFonts w:ascii="Arial" w:hAnsi="Arial" w:cs="Arial"/>
           <w:b/>
           <w:bCs/>
-          <w:color w:val="auto"/>
+          <w:color w:val="FFFFFF" w:themeColor="background1"/>
         </w:rPr>
         <w:t xml:space="preserve"> (1922)</w:t>
       </w:r>
@@ -2692,6 +2944,7 @@
       <w:pPr>
         <w:jc w:val="center"/>
         <w:rPr>
+          <w:color w:val="FFFFFF" w:themeColor="background1"/>
           <w:lang w:eastAsia="en-US"/>
         </w:rPr>
       </w:pPr>
@@ -2700,6 +2953,7 @@
       <w:pPr>
         <w:jc w:val="center"/>
         <w:rPr>
+          <w:color w:val="FFFFFF" w:themeColor="background1"/>
           <w:lang w:eastAsia="en-US"/>
         </w:rPr>
       </w:pPr>
@@ -2708,18 +2962,143 @@
       <w:pPr>
         <w:jc w:val="center"/>
         <w:rPr>
+          <w:color w:val="FFFFFF" w:themeColor="background1"/>
           <w:lang w:eastAsia="en-US"/>
         </w:rPr>
       </w:pPr>
       <w:r>
         <w:rPr>
           <w:noProof/>
+          <w:color w:val="FFFFFF" w:themeColor="background1"/>
         </w:rPr>
         <w:lastRenderedPageBreak/>
         <mc:AlternateContent>
           <mc:Choice Requires="wps">
             <w:drawing>
-              <wp:anchor distT="0" distB="0" distL="114300" distR="114300" simplePos="0" relativeHeight="251664384" behindDoc="0" locked="0" layoutInCell="1" allowOverlap="1" wp14:anchorId="3412E50F" wp14:editId="4031A4BE">
+              <wp:anchor distT="0" distB="0" distL="114300" distR="114300" simplePos="0" relativeHeight="251668480" behindDoc="1" locked="0" layoutInCell="1" allowOverlap="1" wp14:anchorId="64438E35" wp14:editId="66B8F0F1">
+                <wp:simplePos x="0" y="0"/>
+                <wp:positionH relativeFrom="column">
+                  <wp:posOffset>-707087</wp:posOffset>
+                </wp:positionH>
+                <wp:positionV relativeFrom="paragraph">
+                  <wp:posOffset>5051177</wp:posOffset>
+                </wp:positionV>
+                <wp:extent cx="3653155" cy="635"/>
+                <wp:effectExtent l="0" t="0" r="4445" b="8255"/>
+                <wp:wrapTight wrapText="bothSides">
+                  <wp:wrapPolygon edited="0">
+                    <wp:start x="0" y="0"/>
+                    <wp:lineTo x="0" y="20698"/>
+                    <wp:lineTo x="21514" y="20698"/>
+                    <wp:lineTo x="21514" y="0"/>
+                    <wp:lineTo x="0" y="0"/>
+                  </wp:wrapPolygon>
+                </wp:wrapTight>
+                <wp:docPr id="23" name="Caixa de Texto 23"/>
+                <wp:cNvGraphicFramePr/>
+                <a:graphic xmlns:a="http://schemas.openxmlformats.org/drawingml/2006/main">
+                  <a:graphicData uri="http://schemas.microsoft.com/office/word/2010/wordprocessingShape">
+                    <wps:wsp>
+                      <wps:cNvSpPr txBox="1"/>
+                      <wps:spPr>
+                        <a:xfrm>
+                          <a:off x="0" y="0"/>
+                          <a:ext cx="3653155" cy="635"/>
+                        </a:xfrm>
+                        <a:prstGeom prst="rect">
+                          <a:avLst/>
+                        </a:prstGeom>
+                        <a:solidFill>
+                          <a:schemeClr val="tx1"/>
+                        </a:solidFill>
+                        <a:ln>
+                          <a:noFill/>
+                        </a:ln>
+                      </wps:spPr>
+                      <wps:txbx>
+                        <w:txbxContent>
+                          <w:p>
+                            <w:pPr>
+                              <w:pStyle w:val="Legenda"/>
+                              <w:rPr>
+                                <w:rFonts w:ascii="Arial" w:hAnsi="Arial" w:cs="Arial"/>
+                                <w:b/>
+                                <w:bCs/>
+                                <w:noProof/>
+                                <w:color w:val="FFFFFF" w:themeColor="background1"/>
+                                <w:sz w:val="22"/>
+                                <w:szCs w:val="22"/>
+                              </w:rPr>
+                            </w:pPr>
+                            <w:r>
+                              <w:rPr>
+                                <w:rFonts w:ascii="Arial" w:hAnsi="Arial" w:cs="Arial"/>
+                                <w:b/>
+                                <w:bCs/>
+                                <w:color w:val="FFFFFF" w:themeColor="background1"/>
+                              </w:rPr>
+                              <w:t>Figura 4: O Estranho Mundo de Jack (1993)</w:t>
+                            </w:r>
+                          </w:p>
+                        </w:txbxContent>
+                      </wps:txbx>
+                      <wps:bodyPr rot="0" spcFirstLastPara="0" vertOverflow="overflow" horzOverflow="overflow" vert="horz" wrap="square" lIns="0" tIns="0" rIns="0" bIns="0" numCol="1" spcCol="0" rtlCol="0" fromWordArt="0" anchor="t" anchorCtr="0" forceAA="0" compatLnSpc="1">
+                        <a:prstTxWarp prst="textNoShape">
+                          <a:avLst/>
+                        </a:prstTxWarp>
+                        <a:spAutoFit/>
+                      </wps:bodyPr>
+                    </wps:wsp>
+                  </a:graphicData>
+                </a:graphic>
+              </wp:anchor>
+            </w:drawing>
+          </mc:Choice>
+          <mc:Fallback>
+            <w:pict>
+              <v:shape w14:anchorId="64438E35" id="Caixa de Texto 23" o:spid="_x0000_s1027" type="#_x0000_t202" style="position:absolute;left:0;text-align:left;margin-left:-55.7pt;margin-top:397.75pt;width:287.65pt;height:.05pt;z-index:-251648000;visibility:visible;mso-wrap-style:square;mso-wrap-distance-left:9pt;mso-wrap-distance-top:0;mso-wrap-distance-right:9pt;mso-wrap-distance-bottom:0;mso-position-horizontal:absolute;mso-position-horizontal-relative:text;mso-position-vertical:absolute;mso-position-vertical-relative:text;v-text-anchor:top" o:gfxdata="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" fillcolor="black [3213]" stroked="f">
+                <v:textbox style="mso-fit-shape-to-text:t" inset="0,0,0,0">
+                  <w:txbxContent>
+                    <w:p>
+                      <w:pPr>
+                        <w:pStyle w:val="Legenda"/>
+                        <w:rPr>
+                          <w:rFonts w:ascii="Arial" w:hAnsi="Arial" w:cs="Arial"/>
+                          <w:b/>
+                          <w:bCs/>
+                          <w:noProof/>
+                          <w:color w:val="FFFFFF" w:themeColor="background1"/>
+                          <w:sz w:val="22"/>
+                          <w:szCs w:val="22"/>
+                        </w:rPr>
+                      </w:pPr>
+                      <w:r>
+                        <w:rPr>
+                          <w:rFonts w:ascii="Arial" w:hAnsi="Arial" w:cs="Arial"/>
+                          <w:b/>
+                          <w:bCs/>
+                          <w:color w:val="FFFFFF" w:themeColor="background1"/>
+                        </w:rPr>
+                        <w:t>Figura 4: O Estranho Mundo de Jack (1993)</w:t>
+                      </w:r>
+                    </w:p>
+                  </w:txbxContent>
+                </v:textbox>
+                <w10:wrap type="tight"/>
+              </v:shape>
+            </w:pict>
+          </mc:Fallback>
+        </mc:AlternateContent>
+      </w:r>
+      <w:r>
+        <w:rPr>
+          <w:noProof/>
+          <w:color w:val="FFFFFF" w:themeColor="background1"/>
+        </w:rPr>
+        <mc:AlternateContent>
+          <mc:Choice Requires="wps">
+            <w:drawing>
+              <wp:anchor distT="0" distB="0" distL="114300" distR="114300" simplePos="0" relativeHeight="251664384" behindDoc="0" locked="0" layoutInCell="1" allowOverlap="1" wp14:anchorId="3412E50F" wp14:editId="71581596">
                 <wp:simplePos x="0" y="0"/>
                 <wp:positionH relativeFrom="column">
                   <wp:posOffset>3013406</wp:posOffset>
@@ -2728,7 +3107,7 @@
                   <wp:posOffset>5031491</wp:posOffset>
                 </wp:positionV>
                 <wp:extent cx="3293110" cy="635"/>
-                <wp:effectExtent l="0" t="0" r="0" b="0"/>
+                <wp:effectExtent l="0" t="0" r="2540" b="8255"/>
                 <wp:wrapTopAndBottom/>
                 <wp:docPr id="10" name="Caixa de Texto 10"/>
                 <wp:cNvGraphicFramePr/>
@@ -2745,7 +3124,7 @@
                           <a:avLst/>
                         </a:prstGeom>
                         <a:solidFill>
-                          <a:prstClr val="white"/>
+                          <a:schemeClr val="tx1"/>
                         </a:solidFill>
                         <a:ln>
                           <a:noFill/>
@@ -2789,7 +3168,7 @@
           </mc:Choice>
           <mc:Fallback>
             <w:pict>
-              <v:shape w14:anchorId="3412E50F" id="Caixa de Texto 10" o:spid="_x0000_s1027" type="#_x0000_t202" style="position:absolute;left:0;text-align:left;margin-left:237.3pt;margin-top:396.2pt;width:259.3pt;height:.05pt;z-index:251664384;visibility:visible;mso-wrap-style:square;mso-wrap-distance-left:9pt;mso-wrap-distance-top:0;mso-wrap-distance-right:9pt;mso-wrap-distance-bottom:0;mso-position-horizontal:absolute;mso-position-horizontal-relative:text;mso-position-vertical:absolute;mso-position-vertical-relative:text;v-text-anchor:top" o:gfxdata="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" stroked="f">
+              <v:shape w14:anchorId="3412E50F" id="Caixa de Texto 10" o:spid="_x0000_s1028" type="#_x0000_t202" style="position:absolute;left:0;text-align:left;margin-left:237.3pt;margin-top:396.2pt;width:259.3pt;height:.05pt;z-index:251664384;visibility:visible;mso-wrap-style:square;mso-wrap-distance-left:9pt;mso-wrap-distance-top:0;mso-wrap-distance-right:9pt;mso-wrap-distance-bottom:0;mso-position-horizontal:absolute;mso-position-horizontal-relative:text;mso-position-vertical:absolute;mso-position-vertical-relative:text;v-text-anchor:top" o:gfxdata="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" fillcolor="black [3213]" stroked="f">
                 <v:textbox style="mso-fit-shape-to-text:t" inset="0,0,0,0">
                   <w:txbxContent>
                     <w:p>
@@ -2823,145 +3202,7 @@
       <w:r>
         <w:rPr>
           <w:noProof/>
-        </w:rPr>
-        <mc:AlternateContent>
-          <mc:Choice Requires="wps">
-            <w:drawing>
-              <wp:anchor distT="0" distB="0" distL="114300" distR="114300" simplePos="0" relativeHeight="251668480" behindDoc="1" locked="0" layoutInCell="1" allowOverlap="1" wp14:anchorId="64438E35" wp14:editId="3441CB43">
-                <wp:simplePos x="0" y="0"/>
-                <wp:positionH relativeFrom="column">
-                  <wp:posOffset>-707666</wp:posOffset>
-                </wp:positionH>
-                <wp:positionV relativeFrom="paragraph">
-                  <wp:posOffset>5020034</wp:posOffset>
-                </wp:positionV>
-                <wp:extent cx="3653155" cy="635"/>
-                <wp:effectExtent l="0" t="0" r="0" b="0"/>
-                <wp:wrapTight wrapText="bothSides">
-                  <wp:wrapPolygon edited="0">
-                    <wp:start x="0" y="0"/>
-                    <wp:lineTo x="0" y="21600"/>
-                    <wp:lineTo x="21600" y="21600"/>
-                    <wp:lineTo x="21600" y="0"/>
-                  </wp:wrapPolygon>
-                </wp:wrapTight>
-                <wp:docPr id="23" name="Caixa de Texto 23"/>
-                <wp:cNvGraphicFramePr/>
-                <a:graphic xmlns:a="http://schemas.openxmlformats.org/drawingml/2006/main">
-                  <a:graphicData uri="http://schemas.microsoft.com/office/word/2010/wordprocessingShape">
-                    <wps:wsp>
-                      <wps:cNvSpPr txBox="1"/>
-                      <wps:spPr>
-                        <a:xfrm>
-                          <a:off x="0" y="0"/>
-                          <a:ext cx="3653155" cy="635"/>
-                        </a:xfrm>
-                        <a:prstGeom prst="rect">
-                          <a:avLst/>
-                        </a:prstGeom>
-                        <a:solidFill>
-                          <a:prstClr val="white"/>
-                        </a:solidFill>
-                        <a:ln>
-                          <a:noFill/>
-                        </a:ln>
-                      </wps:spPr>
-                      <wps:txbx>
-                        <w:txbxContent>
-                          <w:p>
-                            <w:pPr>
-                              <w:pStyle w:val="Legenda"/>
-                              <w:rPr>
-                                <w:rFonts w:ascii="Arial" w:hAnsi="Arial" w:cs="Arial"/>
-                                <w:b/>
-                                <w:bCs/>
-                                <w:noProof/>
-                                <w:color w:val="auto"/>
-                                <w:sz w:val="22"/>
-                                <w:szCs w:val="22"/>
-                              </w:rPr>
-                            </w:pPr>
-                            <w:r>
-                              <w:rPr>
-                                <w:rFonts w:ascii="Arial" w:hAnsi="Arial" w:cs="Arial"/>
-                                <w:b/>
-                                <w:bCs/>
-                                <w:color w:val="auto"/>
-                              </w:rPr>
-                              <w:t xml:space="preserve">Figura </w:t>
-                            </w:r>
-                            <w:r>
-                              <w:rPr>
-                                <w:rFonts w:ascii="Arial" w:hAnsi="Arial" w:cs="Arial"/>
-                                <w:b/>
-                                <w:bCs/>
-                                <w:color w:val="auto"/>
-                              </w:rPr>
-                              <w:t>4: O Estranho Mundo de Jack (1993)</w:t>
-                            </w:r>
-                          </w:p>
-                        </w:txbxContent>
-                      </wps:txbx>
-                      <wps:bodyPr rot="0" spcFirstLastPara="0" vertOverflow="overflow" horzOverflow="overflow" vert="horz" wrap="square" lIns="0" tIns="0" rIns="0" bIns="0" numCol="1" spcCol="0" rtlCol="0" fromWordArt="0" anchor="t" anchorCtr="0" forceAA="0" compatLnSpc="1">
-                        <a:prstTxWarp prst="textNoShape">
-                          <a:avLst/>
-                        </a:prstTxWarp>
-                        <a:spAutoFit/>
-                      </wps:bodyPr>
-                    </wps:wsp>
-                  </a:graphicData>
-                </a:graphic>
-              </wp:anchor>
-            </w:drawing>
-          </mc:Choice>
-          <mc:Fallback>
-            <w:pict>
-              <v:shape w14:anchorId="64438E35" id="Caixa de Texto 23" o:spid="_x0000_s1028" type="#_x0000_t202" style="position:absolute;left:0;text-align:left;margin-left:-55.7pt;margin-top:395.3pt;width:287.65pt;height:.05pt;z-index:-251648000;visibility:visible;mso-wrap-style:square;mso-wrap-distance-left:9pt;mso-wrap-distance-top:0;mso-wrap-distance-right:9pt;mso-wrap-distance-bottom:0;mso-position-horizontal:absolute;mso-position-horizontal-relative:text;mso-position-vertical:absolute;mso-position-vertical-relative:text;v-text-anchor:top" o:gfxdata="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" stroked="f">
-                <v:textbox style="mso-fit-shape-to-text:t" inset="0,0,0,0">
-                  <w:txbxContent>
-                    <w:p>
-                      <w:pPr>
-                        <w:pStyle w:val="Legenda"/>
-                        <w:rPr>
-                          <w:rFonts w:ascii="Arial" w:hAnsi="Arial" w:cs="Arial"/>
-                          <w:b/>
-                          <w:bCs/>
-                          <w:noProof/>
-                          <w:color w:val="auto"/>
-                          <w:sz w:val="22"/>
-                          <w:szCs w:val="22"/>
-                        </w:rPr>
-                      </w:pPr>
-                      <w:r>
-                        <w:rPr>
-                          <w:rFonts w:ascii="Arial" w:hAnsi="Arial" w:cs="Arial"/>
-                          <w:b/>
-                          <w:bCs/>
-                          <w:color w:val="auto"/>
-                        </w:rPr>
-                        <w:t xml:space="preserve">Figura </w:t>
-                      </w:r>
-                      <w:r>
-                        <w:rPr>
-                          <w:rFonts w:ascii="Arial" w:hAnsi="Arial" w:cs="Arial"/>
-                          <w:b/>
-                          <w:bCs/>
-                          <w:color w:val="auto"/>
-                        </w:rPr>
-                        <w:t>4: O Estranho Mundo de Jack (1993)</w:t>
-                      </w:r>
-                    </w:p>
-                  </w:txbxContent>
-                </v:textbox>
-                <w10:wrap type="tight"/>
-              </v:shape>
-            </w:pict>
-          </mc:Fallback>
-        </mc:AlternateContent>
-      </w:r>
-      <w:r>
-        <w:rPr>
-          <w:noProof/>
+          <w:color w:val="FFFFFF" w:themeColor="background1"/>
         </w:rPr>
         <w:drawing>
           <wp:anchor distT="0" distB="0" distL="114300" distR="114300" simplePos="0" relativeHeight="251660288" behindDoc="0" locked="0" layoutInCell="1" allowOverlap="1" wp14:anchorId="5EB224BC" wp14:editId="3EEA02C9">
@@ -3029,9 +3270,10 @@
       <w:r>
         <w:rPr>
           <w:noProof/>
+          <w:color w:val="FFFFFF" w:themeColor="background1"/>
         </w:rPr>
         <w:drawing>
-          <wp:anchor distT="0" distB="0" distL="114300" distR="114300" simplePos="0" relativeHeight="251659264" behindDoc="0" locked="0" layoutInCell="1" allowOverlap="1" wp14:anchorId="6D2595A6" wp14:editId="52B7D9DC">
+          <wp:anchor distT="0" distB="0" distL="114300" distR="114300" simplePos="0" relativeHeight="251659264" behindDoc="0" locked="0" layoutInCell="1" allowOverlap="1" wp14:anchorId="6D2595A6" wp14:editId="27F94D00">
             <wp:simplePos x="0" y="0"/>
             <wp:positionH relativeFrom="column">
               <wp:posOffset>-698472</wp:posOffset>
@@ -3093,270 +3335,199 @@
           </wp:anchor>
         </w:drawing>
       </w:r>
-      <w:r>
-        <w:rPr>
+    </w:p>
+    <w:p>
+      <w:pPr>
+        <w:pStyle w:val="Ttulo2"/>
+        <w:rPr>
+          <w:color w:val="FFFFFF" w:themeColor="background1"/>
+        </w:rPr>
+      </w:pPr>
+      <w:bookmarkStart w:id="4" w:name="_Toc213512454"/>
+      <w:r>
+        <w:rPr>
+          <w:color w:val="FFFFFF" w:themeColor="background1"/>
+        </w:rPr>
+        <w:t>Música</w:t>
+      </w:r>
+      <w:bookmarkEnd w:id="4"/>
+    </w:p>
+    <w:p>
+      <w:pPr>
+        <w:ind w:firstLine="576"/>
+        <w:jc w:val="both"/>
+        <w:rPr>
+          <w:rFonts w:ascii="Arial" w:hAnsi="Arial" w:cs="Arial"/>
+          <w:color w:val="FFFFFF" w:themeColor="background1"/>
+          <w:sz w:val="24"/>
+          <w:szCs w:val="24"/>
+          <w:lang w:eastAsia="en-US"/>
+        </w:rPr>
+      </w:pPr>
+      <w:r>
+        <w:rPr>
+          <w:rFonts w:ascii="Arial" w:hAnsi="Arial" w:cs="Arial"/>
+          <w:color w:val="FFFFFF" w:themeColor="background1"/>
+          <w:sz w:val="24"/>
+          <w:szCs w:val="24"/>
+          <w:lang w:eastAsia="en-US"/>
+        </w:rPr>
+        <w:t xml:space="preserve">A música é o coração da subcultura gótica, e a banda pioneira foi o Bauhaus, com seu clássico som experimental Bela </w:t>
+      </w:r>
+      <w:proofErr w:type="spellStart"/>
+      <w:r>
+        <w:rPr>
+          <w:rFonts w:ascii="Arial" w:hAnsi="Arial" w:cs="Arial"/>
+          <w:color w:val="FFFFFF" w:themeColor="background1"/>
+          <w:sz w:val="24"/>
+          <w:szCs w:val="24"/>
+          <w:lang w:eastAsia="en-US"/>
+        </w:rPr>
+        <w:t>Lugosi’s</w:t>
+      </w:r>
+      <w:proofErr w:type="spellEnd"/>
+      <w:r>
+        <w:rPr>
+          <w:rFonts w:ascii="Arial" w:hAnsi="Arial" w:cs="Arial"/>
+          <w:color w:val="FFFFFF" w:themeColor="background1"/>
+          <w:sz w:val="24"/>
+          <w:szCs w:val="24"/>
+          <w:lang w:eastAsia="en-US"/>
+        </w:rPr>
+        <w:t xml:space="preserve"> </w:t>
+      </w:r>
+      <w:proofErr w:type="spellStart"/>
+      <w:r>
+        <w:rPr>
+          <w:rFonts w:ascii="Arial" w:hAnsi="Arial" w:cs="Arial"/>
+          <w:color w:val="FFFFFF" w:themeColor="background1"/>
+          <w:sz w:val="24"/>
+          <w:szCs w:val="24"/>
+          <w:lang w:eastAsia="en-US"/>
+        </w:rPr>
+        <w:t>Dead</w:t>
+      </w:r>
+      <w:proofErr w:type="spellEnd"/>
+      <w:r>
+        <w:rPr>
+          <w:rFonts w:ascii="Arial" w:hAnsi="Arial" w:cs="Arial"/>
+          <w:color w:val="FFFFFF" w:themeColor="background1"/>
+          <w:sz w:val="24"/>
+          <w:szCs w:val="24"/>
+          <w:lang w:eastAsia="en-US"/>
+        </w:rPr>
+        <w:t xml:space="preserve">, que conta a morte do ator Bela </w:t>
+      </w:r>
+      <w:proofErr w:type="spellStart"/>
+      <w:r>
+        <w:rPr>
+          <w:rFonts w:ascii="Arial" w:hAnsi="Arial" w:cs="Arial"/>
+          <w:color w:val="FFFFFF" w:themeColor="background1"/>
+          <w:sz w:val="24"/>
+          <w:szCs w:val="24"/>
+          <w:lang w:eastAsia="en-US"/>
+        </w:rPr>
+        <w:t>Lugosi</w:t>
+      </w:r>
+      <w:proofErr w:type="spellEnd"/>
+      <w:r>
+        <w:rPr>
+          <w:rFonts w:ascii="Arial" w:hAnsi="Arial" w:cs="Arial"/>
+          <w:color w:val="FFFFFF" w:themeColor="background1"/>
+          <w:sz w:val="24"/>
+          <w:szCs w:val="24"/>
+          <w:lang w:eastAsia="en-US"/>
+        </w:rPr>
+        <w:t xml:space="preserve">, que interpretou o Drácula. The Cure e Siouxsie </w:t>
+      </w:r>
+      <w:proofErr w:type="spellStart"/>
+      <w:r>
+        <w:rPr>
+          <w:rFonts w:ascii="Arial" w:hAnsi="Arial" w:cs="Arial"/>
+          <w:color w:val="FFFFFF" w:themeColor="background1"/>
+          <w:sz w:val="24"/>
+          <w:szCs w:val="24"/>
+          <w:lang w:eastAsia="en-US"/>
+        </w:rPr>
+        <w:t>and</w:t>
+      </w:r>
+      <w:proofErr w:type="spellEnd"/>
+      <w:r>
+        <w:rPr>
+          <w:rFonts w:ascii="Arial" w:hAnsi="Arial" w:cs="Arial"/>
+          <w:color w:val="FFFFFF" w:themeColor="background1"/>
+          <w:sz w:val="24"/>
+          <w:szCs w:val="24"/>
+          <w:lang w:eastAsia="en-US"/>
+        </w:rPr>
+        <w:t xml:space="preserve"> </w:t>
+      </w:r>
+      <w:proofErr w:type="spellStart"/>
+      <w:r>
+        <w:rPr>
+          <w:rFonts w:ascii="Arial" w:hAnsi="Arial" w:cs="Arial"/>
+          <w:color w:val="FFFFFF" w:themeColor="background1"/>
+          <w:sz w:val="24"/>
+          <w:szCs w:val="24"/>
+          <w:lang w:eastAsia="en-US"/>
+        </w:rPr>
+        <w:t>the</w:t>
+      </w:r>
+      <w:proofErr w:type="spellEnd"/>
+      <w:r>
+        <w:rPr>
+          <w:rFonts w:ascii="Arial" w:hAnsi="Arial" w:cs="Arial"/>
+          <w:color w:val="FFFFFF" w:themeColor="background1"/>
+          <w:sz w:val="24"/>
+          <w:szCs w:val="24"/>
+          <w:lang w:eastAsia="en-US"/>
+        </w:rPr>
+        <w:t xml:space="preserve"> </w:t>
+      </w:r>
+      <w:proofErr w:type="spellStart"/>
+      <w:r>
+        <w:rPr>
+          <w:rFonts w:ascii="Arial" w:hAnsi="Arial" w:cs="Arial"/>
+          <w:color w:val="FFFFFF" w:themeColor="background1"/>
+          <w:sz w:val="24"/>
+          <w:szCs w:val="24"/>
+          <w:lang w:eastAsia="en-US"/>
+        </w:rPr>
+        <w:t>Banshees</w:t>
+      </w:r>
+      <w:proofErr w:type="spellEnd"/>
+      <w:r>
+        <w:rPr>
+          <w:rFonts w:ascii="Arial" w:hAnsi="Arial" w:cs="Arial"/>
+          <w:color w:val="FFFFFF" w:themeColor="background1"/>
+          <w:sz w:val="24"/>
+          <w:szCs w:val="24"/>
+          <w:lang w:eastAsia="en-US"/>
+        </w:rPr>
+        <w:t xml:space="preserve"> consolidaram o gênero, com letras introspectivas, românticas, atmosfera sombria e sonoridade diferente de tudo que havia na época.</w:t>
+      </w:r>
+    </w:p>
+    <w:p>
+      <w:pPr>
+        <w:ind w:firstLine="576"/>
+        <w:jc w:val="both"/>
+        <w:rPr>
+          <w:color w:val="FFFFFF" w:themeColor="background1"/>
+          <w:lang w:eastAsia="en-US"/>
+        </w:rPr>
+      </w:pPr>
+      <w:r>
+        <w:rPr>
+          <w:rFonts w:ascii="Arial" w:hAnsi="Arial" w:cs="Arial"/>
           <w:noProof/>
+          <w:color w:val="FFFFFF" w:themeColor="background1"/>
+          <w:sz w:val="24"/>
+          <w:szCs w:val="24"/>
         </w:rPr>
         <mc:AlternateContent>
           <mc:Choice Requires="wps">
             <w:drawing>
-              <wp:anchor distT="0" distB="0" distL="114300" distR="114300" simplePos="0" relativeHeight="251663360" behindDoc="0" locked="0" layoutInCell="1" allowOverlap="1" wp14:anchorId="31A84033" wp14:editId="3497DD10">
-                <wp:simplePos x="0" y="0"/>
-                <wp:positionH relativeFrom="column">
-                  <wp:posOffset>-714375</wp:posOffset>
-                </wp:positionH>
-                <wp:positionV relativeFrom="paragraph">
-                  <wp:posOffset>4977130</wp:posOffset>
-                </wp:positionV>
-                <wp:extent cx="3373120" cy="635"/>
-                <wp:effectExtent l="0" t="0" r="0" b="0"/>
-                <wp:wrapNone/>
-                <wp:docPr id="9" name="Caixa de Texto 9"/>
-                <wp:cNvGraphicFramePr/>
-                <a:graphic xmlns:a="http://schemas.openxmlformats.org/drawingml/2006/main">
-                  <a:graphicData uri="http://schemas.microsoft.com/office/word/2010/wordprocessingShape">
-                    <wps:wsp>
-                      <wps:cNvSpPr txBox="1"/>
-                      <wps:spPr>
-                        <a:xfrm>
-                          <a:off x="0" y="0"/>
-                          <a:ext cx="3373120" cy="635"/>
-                        </a:xfrm>
-                        <a:prstGeom prst="rect">
-                          <a:avLst/>
-                        </a:prstGeom>
-                        <a:solidFill>
-                          <a:prstClr val="white"/>
-                        </a:solidFill>
-                        <a:ln>
-                          <a:noFill/>
-                        </a:ln>
-                      </wps:spPr>
-                      <wps:txbx>
-                        <w:txbxContent>
-                          <w:p>
-                            <w:pPr>
-                              <w:pStyle w:val="Legenda"/>
-                              <w:rPr>
-                                <w:noProof/>
-                                <w:sz w:val="22"/>
-                                <w:szCs w:val="22"/>
-                              </w:rPr>
-                            </w:pPr>
-                            <w:r>
-                              <w:t>Figura 4: O Estranho Mundo de Jack (1993)</w:t>
-                            </w:r>
-                          </w:p>
-                        </w:txbxContent>
-                      </wps:txbx>
-                      <wps:bodyPr rot="0" spcFirstLastPara="0" vertOverflow="overflow" horzOverflow="overflow" vert="horz" wrap="square" lIns="0" tIns="0" rIns="0" bIns="0" numCol="1" spcCol="0" rtlCol="0" fromWordArt="0" anchor="t" anchorCtr="0" forceAA="0" compatLnSpc="1">
-                        <a:prstTxWarp prst="textNoShape">
-                          <a:avLst/>
-                        </a:prstTxWarp>
-                        <a:spAutoFit/>
-                      </wps:bodyPr>
-                    </wps:wsp>
-                  </a:graphicData>
-                </a:graphic>
-              </wp:anchor>
-            </w:drawing>
-          </mc:Choice>
-          <mc:Fallback>
-            <w:pict>
-              <v:shape w14:anchorId="31A84033" id="Caixa de Texto 9" o:spid="_x0000_s1029" type="#_x0000_t202" style="position:absolute;left:0;text-align:left;margin-left:-56.25pt;margin-top:391.9pt;width:265.6pt;height:.05pt;z-index:251663360;visibility:visible;mso-wrap-style:square;mso-wrap-distance-left:9pt;mso-wrap-distance-top:0;mso-wrap-distance-right:9pt;mso-wrap-distance-bottom:0;mso-position-horizontal:absolute;mso-position-horizontal-relative:text;mso-position-vertical:absolute;mso-position-vertical-relative:text;v-text-anchor:top" o:gfxdata="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" stroked="f">
-                <v:textbox style="mso-fit-shape-to-text:t" inset="0,0,0,0">
-                  <w:txbxContent>
-                    <w:p>
-                      <w:pPr>
-                        <w:pStyle w:val="Legenda"/>
-                        <w:rPr>
-                          <w:noProof/>
-                          <w:sz w:val="22"/>
-                          <w:szCs w:val="22"/>
-                        </w:rPr>
-                      </w:pPr>
-                      <w:r>
-                        <w:t>Figura 4: O Estranho Mundo de Jack (1993)</w:t>
-                      </w:r>
-                    </w:p>
-                  </w:txbxContent>
-                </v:textbox>
-              </v:shape>
-            </w:pict>
-          </mc:Fallback>
-        </mc:AlternateContent>
-      </w:r>
-    </w:p>
-    <w:p>
-      <w:pPr>
-        <w:pStyle w:val="Ttulo2"/>
-      </w:pPr>
-      <w:bookmarkStart w:id="4" w:name="_Toc213512454"/>
-      <w:r>
-        <w:t>Música</w:t>
-      </w:r>
-      <w:bookmarkEnd w:id="4"/>
-    </w:p>
-    <w:p>
-      <w:pPr>
-        <w:ind w:firstLine="576"/>
-        <w:jc w:val="both"/>
-        <w:rPr>
-          <w:rFonts w:ascii="Arial" w:hAnsi="Arial" w:cs="Arial"/>
-          <w:sz w:val="24"/>
-          <w:szCs w:val="24"/>
-          <w:lang w:eastAsia="en-US"/>
-        </w:rPr>
-      </w:pPr>
-      <w:r>
-        <w:rPr>
-          <w:rFonts w:ascii="Arial" w:hAnsi="Arial" w:cs="Arial"/>
-          <w:sz w:val="24"/>
-          <w:szCs w:val="24"/>
-          <w:lang w:eastAsia="en-US"/>
-        </w:rPr>
-        <w:t xml:space="preserve">A música é o coração da subcultura gótica, e a banda pioneira foi o Bauhaus, com seu clássico som experimental Bela </w:t>
-      </w:r>
-      <w:proofErr w:type="spellStart"/>
-      <w:r>
-        <w:rPr>
-          <w:rFonts w:ascii="Arial" w:hAnsi="Arial" w:cs="Arial"/>
-          <w:sz w:val="24"/>
-          <w:szCs w:val="24"/>
-          <w:lang w:eastAsia="en-US"/>
-        </w:rPr>
-        <w:t>Lugosi’s</w:t>
-      </w:r>
-      <w:proofErr w:type="spellEnd"/>
-      <w:r>
-        <w:rPr>
-          <w:rFonts w:ascii="Arial" w:hAnsi="Arial" w:cs="Arial"/>
-          <w:sz w:val="24"/>
-          <w:szCs w:val="24"/>
-          <w:lang w:eastAsia="en-US"/>
-        </w:rPr>
-        <w:t xml:space="preserve"> </w:t>
-      </w:r>
-      <w:proofErr w:type="spellStart"/>
-      <w:r>
-        <w:rPr>
-          <w:rFonts w:ascii="Arial" w:hAnsi="Arial" w:cs="Arial"/>
-          <w:sz w:val="24"/>
-          <w:szCs w:val="24"/>
-          <w:lang w:eastAsia="en-US"/>
-        </w:rPr>
-        <w:t>Dead</w:t>
-      </w:r>
-      <w:proofErr w:type="spellEnd"/>
-      <w:r>
-        <w:rPr>
-          <w:rFonts w:ascii="Arial" w:hAnsi="Arial" w:cs="Arial"/>
-          <w:sz w:val="24"/>
-          <w:szCs w:val="24"/>
-          <w:lang w:eastAsia="en-US"/>
-        </w:rPr>
-        <w:t xml:space="preserve">, que conta a morte do ator Bela </w:t>
-      </w:r>
-      <w:proofErr w:type="spellStart"/>
-      <w:r>
-        <w:rPr>
-          <w:rFonts w:ascii="Arial" w:hAnsi="Arial" w:cs="Arial"/>
-          <w:sz w:val="24"/>
-          <w:szCs w:val="24"/>
-          <w:lang w:eastAsia="en-US"/>
-        </w:rPr>
-        <w:t>Lugosi</w:t>
-      </w:r>
-      <w:proofErr w:type="spellEnd"/>
-      <w:r>
-        <w:rPr>
-          <w:rFonts w:ascii="Arial" w:hAnsi="Arial" w:cs="Arial"/>
-          <w:sz w:val="24"/>
-          <w:szCs w:val="24"/>
-          <w:lang w:eastAsia="en-US"/>
-        </w:rPr>
-        <w:t xml:space="preserve">, que interpretou o Drácula. The Cure e Siouxsie </w:t>
-      </w:r>
-      <w:proofErr w:type="spellStart"/>
-      <w:r>
-        <w:rPr>
-          <w:rFonts w:ascii="Arial" w:hAnsi="Arial" w:cs="Arial"/>
-          <w:sz w:val="24"/>
-          <w:szCs w:val="24"/>
-          <w:lang w:eastAsia="en-US"/>
-        </w:rPr>
-        <w:t>and</w:t>
-      </w:r>
-      <w:proofErr w:type="spellEnd"/>
-      <w:r>
-        <w:rPr>
-          <w:rFonts w:ascii="Arial" w:hAnsi="Arial" w:cs="Arial"/>
-          <w:sz w:val="24"/>
-          <w:szCs w:val="24"/>
-          <w:lang w:eastAsia="en-US"/>
-        </w:rPr>
-        <w:t xml:space="preserve"> </w:t>
-      </w:r>
-      <w:proofErr w:type="spellStart"/>
-      <w:r>
-        <w:rPr>
-          <w:rFonts w:ascii="Arial" w:hAnsi="Arial" w:cs="Arial"/>
-          <w:sz w:val="24"/>
-          <w:szCs w:val="24"/>
-          <w:lang w:eastAsia="en-US"/>
-        </w:rPr>
-        <w:t>the</w:t>
-      </w:r>
-      <w:proofErr w:type="spellEnd"/>
-      <w:r>
-        <w:rPr>
-          <w:rFonts w:ascii="Arial" w:hAnsi="Arial" w:cs="Arial"/>
-          <w:sz w:val="24"/>
-          <w:szCs w:val="24"/>
-          <w:lang w:eastAsia="en-US"/>
-        </w:rPr>
-        <w:t xml:space="preserve"> </w:t>
-      </w:r>
-      <w:proofErr w:type="spellStart"/>
-      <w:r>
-        <w:rPr>
-          <w:rFonts w:ascii="Arial" w:hAnsi="Arial" w:cs="Arial"/>
-          <w:sz w:val="24"/>
-          <w:szCs w:val="24"/>
-          <w:lang w:eastAsia="en-US"/>
-        </w:rPr>
-        <w:t>Banshees</w:t>
-      </w:r>
-      <w:proofErr w:type="spellEnd"/>
-      <w:r>
-        <w:rPr>
-          <w:rFonts w:ascii="Arial" w:hAnsi="Arial" w:cs="Arial"/>
-          <w:sz w:val="24"/>
-          <w:szCs w:val="24"/>
-          <w:lang w:eastAsia="en-US"/>
-        </w:rPr>
-        <w:t xml:space="preserve"> consolidaram o gênero, com letras introspectivas, românticas, atmosfera sombria e sonoridade diferente de tudo que havia na época.</w:t>
-      </w:r>
-    </w:p>
-    <w:p>
-      <w:pPr>
-        <w:ind w:firstLine="576"/>
-        <w:jc w:val="both"/>
-        <w:rPr>
-          <w:lang w:eastAsia="en-US"/>
-        </w:rPr>
-      </w:pPr>
-      <w:r>
-        <w:rPr>
-          <w:rFonts w:ascii="Arial" w:hAnsi="Arial" w:cs="Arial"/>
-          <w:noProof/>
-          <w:sz w:val="24"/>
-          <w:szCs w:val="24"/>
-        </w:rPr>
-        <mc:AlternateContent>
-          <mc:Choice Requires="wps">
-            <w:drawing>
-              <wp:anchor distT="0" distB="0" distL="114300" distR="114300" simplePos="0" relativeHeight="251666432" behindDoc="1" locked="0" layoutInCell="1" allowOverlap="1" wp14:anchorId="4B32982B" wp14:editId="3EE2AD4A">
+              <wp:anchor distT="0" distB="0" distL="114300" distR="114300" simplePos="0" relativeHeight="251666432" behindDoc="1" locked="0" layoutInCell="1" allowOverlap="1" wp14:anchorId="4B32982B" wp14:editId="124BE00E">
                 <wp:simplePos x="0" y="0"/>
                 <wp:positionH relativeFrom="column">
                   <wp:posOffset>2672715</wp:posOffset>
@@ -3365,13 +3536,14 @@
                   <wp:posOffset>1746885</wp:posOffset>
                 </wp:positionV>
                 <wp:extent cx="3653155" cy="635"/>
-                <wp:effectExtent l="0" t="0" r="0" b="0"/>
+                <wp:effectExtent l="0" t="0" r="4445" b="8255"/>
                 <wp:wrapTight wrapText="bothSides">
                   <wp:wrapPolygon edited="0">
                     <wp:start x="0" y="0"/>
-                    <wp:lineTo x="0" y="21600"/>
-                    <wp:lineTo x="21600" y="21600"/>
-                    <wp:lineTo x="21600" y="0"/>
+                    <wp:lineTo x="0" y="20698"/>
+                    <wp:lineTo x="21514" y="20698"/>
+                    <wp:lineTo x="21514" y="0"/>
+                    <wp:lineTo x="0" y="0"/>
                   </wp:wrapPolygon>
                 </wp:wrapTight>
                 <wp:docPr id="12" name="Caixa de Texto 12"/>
@@ -3389,7 +3561,7 @@
                           <a:avLst/>
                         </a:prstGeom>
                         <a:solidFill>
-                          <a:prstClr val="white"/>
+                          <a:schemeClr val="tx1"/>
                         </a:solidFill>
                         <a:ln>
                           <a:noFill/>
@@ -3436,7 +3608,7 @@
           </mc:Choice>
           <mc:Fallback>
             <w:pict>
-              <v:shape w14:anchorId="4B32982B" id="Caixa de Texto 12" o:spid="_x0000_s1030" type="#_x0000_t202" style="position:absolute;left:0;text-align:left;margin-left:210.45pt;margin-top:137.55pt;width:287.65pt;height:.05pt;z-index:-251650048;visibility:visible;mso-wrap-style:square;mso-wrap-distance-left:9pt;mso-wrap-distance-top:0;mso-wrap-distance-right:9pt;mso-wrap-distance-bottom:0;mso-position-horizontal:absolute;mso-position-horizontal-relative:text;mso-position-vertical:absolute;mso-position-vertical-relative:text;v-text-anchor:top" o:gfxdata="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" stroked="f">
+              <v:shape w14:anchorId="4B32982B" id="Caixa de Texto 12" o:spid="_x0000_s1029" type="#_x0000_t202" style="position:absolute;left:0;text-align:left;margin-left:210.45pt;margin-top:137.55pt;width:287.65pt;height:.05pt;z-index:-251650048;visibility:visible;mso-wrap-style:square;mso-wrap-distance-left:9pt;mso-wrap-distance-top:0;mso-wrap-distance-right:9pt;mso-wrap-distance-bottom:0;mso-position-horizontal:absolute;mso-position-horizontal-relative:text;mso-position-vertical:absolute;mso-position-vertical-relative:text;v-text-anchor:top" o:gfxdata="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" fillcolor="black [3213]" stroked="f">
                 <v:textbox style="mso-fit-shape-to-text:t" inset="0,0,0,0">
                   <w:txbxContent>
                     <w:p>
@@ -3474,6 +3646,7 @@
         <w:rPr>
           <w:rFonts w:ascii="Arial" w:hAnsi="Arial" w:cs="Arial"/>
           <w:noProof/>
+          <w:color w:val="FFFFFF" w:themeColor="background1"/>
           <w:sz w:val="24"/>
           <w:szCs w:val="24"/>
         </w:rPr>
@@ -3551,6 +3724,7 @@
       <w:r>
         <w:rPr>
           <w:rFonts w:ascii="Arial" w:hAnsi="Arial" w:cs="Arial"/>
+          <w:color w:val="FFFFFF" w:themeColor="background1"/>
           <w:sz w:val="24"/>
           <w:szCs w:val="24"/>
           <w:lang w:eastAsia="en-US"/>
@@ -3561,6 +3735,7 @@
       <w:r>
         <w:rPr>
           <w:rFonts w:ascii="Arial" w:hAnsi="Arial" w:cs="Arial"/>
+          <w:color w:val="FFFFFF" w:themeColor="background1"/>
           <w:sz w:val="24"/>
           <w:szCs w:val="24"/>
           <w:lang w:eastAsia="en-US"/>
@@ -3571,6 +3746,7 @@
       <w:r>
         <w:rPr>
           <w:rFonts w:ascii="Arial" w:hAnsi="Arial" w:cs="Arial"/>
+          <w:color w:val="FFFFFF" w:themeColor="background1"/>
           <w:sz w:val="24"/>
           <w:szCs w:val="24"/>
           <w:lang w:eastAsia="en-US"/>
@@ -3581,6 +3757,7 @@
       <w:r>
         <w:rPr>
           <w:rFonts w:ascii="Arial" w:hAnsi="Arial" w:cs="Arial"/>
+          <w:color w:val="FFFFFF" w:themeColor="background1"/>
           <w:sz w:val="24"/>
           <w:szCs w:val="24"/>
           <w:lang w:eastAsia="en-US"/>
@@ -3591,6 +3768,7 @@
       <w:r>
         <w:rPr>
           <w:rFonts w:ascii="Arial" w:hAnsi="Arial" w:cs="Arial"/>
+          <w:color w:val="FFFFFF" w:themeColor="background1"/>
           <w:sz w:val="24"/>
           <w:szCs w:val="24"/>
           <w:lang w:eastAsia="en-US"/>
@@ -3601,6 +3779,7 @@
       <w:r>
         <w:rPr>
           <w:rFonts w:ascii="Arial" w:hAnsi="Arial" w:cs="Arial"/>
+          <w:color w:val="FFFFFF" w:themeColor="background1"/>
           <w:sz w:val="24"/>
           <w:szCs w:val="24"/>
           <w:lang w:eastAsia="en-US"/>
@@ -3611,6 +3790,7 @@
       <w:r>
         <w:rPr>
           <w:rFonts w:ascii="Arial" w:hAnsi="Arial" w:cs="Arial"/>
+          <w:color w:val="FFFFFF" w:themeColor="background1"/>
           <w:sz w:val="24"/>
           <w:szCs w:val="24"/>
           <w:lang w:eastAsia="en-US"/>
@@ -3621,6 +3801,7 @@
       <w:r>
         <w:rPr>
           <w:rFonts w:ascii="Arial" w:hAnsi="Arial" w:cs="Arial"/>
+          <w:color w:val="FFFFFF" w:themeColor="background1"/>
           <w:sz w:val="24"/>
           <w:szCs w:val="24"/>
           <w:lang w:eastAsia="en-US"/>
@@ -3631,6 +3812,7 @@
       <w:r>
         <w:rPr>
           <w:rFonts w:ascii="Arial" w:hAnsi="Arial" w:cs="Arial"/>
+          <w:color w:val="FFFFFF" w:themeColor="background1"/>
           <w:sz w:val="24"/>
           <w:szCs w:val="24"/>
           <w:lang w:eastAsia="en-US"/>
@@ -3641,6 +3823,7 @@
       <w:r>
         <w:rPr>
           <w:rFonts w:ascii="Arial" w:hAnsi="Arial" w:cs="Arial"/>
+          <w:color w:val="FFFFFF" w:themeColor="background1"/>
           <w:sz w:val="24"/>
           <w:szCs w:val="24"/>
           <w:lang w:eastAsia="en-US"/>
@@ -3651,6 +3834,7 @@
       <w:r>
         <w:rPr>
           <w:rFonts w:ascii="Arial" w:hAnsi="Arial" w:cs="Arial"/>
+          <w:color w:val="FFFFFF" w:themeColor="background1"/>
           <w:sz w:val="24"/>
           <w:szCs w:val="24"/>
           <w:lang w:eastAsia="en-US"/>
@@ -3661,6 +3845,7 @@
       <w:r>
         <w:rPr>
           <w:rFonts w:ascii="Arial" w:hAnsi="Arial" w:cs="Arial"/>
+          <w:color w:val="FFFFFF" w:themeColor="background1"/>
           <w:sz w:val="24"/>
           <w:szCs w:val="24"/>
           <w:lang w:eastAsia="en-US"/>
@@ -3671,6 +3856,7 @@
       <w:r>
         <w:rPr>
           <w:rFonts w:ascii="Arial" w:hAnsi="Arial" w:cs="Arial"/>
+          <w:color w:val="FFFFFF" w:themeColor="background1"/>
           <w:sz w:val="24"/>
           <w:szCs w:val="24"/>
           <w:lang w:eastAsia="en-US"/>
@@ -3681,6 +3867,7 @@
       <w:r>
         <w:rPr>
           <w:rFonts w:ascii="Arial" w:hAnsi="Arial" w:cs="Arial"/>
+          <w:color w:val="FFFFFF" w:themeColor="background1"/>
           <w:sz w:val="24"/>
           <w:szCs w:val="24"/>
           <w:lang w:eastAsia="en-US"/>
@@ -3691,6 +3878,7 @@
       <w:r>
         <w:rPr>
           <w:rFonts w:ascii="Arial" w:hAnsi="Arial" w:cs="Arial"/>
+          <w:color w:val="FFFFFF" w:themeColor="background1"/>
           <w:sz w:val="24"/>
           <w:szCs w:val="24"/>
           <w:lang w:eastAsia="en-US"/>
@@ -3701,6 +3889,7 @@
       <w:r>
         <w:rPr>
           <w:rFonts w:ascii="Arial" w:hAnsi="Arial" w:cs="Arial"/>
+          <w:color w:val="FFFFFF" w:themeColor="background1"/>
           <w:sz w:val="24"/>
           <w:szCs w:val="24"/>
           <w:lang w:eastAsia="en-US"/>
@@ -3711,6 +3900,7 @@
       <w:r>
         <w:rPr>
           <w:rFonts w:ascii="Arial" w:hAnsi="Arial" w:cs="Arial"/>
+          <w:color w:val="FFFFFF" w:themeColor="background1"/>
           <w:sz w:val="24"/>
           <w:szCs w:val="24"/>
           <w:lang w:eastAsia="en-US"/>
@@ -3721,6 +3911,7 @@
       <w:r>
         <w:rPr>
           <w:rFonts w:ascii="Arial" w:hAnsi="Arial" w:cs="Arial"/>
+          <w:color w:val="FFFFFF" w:themeColor="background1"/>
           <w:sz w:val="24"/>
           <w:szCs w:val="24"/>
           <w:lang w:eastAsia="en-US"/>
@@ -3731,6 +3922,7 @@
       <w:r>
         <w:rPr>
           <w:rFonts w:ascii="Arial" w:hAnsi="Arial" w:cs="Arial"/>
+          <w:color w:val="FFFFFF" w:themeColor="background1"/>
           <w:sz w:val="24"/>
           <w:szCs w:val="24"/>
           <w:lang w:eastAsia="en-US"/>
@@ -3741,6 +3933,7 @@
       <w:r>
         <w:rPr>
           <w:rFonts w:ascii="Arial" w:hAnsi="Arial" w:cs="Arial"/>
+          <w:color w:val="FFFFFF" w:themeColor="background1"/>
           <w:sz w:val="24"/>
           <w:szCs w:val="24"/>
           <w:lang w:eastAsia="en-US"/>
@@ -3752,6 +3945,7 @@
       <w:r>
         <w:rPr>
           <w:rFonts w:ascii="Arial" w:hAnsi="Arial" w:cs="Arial"/>
+          <w:color w:val="FFFFFF" w:themeColor="background1"/>
           <w:sz w:val="24"/>
           <w:szCs w:val="24"/>
           <w:lang w:eastAsia="en-US"/>
@@ -3762,6 +3956,7 @@
       <w:r>
         <w:rPr>
           <w:rFonts w:ascii="Arial" w:hAnsi="Arial" w:cs="Arial"/>
+          <w:color w:val="FFFFFF" w:themeColor="background1"/>
           <w:sz w:val="24"/>
           <w:szCs w:val="24"/>
           <w:lang w:eastAsia="en-US"/>
@@ -3772,6 +3967,7 @@
       <w:r>
         <w:rPr>
           <w:rFonts w:ascii="Arial" w:hAnsi="Arial" w:cs="Arial"/>
+          <w:color w:val="FFFFFF" w:themeColor="background1"/>
           <w:sz w:val="24"/>
           <w:szCs w:val="24"/>
           <w:lang w:eastAsia="en-US"/>
@@ -3783,10 +3979,14 @@
       <w:pPr>
         <w:keepNext/>
         <w:jc w:val="center"/>
+        <w:rPr>
+          <w:color w:val="FFFFFF" w:themeColor="background1"/>
+        </w:rPr>
       </w:pPr>
       <w:r>
         <w:rPr>
           <w:noProof/>
+          <w:color w:val="FFFFFF" w:themeColor="background1"/>
         </w:rPr>
         <w:drawing>
           <wp:inline distT="0" distB="0" distL="0" distR="0" wp14:anchorId="3D22D138" wp14:editId="7BC1293B">
@@ -3846,7 +4046,7 @@
           <w:rFonts w:ascii="Arial" w:hAnsi="Arial" w:cs="Arial"/>
           <w:b/>
           <w:bCs/>
-          <w:color w:val="auto"/>
+          <w:color w:val="FFFFFF" w:themeColor="background1"/>
         </w:rPr>
       </w:pPr>
       <w:r>
@@ -3854,7 +4054,7 @@
           <w:rFonts w:ascii="Arial" w:hAnsi="Arial" w:cs="Arial"/>
           <w:b/>
           <w:bCs/>
-          <w:color w:val="auto"/>
+          <w:color w:val="FFFFFF" w:themeColor="background1"/>
         </w:rPr>
         <w:t xml:space="preserve">Figura 7: Sisters </w:t>
       </w:r>
@@ -3864,7 +4064,7 @@
           <w:rFonts w:ascii="Arial" w:hAnsi="Arial" w:cs="Arial"/>
           <w:b/>
           <w:bCs/>
-          <w:color w:val="auto"/>
+          <w:color w:val="FFFFFF" w:themeColor="background1"/>
         </w:rPr>
         <w:t>Of</w:t>
       </w:r>
@@ -3874,19 +4074,29 @@
           <w:rFonts w:ascii="Arial" w:hAnsi="Arial" w:cs="Arial"/>
           <w:b/>
           <w:bCs/>
-          <w:color w:val="auto"/>
+          <w:color w:val="FFFFFF" w:themeColor="background1"/>
         </w:rPr>
         <w:t xml:space="preserve"> Mercy</w:t>
       </w:r>
     </w:p>
-    <w:p/>
+    <w:p>
+      <w:pPr>
+        <w:rPr>
+          <w:color w:val="FFFFFF" w:themeColor="background1"/>
+        </w:rPr>
+      </w:pPr>
+    </w:p>
     <w:p>
       <w:pPr>
         <w:keepNext/>
+        <w:rPr>
+          <w:color w:val="FFFFFF" w:themeColor="background1"/>
+        </w:rPr>
       </w:pPr>
       <w:r>
         <w:rPr>
           <w:noProof/>
+          <w:color w:val="FFFFFF" w:themeColor="background1"/>
         </w:rPr>
         <w:drawing>
           <wp:inline distT="0" distB="0" distL="0" distR="0" wp14:anchorId="3C57BF1C" wp14:editId="0D4B669F">
@@ -3946,7 +4156,7 @@
           <w:rFonts w:ascii="Arial" w:hAnsi="Arial" w:cs="Arial"/>
           <w:b/>
           <w:bCs/>
-          <w:color w:val="auto"/>
+          <w:color w:val="FFFFFF" w:themeColor="background1"/>
         </w:rPr>
       </w:pPr>
       <w:r>
@@ -3954,7 +4164,7 @@
           <w:rFonts w:ascii="Arial" w:hAnsi="Arial" w:cs="Arial"/>
           <w:b/>
           <w:bCs/>
-          <w:color w:val="auto"/>
+          <w:color w:val="FFFFFF" w:themeColor="background1"/>
         </w:rPr>
         <w:t xml:space="preserve">Figura 8: </w:t>
       </w:r>
@@ -3964,7 +4174,7 @@
           <w:rFonts w:ascii="Arial" w:hAnsi="Arial" w:cs="Arial"/>
           <w:b/>
           <w:bCs/>
-          <w:color w:val="auto"/>
+          <w:color w:val="FFFFFF" w:themeColor="background1"/>
         </w:rPr>
         <w:t>Lebanon</w:t>
       </w:r>
@@ -3974,7 +4184,7 @@
           <w:rFonts w:ascii="Arial" w:hAnsi="Arial" w:cs="Arial"/>
           <w:b/>
           <w:bCs/>
-          <w:color w:val="auto"/>
+          <w:color w:val="FFFFFF" w:themeColor="background1"/>
         </w:rPr>
         <w:t xml:space="preserve"> Hanover</w:t>
       </w:r>
@@ -3983,6 +4193,7 @@
       <w:pPr>
         <w:jc w:val="center"/>
         <w:rPr>
+          <w:color w:val="FFFFFF" w:themeColor="background1"/>
           <w:lang w:eastAsia="en-US"/>
         </w:rPr>
       </w:pPr>
@@ -3991,6 +4202,7 @@
       <w:pPr>
         <w:jc w:val="center"/>
         <w:rPr>
+          <w:color w:val="FFFFFF" w:themeColor="background1"/>
           <w:lang w:eastAsia="en-US"/>
         </w:rPr>
       </w:pPr>
@@ -3998,9 +4210,15 @@
     <w:p>
       <w:pPr>
         <w:pStyle w:val="Ttulo1"/>
+        <w:rPr>
+          <w:color w:val="FFFFFF" w:themeColor="background1"/>
+        </w:rPr>
       </w:pPr>
       <w:bookmarkStart w:id="5" w:name="_Toc213512455"/>
       <w:r>
+        <w:rPr>
+          <w:color w:val="FFFFFF" w:themeColor="background1"/>
+        </w:rPr>
         <w:lastRenderedPageBreak/>
         <w:t>OBJETIVOS</w:t>
       </w:r>
@@ -4012,14 +4230,16 @@
         <w:jc w:val="both"/>
         <w:rPr>
           <w:rFonts w:ascii="Arial" w:hAnsi="Arial" w:cs="Arial"/>
-          <w:sz w:val="24"/>
-          <w:szCs w:val="24"/>
-          <w:lang w:eastAsia="en-US"/>
-        </w:rPr>
-      </w:pPr>
-      <w:r>
-        <w:rPr>
-          <w:rFonts w:ascii="Arial" w:hAnsi="Arial" w:cs="Arial"/>
+          <w:color w:val="FFFFFF" w:themeColor="background1"/>
+          <w:sz w:val="24"/>
+          <w:szCs w:val="24"/>
+          <w:lang w:eastAsia="en-US"/>
+        </w:rPr>
+      </w:pPr>
+      <w:r>
+        <w:rPr>
+          <w:rFonts w:ascii="Arial" w:hAnsi="Arial" w:cs="Arial"/>
+          <w:color w:val="FFFFFF" w:themeColor="background1"/>
           <w:sz w:val="24"/>
           <w:szCs w:val="24"/>
           <w:lang w:eastAsia="en-US"/>
@@ -4033,14 +4253,16 @@
         <w:jc w:val="both"/>
         <w:rPr>
           <w:rFonts w:ascii="Arial" w:hAnsi="Arial" w:cs="Arial"/>
-          <w:sz w:val="24"/>
-          <w:szCs w:val="24"/>
-          <w:lang w:eastAsia="en-US"/>
-        </w:rPr>
-      </w:pPr>
-      <w:r>
-        <w:rPr>
-          <w:rFonts w:ascii="Arial" w:hAnsi="Arial" w:cs="Arial"/>
+          <w:color w:val="FFFFFF" w:themeColor="background1"/>
+          <w:sz w:val="24"/>
+          <w:szCs w:val="24"/>
+          <w:lang w:eastAsia="en-US"/>
+        </w:rPr>
+      </w:pPr>
+      <w:r>
+        <w:rPr>
+          <w:rFonts w:ascii="Arial" w:hAnsi="Arial" w:cs="Arial"/>
+          <w:color w:val="FFFFFF" w:themeColor="background1"/>
           <w:sz w:val="24"/>
           <w:szCs w:val="24"/>
           <w:lang w:eastAsia="en-US"/>
@@ -4054,14 +4276,16 @@
         <w:jc w:val="both"/>
         <w:rPr>
           <w:rFonts w:ascii="Arial" w:hAnsi="Arial" w:cs="Arial"/>
-          <w:sz w:val="24"/>
-          <w:szCs w:val="24"/>
-          <w:lang w:eastAsia="en-US"/>
-        </w:rPr>
-      </w:pPr>
-      <w:r>
-        <w:rPr>
-          <w:rFonts w:ascii="Arial" w:hAnsi="Arial" w:cs="Arial"/>
+          <w:color w:val="FFFFFF" w:themeColor="background1"/>
+          <w:sz w:val="24"/>
+          <w:szCs w:val="24"/>
+          <w:lang w:eastAsia="en-US"/>
+        </w:rPr>
+      </w:pPr>
+      <w:r>
+        <w:rPr>
+          <w:rFonts w:ascii="Arial" w:hAnsi="Arial" w:cs="Arial"/>
+          <w:color w:val="FFFFFF" w:themeColor="background1"/>
           <w:sz w:val="24"/>
           <w:szCs w:val="24"/>
           <w:lang w:eastAsia="en-US"/>
@@ -4072,9 +4296,15 @@
     <w:p>
       <w:pPr>
         <w:pStyle w:val="Ttulo1"/>
+        <w:rPr>
+          <w:color w:val="FFFFFF" w:themeColor="background1"/>
+        </w:rPr>
       </w:pPr>
       <w:bookmarkStart w:id="6" w:name="_Toc213512456"/>
       <w:r>
+        <w:rPr>
+          <w:color w:val="FFFFFF" w:themeColor="background1"/>
+        </w:rPr>
         <w:t>JUSTIFICATIVA</w:t>
       </w:r>
       <w:bookmarkEnd w:id="6"/>
@@ -4085,14 +4315,16 @@
         <w:jc w:val="both"/>
         <w:rPr>
           <w:rFonts w:ascii="Arial" w:hAnsi="Arial" w:cs="Arial"/>
-          <w:sz w:val="24"/>
-          <w:szCs w:val="24"/>
-          <w:lang w:eastAsia="en-US"/>
-        </w:rPr>
-      </w:pPr>
-      <w:r>
-        <w:rPr>
-          <w:rFonts w:ascii="Arial" w:hAnsi="Arial" w:cs="Arial"/>
+          <w:color w:val="FFFFFF" w:themeColor="background1"/>
+          <w:sz w:val="24"/>
+          <w:szCs w:val="24"/>
+          <w:lang w:eastAsia="en-US"/>
+        </w:rPr>
+      </w:pPr>
+      <w:r>
+        <w:rPr>
+          <w:rFonts w:ascii="Arial" w:hAnsi="Arial" w:cs="Arial"/>
+          <w:color w:val="FFFFFF" w:themeColor="background1"/>
           <w:sz w:val="24"/>
           <w:szCs w:val="24"/>
           <w:lang w:eastAsia="en-US"/>
@@ -4106,14 +4338,16 @@
         <w:jc w:val="both"/>
         <w:rPr>
           <w:rFonts w:ascii="Arial" w:hAnsi="Arial" w:cs="Arial"/>
-          <w:sz w:val="24"/>
-          <w:szCs w:val="24"/>
-          <w:lang w:eastAsia="en-US"/>
-        </w:rPr>
-      </w:pPr>
-      <w:r>
-        <w:rPr>
-          <w:rFonts w:ascii="Arial" w:hAnsi="Arial" w:cs="Arial"/>
+          <w:color w:val="FFFFFF" w:themeColor="background1"/>
+          <w:sz w:val="24"/>
+          <w:szCs w:val="24"/>
+          <w:lang w:eastAsia="en-US"/>
+        </w:rPr>
+      </w:pPr>
+      <w:r>
+        <w:rPr>
+          <w:rFonts w:ascii="Arial" w:hAnsi="Arial" w:cs="Arial"/>
+          <w:color w:val="FFFFFF" w:themeColor="background1"/>
           <w:sz w:val="24"/>
           <w:szCs w:val="24"/>
           <w:lang w:eastAsia="en-US"/>
@@ -4127,14 +4361,16 @@
         <w:jc w:val="both"/>
         <w:rPr>
           <w:rFonts w:ascii="Arial" w:hAnsi="Arial" w:cs="Arial"/>
-          <w:sz w:val="24"/>
-          <w:szCs w:val="24"/>
-          <w:lang w:eastAsia="en-US"/>
-        </w:rPr>
-      </w:pPr>
-      <w:r>
-        <w:rPr>
-          <w:rFonts w:ascii="Arial" w:hAnsi="Arial" w:cs="Arial"/>
+          <w:color w:val="FFFFFF" w:themeColor="background1"/>
+          <w:sz w:val="24"/>
+          <w:szCs w:val="24"/>
+          <w:lang w:eastAsia="en-US"/>
+        </w:rPr>
+      </w:pPr>
+      <w:r>
+        <w:rPr>
+          <w:rFonts w:ascii="Arial" w:hAnsi="Arial" w:cs="Arial"/>
+          <w:color w:val="FFFFFF" w:themeColor="background1"/>
           <w:sz w:val="24"/>
           <w:szCs w:val="24"/>
           <w:lang w:eastAsia="en-US"/>
@@ -4145,6 +4381,7 @@
       <w:r>
         <w:rPr>
           <w:rFonts w:ascii="Arial" w:hAnsi="Arial" w:cs="Arial"/>
+          <w:color w:val="FFFFFF" w:themeColor="background1"/>
           <w:sz w:val="24"/>
           <w:szCs w:val="24"/>
           <w:lang w:eastAsia="en-US"/>
@@ -4155,6 +4392,7 @@
       <w:r>
         <w:rPr>
           <w:rFonts w:ascii="Arial" w:hAnsi="Arial" w:cs="Arial"/>
+          <w:color w:val="FFFFFF" w:themeColor="background1"/>
           <w:sz w:val="24"/>
           <w:szCs w:val="24"/>
           <w:lang w:eastAsia="en-US"/>
@@ -4165,6 +4403,7 @@
       <w:r>
         <w:rPr>
           <w:rFonts w:ascii="Arial" w:hAnsi="Arial" w:cs="Arial"/>
+          <w:color w:val="FFFFFF" w:themeColor="background1"/>
           <w:sz w:val="24"/>
           <w:szCs w:val="24"/>
           <w:lang w:eastAsia="en-US"/>
@@ -4175,6 +4414,7 @@
       <w:r>
         <w:rPr>
           <w:rFonts w:ascii="Arial" w:hAnsi="Arial" w:cs="Arial"/>
+          <w:color w:val="FFFFFF" w:themeColor="background1"/>
           <w:sz w:val="24"/>
           <w:szCs w:val="24"/>
           <w:lang w:eastAsia="en-US"/>
@@ -4188,14 +4428,16 @@
         <w:jc w:val="both"/>
         <w:rPr>
           <w:rFonts w:ascii="Arial" w:hAnsi="Arial" w:cs="Arial"/>
-          <w:sz w:val="24"/>
-          <w:szCs w:val="24"/>
-          <w:lang w:eastAsia="en-US"/>
-        </w:rPr>
-      </w:pPr>
-      <w:r>
-        <w:rPr>
-          <w:rFonts w:ascii="Arial" w:hAnsi="Arial" w:cs="Arial"/>
+          <w:color w:val="FFFFFF" w:themeColor="background1"/>
+          <w:sz w:val="24"/>
+          <w:szCs w:val="24"/>
+          <w:lang w:eastAsia="en-US"/>
+        </w:rPr>
+      </w:pPr>
+      <w:r>
+        <w:rPr>
+          <w:rFonts w:ascii="Arial" w:hAnsi="Arial" w:cs="Arial"/>
+          <w:color w:val="FFFFFF" w:themeColor="background1"/>
           <w:sz w:val="24"/>
           <w:szCs w:val="24"/>
           <w:lang w:eastAsia="en-US"/>
@@ -4206,6 +4448,7 @@
       <w:r>
         <w:rPr>
           <w:rFonts w:ascii="Arial" w:hAnsi="Arial" w:cs="Arial"/>
+          <w:color w:val="FFFFFF" w:themeColor="background1"/>
           <w:sz w:val="24"/>
           <w:szCs w:val="24"/>
           <w:lang w:eastAsia="en-US"/>
@@ -4216,6 +4459,7 @@
       <w:r>
         <w:rPr>
           <w:rFonts w:ascii="Arial" w:hAnsi="Arial" w:cs="Arial"/>
+          <w:color w:val="FFFFFF" w:themeColor="background1"/>
           <w:sz w:val="24"/>
           <w:szCs w:val="24"/>
           <w:lang w:eastAsia="en-US"/>
@@ -4226,6 +4470,7 @@
       <w:r>
         <w:rPr>
           <w:rFonts w:ascii="Arial" w:hAnsi="Arial" w:cs="Arial"/>
+          <w:color w:val="FFFFFF" w:themeColor="background1"/>
           <w:sz w:val="24"/>
           <w:szCs w:val="24"/>
           <w:lang w:eastAsia="en-US"/>
@@ -4236,6 +4481,7 @@
       <w:r>
         <w:rPr>
           <w:rFonts w:ascii="Arial" w:hAnsi="Arial" w:cs="Arial"/>
+          <w:color w:val="FFFFFF" w:themeColor="background1"/>
           <w:sz w:val="24"/>
           <w:szCs w:val="24"/>
           <w:lang w:eastAsia="en-US"/>
@@ -4246,6 +4492,7 @@
       <w:r>
         <w:rPr>
           <w:rFonts w:ascii="Arial" w:hAnsi="Arial" w:cs="Arial"/>
+          <w:color w:val="FFFFFF" w:themeColor="background1"/>
           <w:sz w:val="24"/>
           <w:szCs w:val="24"/>
           <w:lang w:eastAsia="en-US"/>
@@ -4256,6 +4503,7 @@
       <w:r>
         <w:rPr>
           <w:rFonts w:ascii="Arial" w:hAnsi="Arial" w:cs="Arial"/>
+          <w:color w:val="FFFFFF" w:themeColor="background1"/>
           <w:sz w:val="24"/>
           <w:szCs w:val="24"/>
           <w:lang w:eastAsia="en-US"/>
@@ -4267,9 +4515,14 @@
       <w:pPr>
         <w:keepNext/>
         <w:jc w:val="center"/>
-      </w:pPr>
-      <w:r>
-        <w:rPr>
+        <w:rPr>
+          <w:color w:val="FFFFFF" w:themeColor="background1"/>
+        </w:rPr>
+      </w:pPr>
+      <w:r>
+        <w:rPr>
+          <w:noProof/>
+          <w:color w:val="FFFFFF" w:themeColor="background1"/>
           <w:lang w:eastAsia="en-US"/>
         </w:rPr>
         <w:drawing>
@@ -4317,7 +4570,7 @@
           <w:rFonts w:ascii="Arial" w:hAnsi="Arial" w:cs="Arial"/>
           <w:b/>
           <w:bCs/>
-          <w:color w:val="auto"/>
+          <w:color w:val="FFFFFF" w:themeColor="background1"/>
         </w:rPr>
       </w:pPr>
       <w:r>
@@ -4325,7 +4578,7 @@
           <w:rFonts w:ascii="Arial" w:hAnsi="Arial" w:cs="Arial"/>
           <w:b/>
           <w:bCs/>
-          <w:color w:val="auto"/>
+          <w:color w:val="FFFFFF" w:themeColor="background1"/>
         </w:rPr>
         <w:t xml:space="preserve">Figura 9: Playlist do </w:t>
       </w:r>
@@ -4335,21 +4588,45 @@
           <w:rFonts w:ascii="Arial" w:hAnsi="Arial" w:cs="Arial"/>
           <w:b/>
           <w:bCs/>
-          <w:color w:val="auto"/>
+          <w:color w:val="FFFFFF" w:themeColor="background1"/>
         </w:rPr>
         <w:t>Spotify</w:t>
       </w:r>
       <w:proofErr w:type="spellEnd"/>
     </w:p>
-    <w:p/>
-    <w:p/>
-    <w:p/>
+    <w:p>
+      <w:pPr>
+        <w:rPr>
+          <w:color w:val="FFFFFF" w:themeColor="background1"/>
+        </w:rPr>
+      </w:pPr>
+    </w:p>
+    <w:p>
+      <w:pPr>
+        <w:rPr>
+          <w:color w:val="FFFFFF" w:themeColor="background1"/>
+        </w:rPr>
+      </w:pPr>
+    </w:p>
+    <w:p>
+      <w:pPr>
+        <w:rPr>
+          <w:color w:val="FFFFFF" w:themeColor="background1"/>
+        </w:rPr>
+      </w:pPr>
+    </w:p>
     <w:p>
       <w:pPr>
         <w:pStyle w:val="Ttulo1"/>
+        <w:rPr>
+          <w:color w:val="FFFFFF" w:themeColor="background1"/>
+        </w:rPr>
       </w:pPr>
       <w:bookmarkStart w:id="7" w:name="_Toc213512457"/>
       <w:r>
+        <w:rPr>
+          <w:color w:val="FFFFFF" w:themeColor="background1"/>
+        </w:rPr>
         <w:lastRenderedPageBreak/>
         <w:t>ESCOPO</w:t>
       </w:r>
@@ -4358,9 +4635,15 @@
     <w:p>
       <w:pPr>
         <w:pStyle w:val="Ttulo2"/>
+        <w:rPr>
+          <w:color w:val="FFFFFF" w:themeColor="background1"/>
+        </w:rPr>
       </w:pPr>
       <w:bookmarkStart w:id="8" w:name="_Toc213512458"/>
       <w:r>
+        <w:rPr>
+          <w:color w:val="FFFFFF" w:themeColor="background1"/>
+        </w:rPr>
         <w:t>Descrição</w:t>
       </w:r>
       <w:bookmarkEnd w:id="8"/>
@@ -4370,14 +4653,16 @@
         <w:ind w:firstLine="576"/>
         <w:rPr>
           <w:rFonts w:ascii="Arial" w:hAnsi="Arial" w:cs="Arial"/>
-          <w:sz w:val="24"/>
-          <w:szCs w:val="24"/>
-          <w:lang w:eastAsia="en-US"/>
-        </w:rPr>
-      </w:pPr>
-      <w:r>
-        <w:rPr>
-          <w:rFonts w:ascii="Arial" w:hAnsi="Arial" w:cs="Arial"/>
+          <w:color w:val="FFFFFF" w:themeColor="background1"/>
+          <w:sz w:val="24"/>
+          <w:szCs w:val="24"/>
+          <w:lang w:eastAsia="en-US"/>
+        </w:rPr>
+      </w:pPr>
+      <w:r>
+        <w:rPr>
+          <w:rFonts w:ascii="Arial" w:hAnsi="Arial" w:cs="Arial"/>
+          <w:color w:val="FFFFFF" w:themeColor="background1"/>
           <w:sz w:val="24"/>
           <w:szCs w:val="24"/>
           <w:lang w:eastAsia="en-US"/>
@@ -4390,14 +4675,16 @@
         <w:ind w:firstLine="576"/>
         <w:rPr>
           <w:rFonts w:ascii="Arial" w:hAnsi="Arial" w:cs="Arial"/>
-          <w:sz w:val="24"/>
-          <w:szCs w:val="24"/>
-          <w:lang w:eastAsia="en-US"/>
-        </w:rPr>
-      </w:pPr>
-      <w:r>
-        <w:rPr>
-          <w:rFonts w:ascii="Arial" w:hAnsi="Arial" w:cs="Arial"/>
+          <w:color w:val="FFFFFF" w:themeColor="background1"/>
+          <w:sz w:val="24"/>
+          <w:szCs w:val="24"/>
+          <w:lang w:eastAsia="en-US"/>
+        </w:rPr>
+      </w:pPr>
+      <w:r>
+        <w:rPr>
+          <w:rFonts w:ascii="Arial" w:hAnsi="Arial" w:cs="Arial"/>
+          <w:color w:val="FFFFFF" w:themeColor="background1"/>
           <w:sz w:val="24"/>
           <w:szCs w:val="24"/>
           <w:lang w:eastAsia="en-US"/>
@@ -4407,6 +4694,7 @@
       <w:r>
         <w:rPr>
           <w:rFonts w:ascii="Arial" w:hAnsi="Arial" w:cs="Arial"/>
+          <w:color w:val="FFFFFF" w:themeColor="background1"/>
           <w:sz w:val="24"/>
           <w:szCs w:val="24"/>
           <w:lang w:eastAsia="en-US"/>
@@ -4417,9 +4705,15 @@
     <w:p>
       <w:pPr>
         <w:pStyle w:val="Ttulo2"/>
+        <w:rPr>
+          <w:color w:val="FFFFFF" w:themeColor="background1"/>
+        </w:rPr>
       </w:pPr>
       <w:bookmarkStart w:id="9" w:name="_Toc213512459"/>
       <w:r>
+        <w:rPr>
+          <w:color w:val="FFFFFF" w:themeColor="background1"/>
+        </w:rPr>
         <w:t>Resultados Esperados</w:t>
       </w:r>
       <w:bookmarkEnd w:id="9"/>
@@ -4430,14 +4724,16 @@
         <w:jc w:val="both"/>
         <w:rPr>
           <w:rFonts w:ascii="Arial" w:hAnsi="Arial" w:cs="Arial"/>
-          <w:sz w:val="24"/>
-          <w:szCs w:val="24"/>
-          <w:lang w:eastAsia="en-US"/>
-        </w:rPr>
-      </w:pPr>
-      <w:r>
-        <w:rPr>
-          <w:rFonts w:ascii="Arial" w:hAnsi="Arial" w:cs="Arial"/>
+          <w:color w:val="FFFFFF" w:themeColor="background1"/>
+          <w:sz w:val="24"/>
+          <w:szCs w:val="24"/>
+          <w:lang w:eastAsia="en-US"/>
+        </w:rPr>
+      </w:pPr>
+      <w:r>
+        <w:rPr>
+          <w:rFonts w:ascii="Arial" w:hAnsi="Arial" w:cs="Arial"/>
+          <w:color w:val="FFFFFF" w:themeColor="background1"/>
           <w:sz w:val="24"/>
           <w:szCs w:val="24"/>
           <w:lang w:eastAsia="en-US"/>
@@ -4455,11 +4751,13 @@
         <w:jc w:val="both"/>
         <w:rPr>
           <w:rFonts w:ascii="Arial" w:hAnsi="Arial" w:cs="Arial"/>
-        </w:rPr>
-      </w:pPr>
-      <w:r>
-        <w:rPr>
-          <w:rFonts w:ascii="Arial" w:hAnsi="Arial" w:cs="Arial"/>
+          <w:color w:val="FFFFFF" w:themeColor="background1"/>
+        </w:rPr>
+      </w:pPr>
+      <w:r>
+        <w:rPr>
+          <w:rFonts w:ascii="Arial" w:hAnsi="Arial" w:cs="Arial"/>
+          <w:color w:val="FFFFFF" w:themeColor="background1"/>
         </w:rPr>
         <w:t>Layout temático com cores escuras e fonte de acordo;</w:t>
       </w:r>
@@ -4474,11 +4772,13 @@
         <w:jc w:val="both"/>
         <w:rPr>
           <w:rFonts w:ascii="Arial" w:hAnsi="Arial" w:cs="Arial"/>
-        </w:rPr>
-      </w:pPr>
-      <w:r>
-        <w:rPr>
-          <w:rFonts w:ascii="Arial" w:hAnsi="Arial" w:cs="Arial"/>
+          <w:color w:val="FFFFFF" w:themeColor="background1"/>
+        </w:rPr>
+      </w:pPr>
+      <w:r>
+        <w:rPr>
+          <w:rFonts w:ascii="Arial" w:hAnsi="Arial" w:cs="Arial"/>
+          <w:color w:val="FFFFFF" w:themeColor="background1"/>
         </w:rPr>
         <w:t>Páginas com conteúdo informativo sobre a subcultura;</w:t>
       </w:r>
@@ -4493,11 +4793,13 @@
         <w:jc w:val="both"/>
         <w:rPr>
           <w:rFonts w:ascii="Arial" w:hAnsi="Arial" w:cs="Arial"/>
-        </w:rPr>
-      </w:pPr>
-      <w:r>
-        <w:rPr>
-          <w:rFonts w:ascii="Arial" w:hAnsi="Arial" w:cs="Arial"/>
+          <w:color w:val="FFFFFF" w:themeColor="background1"/>
+        </w:rPr>
+      </w:pPr>
+      <w:r>
+        <w:rPr>
+          <w:rFonts w:ascii="Arial" w:hAnsi="Arial" w:cs="Arial"/>
+          <w:color w:val="FFFFFF" w:themeColor="background1"/>
         </w:rPr>
         <w:t>Sessão de bandas com os principais gêneros, artistas;</w:t>
       </w:r>
@@ -4512,11 +4814,13 @@
         <w:jc w:val="both"/>
         <w:rPr>
           <w:rFonts w:ascii="Arial" w:hAnsi="Arial" w:cs="Arial"/>
-        </w:rPr>
-      </w:pPr>
-      <w:r>
-        <w:rPr>
-          <w:rFonts w:ascii="Arial" w:hAnsi="Arial" w:cs="Arial"/>
+          <w:color w:val="FFFFFF" w:themeColor="background1"/>
+        </w:rPr>
+      </w:pPr>
+      <w:r>
+        <w:rPr>
+          <w:rFonts w:ascii="Arial" w:hAnsi="Arial" w:cs="Arial"/>
+          <w:color w:val="FFFFFF" w:themeColor="background1"/>
         </w:rPr>
         <w:t>Quiz com sistema de cadastro a fim de armazenar as respostas e os dados dos usuários em um banco de dados;</w:t>
       </w:r>
@@ -4531,11 +4835,13 @@
         <w:jc w:val="both"/>
         <w:rPr>
           <w:rFonts w:ascii="Arial" w:hAnsi="Arial" w:cs="Arial"/>
-        </w:rPr>
-      </w:pPr>
-      <w:r>
-        <w:rPr>
-          <w:rFonts w:ascii="Arial" w:hAnsi="Arial" w:cs="Arial"/>
+          <w:color w:val="FFFFFF" w:themeColor="background1"/>
+        </w:rPr>
+      </w:pPr>
+      <w:r>
+        <w:rPr>
+          <w:rFonts w:ascii="Arial" w:hAnsi="Arial" w:cs="Arial"/>
+          <w:color w:val="FFFFFF" w:themeColor="background1"/>
         </w:rPr>
         <w:t>Dashboard simples com informações relevantes do Quiz e dos usuários.</w:t>
       </w:r>
@@ -4543,9 +4849,15 @@
     <w:p>
       <w:pPr>
         <w:pStyle w:val="Ttulo3"/>
+        <w:rPr>
+          <w:color w:val="FFFFFF" w:themeColor="background1"/>
+        </w:rPr>
       </w:pPr>
       <w:bookmarkStart w:id="10" w:name="_Toc213512460"/>
       <w:r>
+        <w:rPr>
+          <w:color w:val="FFFFFF" w:themeColor="background1"/>
+        </w:rPr>
         <w:t>Requisitos</w:t>
       </w:r>
       <w:bookmarkEnd w:id="10"/>
@@ -4555,14 +4867,16 @@
         <w:ind w:firstLine="360"/>
         <w:rPr>
           <w:rFonts w:ascii="Arial" w:hAnsi="Arial" w:cs="Arial"/>
-          <w:sz w:val="24"/>
-          <w:szCs w:val="24"/>
-          <w:lang w:eastAsia="en-US"/>
-        </w:rPr>
-      </w:pPr>
-      <w:r>
-        <w:rPr>
-          <w:rFonts w:ascii="Arial" w:hAnsi="Arial" w:cs="Arial"/>
+          <w:color w:val="FFFFFF" w:themeColor="background1"/>
+          <w:sz w:val="24"/>
+          <w:szCs w:val="24"/>
+          <w:lang w:eastAsia="en-US"/>
+        </w:rPr>
+      </w:pPr>
+      <w:r>
+        <w:rPr>
+          <w:rFonts w:ascii="Arial" w:hAnsi="Arial" w:cs="Arial"/>
+          <w:color w:val="FFFFFF" w:themeColor="background1"/>
           <w:sz w:val="24"/>
           <w:szCs w:val="24"/>
           <w:lang w:eastAsia="en-US"/>
@@ -4579,11 +4893,13 @@
         </w:numPr>
         <w:rPr>
           <w:rFonts w:ascii="Arial" w:hAnsi="Arial" w:cs="Arial"/>
-        </w:rPr>
-      </w:pPr>
-      <w:r>
-        <w:rPr>
-          <w:rFonts w:ascii="Arial" w:hAnsi="Arial" w:cs="Arial"/>
+          <w:color w:val="FFFFFF" w:themeColor="background1"/>
+        </w:rPr>
+      </w:pPr>
+      <w:r>
+        <w:rPr>
+          <w:rFonts w:ascii="Arial" w:hAnsi="Arial" w:cs="Arial"/>
+          <w:color w:val="FFFFFF" w:themeColor="background1"/>
         </w:rPr>
         <w:t>O sistema deve permitir o cadastro de usuários e o armazenamento das respostas do Quiz;</w:t>
       </w:r>
@@ -4597,11 +4913,13 @@
         </w:numPr>
         <w:rPr>
           <w:rFonts w:ascii="Arial" w:hAnsi="Arial" w:cs="Arial"/>
-        </w:rPr>
-      </w:pPr>
-      <w:r>
-        <w:rPr>
-          <w:rFonts w:ascii="Arial" w:hAnsi="Arial" w:cs="Arial"/>
+          <w:color w:val="FFFFFF" w:themeColor="background1"/>
+        </w:rPr>
+      </w:pPr>
+      <w:r>
+        <w:rPr>
+          <w:rFonts w:ascii="Arial" w:hAnsi="Arial" w:cs="Arial"/>
+          <w:color w:val="FFFFFF" w:themeColor="background1"/>
         </w:rPr>
         <w:t>O Quiz exibirá resultados personalizados para cada usuário de acordo com as respostas;</w:t>
       </w:r>
@@ -4615,11 +4933,13 @@
         </w:numPr>
         <w:rPr>
           <w:rFonts w:ascii="Arial" w:hAnsi="Arial" w:cs="Arial"/>
-        </w:rPr>
-      </w:pPr>
-      <w:r>
-        <w:rPr>
-          <w:rFonts w:ascii="Arial" w:hAnsi="Arial" w:cs="Arial"/>
+          <w:color w:val="FFFFFF" w:themeColor="background1"/>
+        </w:rPr>
+      </w:pPr>
+      <w:r>
+        <w:rPr>
+          <w:rFonts w:ascii="Arial" w:hAnsi="Arial" w:cs="Arial"/>
+          <w:color w:val="FFFFFF" w:themeColor="background1"/>
         </w:rPr>
         <w:t>As páginas devem conter links para navegação entre as sessões do site;</w:t>
       </w:r>
@@ -4633,11 +4953,13 @@
         </w:numPr>
         <w:rPr>
           <w:rFonts w:ascii="Arial" w:hAnsi="Arial" w:cs="Arial"/>
-        </w:rPr>
-      </w:pPr>
-      <w:r>
-        <w:rPr>
-          <w:rFonts w:ascii="Arial" w:hAnsi="Arial" w:cs="Arial"/>
+          <w:color w:val="FFFFFF" w:themeColor="background1"/>
+        </w:rPr>
+      </w:pPr>
+      <w:r>
+        <w:rPr>
+          <w:rFonts w:ascii="Arial" w:hAnsi="Arial" w:cs="Arial"/>
+          <w:color w:val="FFFFFF" w:themeColor="background1"/>
         </w:rPr>
         <w:t>Retorno a página inicial a partir de qualquer outra página;</w:t>
       </w:r>
@@ -4651,11 +4973,13 @@
         </w:numPr>
         <w:rPr>
           <w:rFonts w:ascii="Arial" w:hAnsi="Arial" w:cs="Arial"/>
-        </w:rPr>
-      </w:pPr>
-      <w:r>
-        <w:rPr>
-          <w:rFonts w:ascii="Arial" w:hAnsi="Arial" w:cs="Arial"/>
+          <w:color w:val="FFFFFF" w:themeColor="background1"/>
+        </w:rPr>
+      </w:pPr>
+      <w:r>
+        <w:rPr>
+          <w:rFonts w:ascii="Arial" w:hAnsi="Arial" w:cs="Arial"/>
+          <w:color w:val="FFFFFF" w:themeColor="background1"/>
         </w:rPr>
         <w:t>O banco de dados deve garantir integridade e segurança das informações;</w:t>
       </w:r>
@@ -4669,11 +4993,13 @@
         </w:numPr>
         <w:rPr>
           <w:rFonts w:ascii="Arial" w:hAnsi="Arial" w:cs="Arial"/>
-        </w:rPr>
-      </w:pPr>
-      <w:r>
-        <w:rPr>
-          <w:rFonts w:ascii="Arial" w:hAnsi="Arial" w:cs="Arial"/>
+          <w:color w:val="FFFFFF" w:themeColor="background1"/>
+        </w:rPr>
+      </w:pPr>
+      <w:r>
+        <w:rPr>
+          <w:rFonts w:ascii="Arial" w:hAnsi="Arial" w:cs="Arial"/>
+          <w:color w:val="FFFFFF" w:themeColor="background1"/>
         </w:rPr>
         <w:t>Paleta de Cores de acordo com a temática;</w:t>
       </w:r>
@@ -4687,22 +5013,36 @@
         </w:numPr>
         <w:rPr>
           <w:rFonts w:ascii="Arial" w:hAnsi="Arial" w:cs="Arial"/>
-        </w:rPr>
-      </w:pPr>
-      <w:r>
-        <w:rPr>
-          <w:rFonts w:ascii="Arial" w:hAnsi="Arial" w:cs="Arial"/>
+          <w:color w:val="FFFFFF" w:themeColor="background1"/>
+        </w:rPr>
+      </w:pPr>
+      <w:r>
+        <w:rPr>
+          <w:rFonts w:ascii="Arial" w:hAnsi="Arial" w:cs="Arial"/>
+          <w:color w:val="FFFFFF" w:themeColor="background1"/>
         </w:rPr>
         <w:t>O site deverá ser responsivo a diferentes resoluções de telas de computador.</w:t>
       </w:r>
     </w:p>
-    <w:p/>
+    <w:p>
+      <w:pPr>
+        <w:rPr>
+          <w:color w:val="FFFFFF" w:themeColor="background1"/>
+        </w:rPr>
+      </w:pPr>
+    </w:p>
     <w:p>
       <w:pPr>
         <w:pStyle w:val="Ttulo2"/>
+        <w:rPr>
+          <w:color w:val="FFFFFF" w:themeColor="background1"/>
+        </w:rPr>
       </w:pPr>
       <w:bookmarkStart w:id="11" w:name="_Toc213512461"/>
       <w:r>
+        <w:rPr>
+          <w:color w:val="FFFFFF" w:themeColor="background1"/>
+        </w:rPr>
         <w:t>Premissas</w:t>
       </w:r>
       <w:bookmarkEnd w:id="11"/>
@@ -4713,14 +5053,16 @@
         <w:jc w:val="both"/>
         <w:rPr>
           <w:rFonts w:ascii="Arial" w:hAnsi="Arial" w:cs="Arial"/>
-          <w:sz w:val="24"/>
-          <w:szCs w:val="24"/>
-          <w:lang w:eastAsia="en-US"/>
-        </w:rPr>
-      </w:pPr>
-      <w:r>
-        <w:rPr>
-          <w:rFonts w:ascii="Arial" w:hAnsi="Arial" w:cs="Arial"/>
+          <w:color w:val="FFFFFF" w:themeColor="background1"/>
+          <w:sz w:val="24"/>
+          <w:szCs w:val="24"/>
+          <w:lang w:eastAsia="en-US"/>
+        </w:rPr>
+      </w:pPr>
+      <w:r>
+        <w:rPr>
+          <w:rFonts w:ascii="Arial" w:hAnsi="Arial" w:cs="Arial"/>
+          <w:color w:val="FFFFFF" w:themeColor="background1"/>
           <w:sz w:val="24"/>
           <w:szCs w:val="24"/>
           <w:lang w:eastAsia="en-US"/>
@@ -4738,11 +5080,13 @@
         <w:jc w:val="both"/>
         <w:rPr>
           <w:rFonts w:ascii="Arial" w:hAnsi="Arial" w:cs="Arial"/>
-        </w:rPr>
-      </w:pPr>
-      <w:r>
-        <w:rPr>
-          <w:rFonts w:ascii="Arial" w:hAnsi="Arial" w:cs="Arial"/>
+          <w:color w:val="FFFFFF" w:themeColor="background1"/>
+        </w:rPr>
+      </w:pPr>
+      <w:r>
+        <w:rPr>
+          <w:rFonts w:ascii="Arial" w:hAnsi="Arial" w:cs="Arial"/>
+          <w:color w:val="FFFFFF" w:themeColor="background1"/>
         </w:rPr>
         <w:t>O usuário estará disposto a conhecer e compreender um novo ponto de vista, uma cultura alternativa;</w:t>
       </w:r>
@@ -4757,11 +5101,13 @@
         <w:jc w:val="both"/>
         <w:rPr>
           <w:rFonts w:ascii="Arial" w:hAnsi="Arial" w:cs="Arial"/>
-        </w:rPr>
-      </w:pPr>
-      <w:r>
-        <w:rPr>
-          <w:rFonts w:ascii="Arial" w:hAnsi="Arial" w:cs="Arial"/>
+          <w:color w:val="FFFFFF" w:themeColor="background1"/>
+        </w:rPr>
+      </w:pPr>
+      <w:r>
+        <w:rPr>
+          <w:rFonts w:ascii="Arial" w:hAnsi="Arial" w:cs="Arial"/>
+          <w:color w:val="FFFFFF" w:themeColor="background1"/>
         </w:rPr>
         <w:t>O público-alvo possui interesse na subcultura gótica;</w:t>
       </w:r>
@@ -4776,11 +5122,13 @@
         <w:jc w:val="both"/>
         <w:rPr>
           <w:rFonts w:ascii="Arial" w:hAnsi="Arial" w:cs="Arial"/>
-        </w:rPr>
-      </w:pPr>
-      <w:r>
-        <w:rPr>
-          <w:rFonts w:ascii="Arial" w:hAnsi="Arial" w:cs="Arial"/>
+          <w:color w:val="FFFFFF" w:themeColor="background1"/>
+        </w:rPr>
+      </w:pPr>
+      <w:r>
+        <w:rPr>
+          <w:rFonts w:ascii="Arial" w:hAnsi="Arial" w:cs="Arial"/>
+          <w:color w:val="FFFFFF" w:themeColor="background1"/>
         </w:rPr>
         <w:lastRenderedPageBreak/>
         <w:t>O acesso ao site será feito por ambientes atualizados com suporte as ferramentas utilizadas no projeto;</w:t>
@@ -4796,11 +5144,13 @@
         <w:jc w:val="both"/>
         <w:rPr>
           <w:rFonts w:ascii="Arial" w:hAnsi="Arial" w:cs="Arial"/>
-        </w:rPr>
-      </w:pPr>
-      <w:r>
-        <w:rPr>
-          <w:rFonts w:ascii="Arial" w:hAnsi="Arial" w:cs="Arial"/>
+          <w:color w:val="FFFFFF" w:themeColor="background1"/>
+        </w:rPr>
+      </w:pPr>
+      <w:r>
+        <w:rPr>
+          <w:rFonts w:ascii="Arial" w:hAnsi="Arial" w:cs="Arial"/>
+          <w:color w:val="FFFFFF" w:themeColor="background1"/>
         </w:rPr>
         <w:t>O conteúdo do site será suficiente para um entendimento inicial da subcultura;</w:t>
       </w:r>
@@ -4815,11 +5165,13 @@
         <w:jc w:val="both"/>
         <w:rPr>
           <w:rFonts w:ascii="Arial" w:hAnsi="Arial" w:cs="Arial"/>
-        </w:rPr>
-      </w:pPr>
-      <w:r>
-        <w:rPr>
-          <w:rFonts w:ascii="Arial" w:hAnsi="Arial" w:cs="Arial"/>
+          <w:color w:val="FFFFFF" w:themeColor="background1"/>
+        </w:rPr>
+      </w:pPr>
+      <w:r>
+        <w:rPr>
+          <w:rFonts w:ascii="Arial" w:hAnsi="Arial" w:cs="Arial"/>
+          <w:color w:val="FFFFFF" w:themeColor="background1"/>
         </w:rPr>
         <w:t>O usuário entenderá que o propósito do site é informativo e cultural, sem fins lucrativos;</w:t>
       </w:r>
@@ -4834,11 +5186,13 @@
         <w:jc w:val="both"/>
         <w:rPr>
           <w:rFonts w:ascii="Arial" w:hAnsi="Arial" w:cs="Arial"/>
-        </w:rPr>
-      </w:pPr>
-      <w:r>
-        <w:rPr>
-          <w:rFonts w:ascii="Arial" w:hAnsi="Arial" w:cs="Arial"/>
+          <w:color w:val="FFFFFF" w:themeColor="background1"/>
+        </w:rPr>
+      </w:pPr>
+      <w:r>
+        <w:rPr>
+          <w:rFonts w:ascii="Arial" w:hAnsi="Arial" w:cs="Arial"/>
+          <w:color w:val="FFFFFF" w:themeColor="background1"/>
         </w:rPr>
         <w:t>Os usuários respeitarão o conteúdo proposto, a fim de evitar interpretações de cunho preconceituoso ou julgador;</w:t>
       </w:r>
@@ -4853,11 +5207,13 @@
         <w:jc w:val="both"/>
         <w:rPr>
           <w:rFonts w:ascii="Arial" w:hAnsi="Arial" w:cs="Arial"/>
-        </w:rPr>
-      </w:pPr>
-      <w:r>
-        <w:rPr>
-          <w:rFonts w:ascii="Arial" w:hAnsi="Arial" w:cs="Arial"/>
+          <w:color w:val="FFFFFF" w:themeColor="background1"/>
+        </w:rPr>
+      </w:pPr>
+      <w:r>
+        <w:rPr>
+          <w:rFonts w:ascii="Arial" w:hAnsi="Arial" w:cs="Arial"/>
+          <w:color w:val="FFFFFF" w:themeColor="background1"/>
         </w:rPr>
         <w:t>A experiência do site será interpreta como uma forma de expressão e não deve ser interpretada como apologia a ideologias políticas.</w:t>
       </w:r>
@@ -4865,14 +5221,23 @@
     <w:p>
       <w:pPr>
         <w:ind w:left="360"/>
+        <w:rPr>
+          <w:color w:val="FFFFFF" w:themeColor="background1"/>
+        </w:rPr>
       </w:pPr>
     </w:p>
     <w:p>
       <w:pPr>
         <w:pStyle w:val="Ttulo2"/>
+        <w:rPr>
+          <w:color w:val="FFFFFF" w:themeColor="background1"/>
+        </w:rPr>
       </w:pPr>
       <w:bookmarkStart w:id="12" w:name="_Toc213512462"/>
       <w:r>
+        <w:rPr>
+          <w:color w:val="FFFFFF" w:themeColor="background1"/>
+        </w:rPr>
         <w:t>Limites e Exclusões</w:t>
       </w:r>
       <w:bookmarkEnd w:id="12"/>
@@ -4883,14 +5248,16 @@
         <w:jc w:val="both"/>
         <w:rPr>
           <w:rFonts w:ascii="Arial" w:hAnsi="Arial" w:cs="Arial"/>
-          <w:sz w:val="24"/>
-          <w:szCs w:val="24"/>
-          <w:lang w:eastAsia="en-US"/>
-        </w:rPr>
-      </w:pPr>
-      <w:r>
-        <w:rPr>
-          <w:rFonts w:ascii="Arial" w:hAnsi="Arial" w:cs="Arial"/>
+          <w:color w:val="FFFFFF" w:themeColor="background1"/>
+          <w:sz w:val="24"/>
+          <w:szCs w:val="24"/>
+          <w:lang w:eastAsia="en-US"/>
+        </w:rPr>
+      </w:pPr>
+      <w:r>
+        <w:rPr>
+          <w:rFonts w:ascii="Arial" w:hAnsi="Arial" w:cs="Arial"/>
+          <w:color w:val="FFFFFF" w:themeColor="background1"/>
           <w:sz w:val="24"/>
           <w:szCs w:val="24"/>
           <w:lang w:eastAsia="en-US"/>
@@ -4908,11 +5275,13 @@
         <w:jc w:val="both"/>
         <w:rPr>
           <w:rFonts w:ascii="Arial" w:hAnsi="Arial" w:cs="Arial"/>
-        </w:rPr>
-      </w:pPr>
-      <w:r>
-        <w:rPr>
-          <w:rFonts w:ascii="Arial" w:hAnsi="Arial" w:cs="Arial"/>
+          <w:color w:val="FFFFFF" w:themeColor="background1"/>
+        </w:rPr>
+      </w:pPr>
+      <w:r>
+        <w:rPr>
+          <w:rFonts w:ascii="Arial" w:hAnsi="Arial" w:cs="Arial"/>
+          <w:color w:val="FFFFFF" w:themeColor="background1"/>
         </w:rPr>
         <w:t>Sistema de senha com autenticação multifator;</w:t>
       </w:r>
@@ -4927,11 +5296,13 @@
         <w:jc w:val="both"/>
         <w:rPr>
           <w:rFonts w:ascii="Arial" w:hAnsi="Arial" w:cs="Arial"/>
-        </w:rPr>
-      </w:pPr>
-      <w:r>
-        <w:rPr>
-          <w:rFonts w:ascii="Arial" w:hAnsi="Arial" w:cs="Arial"/>
+          <w:color w:val="FFFFFF" w:themeColor="background1"/>
+        </w:rPr>
+      </w:pPr>
+      <w:r>
+        <w:rPr>
+          <w:rFonts w:ascii="Arial" w:hAnsi="Arial" w:cs="Arial"/>
+          <w:color w:val="FFFFFF" w:themeColor="background1"/>
         </w:rPr>
         <w:t xml:space="preserve">Não haverá APIs externas para música, como Youtube, </w:t>
       </w:r>
@@ -4939,6 +5310,7 @@
       <w:r>
         <w:rPr>
           <w:rFonts w:ascii="Arial" w:hAnsi="Arial" w:cs="Arial"/>
+          <w:color w:val="FFFFFF" w:themeColor="background1"/>
         </w:rPr>
         <w:t>Spotify</w:t>
       </w:r>
@@ -4946,6 +5318,7 @@
       <w:r>
         <w:rPr>
           <w:rFonts w:ascii="Arial" w:hAnsi="Arial" w:cs="Arial"/>
+          <w:color w:val="FFFFFF" w:themeColor="background1"/>
         </w:rPr>
         <w:t xml:space="preserve">, </w:t>
       </w:r>
@@ -4953,6 +5326,7 @@
       <w:r>
         <w:rPr>
           <w:rFonts w:ascii="Arial" w:hAnsi="Arial" w:cs="Arial"/>
+          <w:color w:val="FFFFFF" w:themeColor="background1"/>
         </w:rPr>
         <w:t>Soundcloud</w:t>
       </w:r>
@@ -4960,6 +5334,7 @@
       <w:r>
         <w:rPr>
           <w:rFonts w:ascii="Arial" w:hAnsi="Arial" w:cs="Arial"/>
+          <w:color w:val="FFFFFF" w:themeColor="background1"/>
         </w:rPr>
         <w:t xml:space="preserve"> </w:t>
       </w:r>
@@ -4967,6 +5342,7 @@
       <w:r>
         <w:rPr>
           <w:rFonts w:ascii="Arial" w:hAnsi="Arial" w:cs="Arial"/>
+          <w:color w:val="FFFFFF" w:themeColor="background1"/>
         </w:rPr>
         <w:t>etc</w:t>
       </w:r>
@@ -4974,6 +5350,7 @@
       <w:r>
         <w:rPr>
           <w:rFonts w:ascii="Arial" w:hAnsi="Arial" w:cs="Arial"/>
+          <w:color w:val="FFFFFF" w:themeColor="background1"/>
         </w:rPr>
         <w:t>;</w:t>
       </w:r>
@@ -4988,11 +5365,13 @@
         <w:jc w:val="both"/>
         <w:rPr>
           <w:rFonts w:ascii="Arial" w:hAnsi="Arial" w:cs="Arial"/>
-        </w:rPr>
-      </w:pPr>
-      <w:r>
-        <w:rPr>
-          <w:rFonts w:ascii="Arial" w:hAnsi="Arial" w:cs="Arial"/>
+          <w:color w:val="FFFFFF" w:themeColor="background1"/>
+        </w:rPr>
+      </w:pPr>
+      <w:r>
+        <w:rPr>
+          <w:rFonts w:ascii="Arial" w:hAnsi="Arial" w:cs="Arial"/>
+          <w:color w:val="FFFFFF" w:themeColor="background1"/>
         </w:rPr>
         <w:t>Não haverá sistema de comentários e / ou postagens;</w:t>
       </w:r>
@@ -5007,11 +5386,13 @@
         <w:jc w:val="both"/>
         <w:rPr>
           <w:rFonts w:ascii="Arial" w:hAnsi="Arial" w:cs="Arial"/>
-        </w:rPr>
-      </w:pPr>
-      <w:r>
-        <w:rPr>
-          <w:rFonts w:ascii="Arial" w:hAnsi="Arial" w:cs="Arial"/>
+          <w:color w:val="FFFFFF" w:themeColor="background1"/>
+        </w:rPr>
+      </w:pPr>
+      <w:r>
+        <w:rPr>
+          <w:rFonts w:ascii="Arial" w:hAnsi="Arial" w:cs="Arial"/>
+          <w:color w:val="FFFFFF" w:themeColor="background1"/>
         </w:rPr>
         <w:t>O conteúdo do site se limita exclusivamente informativo sobre a subcultura gótica;</w:t>
       </w:r>
@@ -5026,11 +5407,13 @@
         <w:jc w:val="both"/>
         <w:rPr>
           <w:rFonts w:ascii="Arial" w:hAnsi="Arial" w:cs="Arial"/>
-        </w:rPr>
-      </w:pPr>
-      <w:r>
-        <w:rPr>
-          <w:rFonts w:ascii="Arial" w:hAnsi="Arial" w:cs="Arial"/>
+          <w:color w:val="FFFFFF" w:themeColor="background1"/>
+        </w:rPr>
+      </w:pPr>
+      <w:r>
+        <w:rPr>
+          <w:rFonts w:ascii="Arial" w:hAnsi="Arial" w:cs="Arial"/>
+          <w:color w:val="FFFFFF" w:themeColor="background1"/>
         </w:rPr>
         <w:t>O escopo não abrange marketplace;</w:t>
       </w:r>
@@ -5045,11 +5428,13 @@
         <w:jc w:val="both"/>
         <w:rPr>
           <w:rFonts w:ascii="Arial" w:hAnsi="Arial" w:cs="Arial"/>
-        </w:rPr>
-      </w:pPr>
-      <w:r>
-        <w:rPr>
-          <w:rFonts w:ascii="Arial" w:hAnsi="Arial" w:cs="Arial"/>
+          <w:color w:val="FFFFFF" w:themeColor="background1"/>
+        </w:rPr>
+      </w:pPr>
+      <w:r>
+        <w:rPr>
+          <w:rFonts w:ascii="Arial" w:hAnsi="Arial" w:cs="Arial"/>
+          <w:color w:val="FFFFFF" w:themeColor="background1"/>
         </w:rPr>
         <w:t xml:space="preserve">O banco de dados armazenará apenas informações essenciais para o funcionamento, como nome, </w:t>
       </w:r>
@@ -5057,6 +5442,7 @@
       <w:r>
         <w:rPr>
           <w:rFonts w:ascii="Arial" w:hAnsi="Arial" w:cs="Arial"/>
+          <w:color w:val="FFFFFF" w:themeColor="background1"/>
         </w:rPr>
         <w:t>email</w:t>
       </w:r>
@@ -5064,6 +5450,7 @@
       <w:r>
         <w:rPr>
           <w:rFonts w:ascii="Arial" w:hAnsi="Arial" w:cs="Arial"/>
+          <w:color w:val="FFFFFF" w:themeColor="background1"/>
         </w:rPr>
         <w:t>, resultados do Quiz, gênero e banda favorita.</w:t>
       </w:r>
@@ -5078,6 +5465,7 @@
         <w:rPr>
           <w:rFonts w:eastAsia="Arial" w:cs="Arial"/>
           <w:b w:val="0"/>
+          <w:color w:val="FFFFFF" w:themeColor="background1"/>
           <w:sz w:val="24"/>
           <w:szCs w:val="24"/>
         </w:rPr>

</xml_diff>

<commit_message>
adicionei mais uma restrição e mais uma premissa na documentação, referente a acesso a internet por meio do usuário e utilização das imagens do criador do site
</commit_message>
<xml_diff>
--- a/Documentação/ALittlePieceOfMySoul.docx
+++ b/Documentação/ALittlePieceOfMySoul.docx
@@ -1,6 +1,6 @@
 
 <file path=word/document.xml><?xml version="1.0" encoding="utf-8"?>
-<w:document xmlns:wpc="http://schemas.microsoft.com/office/word/2010/wordprocessingCanvas" xmlns:cx="http://schemas.microsoft.com/office/drawing/2014/chartex" xmlns:cx1="http://schemas.microsoft.com/office/drawing/2015/9/8/chartex" xmlns:cx2="http://schemas.microsoft.com/office/drawing/2015/10/21/chartex" xmlns:cx3="http://schemas.microsoft.com/office/drawing/2016/5/9/chartex" xmlns:cx4="http://schemas.microsoft.com/office/drawing/2016/5/10/chartex" xmlns:cx5="http://schemas.microsoft.com/office/drawing/2016/5/11/chartex" xmlns:cx6="http://schemas.microsoft.com/office/drawing/2016/5/12/chartex" xmlns:cx7="http://schemas.microsoft.com/office/drawing/2016/5/13/chartex" xmlns:cx8="http://schemas.microsoft.com/office/drawing/2016/5/14/chartex" xmlns:mc="http://schemas.openxmlformats.org/markup-compatibility/2006" xmlns:aink="http://schemas.microsoft.com/office/drawing/2016/ink" xmlns:am3d="http://schemas.microsoft.com/office/drawing/2017/model3d" xmlns:o="urn:schemas-microsoft-com:office:office" xmlns:oel="http://schemas.microsoft.com/office/2019/extlst" xmlns:r="http://schemas.openxmlformats.org/officeDocument/2006/relationships" xmlns:m="http://schemas.openxmlformats.org/officeDocument/2006/math" xmlns:v="urn:schemas-microsoft-com:vml" xmlns:wp14="http://schemas.microsoft.com/office/word/2010/wordprocessingDrawing" xmlns:wp="http://schemas.openxmlformats.org/drawingml/2006/wordprocessingDrawing" xmlns:w10="urn:schemas-microsoft-com:office:word" xmlns:w="http://schemas.openxmlformats.org/wordprocessingml/2006/main" xmlns:w14="http://schemas.microsoft.com/office/word/2010/wordml" xmlns:w15="http://schemas.microsoft.com/office/word/2012/wordml" xmlns:w16cex="http://schemas.microsoft.com/office/word/2018/wordml/cex" xmlns:w16cid="http://schemas.microsoft.com/office/word/2016/wordml/cid" xmlns:w16="http://schemas.microsoft.com/office/word/2018/wordml" xmlns:w16sdtdh="http://schemas.microsoft.com/office/word/2020/wordml/sdtdatahash" xmlns:w16se="http://schemas.microsoft.com/office/word/2015/wordml/symex" xmlns:wpg="http://schemas.microsoft.com/office/word/2010/wordprocessingGroup" xmlns:wpi="http://schemas.microsoft.com/office/word/2010/wordprocessingInk" xmlns:wne="http://schemas.microsoft.com/office/word/2006/wordml" xmlns:wps="http://schemas.microsoft.com/office/word/2010/wordprocessingShape" mc:Ignorable="w14 w15 w16se w16cid w16 w16cex w16sdtdh wp14">
+<w:document xmlns:wpc="http://schemas.microsoft.com/office/word/2010/wordprocessingCanvas" xmlns:cx="http://schemas.microsoft.com/office/drawing/2014/chartex" xmlns:cx1="http://schemas.microsoft.com/office/drawing/2015/9/8/chartex" xmlns:cx2="http://schemas.microsoft.com/office/drawing/2015/10/21/chartex" xmlns:cx3="http://schemas.microsoft.com/office/drawing/2016/5/9/chartex" xmlns:cx4="http://schemas.microsoft.com/office/drawing/2016/5/10/chartex" xmlns:cx5="http://schemas.microsoft.com/office/drawing/2016/5/11/chartex" xmlns:cx6="http://schemas.microsoft.com/office/drawing/2016/5/12/chartex" xmlns:cx7="http://schemas.microsoft.com/office/drawing/2016/5/13/chartex" xmlns:cx8="http://schemas.microsoft.com/office/drawing/2016/5/14/chartex" xmlns:mc="http://schemas.openxmlformats.org/markup-compatibility/2006" xmlns:aink="http://schemas.microsoft.com/office/drawing/2016/ink" xmlns:am3d="http://schemas.microsoft.com/office/drawing/2017/model3d" xmlns:o="urn:schemas-microsoft-com:office:office" xmlns:oel="http://schemas.microsoft.com/office/2019/extlst" xmlns:r="http://schemas.openxmlformats.org/officeDocument/2006/relationships" xmlns:m="http://schemas.openxmlformats.org/officeDocument/2006/math" xmlns:v="urn:schemas-microsoft-com:vml" xmlns:wp14="http://schemas.microsoft.com/office/word/2010/wordprocessingDrawing" xmlns:wp="http://schemas.openxmlformats.org/drawingml/2006/wordprocessingDrawing" xmlns:w10="urn:schemas-microsoft-com:office:word" xmlns:w="http://schemas.openxmlformats.org/wordprocessingml/2006/main" xmlns:w14="http://schemas.microsoft.com/office/word/2010/wordml" xmlns:w15="http://schemas.microsoft.com/office/word/2012/wordml" xmlns:w16cex="http://schemas.microsoft.com/office/word/2018/wordml/cex" xmlns:w16cid="http://schemas.microsoft.com/office/word/2016/wordml/cid" xmlns:w16="http://schemas.microsoft.com/office/word/2018/wordml" xmlns:w16du="http://schemas.microsoft.com/office/word/2023/wordml/word16du" xmlns:w16sdtdh="http://schemas.microsoft.com/office/word/2020/wordml/sdtdatahash" xmlns:w16sdtfl="http://schemas.microsoft.com/office/word/2024/wordml/sdtformatlock" xmlns:w16se="http://schemas.microsoft.com/office/word/2015/wordml/symex" xmlns:wpg="http://schemas.microsoft.com/office/word/2010/wordprocessingGroup" xmlns:wpi="http://schemas.microsoft.com/office/word/2010/wordprocessingInk" xmlns:wne="http://schemas.microsoft.com/office/word/2006/wordml" xmlns:wps="http://schemas.microsoft.com/office/word/2010/wordprocessingShape" mc:Ignorable="w14 w15 w16se w16cid w16 w16cex w16sdtdh w16sdtfl w16du wp14">
   <w:background w:color="000000" w:themeColor="text1"/>
   <w:body>
     <w:p>
@@ -272,7 +272,7 @@
               </wp:inline>
             </w:drawing>
           </mc:Choice>
-          <mc:Fallback xmlns:w16du="http://schemas.microsoft.com/office/word/2023/wordml/word16du" xmlns:w16sdtfl="http://schemas.microsoft.com/office/word/2024/wordml/sdtformatlock">
+          <mc:Fallback>
             <w:pict>
               <v:rect w14:anchorId="72F8005B" id="Retângulo 1" o:spid="_x0000_s1026" alt="logo" style="width:24pt;height:24pt;visibility:visible;mso-wrap-style:square;mso-left-percent:-10001;mso-top-percent:-10001;mso-position-horizontal:absolute;mso-position-horizontal-relative:char;mso-position-vertical:absolute;mso-position-vertical-relative:line;mso-left-percent:-10001;mso-top-percent:-10001;v-text-anchor:top" o:gfxdata="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" filled="f" stroked="f">
                 <o:lock v:ext="edit" aspectratio="t"/>
@@ -2249,73 +2249,7 @@
           <w:szCs w:val="24"/>
           <w:lang w:eastAsia="en-US"/>
         </w:rPr>
-        <w:t xml:space="preserve">Uma das pioneiras no estilo e vestimenta gótica foi Siouxsie Sioux, vocalista do Siouxsie </w:t>
-      </w:r>
-      <w:proofErr w:type="spellStart"/>
-      <w:r>
-        <w:rPr>
-          <w:rFonts w:ascii="Arial" w:hAnsi="Arial" w:cs="Arial"/>
-          <w:color w:val="FFFFFF" w:themeColor="background1"/>
-          <w:sz w:val="24"/>
-          <w:szCs w:val="24"/>
-          <w:lang w:eastAsia="en-US"/>
-        </w:rPr>
-        <w:t>and</w:t>
-      </w:r>
-      <w:proofErr w:type="spellEnd"/>
-      <w:r>
-        <w:rPr>
-          <w:rFonts w:ascii="Arial" w:hAnsi="Arial" w:cs="Arial"/>
-          <w:color w:val="FFFFFF" w:themeColor="background1"/>
-          <w:sz w:val="24"/>
-          <w:szCs w:val="24"/>
-          <w:lang w:eastAsia="en-US"/>
-        </w:rPr>
-        <w:t xml:space="preserve"> </w:t>
-      </w:r>
-      <w:proofErr w:type="spellStart"/>
-      <w:r>
-        <w:rPr>
-          <w:rFonts w:ascii="Arial" w:hAnsi="Arial" w:cs="Arial"/>
-          <w:color w:val="FFFFFF" w:themeColor="background1"/>
-          <w:sz w:val="24"/>
-          <w:szCs w:val="24"/>
-          <w:lang w:eastAsia="en-US"/>
-        </w:rPr>
-        <w:t>the</w:t>
-      </w:r>
-      <w:proofErr w:type="spellEnd"/>
-      <w:r>
-        <w:rPr>
-          <w:rFonts w:ascii="Arial" w:hAnsi="Arial" w:cs="Arial"/>
-          <w:color w:val="FFFFFF" w:themeColor="background1"/>
-          <w:sz w:val="24"/>
-          <w:szCs w:val="24"/>
-          <w:lang w:eastAsia="en-US"/>
-        </w:rPr>
-        <w:t xml:space="preserve"> </w:t>
-      </w:r>
-      <w:proofErr w:type="spellStart"/>
-      <w:r>
-        <w:rPr>
-          <w:rFonts w:ascii="Arial" w:hAnsi="Arial" w:cs="Arial"/>
-          <w:color w:val="FFFFFF" w:themeColor="background1"/>
-          <w:sz w:val="24"/>
-          <w:szCs w:val="24"/>
-          <w:lang w:eastAsia="en-US"/>
-        </w:rPr>
-        <w:t>Banshees</w:t>
-      </w:r>
-      <w:proofErr w:type="spellEnd"/>
-      <w:r>
-        <w:rPr>
-          <w:rFonts w:ascii="Arial" w:hAnsi="Arial" w:cs="Arial"/>
-          <w:color w:val="FFFFFF" w:themeColor="background1"/>
-          <w:sz w:val="24"/>
-          <w:szCs w:val="24"/>
-          <w:lang w:eastAsia="en-US"/>
-        </w:rPr>
-        <w:t>.</w:t>
+        <w:t>Uma das pioneiras no estilo e vestimenta gótica foi Siouxsie Sioux, vocalista do Siouxsie and the Banshees.</w:t>
       </w:r>
     </w:p>
     <w:p>
@@ -2333,7 +2267,7 @@
         </w:rPr>
         <w:lastRenderedPageBreak/>
         <w:drawing>
-          <wp:inline distT="0" distB="0" distL="0" distR="0" wp14:anchorId="258DA283" wp14:editId="220BCBA6">
+          <wp:inline distT="0" distB="0" distL="0" distR="0" wp14:anchorId="258DA283" wp14:editId="2CF05AD9">
             <wp:extent cx="2417197" cy="2582629"/>
             <wp:effectExtent l="0" t="0" r="2540" b="8255"/>
             <wp:docPr id="1" name="Imagem 1" descr="O que vcs acham de Siouxsie and the banshees? : r/MusicaBR"/>
@@ -2540,53 +2474,8 @@
           <w:szCs w:val="24"/>
           <w:lang w:eastAsia="en-US"/>
         </w:rPr>
-        <w:t xml:space="preserve">Dos clássicos como </w:t>
-      </w:r>
-      <w:proofErr w:type="spellStart"/>
-      <w:r>
-        <w:rPr>
-          <w:rFonts w:ascii="Arial" w:hAnsi="Arial" w:cs="Arial"/>
-          <w:color w:val="FFFFFF" w:themeColor="background1"/>
-          <w:sz w:val="24"/>
-          <w:szCs w:val="24"/>
-          <w:lang w:eastAsia="en-US"/>
-        </w:rPr>
-        <w:t>Nosferatu</w:t>
-      </w:r>
-      <w:proofErr w:type="spellEnd"/>
-      <w:r>
-        <w:rPr>
-          <w:rFonts w:ascii="Arial" w:hAnsi="Arial" w:cs="Arial"/>
-          <w:color w:val="FFFFFF" w:themeColor="background1"/>
-          <w:sz w:val="24"/>
-          <w:szCs w:val="24"/>
-          <w:lang w:eastAsia="en-US"/>
-        </w:rPr>
-        <w:t xml:space="preserve"> (1922) e London </w:t>
-      </w:r>
-      <w:proofErr w:type="spellStart"/>
-      <w:r>
-        <w:rPr>
-          <w:rFonts w:ascii="Arial" w:hAnsi="Arial" w:cs="Arial"/>
-          <w:color w:val="FFFFFF" w:themeColor="background1"/>
-          <w:sz w:val="24"/>
-          <w:szCs w:val="24"/>
-          <w:lang w:eastAsia="en-US"/>
-        </w:rPr>
-        <w:t>After</w:t>
-      </w:r>
-      <w:proofErr w:type="spellEnd"/>
-      <w:r>
-        <w:rPr>
-          <w:rFonts w:ascii="Arial" w:hAnsi="Arial" w:cs="Arial"/>
-          <w:color w:val="FFFFFF" w:themeColor="background1"/>
-          <w:sz w:val="24"/>
-          <w:szCs w:val="24"/>
-          <w:lang w:eastAsia="en-US"/>
-        </w:rPr>
-        <w:t xml:space="preserve"> Midnight (1927) ao cinema gótico moderno, como O Corvo (1994) ou as animações em </w:t>
-      </w:r>
-      <w:proofErr w:type="spellStart"/>
+        <w:t xml:space="preserve">Dos clássicos como Nosferatu (1922) e London After Midnight (1927) ao cinema gótico moderno, como O Corvo (1994) ou as animações em </w:t>
+      </w:r>
       <w:r>
         <w:rPr>
           <w:rFonts w:ascii="Arial" w:hAnsi="Arial" w:cs="Arial"/>
@@ -2599,7 +2488,6 @@
         </w:rPr>
         <w:t>stop-motion</w:t>
       </w:r>
-      <w:proofErr w:type="spellEnd"/>
       <w:r>
         <w:rPr>
           <w:rFonts w:ascii="Arial" w:hAnsi="Arial" w:cs="Arial"/>
@@ -2680,27 +2568,7 @@
                                 <w:bCs/>
                                 <w:color w:val="FFFFFF" w:themeColor="background1"/>
                               </w:rPr>
-                              <w:t xml:space="preserve">Figura 3: London </w:t>
-                            </w:r>
-                            <w:proofErr w:type="spellStart"/>
-                            <w:r>
-                              <w:rPr>
-                                <w:rFonts w:ascii="Arial" w:hAnsi="Arial" w:cs="Arial"/>
-                                <w:b/>
-                                <w:bCs/>
-                                <w:color w:val="FFFFFF" w:themeColor="background1"/>
-                              </w:rPr>
-                              <w:t>After</w:t>
-                            </w:r>
-                            <w:proofErr w:type="spellEnd"/>
-                            <w:r>
-                              <w:rPr>
-                                <w:rFonts w:ascii="Arial" w:hAnsi="Arial" w:cs="Arial"/>
-                                <w:b/>
-                                <w:bCs/>
-                                <w:color w:val="FFFFFF" w:themeColor="background1"/>
-                              </w:rPr>
-                              <w:t xml:space="preserve"> Midnight (1927)</w:t>
+                              <w:t>Figura 3: London After Midnight (1927)</w:t>
                             </w:r>
                           </w:p>
                         </w:txbxContent>
@@ -2746,27 +2614,7 @@
                           <w:bCs/>
                           <w:color w:val="FFFFFF" w:themeColor="background1"/>
                         </w:rPr>
-                        <w:t xml:space="preserve">Figura 3: London </w:t>
-                      </w:r>
-                      <w:proofErr w:type="spellStart"/>
-                      <w:r>
-                        <w:rPr>
-                          <w:rFonts w:ascii="Arial" w:hAnsi="Arial" w:cs="Arial"/>
-                          <w:b/>
-                          <w:bCs/>
-                          <w:color w:val="FFFFFF" w:themeColor="background1"/>
-                        </w:rPr>
-                        <w:t>After</w:t>
-                      </w:r>
-                      <w:proofErr w:type="spellEnd"/>
-                      <w:r>
-                        <w:rPr>
-                          <w:rFonts w:ascii="Arial" w:hAnsi="Arial" w:cs="Arial"/>
-                          <w:b/>
-                          <w:bCs/>
-                          <w:color w:val="FFFFFF" w:themeColor="background1"/>
-                        </w:rPr>
-                        <w:t xml:space="preserve"> Midnight (1927)</w:t>
+                        <w:t>Figura 3: London After Midnight (1927)</w:t>
                       </w:r>
                     </w:p>
                   </w:txbxContent>
@@ -2917,27 +2765,7 @@
           <w:bCs/>
           <w:color w:val="FFFFFF" w:themeColor="background1"/>
         </w:rPr>
-        <w:t xml:space="preserve">Figura 2: </w:t>
-      </w:r>
-      <w:proofErr w:type="spellStart"/>
-      <w:r>
-        <w:rPr>
-          <w:rFonts w:ascii="Arial" w:hAnsi="Arial" w:cs="Arial"/>
-          <w:b/>
-          <w:bCs/>
-          <w:color w:val="FFFFFF" w:themeColor="background1"/>
-        </w:rPr>
-        <w:t>Nosferatu</w:t>
-      </w:r>
-      <w:proofErr w:type="spellEnd"/>
-      <w:r>
-        <w:rPr>
-          <w:rFonts w:ascii="Arial" w:hAnsi="Arial" w:cs="Arial"/>
-          <w:b/>
-          <w:bCs/>
-          <w:color w:val="FFFFFF" w:themeColor="background1"/>
-        </w:rPr>
-        <w:t xml:space="preserve"> (1922)</w:t>
+        <w:t>Figura 2: Nosferatu (1922)</w:t>
       </w:r>
     </w:p>
     <w:p>
@@ -3273,7 +3101,7 @@
           <w:color w:val="FFFFFF" w:themeColor="background1"/>
         </w:rPr>
         <w:drawing>
-          <wp:anchor distT="0" distB="0" distL="114300" distR="114300" simplePos="0" relativeHeight="251659264" behindDoc="0" locked="0" layoutInCell="1" allowOverlap="1" wp14:anchorId="6D2595A6" wp14:editId="27F94D00">
+          <wp:anchor distT="0" distB="0" distL="114300" distR="114300" simplePos="0" relativeHeight="251659264" behindDoc="0" locked="0" layoutInCell="1" allowOverlap="1" wp14:anchorId="6D2595A6" wp14:editId="58B4D8DC">
             <wp:simplePos x="0" y="0"/>
             <wp:positionH relativeFrom="column">
               <wp:posOffset>-698472</wp:posOffset>
@@ -3372,139 +3200,7 @@
           <w:szCs w:val="24"/>
           <w:lang w:eastAsia="en-US"/>
         </w:rPr>
-        <w:t xml:space="preserve">A música é o coração da subcultura gótica, e a banda pioneira foi o Bauhaus, com seu clássico som experimental Bela </w:t>
-      </w:r>
-      <w:proofErr w:type="spellStart"/>
-      <w:r>
-        <w:rPr>
-          <w:rFonts w:ascii="Arial" w:hAnsi="Arial" w:cs="Arial"/>
-          <w:color w:val="FFFFFF" w:themeColor="background1"/>
-          <w:sz w:val="24"/>
-          <w:szCs w:val="24"/>
-          <w:lang w:eastAsia="en-US"/>
-        </w:rPr>
-        <w:t>Lugosi’s</w:t>
-      </w:r>
-      <w:proofErr w:type="spellEnd"/>
-      <w:r>
-        <w:rPr>
-          <w:rFonts w:ascii="Arial" w:hAnsi="Arial" w:cs="Arial"/>
-          <w:color w:val="FFFFFF" w:themeColor="background1"/>
-          <w:sz w:val="24"/>
-          <w:szCs w:val="24"/>
-          <w:lang w:eastAsia="en-US"/>
-        </w:rPr>
-        <w:t xml:space="preserve"> </w:t>
-      </w:r>
-      <w:proofErr w:type="spellStart"/>
-      <w:r>
-        <w:rPr>
-          <w:rFonts w:ascii="Arial" w:hAnsi="Arial" w:cs="Arial"/>
-          <w:color w:val="FFFFFF" w:themeColor="background1"/>
-          <w:sz w:val="24"/>
-          <w:szCs w:val="24"/>
-          <w:lang w:eastAsia="en-US"/>
-        </w:rPr>
-        <w:t>Dead</w:t>
-      </w:r>
-      <w:proofErr w:type="spellEnd"/>
-      <w:r>
-        <w:rPr>
-          <w:rFonts w:ascii="Arial" w:hAnsi="Arial" w:cs="Arial"/>
-          <w:color w:val="FFFFFF" w:themeColor="background1"/>
-          <w:sz w:val="24"/>
-          <w:szCs w:val="24"/>
-          <w:lang w:eastAsia="en-US"/>
-        </w:rPr>
-        <w:t xml:space="preserve">, que conta a morte do ator Bela </w:t>
-      </w:r>
-      <w:proofErr w:type="spellStart"/>
-      <w:r>
-        <w:rPr>
-          <w:rFonts w:ascii="Arial" w:hAnsi="Arial" w:cs="Arial"/>
-          <w:color w:val="FFFFFF" w:themeColor="background1"/>
-          <w:sz w:val="24"/>
-          <w:szCs w:val="24"/>
-          <w:lang w:eastAsia="en-US"/>
-        </w:rPr>
-        <w:t>Lugosi</w:t>
-      </w:r>
-      <w:proofErr w:type="spellEnd"/>
-      <w:r>
-        <w:rPr>
-          <w:rFonts w:ascii="Arial" w:hAnsi="Arial" w:cs="Arial"/>
-          <w:color w:val="FFFFFF" w:themeColor="background1"/>
-          <w:sz w:val="24"/>
-          <w:szCs w:val="24"/>
-          <w:lang w:eastAsia="en-US"/>
-        </w:rPr>
-        <w:t xml:space="preserve">, que interpretou o Drácula. The Cure e Siouxsie </w:t>
-      </w:r>
-      <w:proofErr w:type="spellStart"/>
-      <w:r>
-        <w:rPr>
-          <w:rFonts w:ascii="Arial" w:hAnsi="Arial" w:cs="Arial"/>
-          <w:color w:val="FFFFFF" w:themeColor="background1"/>
-          <w:sz w:val="24"/>
-          <w:szCs w:val="24"/>
-          <w:lang w:eastAsia="en-US"/>
-        </w:rPr>
-        <w:t>and</w:t>
-      </w:r>
-      <w:proofErr w:type="spellEnd"/>
-      <w:r>
-        <w:rPr>
-          <w:rFonts w:ascii="Arial" w:hAnsi="Arial" w:cs="Arial"/>
-          <w:color w:val="FFFFFF" w:themeColor="background1"/>
-          <w:sz w:val="24"/>
-          <w:szCs w:val="24"/>
-          <w:lang w:eastAsia="en-US"/>
-        </w:rPr>
-        <w:t xml:space="preserve"> </w:t>
-      </w:r>
-      <w:proofErr w:type="spellStart"/>
-      <w:r>
-        <w:rPr>
-          <w:rFonts w:ascii="Arial" w:hAnsi="Arial" w:cs="Arial"/>
-          <w:color w:val="FFFFFF" w:themeColor="background1"/>
-          <w:sz w:val="24"/>
-          <w:szCs w:val="24"/>
-          <w:lang w:eastAsia="en-US"/>
-        </w:rPr>
-        <w:t>the</w:t>
-      </w:r>
-      <w:proofErr w:type="spellEnd"/>
-      <w:r>
-        <w:rPr>
-          <w:rFonts w:ascii="Arial" w:hAnsi="Arial" w:cs="Arial"/>
-          <w:color w:val="FFFFFF" w:themeColor="background1"/>
-          <w:sz w:val="24"/>
-          <w:szCs w:val="24"/>
-          <w:lang w:eastAsia="en-US"/>
-        </w:rPr>
-        <w:t xml:space="preserve"> </w:t>
-      </w:r>
-      <w:proofErr w:type="spellStart"/>
-      <w:r>
-        <w:rPr>
-          <w:rFonts w:ascii="Arial" w:hAnsi="Arial" w:cs="Arial"/>
-          <w:color w:val="FFFFFF" w:themeColor="background1"/>
-          <w:sz w:val="24"/>
-          <w:szCs w:val="24"/>
-          <w:lang w:eastAsia="en-US"/>
-        </w:rPr>
-        <w:t>Banshees</w:t>
-      </w:r>
-      <w:proofErr w:type="spellEnd"/>
-      <w:r>
-        <w:rPr>
-          <w:rFonts w:ascii="Arial" w:hAnsi="Arial" w:cs="Arial"/>
-          <w:color w:val="FFFFFF" w:themeColor="background1"/>
-          <w:sz w:val="24"/>
-          <w:szCs w:val="24"/>
-          <w:lang w:eastAsia="en-US"/>
-        </w:rPr>
-        <w:t xml:space="preserve"> consolidaram o gênero, com letras introspectivas, românticas, atmosfera sombria e sonoridade diferente de tudo que havia na época.</w:t>
+        <w:t>A música é o coração da subcultura gótica, e a banda pioneira foi o Bauhaus, com seu clássico som experimental Bela Lugosi’s Dead, que conta a morte do ator Bela Lugosi, que interpretou o Drácula. The Cure e Siouxsie and the Banshees consolidaram o gênero, com letras introspectivas, românticas, atmosfera sombria e sonoridade diferente de tudo que havia na época.</w:t>
       </w:r>
     </w:p>
     <w:p>
@@ -3729,9 +3425,8 @@
           <w:szCs w:val="24"/>
           <w:lang w:eastAsia="en-US"/>
         </w:rPr>
-        <w:t xml:space="preserve">Conforme passar do tempo, gêneros góticos foram surgindo, como </w:t>
-      </w:r>
-      <w:proofErr w:type="spellStart"/>
+        <w:t xml:space="preserve">Conforme passar do tempo, gêneros góticos foram surgindo, como Darkwave, Post-Punk, Deathrock e EBM (Electronic Body Music), com muitas bandas nesses gêneros, porém, vale a ressalva para o Sisters Of Mercy, Lebanon Hanover, She Past Away e Twin Tribes. Vale citar a melancolia nas músicas góticas, como por exemplo o mantra “Sadness Is </w:t>
+      </w:r>
       <w:r>
         <w:rPr>
           <w:rFonts w:ascii="Arial" w:hAnsi="Arial" w:cs="Arial"/>
@@ -3740,239 +3435,8 @@
           <w:szCs w:val="24"/>
           <w:lang w:eastAsia="en-US"/>
         </w:rPr>
-        <w:t>Darkwave</w:t>
-      </w:r>
-      <w:proofErr w:type="spellEnd"/>
-      <w:r>
-        <w:rPr>
-          <w:rFonts w:ascii="Arial" w:hAnsi="Arial" w:cs="Arial"/>
-          <w:color w:val="FFFFFF" w:themeColor="background1"/>
-          <w:sz w:val="24"/>
-          <w:szCs w:val="24"/>
-          <w:lang w:eastAsia="en-US"/>
-        </w:rPr>
-        <w:t xml:space="preserve">, Post-Punk, </w:t>
-      </w:r>
-      <w:proofErr w:type="spellStart"/>
-      <w:r>
-        <w:rPr>
-          <w:rFonts w:ascii="Arial" w:hAnsi="Arial" w:cs="Arial"/>
-          <w:color w:val="FFFFFF" w:themeColor="background1"/>
-          <w:sz w:val="24"/>
-          <w:szCs w:val="24"/>
-          <w:lang w:eastAsia="en-US"/>
-        </w:rPr>
-        <w:t>Deathrock</w:t>
-      </w:r>
-      <w:proofErr w:type="spellEnd"/>
-      <w:r>
-        <w:rPr>
-          <w:rFonts w:ascii="Arial" w:hAnsi="Arial" w:cs="Arial"/>
-          <w:color w:val="FFFFFF" w:themeColor="background1"/>
-          <w:sz w:val="24"/>
-          <w:szCs w:val="24"/>
-          <w:lang w:eastAsia="en-US"/>
-        </w:rPr>
-        <w:t xml:space="preserve"> e EBM (</w:t>
-      </w:r>
-      <w:proofErr w:type="spellStart"/>
-      <w:r>
-        <w:rPr>
-          <w:rFonts w:ascii="Arial" w:hAnsi="Arial" w:cs="Arial"/>
-          <w:color w:val="FFFFFF" w:themeColor="background1"/>
-          <w:sz w:val="24"/>
-          <w:szCs w:val="24"/>
-          <w:lang w:eastAsia="en-US"/>
-        </w:rPr>
-        <w:t>Electronic</w:t>
-      </w:r>
-      <w:proofErr w:type="spellEnd"/>
-      <w:r>
-        <w:rPr>
-          <w:rFonts w:ascii="Arial" w:hAnsi="Arial" w:cs="Arial"/>
-          <w:color w:val="FFFFFF" w:themeColor="background1"/>
-          <w:sz w:val="24"/>
-          <w:szCs w:val="24"/>
-          <w:lang w:eastAsia="en-US"/>
-        </w:rPr>
-        <w:t xml:space="preserve"> Body Music), com muitas bandas nesses gêneros, porém, vale a ressalva para o Sisters </w:t>
-      </w:r>
-      <w:proofErr w:type="spellStart"/>
-      <w:r>
-        <w:rPr>
-          <w:rFonts w:ascii="Arial" w:hAnsi="Arial" w:cs="Arial"/>
-          <w:color w:val="FFFFFF" w:themeColor="background1"/>
-          <w:sz w:val="24"/>
-          <w:szCs w:val="24"/>
-          <w:lang w:eastAsia="en-US"/>
-        </w:rPr>
-        <w:t>Of</w:t>
-      </w:r>
-      <w:proofErr w:type="spellEnd"/>
-      <w:r>
-        <w:rPr>
-          <w:rFonts w:ascii="Arial" w:hAnsi="Arial" w:cs="Arial"/>
-          <w:color w:val="FFFFFF" w:themeColor="background1"/>
-          <w:sz w:val="24"/>
-          <w:szCs w:val="24"/>
-          <w:lang w:eastAsia="en-US"/>
-        </w:rPr>
-        <w:t xml:space="preserve"> Mercy, </w:t>
-      </w:r>
-      <w:proofErr w:type="spellStart"/>
-      <w:r>
-        <w:rPr>
-          <w:rFonts w:ascii="Arial" w:hAnsi="Arial" w:cs="Arial"/>
-          <w:color w:val="FFFFFF" w:themeColor="background1"/>
-          <w:sz w:val="24"/>
-          <w:szCs w:val="24"/>
-          <w:lang w:eastAsia="en-US"/>
-        </w:rPr>
-        <w:t>Lebanon</w:t>
-      </w:r>
-      <w:proofErr w:type="spellEnd"/>
-      <w:r>
-        <w:rPr>
-          <w:rFonts w:ascii="Arial" w:hAnsi="Arial" w:cs="Arial"/>
-          <w:color w:val="FFFFFF" w:themeColor="background1"/>
-          <w:sz w:val="24"/>
-          <w:szCs w:val="24"/>
-          <w:lang w:eastAsia="en-US"/>
-        </w:rPr>
-        <w:t xml:space="preserve"> Hanover, She </w:t>
-      </w:r>
-      <w:proofErr w:type="spellStart"/>
-      <w:r>
-        <w:rPr>
-          <w:rFonts w:ascii="Arial" w:hAnsi="Arial" w:cs="Arial"/>
-          <w:color w:val="FFFFFF" w:themeColor="background1"/>
-          <w:sz w:val="24"/>
-          <w:szCs w:val="24"/>
-          <w:lang w:eastAsia="en-US"/>
-        </w:rPr>
-        <w:t>Past</w:t>
-      </w:r>
-      <w:proofErr w:type="spellEnd"/>
-      <w:r>
-        <w:rPr>
-          <w:rFonts w:ascii="Arial" w:hAnsi="Arial" w:cs="Arial"/>
-          <w:color w:val="FFFFFF" w:themeColor="background1"/>
-          <w:sz w:val="24"/>
-          <w:szCs w:val="24"/>
-          <w:lang w:eastAsia="en-US"/>
-        </w:rPr>
-        <w:t xml:space="preserve"> Away e Twin </w:t>
-      </w:r>
-      <w:proofErr w:type="spellStart"/>
-      <w:r>
-        <w:rPr>
-          <w:rFonts w:ascii="Arial" w:hAnsi="Arial" w:cs="Arial"/>
-          <w:color w:val="FFFFFF" w:themeColor="background1"/>
-          <w:sz w:val="24"/>
-          <w:szCs w:val="24"/>
-          <w:lang w:eastAsia="en-US"/>
-        </w:rPr>
-        <w:t>Tribes</w:t>
-      </w:r>
-      <w:proofErr w:type="spellEnd"/>
-      <w:r>
-        <w:rPr>
-          <w:rFonts w:ascii="Arial" w:hAnsi="Arial" w:cs="Arial"/>
-          <w:color w:val="FFFFFF" w:themeColor="background1"/>
-          <w:sz w:val="24"/>
-          <w:szCs w:val="24"/>
-          <w:lang w:eastAsia="en-US"/>
-        </w:rPr>
-        <w:t>. Vale citar a melancolia nas músicas góticas, como por exemplo o mantra “</w:t>
-      </w:r>
-      <w:proofErr w:type="spellStart"/>
-      <w:r>
-        <w:rPr>
-          <w:rFonts w:ascii="Arial" w:hAnsi="Arial" w:cs="Arial"/>
-          <w:color w:val="FFFFFF" w:themeColor="background1"/>
-          <w:sz w:val="24"/>
-          <w:szCs w:val="24"/>
-          <w:lang w:eastAsia="en-US"/>
-        </w:rPr>
-        <w:t>Sadness</w:t>
-      </w:r>
-      <w:proofErr w:type="spellEnd"/>
-      <w:r>
-        <w:rPr>
-          <w:rFonts w:ascii="Arial" w:hAnsi="Arial" w:cs="Arial"/>
-          <w:color w:val="FFFFFF" w:themeColor="background1"/>
-          <w:sz w:val="24"/>
-          <w:szCs w:val="24"/>
-          <w:lang w:eastAsia="en-US"/>
-        </w:rPr>
-        <w:t xml:space="preserve"> </w:t>
-      </w:r>
-      <w:proofErr w:type="spellStart"/>
-      <w:r>
-        <w:rPr>
-          <w:rFonts w:ascii="Arial" w:hAnsi="Arial" w:cs="Arial"/>
-          <w:color w:val="FFFFFF" w:themeColor="background1"/>
-          <w:sz w:val="24"/>
-          <w:szCs w:val="24"/>
-          <w:lang w:eastAsia="en-US"/>
-        </w:rPr>
-        <w:t>Is</w:t>
-      </w:r>
-      <w:proofErr w:type="spellEnd"/>
-      <w:r>
-        <w:rPr>
-          <w:rFonts w:ascii="Arial" w:hAnsi="Arial" w:cs="Arial"/>
-          <w:color w:val="FFFFFF" w:themeColor="background1"/>
-          <w:sz w:val="24"/>
-          <w:szCs w:val="24"/>
-          <w:lang w:eastAsia="en-US"/>
-        </w:rPr>
-        <w:t xml:space="preserve"> </w:t>
-      </w:r>
-      <w:proofErr w:type="spellStart"/>
-      <w:r>
-        <w:rPr>
-          <w:rFonts w:ascii="Arial" w:hAnsi="Arial" w:cs="Arial"/>
-          <w:color w:val="FFFFFF" w:themeColor="background1"/>
-          <w:sz w:val="24"/>
-          <w:szCs w:val="24"/>
-          <w:lang w:eastAsia="en-US"/>
-        </w:rPr>
         <w:lastRenderedPageBreak/>
-        <w:t>Rebellion</w:t>
-      </w:r>
-      <w:proofErr w:type="spellEnd"/>
-      <w:r>
-        <w:rPr>
-          <w:rFonts w:ascii="Arial" w:hAnsi="Arial" w:cs="Arial"/>
-          <w:color w:val="FFFFFF" w:themeColor="background1"/>
-          <w:sz w:val="24"/>
-          <w:szCs w:val="24"/>
-          <w:lang w:eastAsia="en-US"/>
-        </w:rPr>
-        <w:t xml:space="preserve">”, uma música do </w:t>
-      </w:r>
-      <w:proofErr w:type="spellStart"/>
-      <w:r>
-        <w:rPr>
-          <w:rFonts w:ascii="Arial" w:hAnsi="Arial" w:cs="Arial"/>
-          <w:color w:val="FFFFFF" w:themeColor="background1"/>
-          <w:sz w:val="24"/>
-          <w:szCs w:val="24"/>
-          <w:lang w:eastAsia="en-US"/>
-        </w:rPr>
-        <w:t>Lebanon</w:t>
-      </w:r>
-      <w:proofErr w:type="spellEnd"/>
-      <w:r>
-        <w:rPr>
-          <w:rFonts w:ascii="Arial" w:hAnsi="Arial" w:cs="Arial"/>
-          <w:color w:val="FFFFFF" w:themeColor="background1"/>
-          <w:sz w:val="24"/>
-          <w:szCs w:val="24"/>
-          <w:lang w:eastAsia="en-US"/>
-        </w:rPr>
-        <w:t xml:space="preserve"> Hanover, que destaca a superficialidade das pessoas em não buscarem autoconhecimento.</w:t>
+        <w:t>Rebellion”, uma música do Lebanon Hanover, que destaca a superficialidade das pessoas em não buscarem autoconhecimento.</w:t>
       </w:r>
     </w:p>
     <w:p>
@@ -4056,27 +3520,7 @@
           <w:bCs/>
           <w:color w:val="FFFFFF" w:themeColor="background1"/>
         </w:rPr>
-        <w:t xml:space="preserve">Figura 7: Sisters </w:t>
-      </w:r>
-      <w:proofErr w:type="spellStart"/>
-      <w:r>
-        <w:rPr>
-          <w:rFonts w:ascii="Arial" w:hAnsi="Arial" w:cs="Arial"/>
-          <w:b/>
-          <w:bCs/>
-          <w:color w:val="FFFFFF" w:themeColor="background1"/>
-        </w:rPr>
-        <w:t>Of</w:t>
-      </w:r>
-      <w:proofErr w:type="spellEnd"/>
-      <w:r>
-        <w:rPr>
-          <w:rFonts w:ascii="Arial" w:hAnsi="Arial" w:cs="Arial"/>
-          <w:b/>
-          <w:bCs/>
-          <w:color w:val="FFFFFF" w:themeColor="background1"/>
-        </w:rPr>
-        <w:t xml:space="preserve"> Mercy</w:t>
+        <w:t>Figura 7: Sisters Of Mercy</w:t>
       </w:r>
     </w:p>
     <w:p>
@@ -4166,27 +3610,7 @@
           <w:bCs/>
           <w:color w:val="FFFFFF" w:themeColor="background1"/>
         </w:rPr>
-        <w:t xml:space="preserve">Figura 8: </w:t>
-      </w:r>
-      <w:proofErr w:type="spellStart"/>
-      <w:r>
-        <w:rPr>
-          <w:rFonts w:ascii="Arial" w:hAnsi="Arial" w:cs="Arial"/>
-          <w:b/>
-          <w:bCs/>
-          <w:color w:val="FFFFFF" w:themeColor="background1"/>
-        </w:rPr>
-        <w:t>Lebanon</w:t>
-      </w:r>
-      <w:proofErr w:type="spellEnd"/>
-      <w:r>
-        <w:rPr>
-          <w:rFonts w:ascii="Arial" w:hAnsi="Arial" w:cs="Arial"/>
-          <w:b/>
-          <w:bCs/>
-          <w:color w:val="FFFFFF" w:themeColor="background1"/>
-        </w:rPr>
-        <w:t xml:space="preserve"> Hanover</w:t>
+        <w:t>Figura 8: Lebanon Hanover</w:t>
       </w:r>
     </w:p>
     <w:p>
@@ -4375,51 +3799,7 @@
           <w:szCs w:val="24"/>
           <w:lang w:eastAsia="en-US"/>
         </w:rPr>
-        <w:t xml:space="preserve">O que me chateia é que há muito estereótipos no meio, falando que góticos são tristes, ou que góticos odeiam todo mundo, e não é verdade, e está longe de ser verdade, é só um jeito diferente de viver que as outras pessoas, e não há nada de errado nisso, portanto, A Little Piece </w:t>
-      </w:r>
-      <w:proofErr w:type="spellStart"/>
-      <w:r>
-        <w:rPr>
-          <w:rFonts w:ascii="Arial" w:hAnsi="Arial" w:cs="Arial"/>
-          <w:color w:val="FFFFFF" w:themeColor="background1"/>
-          <w:sz w:val="24"/>
-          <w:szCs w:val="24"/>
-          <w:lang w:eastAsia="en-US"/>
-        </w:rPr>
-        <w:t>Of</w:t>
-      </w:r>
-      <w:proofErr w:type="spellEnd"/>
-      <w:r>
-        <w:rPr>
-          <w:rFonts w:ascii="Arial" w:hAnsi="Arial" w:cs="Arial"/>
-          <w:color w:val="FFFFFF" w:themeColor="background1"/>
-          <w:sz w:val="24"/>
-          <w:szCs w:val="24"/>
-          <w:lang w:eastAsia="en-US"/>
-        </w:rPr>
-        <w:t xml:space="preserve"> </w:t>
-      </w:r>
-      <w:proofErr w:type="spellStart"/>
-      <w:r>
-        <w:rPr>
-          <w:rFonts w:ascii="Arial" w:hAnsi="Arial" w:cs="Arial"/>
-          <w:color w:val="FFFFFF" w:themeColor="background1"/>
-          <w:sz w:val="24"/>
-          <w:szCs w:val="24"/>
-          <w:lang w:eastAsia="en-US"/>
-        </w:rPr>
-        <w:t>My</w:t>
-      </w:r>
-      <w:proofErr w:type="spellEnd"/>
-      <w:r>
-        <w:rPr>
-          <w:rFonts w:ascii="Arial" w:hAnsi="Arial" w:cs="Arial"/>
-          <w:color w:val="FFFFFF" w:themeColor="background1"/>
-          <w:sz w:val="24"/>
-          <w:szCs w:val="24"/>
-          <w:lang w:eastAsia="en-US"/>
-        </w:rPr>
-        <w:t xml:space="preserve"> Soul veio para desmistificar alguns mitos e estereótipos sobre a subcultura.</w:t>
+        <w:t>O que me chateia é que há muito estereótipos no meio, falando que góticos são tristes, ou que góticos odeiam todo mundo, e não é verdade, e está longe de ser verdade, é só um jeito diferente de viver que as outras pessoas, e não há nada de errado nisso, portanto, A Little Piece Of My Soul veio para desmistificar alguns mitos e estereótipos sobre a subcultura.</w:t>
       </w:r>
     </w:p>
     <w:p>
@@ -4442,73 +3822,7 @@
           <w:szCs w:val="24"/>
           <w:lang w:eastAsia="en-US"/>
         </w:rPr>
-        <w:t xml:space="preserve">O nome A Little Piece </w:t>
-      </w:r>
-      <w:proofErr w:type="spellStart"/>
-      <w:r>
-        <w:rPr>
-          <w:rFonts w:ascii="Arial" w:hAnsi="Arial" w:cs="Arial"/>
-          <w:color w:val="FFFFFF" w:themeColor="background1"/>
-          <w:sz w:val="24"/>
-          <w:szCs w:val="24"/>
-          <w:lang w:eastAsia="en-US"/>
-        </w:rPr>
-        <w:t>Of</w:t>
-      </w:r>
-      <w:proofErr w:type="spellEnd"/>
-      <w:r>
-        <w:rPr>
-          <w:rFonts w:ascii="Arial" w:hAnsi="Arial" w:cs="Arial"/>
-          <w:color w:val="FFFFFF" w:themeColor="background1"/>
-          <w:sz w:val="24"/>
-          <w:szCs w:val="24"/>
-          <w:lang w:eastAsia="en-US"/>
-        </w:rPr>
-        <w:t xml:space="preserve"> </w:t>
-      </w:r>
-      <w:proofErr w:type="spellStart"/>
-      <w:r>
-        <w:rPr>
-          <w:rFonts w:ascii="Arial" w:hAnsi="Arial" w:cs="Arial"/>
-          <w:color w:val="FFFFFF" w:themeColor="background1"/>
-          <w:sz w:val="24"/>
-          <w:szCs w:val="24"/>
-          <w:lang w:eastAsia="en-US"/>
-        </w:rPr>
-        <w:t>My</w:t>
-      </w:r>
-      <w:proofErr w:type="spellEnd"/>
-      <w:r>
-        <w:rPr>
-          <w:rFonts w:ascii="Arial" w:hAnsi="Arial" w:cs="Arial"/>
-          <w:color w:val="FFFFFF" w:themeColor="background1"/>
-          <w:sz w:val="24"/>
-          <w:szCs w:val="24"/>
-          <w:lang w:eastAsia="en-US"/>
-        </w:rPr>
-        <w:t xml:space="preserve"> Soul surgiu através da minha playlist do </w:t>
-      </w:r>
-      <w:proofErr w:type="spellStart"/>
-      <w:r>
-        <w:rPr>
-          <w:rFonts w:ascii="Arial" w:hAnsi="Arial" w:cs="Arial"/>
-          <w:color w:val="FFFFFF" w:themeColor="background1"/>
-          <w:sz w:val="24"/>
-          <w:szCs w:val="24"/>
-          <w:lang w:eastAsia="en-US"/>
-        </w:rPr>
-        <w:t>Spotify</w:t>
-      </w:r>
-      <w:proofErr w:type="spellEnd"/>
-      <w:r>
-        <w:rPr>
-          <w:rFonts w:ascii="Arial" w:hAnsi="Arial" w:cs="Arial"/>
-          <w:color w:val="FFFFFF" w:themeColor="background1"/>
-          <w:sz w:val="24"/>
-          <w:szCs w:val="24"/>
-          <w:lang w:eastAsia="en-US"/>
-        </w:rPr>
-        <w:t>, de mesmo nome do projeto.</w:t>
+        <w:t>O nome A Little Piece Of My Soul surgiu através da minha playlist do Spotify, de mesmo nome do projeto.</w:t>
       </w:r>
     </w:p>
     <w:p>
@@ -4580,19 +3894,8 @@
           <w:bCs/>
           <w:color w:val="FFFFFF" w:themeColor="background1"/>
         </w:rPr>
-        <w:t xml:space="preserve">Figura 9: Playlist do </w:t>
-      </w:r>
-      <w:proofErr w:type="spellStart"/>
-      <w:r>
-        <w:rPr>
-          <w:rFonts w:ascii="Arial" w:hAnsi="Arial" w:cs="Arial"/>
-          <w:b/>
-          <w:bCs/>
-          <w:color w:val="FFFFFF" w:themeColor="background1"/>
-        </w:rPr>
-        <w:t>Spotify</w:t>
-      </w:r>
-      <w:proofErr w:type="spellEnd"/>
+        <w:t>Figura 9: Playlist do Spotify</w:t>
+      </w:r>
     </w:p>
     <w:p>
       <w:pPr>
@@ -5220,6 +4523,27 @@
     </w:p>
     <w:p>
       <w:pPr>
+        <w:pStyle w:val="PargrafodaLista"/>
+        <w:numPr>
+          <w:ilvl w:val="0"/>
+          <w:numId w:val="5"/>
+        </w:numPr>
+        <w:jc w:val="both"/>
+        <w:rPr>
+          <w:rFonts w:ascii="Arial" w:hAnsi="Arial" w:cs="Arial"/>
+          <w:color w:val="FFFFFF" w:themeColor="background1"/>
+        </w:rPr>
+      </w:pPr>
+      <w:r>
+        <w:rPr>
+          <w:rFonts w:ascii="Arial" w:hAnsi="Arial" w:cs="Arial"/>
+          <w:color w:val="FFFFFF" w:themeColor="background1"/>
+        </w:rPr>
+        <w:t>Os usuários terão acesso a internet para visualização do site.</w:t>
+      </w:r>
+    </w:p>
+    <w:p>
+      <w:pPr>
         <w:ind w:left="360"/>
         <w:rPr>
           <w:color w:val="FFFFFF" w:themeColor="background1"/>
@@ -5304,55 +4628,7 @@
           <w:rFonts w:ascii="Arial" w:hAnsi="Arial" w:cs="Arial"/>
           <w:color w:val="FFFFFF" w:themeColor="background1"/>
         </w:rPr>
-        <w:t xml:space="preserve">Não haverá APIs externas para música, como Youtube, </w:t>
-      </w:r>
-      <w:proofErr w:type="spellStart"/>
-      <w:r>
-        <w:rPr>
-          <w:rFonts w:ascii="Arial" w:hAnsi="Arial" w:cs="Arial"/>
-          <w:color w:val="FFFFFF" w:themeColor="background1"/>
-        </w:rPr>
-        <w:t>Spotify</w:t>
-      </w:r>
-      <w:proofErr w:type="spellEnd"/>
-      <w:r>
-        <w:rPr>
-          <w:rFonts w:ascii="Arial" w:hAnsi="Arial" w:cs="Arial"/>
-          <w:color w:val="FFFFFF" w:themeColor="background1"/>
-        </w:rPr>
-        <w:t xml:space="preserve">, </w:t>
-      </w:r>
-      <w:proofErr w:type="spellStart"/>
-      <w:r>
-        <w:rPr>
-          <w:rFonts w:ascii="Arial" w:hAnsi="Arial" w:cs="Arial"/>
-          <w:color w:val="FFFFFF" w:themeColor="background1"/>
-        </w:rPr>
-        <w:t>Soundcloud</w:t>
-      </w:r>
-      <w:proofErr w:type="spellEnd"/>
-      <w:r>
-        <w:rPr>
-          <w:rFonts w:ascii="Arial" w:hAnsi="Arial" w:cs="Arial"/>
-          <w:color w:val="FFFFFF" w:themeColor="background1"/>
-        </w:rPr>
-        <w:t xml:space="preserve"> </w:t>
-      </w:r>
-      <w:proofErr w:type="spellStart"/>
-      <w:r>
-        <w:rPr>
-          <w:rFonts w:ascii="Arial" w:hAnsi="Arial" w:cs="Arial"/>
-          <w:color w:val="FFFFFF" w:themeColor="background1"/>
-        </w:rPr>
-        <w:t>etc</w:t>
-      </w:r>
-      <w:proofErr w:type="spellEnd"/>
-      <w:r>
-        <w:rPr>
-          <w:rFonts w:ascii="Arial" w:hAnsi="Arial" w:cs="Arial"/>
-          <w:color w:val="FFFFFF" w:themeColor="background1"/>
-        </w:rPr>
-        <w:t>;</w:t>
+        <w:t>Não haverá APIs externas para música, como Youtube, Spotify, Soundcloud etc;</w:t>
       </w:r>
     </w:p>
     <w:p>
@@ -5436,23 +4712,35 @@
           <w:rFonts w:ascii="Arial" w:hAnsi="Arial" w:cs="Arial"/>
           <w:color w:val="FFFFFF" w:themeColor="background1"/>
         </w:rPr>
-        <w:t xml:space="preserve">O banco de dados armazenará apenas informações essenciais para o funcionamento, como nome, </w:t>
-      </w:r>
-      <w:proofErr w:type="spellStart"/>
-      <w:r>
-        <w:rPr>
-          <w:rFonts w:ascii="Arial" w:hAnsi="Arial" w:cs="Arial"/>
-          <w:color w:val="FFFFFF" w:themeColor="background1"/>
-        </w:rPr>
-        <w:t>email</w:t>
-      </w:r>
-      <w:proofErr w:type="spellEnd"/>
-      <w:r>
-        <w:rPr>
-          <w:rFonts w:ascii="Arial" w:hAnsi="Arial" w:cs="Arial"/>
-          <w:color w:val="FFFFFF" w:themeColor="background1"/>
-        </w:rPr>
-        <w:t>, resultados do Quiz, gênero e banda favorita.</w:t>
+        <w:t>O banco de dados armazenará apenas informações essenciais para o funcionamento, como nome, email, resultados do Quiz, gênero e banda favorita</w:t>
+      </w:r>
+      <w:r>
+        <w:rPr>
+          <w:rFonts w:ascii="Arial" w:hAnsi="Arial" w:cs="Arial"/>
+          <w:color w:val="FFFFFF" w:themeColor="background1"/>
+        </w:rPr>
+        <w:t>;</w:t>
+      </w:r>
+    </w:p>
+    <w:p>
+      <w:pPr>
+        <w:pStyle w:val="PargrafodaLista"/>
+        <w:numPr>
+          <w:ilvl w:val="0"/>
+          <w:numId w:val="4"/>
+        </w:numPr>
+        <w:jc w:val="both"/>
+        <w:rPr>
+          <w:rFonts w:ascii="Arial" w:hAnsi="Arial" w:cs="Arial"/>
+          <w:color w:val="FFFFFF" w:themeColor="background1"/>
+        </w:rPr>
+      </w:pPr>
+      <w:r>
+        <w:rPr>
+          <w:rFonts w:ascii="Arial" w:hAnsi="Arial" w:cs="Arial"/>
+          <w:color w:val="FFFFFF" w:themeColor="background1"/>
+        </w:rPr>
+        <w:t>As imagens do criador (foto do rosto, foto em shows etc) não devem ser utilizadas por terceiros com quaisquer objetivos, sejam eles lucrativos ou não.</w:t>
       </w:r>
     </w:p>
     <w:p>
@@ -5484,7 +4772,7 @@
 </file>
 
 <file path=word/endnotes.xml><?xml version="1.0" encoding="utf-8"?>
-<w:endnotes xmlns:wpc="http://schemas.microsoft.com/office/word/2010/wordprocessingCanvas" xmlns:cx="http://schemas.microsoft.com/office/drawing/2014/chartex" xmlns:cx1="http://schemas.microsoft.com/office/drawing/2015/9/8/chartex" xmlns:cx2="http://schemas.microsoft.com/office/drawing/2015/10/21/chartex" xmlns:cx3="http://schemas.microsoft.com/office/drawing/2016/5/9/chartex" xmlns:cx4="http://schemas.microsoft.com/office/drawing/2016/5/10/chartex" xmlns:cx5="http://schemas.microsoft.com/office/drawing/2016/5/11/chartex" xmlns:cx6="http://schemas.microsoft.com/office/drawing/2016/5/12/chartex" xmlns:cx7="http://schemas.microsoft.com/office/drawing/2016/5/13/chartex" xmlns:cx8="http://schemas.microsoft.com/office/drawing/2016/5/14/chartex" xmlns:mc="http://schemas.openxmlformats.org/markup-compatibility/2006" xmlns:aink="http://schemas.microsoft.com/office/drawing/2016/ink" xmlns:am3d="http://schemas.microsoft.com/office/drawing/2017/model3d" xmlns:o="urn:schemas-microsoft-com:office:office" xmlns:oel="http://schemas.microsoft.com/office/2019/extlst" xmlns:r="http://schemas.openxmlformats.org/officeDocument/2006/relationships" xmlns:m="http://schemas.openxmlformats.org/officeDocument/2006/math" xmlns:v="urn:schemas-microsoft-com:vml" xmlns:wp14="http://schemas.microsoft.com/office/word/2010/wordprocessingDrawing" xmlns:wp="http://schemas.openxmlformats.org/drawingml/2006/wordprocessingDrawing" xmlns:w10="urn:schemas-microsoft-com:office:word" xmlns:w="http://schemas.openxmlformats.org/wordprocessingml/2006/main" xmlns:w14="http://schemas.microsoft.com/office/word/2010/wordml" xmlns:w15="http://schemas.microsoft.com/office/word/2012/wordml" xmlns:w16cex="http://schemas.microsoft.com/office/word/2018/wordml/cex" xmlns:w16cid="http://schemas.microsoft.com/office/word/2016/wordml/cid" xmlns:w16="http://schemas.microsoft.com/office/word/2018/wordml" xmlns:w16sdtdh="http://schemas.microsoft.com/office/word/2020/wordml/sdtdatahash" xmlns:w16se="http://schemas.microsoft.com/office/word/2015/wordml/symex" xmlns:wpg="http://schemas.microsoft.com/office/word/2010/wordprocessingGroup" xmlns:wpi="http://schemas.microsoft.com/office/word/2010/wordprocessingInk" xmlns:wne="http://schemas.microsoft.com/office/word/2006/wordml" xmlns:wps="http://schemas.microsoft.com/office/word/2010/wordprocessingShape" mc:Ignorable="w14 w15 w16se w16cid w16 w16cex w16sdtdh wp14">
+<w:endnotes xmlns:wpc="http://schemas.microsoft.com/office/word/2010/wordprocessingCanvas" xmlns:cx="http://schemas.microsoft.com/office/drawing/2014/chartex" xmlns:cx1="http://schemas.microsoft.com/office/drawing/2015/9/8/chartex" xmlns:cx2="http://schemas.microsoft.com/office/drawing/2015/10/21/chartex" xmlns:cx3="http://schemas.microsoft.com/office/drawing/2016/5/9/chartex" xmlns:cx4="http://schemas.microsoft.com/office/drawing/2016/5/10/chartex" xmlns:cx5="http://schemas.microsoft.com/office/drawing/2016/5/11/chartex" xmlns:cx6="http://schemas.microsoft.com/office/drawing/2016/5/12/chartex" xmlns:cx7="http://schemas.microsoft.com/office/drawing/2016/5/13/chartex" xmlns:cx8="http://schemas.microsoft.com/office/drawing/2016/5/14/chartex" xmlns:mc="http://schemas.openxmlformats.org/markup-compatibility/2006" xmlns:aink="http://schemas.microsoft.com/office/drawing/2016/ink" xmlns:am3d="http://schemas.microsoft.com/office/drawing/2017/model3d" xmlns:o="urn:schemas-microsoft-com:office:office" xmlns:oel="http://schemas.microsoft.com/office/2019/extlst" xmlns:r="http://schemas.openxmlformats.org/officeDocument/2006/relationships" xmlns:m="http://schemas.openxmlformats.org/officeDocument/2006/math" xmlns:v="urn:schemas-microsoft-com:vml" xmlns:wp14="http://schemas.microsoft.com/office/word/2010/wordprocessingDrawing" xmlns:wp="http://schemas.openxmlformats.org/drawingml/2006/wordprocessingDrawing" xmlns:w10="urn:schemas-microsoft-com:office:word" xmlns:w="http://schemas.openxmlformats.org/wordprocessingml/2006/main" xmlns:w14="http://schemas.microsoft.com/office/word/2010/wordml" xmlns:w15="http://schemas.microsoft.com/office/word/2012/wordml" xmlns:w16cex="http://schemas.microsoft.com/office/word/2018/wordml/cex" xmlns:w16cid="http://schemas.microsoft.com/office/word/2016/wordml/cid" xmlns:w16="http://schemas.microsoft.com/office/word/2018/wordml" xmlns:w16du="http://schemas.microsoft.com/office/word/2023/wordml/word16du" xmlns:w16sdtdh="http://schemas.microsoft.com/office/word/2020/wordml/sdtdatahash" xmlns:w16sdtfl="http://schemas.microsoft.com/office/word/2024/wordml/sdtformatlock" xmlns:w16se="http://schemas.microsoft.com/office/word/2015/wordml/symex" xmlns:wpg="http://schemas.microsoft.com/office/word/2010/wordprocessingGroup" xmlns:wpi="http://schemas.microsoft.com/office/word/2010/wordprocessingInk" xmlns:wne="http://schemas.microsoft.com/office/word/2006/wordml" xmlns:wps="http://schemas.microsoft.com/office/word/2010/wordprocessingShape" mc:Ignorable="w14 w15 w16se w16cid w16 w16cex w16sdtdh w16sdtfl w16du wp14">
   <w:endnote w:type="separator" w:id="-1">
     <w:p>
       <w:pPr>
@@ -5509,7 +4797,7 @@
 </file>
 
 <file path=word/footer1.xml><?xml version="1.0" encoding="utf-8"?>
-<w:ftr xmlns:wpc="http://schemas.microsoft.com/office/word/2010/wordprocessingCanvas" xmlns:cx="http://schemas.microsoft.com/office/drawing/2014/chartex" xmlns:cx1="http://schemas.microsoft.com/office/drawing/2015/9/8/chartex" xmlns:cx2="http://schemas.microsoft.com/office/drawing/2015/10/21/chartex" xmlns:cx3="http://schemas.microsoft.com/office/drawing/2016/5/9/chartex" xmlns:cx4="http://schemas.microsoft.com/office/drawing/2016/5/10/chartex" xmlns:cx5="http://schemas.microsoft.com/office/drawing/2016/5/11/chartex" xmlns:cx6="http://schemas.microsoft.com/office/drawing/2016/5/12/chartex" xmlns:cx7="http://schemas.microsoft.com/office/drawing/2016/5/13/chartex" xmlns:cx8="http://schemas.microsoft.com/office/drawing/2016/5/14/chartex" xmlns:mc="http://schemas.openxmlformats.org/markup-compatibility/2006" xmlns:aink="http://schemas.microsoft.com/office/drawing/2016/ink" xmlns:am3d="http://schemas.microsoft.com/office/drawing/2017/model3d" xmlns:o="urn:schemas-microsoft-com:office:office" xmlns:oel="http://schemas.microsoft.com/office/2019/extlst" xmlns:r="http://schemas.openxmlformats.org/officeDocument/2006/relationships" xmlns:m="http://schemas.openxmlformats.org/officeDocument/2006/math" xmlns:v="urn:schemas-microsoft-com:vml" xmlns:wp14="http://schemas.microsoft.com/office/word/2010/wordprocessingDrawing" xmlns:wp="http://schemas.openxmlformats.org/drawingml/2006/wordprocessingDrawing" xmlns:w10="urn:schemas-microsoft-com:office:word" xmlns:w="http://schemas.openxmlformats.org/wordprocessingml/2006/main" xmlns:w14="http://schemas.microsoft.com/office/word/2010/wordml" xmlns:w15="http://schemas.microsoft.com/office/word/2012/wordml" xmlns:w16cex="http://schemas.microsoft.com/office/word/2018/wordml/cex" xmlns:w16cid="http://schemas.microsoft.com/office/word/2016/wordml/cid" xmlns:w16="http://schemas.microsoft.com/office/word/2018/wordml" xmlns:w16sdtdh="http://schemas.microsoft.com/office/word/2020/wordml/sdtdatahash" xmlns:w16se="http://schemas.microsoft.com/office/word/2015/wordml/symex" xmlns:wpg="http://schemas.microsoft.com/office/word/2010/wordprocessingGroup" xmlns:wpi="http://schemas.microsoft.com/office/word/2010/wordprocessingInk" xmlns:wne="http://schemas.microsoft.com/office/word/2006/wordml" xmlns:wps="http://schemas.microsoft.com/office/word/2010/wordprocessingShape" mc:Ignorable="w14 w15 w16se w16cid w16 w16cex w16sdtdh wp14">
+<w:ftr xmlns:wpc="http://schemas.microsoft.com/office/word/2010/wordprocessingCanvas" xmlns:cx="http://schemas.microsoft.com/office/drawing/2014/chartex" xmlns:cx1="http://schemas.microsoft.com/office/drawing/2015/9/8/chartex" xmlns:cx2="http://schemas.microsoft.com/office/drawing/2015/10/21/chartex" xmlns:cx3="http://schemas.microsoft.com/office/drawing/2016/5/9/chartex" xmlns:cx4="http://schemas.microsoft.com/office/drawing/2016/5/10/chartex" xmlns:cx5="http://schemas.microsoft.com/office/drawing/2016/5/11/chartex" xmlns:cx6="http://schemas.microsoft.com/office/drawing/2016/5/12/chartex" xmlns:cx7="http://schemas.microsoft.com/office/drawing/2016/5/13/chartex" xmlns:cx8="http://schemas.microsoft.com/office/drawing/2016/5/14/chartex" xmlns:mc="http://schemas.openxmlformats.org/markup-compatibility/2006" xmlns:aink="http://schemas.microsoft.com/office/drawing/2016/ink" xmlns:am3d="http://schemas.microsoft.com/office/drawing/2017/model3d" xmlns:o="urn:schemas-microsoft-com:office:office" xmlns:oel="http://schemas.microsoft.com/office/2019/extlst" xmlns:r="http://schemas.openxmlformats.org/officeDocument/2006/relationships" xmlns:m="http://schemas.openxmlformats.org/officeDocument/2006/math" xmlns:v="urn:schemas-microsoft-com:vml" xmlns:wp14="http://schemas.microsoft.com/office/word/2010/wordprocessingDrawing" xmlns:wp="http://schemas.openxmlformats.org/drawingml/2006/wordprocessingDrawing" xmlns:w10="urn:schemas-microsoft-com:office:word" xmlns:w="http://schemas.openxmlformats.org/wordprocessingml/2006/main" xmlns:w14="http://schemas.microsoft.com/office/word/2010/wordml" xmlns:w15="http://schemas.microsoft.com/office/word/2012/wordml" xmlns:w16cex="http://schemas.microsoft.com/office/word/2018/wordml/cex" xmlns:w16cid="http://schemas.microsoft.com/office/word/2016/wordml/cid" xmlns:w16="http://schemas.microsoft.com/office/word/2018/wordml" xmlns:w16du="http://schemas.microsoft.com/office/word/2023/wordml/word16du" xmlns:w16sdtdh="http://schemas.microsoft.com/office/word/2020/wordml/sdtdatahash" xmlns:w16sdtfl="http://schemas.microsoft.com/office/word/2024/wordml/sdtformatlock" xmlns:w16se="http://schemas.microsoft.com/office/word/2015/wordml/symex" xmlns:wpg="http://schemas.microsoft.com/office/word/2010/wordprocessingGroup" xmlns:wpi="http://schemas.microsoft.com/office/word/2010/wordprocessingInk" xmlns:wne="http://schemas.microsoft.com/office/word/2006/wordml" xmlns:wps="http://schemas.microsoft.com/office/word/2010/wordprocessingShape" mc:Ignorable="w14 w15 w16se w16cid w16 w16cex w16sdtdh w16sdtfl w16du wp14">
   <w:p>
     <w:pPr>
       <w:pStyle w:val="Rodap"/>
@@ -5525,7 +4813,7 @@
 </file>
 
 <file path=word/footer2.xml><?xml version="1.0" encoding="utf-8"?>
-<w:ftr xmlns:wpc="http://schemas.microsoft.com/office/word/2010/wordprocessingCanvas" xmlns:cx="http://schemas.microsoft.com/office/drawing/2014/chartex" xmlns:cx1="http://schemas.microsoft.com/office/drawing/2015/9/8/chartex" xmlns:cx2="http://schemas.microsoft.com/office/drawing/2015/10/21/chartex" xmlns:cx3="http://schemas.microsoft.com/office/drawing/2016/5/9/chartex" xmlns:cx4="http://schemas.microsoft.com/office/drawing/2016/5/10/chartex" xmlns:cx5="http://schemas.microsoft.com/office/drawing/2016/5/11/chartex" xmlns:cx6="http://schemas.microsoft.com/office/drawing/2016/5/12/chartex" xmlns:cx7="http://schemas.microsoft.com/office/drawing/2016/5/13/chartex" xmlns:cx8="http://schemas.microsoft.com/office/drawing/2016/5/14/chartex" xmlns:mc="http://schemas.openxmlformats.org/markup-compatibility/2006" xmlns:aink="http://schemas.microsoft.com/office/drawing/2016/ink" xmlns:am3d="http://schemas.microsoft.com/office/drawing/2017/model3d" xmlns:o="urn:schemas-microsoft-com:office:office" xmlns:oel="http://schemas.microsoft.com/office/2019/extlst" xmlns:r="http://schemas.openxmlformats.org/officeDocument/2006/relationships" xmlns:m="http://schemas.openxmlformats.org/officeDocument/2006/math" xmlns:v="urn:schemas-microsoft-com:vml" xmlns:wp14="http://schemas.microsoft.com/office/word/2010/wordprocessingDrawing" xmlns:wp="http://schemas.openxmlformats.org/drawingml/2006/wordprocessingDrawing" xmlns:w10="urn:schemas-microsoft-com:office:word" xmlns:w="http://schemas.openxmlformats.org/wordprocessingml/2006/main" xmlns:w14="http://schemas.microsoft.com/office/word/2010/wordml" xmlns:w15="http://schemas.microsoft.com/office/word/2012/wordml" xmlns:w16cex="http://schemas.microsoft.com/office/word/2018/wordml/cex" xmlns:w16cid="http://schemas.microsoft.com/office/word/2016/wordml/cid" xmlns:w16="http://schemas.microsoft.com/office/word/2018/wordml" xmlns:w16sdtdh="http://schemas.microsoft.com/office/word/2020/wordml/sdtdatahash" xmlns:w16se="http://schemas.microsoft.com/office/word/2015/wordml/symex" xmlns:wpg="http://schemas.microsoft.com/office/word/2010/wordprocessingGroup" xmlns:wpi="http://schemas.microsoft.com/office/word/2010/wordprocessingInk" xmlns:wne="http://schemas.microsoft.com/office/word/2006/wordml" xmlns:wps="http://schemas.microsoft.com/office/word/2010/wordprocessingShape" mc:Ignorable="w14 w15 w16se w16cid w16 w16cex w16sdtdh wp14">
+<w:ftr xmlns:wpc="http://schemas.microsoft.com/office/word/2010/wordprocessingCanvas" xmlns:cx="http://schemas.microsoft.com/office/drawing/2014/chartex" xmlns:cx1="http://schemas.microsoft.com/office/drawing/2015/9/8/chartex" xmlns:cx2="http://schemas.microsoft.com/office/drawing/2015/10/21/chartex" xmlns:cx3="http://schemas.microsoft.com/office/drawing/2016/5/9/chartex" xmlns:cx4="http://schemas.microsoft.com/office/drawing/2016/5/10/chartex" xmlns:cx5="http://schemas.microsoft.com/office/drawing/2016/5/11/chartex" xmlns:cx6="http://schemas.microsoft.com/office/drawing/2016/5/12/chartex" xmlns:cx7="http://schemas.microsoft.com/office/drawing/2016/5/13/chartex" xmlns:cx8="http://schemas.microsoft.com/office/drawing/2016/5/14/chartex" xmlns:mc="http://schemas.openxmlformats.org/markup-compatibility/2006" xmlns:aink="http://schemas.microsoft.com/office/drawing/2016/ink" xmlns:am3d="http://schemas.microsoft.com/office/drawing/2017/model3d" xmlns:o="urn:schemas-microsoft-com:office:office" xmlns:oel="http://schemas.microsoft.com/office/2019/extlst" xmlns:r="http://schemas.openxmlformats.org/officeDocument/2006/relationships" xmlns:m="http://schemas.openxmlformats.org/officeDocument/2006/math" xmlns:v="urn:schemas-microsoft-com:vml" xmlns:wp14="http://schemas.microsoft.com/office/word/2010/wordprocessingDrawing" xmlns:wp="http://schemas.openxmlformats.org/drawingml/2006/wordprocessingDrawing" xmlns:w10="urn:schemas-microsoft-com:office:word" xmlns:w="http://schemas.openxmlformats.org/wordprocessingml/2006/main" xmlns:w14="http://schemas.microsoft.com/office/word/2010/wordml" xmlns:w15="http://schemas.microsoft.com/office/word/2012/wordml" xmlns:w16cex="http://schemas.microsoft.com/office/word/2018/wordml/cex" xmlns:w16cid="http://schemas.microsoft.com/office/word/2016/wordml/cid" xmlns:w16="http://schemas.microsoft.com/office/word/2018/wordml" xmlns:w16du="http://schemas.microsoft.com/office/word/2023/wordml/word16du" xmlns:w16sdtdh="http://schemas.microsoft.com/office/word/2020/wordml/sdtdatahash" xmlns:w16sdtfl="http://schemas.microsoft.com/office/word/2024/wordml/sdtformatlock" xmlns:w16se="http://schemas.microsoft.com/office/word/2015/wordml/symex" xmlns:wpg="http://schemas.microsoft.com/office/word/2010/wordprocessingGroup" xmlns:wpi="http://schemas.microsoft.com/office/word/2010/wordprocessingInk" xmlns:wne="http://schemas.microsoft.com/office/word/2006/wordml" xmlns:wps="http://schemas.microsoft.com/office/word/2010/wordprocessingShape" mc:Ignorable="w14 w15 w16se w16cid w16 w16cex w16sdtdh w16sdtfl w16du wp14">
   <w:sdt>
     <w:sdtPr>
       <w:id w:val="1146784156"/>
@@ -5567,7 +4855,7 @@
 </file>
 
 <file path=word/footnotes.xml><?xml version="1.0" encoding="utf-8"?>
-<w:footnotes xmlns:wpc="http://schemas.microsoft.com/office/word/2010/wordprocessingCanvas" xmlns:cx="http://schemas.microsoft.com/office/drawing/2014/chartex" xmlns:cx1="http://schemas.microsoft.com/office/drawing/2015/9/8/chartex" xmlns:cx2="http://schemas.microsoft.com/office/drawing/2015/10/21/chartex" xmlns:cx3="http://schemas.microsoft.com/office/drawing/2016/5/9/chartex" xmlns:cx4="http://schemas.microsoft.com/office/drawing/2016/5/10/chartex" xmlns:cx5="http://schemas.microsoft.com/office/drawing/2016/5/11/chartex" xmlns:cx6="http://schemas.microsoft.com/office/drawing/2016/5/12/chartex" xmlns:cx7="http://schemas.microsoft.com/office/drawing/2016/5/13/chartex" xmlns:cx8="http://schemas.microsoft.com/office/drawing/2016/5/14/chartex" xmlns:mc="http://schemas.openxmlformats.org/markup-compatibility/2006" xmlns:aink="http://schemas.microsoft.com/office/drawing/2016/ink" xmlns:am3d="http://schemas.microsoft.com/office/drawing/2017/model3d" xmlns:o="urn:schemas-microsoft-com:office:office" xmlns:oel="http://schemas.microsoft.com/office/2019/extlst" xmlns:r="http://schemas.openxmlformats.org/officeDocument/2006/relationships" xmlns:m="http://schemas.openxmlformats.org/officeDocument/2006/math" xmlns:v="urn:schemas-microsoft-com:vml" xmlns:wp14="http://schemas.microsoft.com/office/word/2010/wordprocessingDrawing" xmlns:wp="http://schemas.openxmlformats.org/drawingml/2006/wordprocessingDrawing" xmlns:w10="urn:schemas-microsoft-com:office:word" xmlns:w="http://schemas.openxmlformats.org/wordprocessingml/2006/main" xmlns:w14="http://schemas.microsoft.com/office/word/2010/wordml" xmlns:w15="http://schemas.microsoft.com/office/word/2012/wordml" xmlns:w16cex="http://schemas.microsoft.com/office/word/2018/wordml/cex" xmlns:w16cid="http://schemas.microsoft.com/office/word/2016/wordml/cid" xmlns:w16="http://schemas.microsoft.com/office/word/2018/wordml" xmlns:w16sdtdh="http://schemas.microsoft.com/office/word/2020/wordml/sdtdatahash" xmlns:w16se="http://schemas.microsoft.com/office/word/2015/wordml/symex" xmlns:wpg="http://schemas.microsoft.com/office/word/2010/wordprocessingGroup" xmlns:wpi="http://schemas.microsoft.com/office/word/2010/wordprocessingInk" xmlns:wne="http://schemas.microsoft.com/office/word/2006/wordml" xmlns:wps="http://schemas.microsoft.com/office/word/2010/wordprocessingShape" mc:Ignorable="w14 w15 w16se w16cid w16 w16cex w16sdtdh wp14">
+<w:footnotes xmlns:wpc="http://schemas.microsoft.com/office/word/2010/wordprocessingCanvas" xmlns:cx="http://schemas.microsoft.com/office/drawing/2014/chartex" xmlns:cx1="http://schemas.microsoft.com/office/drawing/2015/9/8/chartex" xmlns:cx2="http://schemas.microsoft.com/office/drawing/2015/10/21/chartex" xmlns:cx3="http://schemas.microsoft.com/office/drawing/2016/5/9/chartex" xmlns:cx4="http://schemas.microsoft.com/office/drawing/2016/5/10/chartex" xmlns:cx5="http://schemas.microsoft.com/office/drawing/2016/5/11/chartex" xmlns:cx6="http://schemas.microsoft.com/office/drawing/2016/5/12/chartex" xmlns:cx7="http://schemas.microsoft.com/office/drawing/2016/5/13/chartex" xmlns:cx8="http://schemas.microsoft.com/office/drawing/2016/5/14/chartex" xmlns:mc="http://schemas.openxmlformats.org/markup-compatibility/2006" xmlns:aink="http://schemas.microsoft.com/office/drawing/2016/ink" xmlns:am3d="http://schemas.microsoft.com/office/drawing/2017/model3d" xmlns:o="urn:schemas-microsoft-com:office:office" xmlns:oel="http://schemas.microsoft.com/office/2019/extlst" xmlns:r="http://schemas.openxmlformats.org/officeDocument/2006/relationships" xmlns:m="http://schemas.openxmlformats.org/officeDocument/2006/math" xmlns:v="urn:schemas-microsoft-com:vml" xmlns:wp14="http://schemas.microsoft.com/office/word/2010/wordprocessingDrawing" xmlns:wp="http://schemas.openxmlformats.org/drawingml/2006/wordprocessingDrawing" xmlns:w10="urn:schemas-microsoft-com:office:word" xmlns:w="http://schemas.openxmlformats.org/wordprocessingml/2006/main" xmlns:w14="http://schemas.microsoft.com/office/word/2010/wordml" xmlns:w15="http://schemas.microsoft.com/office/word/2012/wordml" xmlns:w16cex="http://schemas.microsoft.com/office/word/2018/wordml/cex" xmlns:w16cid="http://schemas.microsoft.com/office/word/2016/wordml/cid" xmlns:w16="http://schemas.microsoft.com/office/word/2018/wordml" xmlns:w16du="http://schemas.microsoft.com/office/word/2023/wordml/word16du" xmlns:w16sdtdh="http://schemas.microsoft.com/office/word/2020/wordml/sdtdatahash" xmlns:w16sdtfl="http://schemas.microsoft.com/office/word/2024/wordml/sdtformatlock" xmlns:w16se="http://schemas.microsoft.com/office/word/2015/wordml/symex" xmlns:wpg="http://schemas.microsoft.com/office/word/2010/wordprocessingGroup" xmlns:wpi="http://schemas.microsoft.com/office/word/2010/wordprocessingInk" xmlns:wne="http://schemas.microsoft.com/office/word/2006/wordml" xmlns:wps="http://schemas.microsoft.com/office/word/2010/wordprocessingShape" mc:Ignorable="w14 w15 w16se w16cid w16 w16cex w16sdtdh w16sdtfl w16du wp14">
   <w:footnote w:type="separator" w:id="-1">
     <w:p>
       <w:pPr>
@@ -5592,7 +4880,7 @@
 </file>
 
 <file path=word/header1.xml><?xml version="1.0" encoding="utf-8"?>
-<w:hdr xmlns:wpc="http://schemas.microsoft.com/office/word/2010/wordprocessingCanvas" xmlns:cx="http://schemas.microsoft.com/office/drawing/2014/chartex" xmlns:cx1="http://schemas.microsoft.com/office/drawing/2015/9/8/chartex" xmlns:cx2="http://schemas.microsoft.com/office/drawing/2015/10/21/chartex" xmlns:cx3="http://schemas.microsoft.com/office/drawing/2016/5/9/chartex" xmlns:cx4="http://schemas.microsoft.com/office/drawing/2016/5/10/chartex" xmlns:cx5="http://schemas.microsoft.com/office/drawing/2016/5/11/chartex" xmlns:cx6="http://schemas.microsoft.com/office/drawing/2016/5/12/chartex" xmlns:cx7="http://schemas.microsoft.com/office/drawing/2016/5/13/chartex" xmlns:cx8="http://schemas.microsoft.com/office/drawing/2016/5/14/chartex" xmlns:mc="http://schemas.openxmlformats.org/markup-compatibility/2006" xmlns:aink="http://schemas.microsoft.com/office/drawing/2016/ink" xmlns:am3d="http://schemas.microsoft.com/office/drawing/2017/model3d" xmlns:o="urn:schemas-microsoft-com:office:office" xmlns:oel="http://schemas.microsoft.com/office/2019/extlst" xmlns:r="http://schemas.openxmlformats.org/officeDocument/2006/relationships" xmlns:m="http://schemas.openxmlformats.org/officeDocument/2006/math" xmlns:v="urn:schemas-microsoft-com:vml" xmlns:wp14="http://schemas.microsoft.com/office/word/2010/wordprocessingDrawing" xmlns:wp="http://schemas.openxmlformats.org/drawingml/2006/wordprocessingDrawing" xmlns:w10="urn:schemas-microsoft-com:office:word" xmlns:w="http://schemas.openxmlformats.org/wordprocessingml/2006/main" xmlns:w14="http://schemas.microsoft.com/office/word/2010/wordml" xmlns:w15="http://schemas.microsoft.com/office/word/2012/wordml" xmlns:w16cex="http://schemas.microsoft.com/office/word/2018/wordml/cex" xmlns:w16cid="http://schemas.microsoft.com/office/word/2016/wordml/cid" xmlns:w16="http://schemas.microsoft.com/office/word/2018/wordml" xmlns:w16sdtdh="http://schemas.microsoft.com/office/word/2020/wordml/sdtdatahash" xmlns:w16se="http://schemas.microsoft.com/office/word/2015/wordml/symex" xmlns:wpg="http://schemas.microsoft.com/office/word/2010/wordprocessingGroup" xmlns:wpi="http://schemas.microsoft.com/office/word/2010/wordprocessingInk" xmlns:wne="http://schemas.microsoft.com/office/word/2006/wordml" xmlns:wps="http://schemas.microsoft.com/office/word/2010/wordprocessingShape" mc:Ignorable="w14 w15 w16se w16cid w16 w16cex w16sdtdh wp14">
+<w:hdr xmlns:wpc="http://schemas.microsoft.com/office/word/2010/wordprocessingCanvas" xmlns:cx="http://schemas.microsoft.com/office/drawing/2014/chartex" xmlns:cx1="http://schemas.microsoft.com/office/drawing/2015/9/8/chartex" xmlns:cx2="http://schemas.microsoft.com/office/drawing/2015/10/21/chartex" xmlns:cx3="http://schemas.microsoft.com/office/drawing/2016/5/9/chartex" xmlns:cx4="http://schemas.microsoft.com/office/drawing/2016/5/10/chartex" xmlns:cx5="http://schemas.microsoft.com/office/drawing/2016/5/11/chartex" xmlns:cx6="http://schemas.microsoft.com/office/drawing/2016/5/12/chartex" xmlns:cx7="http://schemas.microsoft.com/office/drawing/2016/5/13/chartex" xmlns:cx8="http://schemas.microsoft.com/office/drawing/2016/5/14/chartex" xmlns:mc="http://schemas.openxmlformats.org/markup-compatibility/2006" xmlns:aink="http://schemas.microsoft.com/office/drawing/2016/ink" xmlns:am3d="http://schemas.microsoft.com/office/drawing/2017/model3d" xmlns:o="urn:schemas-microsoft-com:office:office" xmlns:oel="http://schemas.microsoft.com/office/2019/extlst" xmlns:r="http://schemas.openxmlformats.org/officeDocument/2006/relationships" xmlns:m="http://schemas.openxmlformats.org/officeDocument/2006/math" xmlns:v="urn:schemas-microsoft-com:vml" xmlns:wp14="http://schemas.microsoft.com/office/word/2010/wordprocessingDrawing" xmlns:wp="http://schemas.openxmlformats.org/drawingml/2006/wordprocessingDrawing" xmlns:w10="urn:schemas-microsoft-com:office:word" xmlns:w="http://schemas.openxmlformats.org/wordprocessingml/2006/main" xmlns:w14="http://schemas.microsoft.com/office/word/2010/wordml" xmlns:w15="http://schemas.microsoft.com/office/word/2012/wordml" xmlns:w16cex="http://schemas.microsoft.com/office/word/2018/wordml/cex" xmlns:w16cid="http://schemas.microsoft.com/office/word/2016/wordml/cid" xmlns:w16="http://schemas.microsoft.com/office/word/2018/wordml" xmlns:w16du="http://schemas.microsoft.com/office/word/2023/wordml/word16du" xmlns:w16sdtdh="http://schemas.microsoft.com/office/word/2020/wordml/sdtdatahash" xmlns:w16sdtfl="http://schemas.microsoft.com/office/word/2024/wordml/sdtformatlock" xmlns:w16se="http://schemas.microsoft.com/office/word/2015/wordml/symex" xmlns:wpg="http://schemas.microsoft.com/office/word/2010/wordprocessingGroup" xmlns:wpi="http://schemas.microsoft.com/office/word/2010/wordprocessingInk" xmlns:wne="http://schemas.microsoft.com/office/word/2006/wordml" xmlns:wps="http://schemas.microsoft.com/office/word/2010/wordprocessingShape" mc:Ignorable="w14 w15 w16se w16cid w16 w16cex w16sdtdh w16sdtfl w16du wp14">
   <w:p>
     <w:pPr>
       <w:pStyle w:val="Cabealho"/>
@@ -5674,7 +4962,7 @@
 </file>
 
 <file path=word/numbering.xml><?xml version="1.0" encoding="utf-8"?>
-<w:numbering xmlns:wpc="http://schemas.microsoft.com/office/word/2010/wordprocessingCanvas" xmlns:cx="http://schemas.microsoft.com/office/drawing/2014/chartex" xmlns:cx1="http://schemas.microsoft.com/office/drawing/2015/9/8/chartex" xmlns:cx2="http://schemas.microsoft.com/office/drawing/2015/10/21/chartex" xmlns:cx3="http://schemas.microsoft.com/office/drawing/2016/5/9/chartex" xmlns:cx4="http://schemas.microsoft.com/office/drawing/2016/5/10/chartex" xmlns:cx5="http://schemas.microsoft.com/office/drawing/2016/5/11/chartex" xmlns:cx6="http://schemas.microsoft.com/office/drawing/2016/5/12/chartex" xmlns:cx7="http://schemas.microsoft.com/office/drawing/2016/5/13/chartex" xmlns:cx8="http://schemas.microsoft.com/office/drawing/2016/5/14/chartex" xmlns:mc="http://schemas.openxmlformats.org/markup-compatibility/2006" xmlns:aink="http://schemas.microsoft.com/office/drawing/2016/ink" xmlns:am3d="http://schemas.microsoft.com/office/drawing/2017/model3d" xmlns:o="urn:schemas-microsoft-com:office:office" xmlns:oel="http://schemas.microsoft.com/office/2019/extlst" xmlns:r="http://schemas.openxmlformats.org/officeDocument/2006/relationships" xmlns:m="http://schemas.openxmlformats.org/officeDocument/2006/math" xmlns:v="urn:schemas-microsoft-com:vml" xmlns:wp14="http://schemas.microsoft.com/office/word/2010/wordprocessingDrawing" xmlns:wp="http://schemas.openxmlformats.org/drawingml/2006/wordprocessingDrawing" xmlns:w10="urn:schemas-microsoft-com:office:word" xmlns:w="http://schemas.openxmlformats.org/wordprocessingml/2006/main" xmlns:w14="http://schemas.microsoft.com/office/word/2010/wordml" xmlns:w15="http://schemas.microsoft.com/office/word/2012/wordml" xmlns:w16cex="http://schemas.microsoft.com/office/word/2018/wordml/cex" xmlns:w16cid="http://schemas.microsoft.com/office/word/2016/wordml/cid" xmlns:w16="http://schemas.microsoft.com/office/word/2018/wordml" xmlns:w16sdtdh="http://schemas.microsoft.com/office/word/2020/wordml/sdtdatahash" xmlns:w16se="http://schemas.microsoft.com/office/word/2015/wordml/symex" xmlns:wpg="http://schemas.microsoft.com/office/word/2010/wordprocessingGroup" xmlns:wpi="http://schemas.microsoft.com/office/word/2010/wordprocessingInk" xmlns:wne="http://schemas.microsoft.com/office/word/2006/wordml" xmlns:wps="http://schemas.microsoft.com/office/word/2010/wordprocessingShape" mc:Ignorable="w14 w15 w16se w16cid w16 w16cex w16sdtdh wp14">
+<w:numbering xmlns:wpc="http://schemas.microsoft.com/office/word/2010/wordprocessingCanvas" xmlns:cx="http://schemas.microsoft.com/office/drawing/2014/chartex" xmlns:cx1="http://schemas.microsoft.com/office/drawing/2015/9/8/chartex" xmlns:cx2="http://schemas.microsoft.com/office/drawing/2015/10/21/chartex" xmlns:cx3="http://schemas.microsoft.com/office/drawing/2016/5/9/chartex" xmlns:cx4="http://schemas.microsoft.com/office/drawing/2016/5/10/chartex" xmlns:cx5="http://schemas.microsoft.com/office/drawing/2016/5/11/chartex" xmlns:cx6="http://schemas.microsoft.com/office/drawing/2016/5/12/chartex" xmlns:cx7="http://schemas.microsoft.com/office/drawing/2016/5/13/chartex" xmlns:cx8="http://schemas.microsoft.com/office/drawing/2016/5/14/chartex" xmlns:mc="http://schemas.openxmlformats.org/markup-compatibility/2006" xmlns:aink="http://schemas.microsoft.com/office/drawing/2016/ink" xmlns:am3d="http://schemas.microsoft.com/office/drawing/2017/model3d" xmlns:o="urn:schemas-microsoft-com:office:office" xmlns:oel="http://schemas.microsoft.com/office/2019/extlst" xmlns:r="http://schemas.openxmlformats.org/officeDocument/2006/relationships" xmlns:m="http://schemas.openxmlformats.org/officeDocument/2006/math" xmlns:v="urn:schemas-microsoft-com:vml" xmlns:wp14="http://schemas.microsoft.com/office/word/2010/wordprocessingDrawing" xmlns:wp="http://schemas.openxmlformats.org/drawingml/2006/wordprocessingDrawing" xmlns:w10="urn:schemas-microsoft-com:office:word" xmlns:w="http://schemas.openxmlformats.org/wordprocessingml/2006/main" xmlns:w14="http://schemas.microsoft.com/office/word/2010/wordml" xmlns:w15="http://schemas.microsoft.com/office/word/2012/wordml" xmlns:w16cex="http://schemas.microsoft.com/office/word/2018/wordml/cex" xmlns:w16cid="http://schemas.microsoft.com/office/word/2016/wordml/cid" xmlns:w16="http://schemas.microsoft.com/office/word/2018/wordml" xmlns:w16du="http://schemas.microsoft.com/office/word/2023/wordml/word16du" xmlns:w16sdtdh="http://schemas.microsoft.com/office/word/2020/wordml/sdtdatahash" xmlns:w16sdtfl="http://schemas.microsoft.com/office/word/2024/wordml/sdtformatlock" xmlns:w16se="http://schemas.microsoft.com/office/word/2015/wordml/symex" xmlns:wpg="http://schemas.microsoft.com/office/word/2010/wordprocessingGroup" xmlns:wpi="http://schemas.microsoft.com/office/word/2010/wordprocessingInk" xmlns:wne="http://schemas.microsoft.com/office/word/2006/wordml" xmlns:wps="http://schemas.microsoft.com/office/word/2010/wordprocessingShape" mc:Ignorable="w14 w15 w16se w16cid w16 w16cex w16sdtdh w16sdtfl w16du wp14">
   <w:abstractNum w:abstractNumId="0" w15:restartNumberingAfterBreak="0">
     <w:nsid w:val="32D9745D"/>
     <w:multiLevelType w:val="multilevel"/>
@@ -6241,7 +5529,7 @@
 </file>
 
 <file path=word/styles.xml><?xml version="1.0" encoding="utf-8"?>
-<w:styles xmlns:mc="http://schemas.openxmlformats.org/markup-compatibility/2006" xmlns:r="http://schemas.openxmlformats.org/officeDocument/2006/relationships" xmlns:w="http://schemas.openxmlformats.org/wordprocessingml/2006/main" xmlns:w14="http://schemas.microsoft.com/office/word/2010/wordml" xmlns:w15="http://schemas.microsoft.com/office/word/2012/wordml" xmlns:w16cex="http://schemas.microsoft.com/office/word/2018/wordml/cex" xmlns:w16cid="http://schemas.microsoft.com/office/word/2016/wordml/cid" xmlns:w16="http://schemas.microsoft.com/office/word/2018/wordml" xmlns:w16sdtdh="http://schemas.microsoft.com/office/word/2020/wordml/sdtdatahash" xmlns:w16se="http://schemas.microsoft.com/office/word/2015/wordml/symex" mc:Ignorable="w14 w15 w16se w16cid w16 w16cex w16sdtdh">
+<w:styles xmlns:mc="http://schemas.openxmlformats.org/markup-compatibility/2006" xmlns:r="http://schemas.openxmlformats.org/officeDocument/2006/relationships" xmlns:w="http://schemas.openxmlformats.org/wordprocessingml/2006/main" xmlns:w14="http://schemas.microsoft.com/office/word/2010/wordml" xmlns:w15="http://schemas.microsoft.com/office/word/2012/wordml" xmlns:w16cex="http://schemas.microsoft.com/office/word/2018/wordml/cex" xmlns:w16cid="http://schemas.microsoft.com/office/word/2016/wordml/cid" xmlns:w16="http://schemas.microsoft.com/office/word/2018/wordml" xmlns:w16du="http://schemas.microsoft.com/office/word/2023/wordml/word16du" xmlns:w16sdtdh="http://schemas.microsoft.com/office/word/2020/wordml/sdtdatahash" xmlns:w16sdtfl="http://schemas.microsoft.com/office/word/2024/wordml/sdtformatlock" xmlns:w16se="http://schemas.microsoft.com/office/word/2015/wordml/symex" mc:Ignorable="w14 w15 w16se w16cid w16 w16cex w16sdtdh w16sdtfl w16du">
   <w:docDefaults>
     <w:rPrDefault>
       <w:rPr>

</xml_diff>

<commit_message>
havia faltado a legenda da imagem do Trello, adicionei
</commit_message>
<xml_diff>
--- a/Documentação/ALittlePieceOfMySoul.docx
+++ b/Documentação/ALittlePieceOfMySoul.docx
@@ -272,7 +272,7 @@
               </wp:inline>
             </w:drawing>
           </mc:Choice>
-          <mc:Fallback xmlns:w16du="http://schemas.microsoft.com/office/word/2023/wordml/word16du" xmlns:w16sdtfl="http://schemas.microsoft.com/office/word/2024/wordml/sdtformatlock">
+          <mc:Fallback xmlns:w16sdtfl="http://schemas.microsoft.com/office/word/2024/wordml/sdtformatlock" xmlns:w16du="http://schemas.microsoft.com/office/word/2023/wordml/word16du">
             <w:pict>
               <v:rect w14:anchorId="72F8005B" id="Retângulo 1" o:spid="_x0000_s1026" alt="logo" style="width:24pt;height:24pt;visibility:visible;mso-wrap-style:square;mso-left-percent:-10001;mso-top-percent:-10001;mso-position-horizontal:absolute;mso-position-horizontal-relative:char;mso-position-vertical:absolute;mso-position-vertical-relative:line;mso-left-percent:-10001;mso-top-percent:-10001;v-text-anchor:top" o:gfxdata="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" filled="f" stroked="f">
                 <o:lock v:ext="edit" aspectratio="t"/>
@@ -2621,73 +2621,7 @@
           <w:szCs w:val="24"/>
           <w:lang w:eastAsia="en-US"/>
         </w:rPr>
-        <w:t xml:space="preserve">Uma das pioneiras no estilo e vestimenta gótica foi Siouxsie Sioux, vocalista do Siouxsie </w:t>
-      </w:r>
-      <w:proofErr w:type="spellStart"/>
-      <w:r>
-        <w:rPr>
-          <w:rFonts w:ascii="Arial" w:hAnsi="Arial" w:cs="Arial"/>
-          <w:color w:val="FFFFFF" w:themeColor="background1"/>
-          <w:sz w:val="24"/>
-          <w:szCs w:val="24"/>
-          <w:lang w:eastAsia="en-US"/>
-        </w:rPr>
-        <w:t>and</w:t>
-      </w:r>
-      <w:proofErr w:type="spellEnd"/>
-      <w:r>
-        <w:rPr>
-          <w:rFonts w:ascii="Arial" w:hAnsi="Arial" w:cs="Arial"/>
-          <w:color w:val="FFFFFF" w:themeColor="background1"/>
-          <w:sz w:val="24"/>
-          <w:szCs w:val="24"/>
-          <w:lang w:eastAsia="en-US"/>
-        </w:rPr>
-        <w:t xml:space="preserve"> </w:t>
-      </w:r>
-      <w:proofErr w:type="spellStart"/>
-      <w:r>
-        <w:rPr>
-          <w:rFonts w:ascii="Arial" w:hAnsi="Arial" w:cs="Arial"/>
-          <w:color w:val="FFFFFF" w:themeColor="background1"/>
-          <w:sz w:val="24"/>
-          <w:szCs w:val="24"/>
-          <w:lang w:eastAsia="en-US"/>
-        </w:rPr>
-        <w:t>the</w:t>
-      </w:r>
-      <w:proofErr w:type="spellEnd"/>
-      <w:r>
-        <w:rPr>
-          <w:rFonts w:ascii="Arial" w:hAnsi="Arial" w:cs="Arial"/>
-          <w:color w:val="FFFFFF" w:themeColor="background1"/>
-          <w:sz w:val="24"/>
-          <w:szCs w:val="24"/>
-          <w:lang w:eastAsia="en-US"/>
-        </w:rPr>
-        <w:t xml:space="preserve"> </w:t>
-      </w:r>
-      <w:proofErr w:type="spellStart"/>
-      <w:r>
-        <w:rPr>
-          <w:rFonts w:ascii="Arial" w:hAnsi="Arial" w:cs="Arial"/>
-          <w:color w:val="FFFFFF" w:themeColor="background1"/>
-          <w:sz w:val="24"/>
-          <w:szCs w:val="24"/>
-          <w:lang w:eastAsia="en-US"/>
-        </w:rPr>
-        <w:t>Banshees</w:t>
-      </w:r>
-      <w:proofErr w:type="spellEnd"/>
-      <w:r>
-        <w:rPr>
-          <w:rFonts w:ascii="Arial" w:hAnsi="Arial" w:cs="Arial"/>
-          <w:color w:val="FFFFFF" w:themeColor="background1"/>
-          <w:sz w:val="24"/>
-          <w:szCs w:val="24"/>
-          <w:lang w:eastAsia="en-US"/>
-        </w:rPr>
-        <w:t>.</w:t>
+        <w:t>Uma das pioneiras no estilo e vestimenta gótica foi Siouxsie Sioux, vocalista do Siouxsie and the Banshees.</w:t>
       </w:r>
     </w:p>
     <w:p>
@@ -2705,7 +2639,7 @@
         </w:rPr>
         <w:lastRenderedPageBreak/>
         <w:drawing>
-          <wp:inline distT="0" distB="0" distL="0" distR="0" wp14:anchorId="258DA283" wp14:editId="1330C360">
+          <wp:inline distT="0" distB="0" distL="0" distR="0" wp14:anchorId="258DA283" wp14:editId="69A8F6B3">
             <wp:extent cx="2417197" cy="2582629"/>
             <wp:effectExtent l="0" t="0" r="2540" b="8255"/>
             <wp:docPr id="1" name="Imagem 1" descr="O que vcs acham de Siouxsie and the banshees? : r/MusicaBR"/>
@@ -2912,53 +2846,8 @@
           <w:szCs w:val="24"/>
           <w:lang w:eastAsia="en-US"/>
         </w:rPr>
-        <w:t xml:space="preserve">Dos clássicos como </w:t>
-      </w:r>
-      <w:proofErr w:type="spellStart"/>
-      <w:r>
-        <w:rPr>
-          <w:rFonts w:ascii="Arial" w:hAnsi="Arial" w:cs="Arial"/>
-          <w:color w:val="FFFFFF" w:themeColor="background1"/>
-          <w:sz w:val="24"/>
-          <w:szCs w:val="24"/>
-          <w:lang w:eastAsia="en-US"/>
-        </w:rPr>
-        <w:t>Nosferatu</w:t>
-      </w:r>
-      <w:proofErr w:type="spellEnd"/>
-      <w:r>
-        <w:rPr>
-          <w:rFonts w:ascii="Arial" w:hAnsi="Arial" w:cs="Arial"/>
-          <w:color w:val="FFFFFF" w:themeColor="background1"/>
-          <w:sz w:val="24"/>
-          <w:szCs w:val="24"/>
-          <w:lang w:eastAsia="en-US"/>
-        </w:rPr>
-        <w:t xml:space="preserve"> (1922) e London </w:t>
-      </w:r>
-      <w:proofErr w:type="spellStart"/>
-      <w:r>
-        <w:rPr>
-          <w:rFonts w:ascii="Arial" w:hAnsi="Arial" w:cs="Arial"/>
-          <w:color w:val="FFFFFF" w:themeColor="background1"/>
-          <w:sz w:val="24"/>
-          <w:szCs w:val="24"/>
-          <w:lang w:eastAsia="en-US"/>
-        </w:rPr>
-        <w:t>After</w:t>
-      </w:r>
-      <w:proofErr w:type="spellEnd"/>
-      <w:r>
-        <w:rPr>
-          <w:rFonts w:ascii="Arial" w:hAnsi="Arial" w:cs="Arial"/>
-          <w:color w:val="FFFFFF" w:themeColor="background1"/>
-          <w:sz w:val="24"/>
-          <w:szCs w:val="24"/>
-          <w:lang w:eastAsia="en-US"/>
-        </w:rPr>
-        <w:t xml:space="preserve"> Midnight (1927) ao cinema gótico moderno, como O Corvo (1994) ou as animações em </w:t>
-      </w:r>
-      <w:proofErr w:type="spellStart"/>
+        <w:t xml:space="preserve">Dos clássicos como Nosferatu (1922) e London After Midnight (1927) ao cinema gótico moderno, como O Corvo (1994) ou as animações em </w:t>
+      </w:r>
       <w:r>
         <w:rPr>
           <w:rFonts w:ascii="Arial" w:hAnsi="Arial" w:cs="Arial"/>
@@ -2971,7 +2860,6 @@
         </w:rPr>
         <w:t>stop-motion</w:t>
       </w:r>
-      <w:proofErr w:type="spellEnd"/>
       <w:r>
         <w:rPr>
           <w:rFonts w:ascii="Arial" w:hAnsi="Arial" w:cs="Arial"/>
@@ -3052,27 +2940,7 @@
                                 <w:bCs/>
                                 <w:color w:val="FFFFFF" w:themeColor="background1"/>
                               </w:rPr>
-                              <w:t xml:space="preserve">Figura 3: London </w:t>
-                            </w:r>
-                            <w:proofErr w:type="spellStart"/>
-                            <w:r>
-                              <w:rPr>
-                                <w:rFonts w:ascii="Arial" w:hAnsi="Arial" w:cs="Arial"/>
-                                <w:b/>
-                                <w:bCs/>
-                                <w:color w:val="FFFFFF" w:themeColor="background1"/>
-                              </w:rPr>
-                              <w:t>After</w:t>
-                            </w:r>
-                            <w:proofErr w:type="spellEnd"/>
-                            <w:r>
-                              <w:rPr>
-                                <w:rFonts w:ascii="Arial" w:hAnsi="Arial" w:cs="Arial"/>
-                                <w:b/>
-                                <w:bCs/>
-                                <w:color w:val="FFFFFF" w:themeColor="background1"/>
-                              </w:rPr>
-                              <w:t xml:space="preserve"> Midnight (1927)</w:t>
+                              <w:t>Figura 3: London After Midnight (1927)</w:t>
                             </w:r>
                           </w:p>
                         </w:txbxContent>
@@ -3118,27 +2986,7 @@
                           <w:bCs/>
                           <w:color w:val="FFFFFF" w:themeColor="background1"/>
                         </w:rPr>
-                        <w:t xml:space="preserve">Figura 3: London </w:t>
-                      </w:r>
-                      <w:proofErr w:type="spellStart"/>
-                      <w:r>
-                        <w:rPr>
-                          <w:rFonts w:ascii="Arial" w:hAnsi="Arial" w:cs="Arial"/>
-                          <w:b/>
-                          <w:bCs/>
-                          <w:color w:val="FFFFFF" w:themeColor="background1"/>
-                        </w:rPr>
-                        <w:t>After</w:t>
-                      </w:r>
-                      <w:proofErr w:type="spellEnd"/>
-                      <w:r>
-                        <w:rPr>
-                          <w:rFonts w:ascii="Arial" w:hAnsi="Arial" w:cs="Arial"/>
-                          <w:b/>
-                          <w:bCs/>
-                          <w:color w:val="FFFFFF" w:themeColor="background1"/>
-                        </w:rPr>
-                        <w:t xml:space="preserve"> Midnight (1927)</w:t>
+                        <w:t>Figura 3: London After Midnight (1927)</w:t>
                       </w:r>
                     </w:p>
                   </w:txbxContent>
@@ -3289,27 +3137,7 @@
           <w:bCs/>
           <w:color w:val="FFFFFF" w:themeColor="background1"/>
         </w:rPr>
-        <w:t xml:space="preserve">Figura 2: </w:t>
-      </w:r>
-      <w:proofErr w:type="spellStart"/>
-      <w:r>
-        <w:rPr>
-          <w:rFonts w:ascii="Arial" w:hAnsi="Arial" w:cs="Arial"/>
-          <w:b/>
-          <w:bCs/>
-          <w:color w:val="FFFFFF" w:themeColor="background1"/>
-        </w:rPr>
-        <w:t>Nosferatu</w:t>
-      </w:r>
-      <w:proofErr w:type="spellEnd"/>
-      <w:r>
-        <w:rPr>
-          <w:rFonts w:ascii="Arial" w:hAnsi="Arial" w:cs="Arial"/>
-          <w:b/>
-          <w:bCs/>
-          <w:color w:val="FFFFFF" w:themeColor="background1"/>
-        </w:rPr>
-        <w:t xml:space="preserve"> (1922)</w:t>
+        <w:t>Figura 2: Nosferatu (1922)</w:t>
       </w:r>
     </w:p>
     <w:p>
@@ -3645,7 +3473,7 @@
           <w:color w:val="FFFFFF" w:themeColor="background1"/>
         </w:rPr>
         <w:drawing>
-          <wp:anchor distT="0" distB="0" distL="114300" distR="114300" simplePos="0" relativeHeight="251659264" behindDoc="0" locked="0" layoutInCell="1" allowOverlap="1" wp14:anchorId="6D2595A6" wp14:editId="43F46E1A">
+          <wp:anchor distT="0" distB="0" distL="114300" distR="114300" simplePos="0" relativeHeight="251659264" behindDoc="0" locked="0" layoutInCell="1" allowOverlap="1" wp14:anchorId="6D2595A6" wp14:editId="33D76776">
             <wp:simplePos x="0" y="0"/>
             <wp:positionH relativeFrom="column">
               <wp:posOffset>-698472</wp:posOffset>
@@ -3744,139 +3572,7 @@
           <w:szCs w:val="24"/>
           <w:lang w:eastAsia="en-US"/>
         </w:rPr>
-        <w:t xml:space="preserve">A música é o coração da subcultura gótica, e a banda pioneira foi o Bauhaus, com seu clássico som experimental Bela </w:t>
-      </w:r>
-      <w:proofErr w:type="spellStart"/>
-      <w:r>
-        <w:rPr>
-          <w:rFonts w:ascii="Arial" w:hAnsi="Arial" w:cs="Arial"/>
-          <w:color w:val="FFFFFF" w:themeColor="background1"/>
-          <w:sz w:val="24"/>
-          <w:szCs w:val="24"/>
-          <w:lang w:eastAsia="en-US"/>
-        </w:rPr>
-        <w:t>Lugosi’s</w:t>
-      </w:r>
-      <w:proofErr w:type="spellEnd"/>
-      <w:r>
-        <w:rPr>
-          <w:rFonts w:ascii="Arial" w:hAnsi="Arial" w:cs="Arial"/>
-          <w:color w:val="FFFFFF" w:themeColor="background1"/>
-          <w:sz w:val="24"/>
-          <w:szCs w:val="24"/>
-          <w:lang w:eastAsia="en-US"/>
-        </w:rPr>
-        <w:t xml:space="preserve"> </w:t>
-      </w:r>
-      <w:proofErr w:type="spellStart"/>
-      <w:r>
-        <w:rPr>
-          <w:rFonts w:ascii="Arial" w:hAnsi="Arial" w:cs="Arial"/>
-          <w:color w:val="FFFFFF" w:themeColor="background1"/>
-          <w:sz w:val="24"/>
-          <w:szCs w:val="24"/>
-          <w:lang w:eastAsia="en-US"/>
-        </w:rPr>
-        <w:t>Dead</w:t>
-      </w:r>
-      <w:proofErr w:type="spellEnd"/>
-      <w:r>
-        <w:rPr>
-          <w:rFonts w:ascii="Arial" w:hAnsi="Arial" w:cs="Arial"/>
-          <w:color w:val="FFFFFF" w:themeColor="background1"/>
-          <w:sz w:val="24"/>
-          <w:szCs w:val="24"/>
-          <w:lang w:eastAsia="en-US"/>
-        </w:rPr>
-        <w:t xml:space="preserve">, que conta a morte do ator Bela </w:t>
-      </w:r>
-      <w:proofErr w:type="spellStart"/>
-      <w:r>
-        <w:rPr>
-          <w:rFonts w:ascii="Arial" w:hAnsi="Arial" w:cs="Arial"/>
-          <w:color w:val="FFFFFF" w:themeColor="background1"/>
-          <w:sz w:val="24"/>
-          <w:szCs w:val="24"/>
-          <w:lang w:eastAsia="en-US"/>
-        </w:rPr>
-        <w:t>Lugosi</w:t>
-      </w:r>
-      <w:proofErr w:type="spellEnd"/>
-      <w:r>
-        <w:rPr>
-          <w:rFonts w:ascii="Arial" w:hAnsi="Arial" w:cs="Arial"/>
-          <w:color w:val="FFFFFF" w:themeColor="background1"/>
-          <w:sz w:val="24"/>
-          <w:szCs w:val="24"/>
-          <w:lang w:eastAsia="en-US"/>
-        </w:rPr>
-        <w:t xml:space="preserve">, que interpretou o Drácula. The Cure e Siouxsie </w:t>
-      </w:r>
-      <w:proofErr w:type="spellStart"/>
-      <w:r>
-        <w:rPr>
-          <w:rFonts w:ascii="Arial" w:hAnsi="Arial" w:cs="Arial"/>
-          <w:color w:val="FFFFFF" w:themeColor="background1"/>
-          <w:sz w:val="24"/>
-          <w:szCs w:val="24"/>
-          <w:lang w:eastAsia="en-US"/>
-        </w:rPr>
-        <w:t>and</w:t>
-      </w:r>
-      <w:proofErr w:type="spellEnd"/>
-      <w:r>
-        <w:rPr>
-          <w:rFonts w:ascii="Arial" w:hAnsi="Arial" w:cs="Arial"/>
-          <w:color w:val="FFFFFF" w:themeColor="background1"/>
-          <w:sz w:val="24"/>
-          <w:szCs w:val="24"/>
-          <w:lang w:eastAsia="en-US"/>
-        </w:rPr>
-        <w:t xml:space="preserve"> </w:t>
-      </w:r>
-      <w:proofErr w:type="spellStart"/>
-      <w:r>
-        <w:rPr>
-          <w:rFonts w:ascii="Arial" w:hAnsi="Arial" w:cs="Arial"/>
-          <w:color w:val="FFFFFF" w:themeColor="background1"/>
-          <w:sz w:val="24"/>
-          <w:szCs w:val="24"/>
-          <w:lang w:eastAsia="en-US"/>
-        </w:rPr>
-        <w:t>the</w:t>
-      </w:r>
-      <w:proofErr w:type="spellEnd"/>
-      <w:r>
-        <w:rPr>
-          <w:rFonts w:ascii="Arial" w:hAnsi="Arial" w:cs="Arial"/>
-          <w:color w:val="FFFFFF" w:themeColor="background1"/>
-          <w:sz w:val="24"/>
-          <w:szCs w:val="24"/>
-          <w:lang w:eastAsia="en-US"/>
-        </w:rPr>
-        <w:t xml:space="preserve"> </w:t>
-      </w:r>
-      <w:proofErr w:type="spellStart"/>
-      <w:r>
-        <w:rPr>
-          <w:rFonts w:ascii="Arial" w:hAnsi="Arial" w:cs="Arial"/>
-          <w:color w:val="FFFFFF" w:themeColor="background1"/>
-          <w:sz w:val="24"/>
-          <w:szCs w:val="24"/>
-          <w:lang w:eastAsia="en-US"/>
-        </w:rPr>
-        <w:t>Banshees</w:t>
-      </w:r>
-      <w:proofErr w:type="spellEnd"/>
-      <w:r>
-        <w:rPr>
-          <w:rFonts w:ascii="Arial" w:hAnsi="Arial" w:cs="Arial"/>
-          <w:color w:val="FFFFFF" w:themeColor="background1"/>
-          <w:sz w:val="24"/>
-          <w:szCs w:val="24"/>
-          <w:lang w:eastAsia="en-US"/>
-        </w:rPr>
-        <w:t xml:space="preserve"> consolidaram o gênero, com letras introspectivas, românticas, atmosfera sombria e sonoridade diferente de tudo que havia na época.</w:t>
+        <w:t>A música é o coração da subcultura gótica, e a banda pioneira foi o Bauhaus, com seu clássico som experimental Bela Lugosi’s Dead, que conta a morte do ator Bela Lugosi, que interpretou o Drácula. The Cure e Siouxsie and the Banshees consolidaram o gênero, com letras introspectivas, românticas, atmosfera sombria e sonoridade diferente de tudo que havia na época.</w:t>
       </w:r>
     </w:p>
     <w:p>
@@ -4101,207 +3797,8 @@
           <w:szCs w:val="24"/>
           <w:lang w:eastAsia="en-US"/>
         </w:rPr>
-        <w:t xml:space="preserve">Conforme passar do tempo, gêneros góticos foram surgindo, como </w:t>
-      </w:r>
-      <w:proofErr w:type="spellStart"/>
-      <w:r>
-        <w:rPr>
-          <w:rFonts w:ascii="Arial" w:hAnsi="Arial" w:cs="Arial"/>
-          <w:color w:val="FFFFFF" w:themeColor="background1"/>
-          <w:sz w:val="24"/>
-          <w:szCs w:val="24"/>
-          <w:lang w:eastAsia="en-US"/>
-        </w:rPr>
-        <w:t>Darkwave</w:t>
-      </w:r>
-      <w:proofErr w:type="spellEnd"/>
-      <w:r>
-        <w:rPr>
-          <w:rFonts w:ascii="Arial" w:hAnsi="Arial" w:cs="Arial"/>
-          <w:color w:val="FFFFFF" w:themeColor="background1"/>
-          <w:sz w:val="24"/>
-          <w:szCs w:val="24"/>
-          <w:lang w:eastAsia="en-US"/>
-        </w:rPr>
-        <w:t xml:space="preserve">, Post-Punk, </w:t>
-      </w:r>
-      <w:proofErr w:type="spellStart"/>
-      <w:r>
-        <w:rPr>
-          <w:rFonts w:ascii="Arial" w:hAnsi="Arial" w:cs="Arial"/>
-          <w:color w:val="FFFFFF" w:themeColor="background1"/>
-          <w:sz w:val="24"/>
-          <w:szCs w:val="24"/>
-          <w:lang w:eastAsia="en-US"/>
-        </w:rPr>
-        <w:t>Deathrock</w:t>
-      </w:r>
-      <w:proofErr w:type="spellEnd"/>
-      <w:r>
-        <w:rPr>
-          <w:rFonts w:ascii="Arial" w:hAnsi="Arial" w:cs="Arial"/>
-          <w:color w:val="FFFFFF" w:themeColor="background1"/>
-          <w:sz w:val="24"/>
-          <w:szCs w:val="24"/>
-          <w:lang w:eastAsia="en-US"/>
-        </w:rPr>
-        <w:t xml:space="preserve"> e EBM (</w:t>
-      </w:r>
-      <w:proofErr w:type="spellStart"/>
-      <w:r>
-        <w:rPr>
-          <w:rFonts w:ascii="Arial" w:hAnsi="Arial" w:cs="Arial"/>
-          <w:color w:val="FFFFFF" w:themeColor="background1"/>
-          <w:sz w:val="24"/>
-          <w:szCs w:val="24"/>
-          <w:lang w:eastAsia="en-US"/>
-        </w:rPr>
-        <w:t>Electronic</w:t>
-      </w:r>
-      <w:proofErr w:type="spellEnd"/>
-      <w:r>
-        <w:rPr>
-          <w:rFonts w:ascii="Arial" w:hAnsi="Arial" w:cs="Arial"/>
-          <w:color w:val="FFFFFF" w:themeColor="background1"/>
-          <w:sz w:val="24"/>
-          <w:szCs w:val="24"/>
-          <w:lang w:eastAsia="en-US"/>
-        </w:rPr>
-        <w:t xml:space="preserve"> Body Music), com muitas bandas nesses gêneros, porém, vale a ressalva para o Sisters </w:t>
-      </w:r>
-      <w:proofErr w:type="spellStart"/>
-      <w:r>
-        <w:rPr>
-          <w:rFonts w:ascii="Arial" w:hAnsi="Arial" w:cs="Arial"/>
-          <w:color w:val="FFFFFF" w:themeColor="background1"/>
-          <w:sz w:val="24"/>
-          <w:szCs w:val="24"/>
-          <w:lang w:eastAsia="en-US"/>
-        </w:rPr>
-        <w:t>Of</w:t>
-      </w:r>
-      <w:proofErr w:type="spellEnd"/>
-      <w:r>
-        <w:rPr>
-          <w:rFonts w:ascii="Arial" w:hAnsi="Arial" w:cs="Arial"/>
-          <w:color w:val="FFFFFF" w:themeColor="background1"/>
-          <w:sz w:val="24"/>
-          <w:szCs w:val="24"/>
-          <w:lang w:eastAsia="en-US"/>
-        </w:rPr>
-        <w:t xml:space="preserve"> Mercy, </w:t>
-      </w:r>
-      <w:proofErr w:type="spellStart"/>
-      <w:r>
-        <w:rPr>
-          <w:rFonts w:ascii="Arial" w:hAnsi="Arial" w:cs="Arial"/>
-          <w:color w:val="FFFFFF" w:themeColor="background1"/>
-          <w:sz w:val="24"/>
-          <w:szCs w:val="24"/>
-          <w:lang w:eastAsia="en-US"/>
-        </w:rPr>
-        <w:t>Lebanon</w:t>
-      </w:r>
-      <w:proofErr w:type="spellEnd"/>
-      <w:r>
-        <w:rPr>
-          <w:rFonts w:ascii="Arial" w:hAnsi="Arial" w:cs="Arial"/>
-          <w:color w:val="FFFFFF" w:themeColor="background1"/>
-          <w:sz w:val="24"/>
-          <w:szCs w:val="24"/>
-          <w:lang w:eastAsia="en-US"/>
-        </w:rPr>
-        <w:t xml:space="preserve"> Hanover, She </w:t>
-      </w:r>
-      <w:proofErr w:type="spellStart"/>
-      <w:r>
-        <w:rPr>
-          <w:rFonts w:ascii="Arial" w:hAnsi="Arial" w:cs="Arial"/>
-          <w:color w:val="FFFFFF" w:themeColor="background1"/>
-          <w:sz w:val="24"/>
-          <w:szCs w:val="24"/>
-          <w:lang w:eastAsia="en-US"/>
-        </w:rPr>
-        <w:t>Past</w:t>
-      </w:r>
-      <w:proofErr w:type="spellEnd"/>
-      <w:r>
-        <w:rPr>
-          <w:rFonts w:ascii="Arial" w:hAnsi="Arial" w:cs="Arial"/>
-          <w:color w:val="FFFFFF" w:themeColor="background1"/>
-          <w:sz w:val="24"/>
-          <w:szCs w:val="24"/>
-          <w:lang w:eastAsia="en-US"/>
-        </w:rPr>
-        <w:t xml:space="preserve"> Away e Twin </w:t>
-      </w:r>
-      <w:proofErr w:type="spellStart"/>
-      <w:r>
-        <w:rPr>
-          <w:rFonts w:ascii="Arial" w:hAnsi="Arial" w:cs="Arial"/>
-          <w:color w:val="FFFFFF" w:themeColor="background1"/>
-          <w:sz w:val="24"/>
-          <w:szCs w:val="24"/>
-          <w:lang w:eastAsia="en-US"/>
-        </w:rPr>
-        <w:t>Tribes</w:t>
-      </w:r>
-      <w:proofErr w:type="spellEnd"/>
-      <w:r>
-        <w:rPr>
-          <w:rFonts w:ascii="Arial" w:hAnsi="Arial" w:cs="Arial"/>
-          <w:color w:val="FFFFFF" w:themeColor="background1"/>
-          <w:sz w:val="24"/>
-          <w:szCs w:val="24"/>
-          <w:lang w:eastAsia="en-US"/>
-        </w:rPr>
-        <w:t>. Vale citar a melancolia nas músicas góticas, como por exemplo o mantra “</w:t>
-      </w:r>
-      <w:proofErr w:type="spellStart"/>
-      <w:r>
-        <w:rPr>
-          <w:rFonts w:ascii="Arial" w:hAnsi="Arial" w:cs="Arial"/>
-          <w:color w:val="FFFFFF" w:themeColor="background1"/>
-          <w:sz w:val="24"/>
-          <w:szCs w:val="24"/>
-          <w:lang w:eastAsia="en-US"/>
-        </w:rPr>
-        <w:t>Sadness</w:t>
-      </w:r>
-      <w:proofErr w:type="spellEnd"/>
-      <w:r>
-        <w:rPr>
-          <w:rFonts w:ascii="Arial" w:hAnsi="Arial" w:cs="Arial"/>
-          <w:color w:val="FFFFFF" w:themeColor="background1"/>
-          <w:sz w:val="24"/>
-          <w:szCs w:val="24"/>
-          <w:lang w:eastAsia="en-US"/>
-        </w:rPr>
-        <w:t xml:space="preserve"> </w:t>
-      </w:r>
-      <w:proofErr w:type="spellStart"/>
-      <w:r>
-        <w:rPr>
-          <w:rFonts w:ascii="Arial" w:hAnsi="Arial" w:cs="Arial"/>
-          <w:color w:val="FFFFFF" w:themeColor="background1"/>
-          <w:sz w:val="24"/>
-          <w:szCs w:val="24"/>
-          <w:lang w:eastAsia="en-US"/>
-        </w:rPr>
-        <w:t>Is</w:t>
-      </w:r>
-      <w:proofErr w:type="spellEnd"/>
-      <w:r>
-        <w:rPr>
-          <w:rFonts w:ascii="Arial" w:hAnsi="Arial" w:cs="Arial"/>
-          <w:color w:val="FFFFFF" w:themeColor="background1"/>
-          <w:sz w:val="24"/>
-          <w:szCs w:val="24"/>
-          <w:lang w:eastAsia="en-US"/>
-        </w:rPr>
-        <w:t xml:space="preserve"> </w:t>
-      </w:r>
-      <w:proofErr w:type="spellStart"/>
+        <w:t xml:space="preserve">Conforme passar do tempo, gêneros góticos foram surgindo, como Darkwave, Post-Punk, Deathrock e EBM (Electronic Body Music), com muitas bandas nesses gêneros, porém, vale a ressalva para o Sisters Of Mercy, Lebanon Hanover, She Past Away e Twin Tribes. Vale citar a melancolia nas músicas góticas, como por exemplo o mantra “Sadness Is </w:t>
+      </w:r>
       <w:r>
         <w:rPr>
           <w:rFonts w:ascii="Arial" w:hAnsi="Arial" w:cs="Arial"/>
@@ -4311,40 +3808,7 @@
           <w:lang w:eastAsia="en-US"/>
         </w:rPr>
         <w:lastRenderedPageBreak/>
-        <w:t>Rebellion</w:t>
-      </w:r>
-      <w:proofErr w:type="spellEnd"/>
-      <w:r>
-        <w:rPr>
-          <w:rFonts w:ascii="Arial" w:hAnsi="Arial" w:cs="Arial"/>
-          <w:color w:val="FFFFFF" w:themeColor="background1"/>
-          <w:sz w:val="24"/>
-          <w:szCs w:val="24"/>
-          <w:lang w:eastAsia="en-US"/>
-        </w:rPr>
-        <w:t xml:space="preserve">”, uma música do </w:t>
-      </w:r>
-      <w:proofErr w:type="spellStart"/>
-      <w:r>
-        <w:rPr>
-          <w:rFonts w:ascii="Arial" w:hAnsi="Arial" w:cs="Arial"/>
-          <w:color w:val="FFFFFF" w:themeColor="background1"/>
-          <w:sz w:val="24"/>
-          <w:szCs w:val="24"/>
-          <w:lang w:eastAsia="en-US"/>
-        </w:rPr>
-        <w:t>Lebanon</w:t>
-      </w:r>
-      <w:proofErr w:type="spellEnd"/>
-      <w:r>
-        <w:rPr>
-          <w:rFonts w:ascii="Arial" w:hAnsi="Arial" w:cs="Arial"/>
-          <w:color w:val="FFFFFF" w:themeColor="background1"/>
-          <w:sz w:val="24"/>
-          <w:szCs w:val="24"/>
-          <w:lang w:eastAsia="en-US"/>
-        </w:rPr>
-        <w:t xml:space="preserve"> Hanover, que destaca a superficialidade das pessoas em não buscarem autoconhecimento.</w:t>
+        <w:t>Rebellion”, uma música do Lebanon Hanover, que destaca a superficialidade das pessoas em não buscarem autoconhecimento.</w:t>
       </w:r>
     </w:p>
     <w:p>
@@ -4428,27 +3892,7 @@
           <w:bCs/>
           <w:color w:val="FFFFFF" w:themeColor="background1"/>
         </w:rPr>
-        <w:t xml:space="preserve">Figura 7: Sisters </w:t>
-      </w:r>
-      <w:proofErr w:type="spellStart"/>
-      <w:r>
-        <w:rPr>
-          <w:rFonts w:ascii="Arial" w:hAnsi="Arial" w:cs="Arial"/>
-          <w:b/>
-          <w:bCs/>
-          <w:color w:val="FFFFFF" w:themeColor="background1"/>
-        </w:rPr>
-        <w:t>Of</w:t>
-      </w:r>
-      <w:proofErr w:type="spellEnd"/>
-      <w:r>
-        <w:rPr>
-          <w:rFonts w:ascii="Arial" w:hAnsi="Arial" w:cs="Arial"/>
-          <w:b/>
-          <w:bCs/>
-          <w:color w:val="FFFFFF" w:themeColor="background1"/>
-        </w:rPr>
-        <w:t xml:space="preserve"> Mercy</w:t>
+        <w:t>Figura 7: Sisters Of Mercy</w:t>
       </w:r>
     </w:p>
     <w:p>
@@ -4538,27 +3982,7 @@
           <w:bCs/>
           <w:color w:val="FFFFFF" w:themeColor="background1"/>
         </w:rPr>
-        <w:t xml:space="preserve">Figura 8: </w:t>
-      </w:r>
-      <w:proofErr w:type="spellStart"/>
-      <w:r>
-        <w:rPr>
-          <w:rFonts w:ascii="Arial" w:hAnsi="Arial" w:cs="Arial"/>
-          <w:b/>
-          <w:bCs/>
-          <w:color w:val="FFFFFF" w:themeColor="background1"/>
-        </w:rPr>
-        <w:t>Lebanon</w:t>
-      </w:r>
-      <w:proofErr w:type="spellEnd"/>
-      <w:r>
-        <w:rPr>
-          <w:rFonts w:ascii="Arial" w:hAnsi="Arial" w:cs="Arial"/>
-          <w:b/>
-          <w:bCs/>
-          <w:color w:val="FFFFFF" w:themeColor="background1"/>
-        </w:rPr>
-        <w:t xml:space="preserve"> Hanover</w:t>
+        <w:t>Figura 8: Lebanon Hanover</w:t>
       </w:r>
     </w:p>
     <w:p>
@@ -4747,51 +4171,7 @@
           <w:szCs w:val="24"/>
           <w:lang w:eastAsia="en-US"/>
         </w:rPr>
-        <w:t xml:space="preserve">O que me chateia é que há muito estereótipos no meio, falando que góticos são tristes, ou que góticos odeiam todo mundo, e não é verdade, e está longe de ser verdade, é só um jeito diferente de viver que as outras pessoas, e não há nada de errado nisso, portanto, A Little Piece </w:t>
-      </w:r>
-      <w:proofErr w:type="spellStart"/>
-      <w:r>
-        <w:rPr>
-          <w:rFonts w:ascii="Arial" w:hAnsi="Arial" w:cs="Arial"/>
-          <w:color w:val="FFFFFF" w:themeColor="background1"/>
-          <w:sz w:val="24"/>
-          <w:szCs w:val="24"/>
-          <w:lang w:eastAsia="en-US"/>
-        </w:rPr>
-        <w:t>Of</w:t>
-      </w:r>
-      <w:proofErr w:type="spellEnd"/>
-      <w:r>
-        <w:rPr>
-          <w:rFonts w:ascii="Arial" w:hAnsi="Arial" w:cs="Arial"/>
-          <w:color w:val="FFFFFF" w:themeColor="background1"/>
-          <w:sz w:val="24"/>
-          <w:szCs w:val="24"/>
-          <w:lang w:eastAsia="en-US"/>
-        </w:rPr>
-        <w:t xml:space="preserve"> </w:t>
-      </w:r>
-      <w:proofErr w:type="spellStart"/>
-      <w:r>
-        <w:rPr>
-          <w:rFonts w:ascii="Arial" w:hAnsi="Arial" w:cs="Arial"/>
-          <w:color w:val="FFFFFF" w:themeColor="background1"/>
-          <w:sz w:val="24"/>
-          <w:szCs w:val="24"/>
-          <w:lang w:eastAsia="en-US"/>
-        </w:rPr>
-        <w:t>My</w:t>
-      </w:r>
-      <w:proofErr w:type="spellEnd"/>
-      <w:r>
-        <w:rPr>
-          <w:rFonts w:ascii="Arial" w:hAnsi="Arial" w:cs="Arial"/>
-          <w:color w:val="FFFFFF" w:themeColor="background1"/>
-          <w:sz w:val="24"/>
-          <w:szCs w:val="24"/>
-          <w:lang w:eastAsia="en-US"/>
-        </w:rPr>
-        <w:t xml:space="preserve"> Soul veio para desmistificar alguns mitos e estereótipos sobre a subcultura.</w:t>
+        <w:t>O que me chateia é que há muito estereótipos no meio, falando que góticos são tristes, ou que góticos odeiam todo mundo, e não é verdade, e está longe de ser verdade, é só um jeito diferente de viver que as outras pessoas, e não há nada de errado nisso, portanto, A Little Piece Of My Soul veio para desmistificar alguns mitos e estereótipos sobre a subcultura.</w:t>
       </w:r>
     </w:p>
     <w:p>
@@ -4814,51 +4194,7 @@
           <w:szCs w:val="24"/>
           <w:lang w:eastAsia="en-US"/>
         </w:rPr>
-        <w:t xml:space="preserve">O nome A Little Piece </w:t>
-      </w:r>
-      <w:proofErr w:type="spellStart"/>
-      <w:r>
-        <w:rPr>
-          <w:rFonts w:ascii="Arial" w:hAnsi="Arial" w:cs="Arial"/>
-          <w:color w:val="FFFFFF" w:themeColor="background1"/>
-          <w:sz w:val="24"/>
-          <w:szCs w:val="24"/>
-          <w:lang w:eastAsia="en-US"/>
-        </w:rPr>
-        <w:t>Of</w:t>
-      </w:r>
-      <w:proofErr w:type="spellEnd"/>
-      <w:r>
-        <w:rPr>
-          <w:rFonts w:ascii="Arial" w:hAnsi="Arial" w:cs="Arial"/>
-          <w:color w:val="FFFFFF" w:themeColor="background1"/>
-          <w:sz w:val="24"/>
-          <w:szCs w:val="24"/>
-          <w:lang w:eastAsia="en-US"/>
-        </w:rPr>
-        <w:t xml:space="preserve"> </w:t>
-      </w:r>
-      <w:proofErr w:type="spellStart"/>
-      <w:r>
-        <w:rPr>
-          <w:rFonts w:ascii="Arial" w:hAnsi="Arial" w:cs="Arial"/>
-          <w:color w:val="FFFFFF" w:themeColor="background1"/>
-          <w:sz w:val="24"/>
-          <w:szCs w:val="24"/>
-          <w:lang w:eastAsia="en-US"/>
-        </w:rPr>
-        <w:t>My</w:t>
-      </w:r>
-      <w:proofErr w:type="spellEnd"/>
-      <w:r>
-        <w:rPr>
-          <w:rFonts w:ascii="Arial" w:hAnsi="Arial" w:cs="Arial"/>
-          <w:color w:val="FFFFFF" w:themeColor="background1"/>
-          <w:sz w:val="24"/>
-          <w:szCs w:val="24"/>
-          <w:lang w:eastAsia="en-US"/>
-        </w:rPr>
-        <w:t xml:space="preserve"> Soul surgiu através da minha playlist do Spotify, de mesmo nome do projeto.</w:t>
+        <w:t>O nome A Little Piece Of My Soul surgiu através da minha playlist do Spotify, de mesmo nome do projeto.</w:t>
       </w:r>
     </w:p>
     <w:p>
@@ -5575,23 +4911,7 @@
           <w:rFonts w:ascii="Arial" w:hAnsi="Arial" w:cs="Arial"/>
           <w:color w:val="FFFFFF" w:themeColor="background1"/>
         </w:rPr>
-        <w:t xml:space="preserve">Os usuários terão acesso </w:t>
-      </w:r>
-      <w:proofErr w:type="spellStart"/>
-      <w:r>
-        <w:rPr>
-          <w:rFonts w:ascii="Arial" w:hAnsi="Arial" w:cs="Arial"/>
-          <w:color w:val="FFFFFF" w:themeColor="background1"/>
-        </w:rPr>
-        <w:t>a</w:t>
-      </w:r>
-      <w:proofErr w:type="spellEnd"/>
-      <w:r>
-        <w:rPr>
-          <w:rFonts w:ascii="Arial" w:hAnsi="Arial" w:cs="Arial"/>
-          <w:color w:val="FFFFFF" w:themeColor="background1"/>
-        </w:rPr>
-        <w:t xml:space="preserve"> internet para visualização do site.</w:t>
+        <w:t>Os usuários terão acesso a internet para visualização do site.</w:t>
       </w:r>
     </w:p>
     <w:p>
@@ -5680,55 +5000,7 @@
           <w:rFonts w:ascii="Arial" w:hAnsi="Arial" w:cs="Arial"/>
           <w:color w:val="FFFFFF" w:themeColor="background1"/>
         </w:rPr>
-        <w:t xml:space="preserve">Não haverá APIs externas para música, como Youtube, </w:t>
-      </w:r>
-      <w:proofErr w:type="spellStart"/>
-      <w:r>
-        <w:rPr>
-          <w:rFonts w:ascii="Arial" w:hAnsi="Arial" w:cs="Arial"/>
-          <w:color w:val="FFFFFF" w:themeColor="background1"/>
-        </w:rPr>
-        <w:t>Spotify</w:t>
-      </w:r>
-      <w:proofErr w:type="spellEnd"/>
-      <w:r>
-        <w:rPr>
-          <w:rFonts w:ascii="Arial" w:hAnsi="Arial" w:cs="Arial"/>
-          <w:color w:val="FFFFFF" w:themeColor="background1"/>
-        </w:rPr>
-        <w:t xml:space="preserve">, </w:t>
-      </w:r>
-      <w:proofErr w:type="spellStart"/>
-      <w:r>
-        <w:rPr>
-          <w:rFonts w:ascii="Arial" w:hAnsi="Arial" w:cs="Arial"/>
-          <w:color w:val="FFFFFF" w:themeColor="background1"/>
-        </w:rPr>
-        <w:t>Soundcloud</w:t>
-      </w:r>
-      <w:proofErr w:type="spellEnd"/>
-      <w:r>
-        <w:rPr>
-          <w:rFonts w:ascii="Arial" w:hAnsi="Arial" w:cs="Arial"/>
-          <w:color w:val="FFFFFF" w:themeColor="background1"/>
-        </w:rPr>
-        <w:t xml:space="preserve"> </w:t>
-      </w:r>
-      <w:proofErr w:type="spellStart"/>
-      <w:r>
-        <w:rPr>
-          <w:rFonts w:ascii="Arial" w:hAnsi="Arial" w:cs="Arial"/>
-          <w:color w:val="FFFFFF" w:themeColor="background1"/>
-        </w:rPr>
-        <w:t>etc</w:t>
-      </w:r>
-      <w:proofErr w:type="spellEnd"/>
-      <w:r>
-        <w:rPr>
-          <w:rFonts w:ascii="Arial" w:hAnsi="Arial" w:cs="Arial"/>
-          <w:color w:val="FFFFFF" w:themeColor="background1"/>
-        </w:rPr>
-        <w:t>;</w:t>
+        <w:t>Não haverá APIs externas para música, como Youtube, Spotify, Soundcloud etc;</w:t>
       </w:r>
     </w:p>
     <w:p>
@@ -5812,23 +5084,7 @@
           <w:rFonts w:ascii="Arial" w:hAnsi="Arial" w:cs="Arial"/>
           <w:color w:val="FFFFFF" w:themeColor="background1"/>
         </w:rPr>
-        <w:t xml:space="preserve">O banco de dados armazenará apenas informações essenciais para o funcionamento, como nome, </w:t>
-      </w:r>
-      <w:proofErr w:type="spellStart"/>
-      <w:r>
-        <w:rPr>
-          <w:rFonts w:ascii="Arial" w:hAnsi="Arial" w:cs="Arial"/>
-          <w:color w:val="FFFFFF" w:themeColor="background1"/>
-        </w:rPr>
-        <w:t>email</w:t>
-      </w:r>
-      <w:proofErr w:type="spellEnd"/>
-      <w:r>
-        <w:rPr>
-          <w:rFonts w:ascii="Arial" w:hAnsi="Arial" w:cs="Arial"/>
-          <w:color w:val="FFFFFF" w:themeColor="background1"/>
-        </w:rPr>
-        <w:t>, resultados do Quiz, gênero e banda favorita</w:t>
+        <w:t>O banco de dados armazenará apenas informações essenciais para o funcionamento, como nome, email, resultados do Quiz, gênero e banda favorita</w:t>
       </w:r>
       <w:r>
         <w:rPr>
@@ -5856,23 +5112,7 @@
           <w:rFonts w:ascii="Arial" w:hAnsi="Arial" w:cs="Arial"/>
           <w:color w:val="FFFFFF" w:themeColor="background1"/>
         </w:rPr>
-        <w:t xml:space="preserve">As imagens do criador (foto do rosto, foto em shows </w:t>
-      </w:r>
-      <w:proofErr w:type="spellStart"/>
-      <w:r>
-        <w:rPr>
-          <w:rFonts w:ascii="Arial" w:hAnsi="Arial" w:cs="Arial"/>
-          <w:color w:val="FFFFFF" w:themeColor="background1"/>
-        </w:rPr>
-        <w:t>etc</w:t>
-      </w:r>
-      <w:proofErr w:type="spellEnd"/>
-      <w:r>
-        <w:rPr>
-          <w:rFonts w:ascii="Arial" w:hAnsi="Arial" w:cs="Arial"/>
-          <w:color w:val="FFFFFF" w:themeColor="background1"/>
-        </w:rPr>
-        <w:t>) não devem ser utilizadas por terceiros com quaisquer objetivos, sejam eles lucrativos ou não</w:t>
+        <w:t>As imagens do criador (foto do rosto, foto em shows etc) não devem ser utilizadas por terceiros com quaisquer objetivos, sejam eles lucrativos ou não</w:t>
       </w:r>
       <w:r>
         <w:rPr>
@@ -6158,67 +5398,7 @@
           <w:szCs w:val="24"/>
           <w:lang w:eastAsia="en-US"/>
         </w:rPr>
-        <w:t xml:space="preserve">do </w:t>
-      </w:r>
-      <w:proofErr w:type="spellStart"/>
-      <w:r>
-        <w:rPr>
-          <w:rFonts w:ascii="Arial" w:hAnsi="Arial" w:cs="Arial"/>
-          <w:sz w:val="24"/>
-          <w:szCs w:val="24"/>
-          <w:lang w:eastAsia="en-US"/>
-        </w:rPr>
-        <w:t>Hypervisor</w:t>
-      </w:r>
-      <w:proofErr w:type="spellEnd"/>
-      <w:r>
-        <w:rPr>
-          <w:rFonts w:ascii="Arial" w:hAnsi="Arial" w:cs="Arial"/>
-          <w:sz w:val="24"/>
-          <w:szCs w:val="24"/>
-          <w:lang w:eastAsia="en-US"/>
-        </w:rPr>
-        <w:t xml:space="preserve"> </w:t>
-      </w:r>
-      <w:proofErr w:type="spellStart"/>
-      <w:r>
-        <w:rPr>
-          <w:rFonts w:ascii="Arial" w:hAnsi="Arial" w:cs="Arial"/>
-          <w:sz w:val="24"/>
-          <w:szCs w:val="24"/>
-          <w:lang w:eastAsia="en-US"/>
-        </w:rPr>
-        <w:t>VirtualBox</w:t>
-      </w:r>
-      <w:proofErr w:type="spellEnd"/>
-      <w:r>
-        <w:rPr>
-          <w:rFonts w:ascii="Arial" w:hAnsi="Arial" w:cs="Arial"/>
-          <w:sz w:val="24"/>
-          <w:szCs w:val="24"/>
-          <w:lang w:eastAsia="en-US"/>
-        </w:rPr>
-        <w:t xml:space="preserve">, uma máquina virtual com o sistema operacional </w:t>
-      </w:r>
-      <w:proofErr w:type="spellStart"/>
-      <w:r>
-        <w:rPr>
-          <w:rFonts w:ascii="Arial" w:hAnsi="Arial" w:cs="Arial"/>
-          <w:sz w:val="24"/>
-          <w:szCs w:val="24"/>
-          <w:lang w:eastAsia="en-US"/>
-        </w:rPr>
-        <w:t>Lubuntu</w:t>
-      </w:r>
-      <w:proofErr w:type="spellEnd"/>
-      <w:r>
-        <w:rPr>
-          <w:rFonts w:ascii="Arial" w:hAnsi="Arial" w:cs="Arial"/>
-          <w:sz w:val="24"/>
-          <w:szCs w:val="24"/>
-          <w:lang w:eastAsia="en-US"/>
-        </w:rPr>
-        <w:t xml:space="preserve"> Linux foi instalada, visando maior segurança e isolamento do ambiente do projeto.</w:t>
+        <w:t>do Hypervisor VirtualBox, uma máquina virtual com o sistema operacional Lubuntu Linux foi instalada, visando maior segurança e isolamento do ambiente do projeto.</w:t>
       </w:r>
     </w:p>
     <w:p>
@@ -6246,125 +5426,25 @@
           <w:szCs w:val="24"/>
           <w:lang w:eastAsia="en-US"/>
         </w:rPr>
-        <w:t xml:space="preserve">o servidor de banco de dados MySQL Server foi instalado e configurado, o site A Little Piece </w:t>
-      </w:r>
-      <w:proofErr w:type="spellStart"/>
-      <w:r>
-        <w:rPr>
-          <w:rFonts w:ascii="Arial" w:hAnsi="Arial" w:cs="Arial"/>
-          <w:sz w:val="24"/>
-          <w:szCs w:val="24"/>
-          <w:lang w:eastAsia="en-US"/>
-        </w:rPr>
-        <w:t>Of</w:t>
-      </w:r>
-      <w:proofErr w:type="spellEnd"/>
-      <w:r>
-        <w:rPr>
-          <w:rFonts w:ascii="Arial" w:hAnsi="Arial" w:cs="Arial"/>
-          <w:sz w:val="24"/>
-          <w:szCs w:val="24"/>
-          <w:lang w:eastAsia="en-US"/>
-        </w:rPr>
-        <w:t xml:space="preserve"> </w:t>
-      </w:r>
-      <w:proofErr w:type="spellStart"/>
-      <w:r>
-        <w:rPr>
-          <w:rFonts w:ascii="Arial" w:hAnsi="Arial" w:cs="Arial"/>
-          <w:sz w:val="24"/>
-          <w:szCs w:val="24"/>
-          <w:lang w:eastAsia="en-US"/>
-        </w:rPr>
-        <w:t>My</w:t>
-      </w:r>
-      <w:proofErr w:type="spellEnd"/>
-      <w:r>
-        <w:rPr>
-          <w:rFonts w:ascii="Arial" w:hAnsi="Arial" w:cs="Arial"/>
-          <w:sz w:val="24"/>
-          <w:szCs w:val="24"/>
-          <w:lang w:eastAsia="en-US"/>
-        </w:rPr>
-        <w:t xml:space="preserve"> Soul foi hospedado nessa máquina virtual </w:t>
-      </w:r>
-      <w:r>
-        <w:rPr>
-          <w:rFonts w:ascii="Arial" w:hAnsi="Arial" w:cs="Arial"/>
-          <w:sz w:val="24"/>
-          <w:szCs w:val="24"/>
-          <w:lang w:eastAsia="en-US"/>
-        </w:rPr>
-        <w:t xml:space="preserve">e através da API Web Data </w:t>
-      </w:r>
-      <w:proofErr w:type="spellStart"/>
-      <w:r>
-        <w:rPr>
-          <w:rFonts w:ascii="Arial" w:hAnsi="Arial" w:cs="Arial"/>
-          <w:sz w:val="24"/>
-          <w:szCs w:val="24"/>
-          <w:lang w:eastAsia="en-US"/>
-        </w:rPr>
-        <w:t>Viz</w:t>
-      </w:r>
-      <w:proofErr w:type="spellEnd"/>
-      <w:r>
-        <w:rPr>
-          <w:rFonts w:ascii="Arial" w:hAnsi="Arial" w:cs="Arial"/>
-          <w:sz w:val="24"/>
-          <w:szCs w:val="24"/>
-          <w:lang w:eastAsia="en-US"/>
-        </w:rPr>
-        <w:t xml:space="preserve"> os dados do site são atualizados conforme dados do banco, </w:t>
-      </w:r>
-      <w:r>
-        <w:rPr>
-          <w:rFonts w:ascii="Arial" w:hAnsi="Arial" w:cs="Arial"/>
-          <w:sz w:val="24"/>
-          <w:szCs w:val="24"/>
-          <w:lang w:eastAsia="en-US"/>
-        </w:rPr>
-        <w:t xml:space="preserve">na qual ela realiza operações de </w:t>
-      </w:r>
-      <w:proofErr w:type="spellStart"/>
-      <w:r>
-        <w:rPr>
-          <w:rFonts w:ascii="Arial" w:hAnsi="Arial" w:cs="Arial"/>
-          <w:sz w:val="24"/>
-          <w:szCs w:val="24"/>
-          <w:lang w:eastAsia="en-US"/>
-        </w:rPr>
-        <w:t>insert</w:t>
-      </w:r>
-      <w:proofErr w:type="spellEnd"/>
-      <w:r>
-        <w:rPr>
-          <w:rFonts w:ascii="Arial" w:hAnsi="Arial" w:cs="Arial"/>
-          <w:sz w:val="24"/>
-          <w:szCs w:val="24"/>
-          <w:lang w:eastAsia="en-US"/>
-        </w:rPr>
-        <w:t xml:space="preserve"> e </w:t>
-      </w:r>
-      <w:proofErr w:type="spellStart"/>
-      <w:r>
-        <w:rPr>
-          <w:rFonts w:ascii="Arial" w:hAnsi="Arial" w:cs="Arial"/>
-          <w:sz w:val="24"/>
-          <w:szCs w:val="24"/>
-          <w:lang w:eastAsia="en-US"/>
-        </w:rPr>
-        <w:t>select</w:t>
-      </w:r>
-      <w:proofErr w:type="spellEnd"/>
-      <w:r>
-        <w:rPr>
-          <w:rFonts w:ascii="Arial" w:hAnsi="Arial" w:cs="Arial"/>
-          <w:sz w:val="24"/>
-          <w:szCs w:val="24"/>
-          <w:lang w:eastAsia="en-US"/>
-        </w:rPr>
-        <w:t xml:space="preserve"> no banco. E por último, o usuário acessa sua dashboard após realização do Quiz.</w:t>
+        <w:t xml:space="preserve">o servidor de banco de dados MySQL Server foi instalado e configurado, o site A Little Piece Of My Soul foi hospedado nessa máquina virtual </w:t>
+      </w:r>
+      <w:r>
+        <w:rPr>
+          <w:rFonts w:ascii="Arial" w:hAnsi="Arial" w:cs="Arial"/>
+          <w:sz w:val="24"/>
+          <w:szCs w:val="24"/>
+          <w:lang w:eastAsia="en-US"/>
+        </w:rPr>
+        <w:t xml:space="preserve">e através da API Web Data Viz os dados do site são atualizados conforme dados do banco, </w:t>
+      </w:r>
+      <w:r>
+        <w:rPr>
+          <w:rFonts w:ascii="Arial" w:hAnsi="Arial" w:cs="Arial"/>
+          <w:sz w:val="24"/>
+          <w:szCs w:val="24"/>
+          <w:lang w:eastAsia="en-US"/>
+        </w:rPr>
+        <w:t>na qual ela realiza operações de insert e select no banco. E por último, o usuário acessa sua dashboard após realização do Quiz.</w:t>
       </w:r>
     </w:p>
     <w:p>
@@ -6778,19 +5858,8 @@
           <w:bCs/>
           <w:color w:val="FFFFFF" w:themeColor="background1"/>
         </w:rPr>
-        <w:t xml:space="preserve">: Gráfico de </w:t>
-      </w:r>
-      <w:proofErr w:type="spellStart"/>
-      <w:r>
-        <w:rPr>
-          <w:rFonts w:ascii="Arial" w:hAnsi="Arial" w:cs="Arial"/>
-          <w:b/>
-          <w:bCs/>
-          <w:color w:val="FFFFFF" w:themeColor="background1"/>
-        </w:rPr>
-        <w:t>BurnDown</w:t>
-      </w:r>
-      <w:proofErr w:type="spellEnd"/>
+        <w:t>: Gráfico de BurnDown</w:t>
+      </w:r>
     </w:p>
     <w:p>
       <w:pPr>
@@ -6813,29 +5882,7 @@
           <w:lang w:eastAsia="en-US"/>
         </w:rPr>
         <w:lastRenderedPageBreak/>
-        <w:t xml:space="preserve">Ainda na planilha de backlog, como forma de medir meu desempenho e capacidade de entrega foi realizado um gráfico de </w:t>
-      </w:r>
-      <w:proofErr w:type="spellStart"/>
-      <w:r>
-        <w:rPr>
-          <w:rFonts w:ascii="Arial" w:hAnsi="Arial" w:cs="Arial"/>
-          <w:color w:val="FFFFFF" w:themeColor="background1"/>
-          <w:sz w:val="24"/>
-          <w:szCs w:val="24"/>
-          <w:lang w:eastAsia="en-US"/>
-        </w:rPr>
-        <w:t>BurnDown</w:t>
-      </w:r>
-      <w:proofErr w:type="spellEnd"/>
-      <w:r>
-        <w:rPr>
-          <w:rFonts w:ascii="Arial" w:hAnsi="Arial" w:cs="Arial"/>
-          <w:color w:val="FFFFFF" w:themeColor="background1"/>
-          <w:sz w:val="24"/>
-          <w:szCs w:val="24"/>
-          <w:lang w:eastAsia="en-US"/>
-        </w:rPr>
-        <w:t>, com duas métricas: planejado e entregue, métricas as quais foram extraídas da somatória dos pontos Fibonacci totais, o que foi entregue e o que está pendente em cada Sprint, tendo em vista que o item pendente na Sprint foi acumulado para a próxima.</w:t>
+        <w:t>Ainda na planilha de backlog, como forma de medir meu desempenho e capacidade de entrega foi realizado um gráfico de BurnDown, com duas métricas: planejado e entregue, métricas as quais foram extraídas da somatória dos pontos Fibonacci totais, o que foi entregue e o que está pendente em cada Sprint, tendo em vista que o item pendente na Sprint foi acumulado para a próxima.</w:t>
       </w:r>
     </w:p>
     <w:p>
@@ -6858,29 +5905,7 @@
           <w:szCs w:val="24"/>
           <w:lang w:eastAsia="en-US"/>
         </w:rPr>
-        <w:t xml:space="preserve">Todos os requisitos no backlog foram transferidos para outra plataforma de gestão, o </w:t>
-      </w:r>
-      <w:proofErr w:type="spellStart"/>
-      <w:r>
-        <w:rPr>
-          <w:rFonts w:ascii="Arial" w:hAnsi="Arial" w:cs="Arial"/>
-          <w:color w:val="FFFFFF" w:themeColor="background1"/>
-          <w:sz w:val="24"/>
-          <w:szCs w:val="24"/>
-          <w:lang w:eastAsia="en-US"/>
-        </w:rPr>
-        <w:t>Trello</w:t>
-      </w:r>
-      <w:proofErr w:type="spellEnd"/>
-      <w:r>
-        <w:rPr>
-          <w:rFonts w:ascii="Arial" w:hAnsi="Arial" w:cs="Arial"/>
-          <w:color w:val="FFFFFF" w:themeColor="background1"/>
-          <w:sz w:val="24"/>
-          <w:szCs w:val="24"/>
-          <w:lang w:eastAsia="en-US"/>
-        </w:rPr>
-        <w:t xml:space="preserve">, nele, separei em 3 colunas: “A Fazer”, “Em Andamento” e “Concluído”, </w:t>
+        <w:t xml:space="preserve">Todos os requisitos no backlog foram transferidos para outra plataforma de gestão, o Trello, nele, separei em 3 colunas: “A Fazer”, “Em Andamento” e “Concluído”, </w:t>
       </w:r>
       <w:r>
         <w:rPr>
@@ -6895,15 +5920,9 @@
     </w:p>
     <w:p>
       <w:pPr>
+        <w:keepNext/>
         <w:ind w:firstLine="432"/>
         <w:jc w:val="both"/>
-        <w:rPr>
-          <w:rFonts w:ascii="Arial" w:hAnsi="Arial" w:cs="Arial"/>
-          <w:color w:val="FFFFFF" w:themeColor="background1"/>
-          <w:sz w:val="24"/>
-          <w:szCs w:val="24"/>
-          <w:lang w:eastAsia="en-US"/>
-        </w:rPr>
       </w:pPr>
       <w:r>
         <w:rPr>
@@ -6953,6 +5972,30 @@
     </w:p>
     <w:p>
       <w:pPr>
+        <w:pStyle w:val="Legenda"/>
+        <w:jc w:val="center"/>
+        <w:rPr>
+          <w:rFonts w:ascii="Arial" w:hAnsi="Arial" w:cs="Arial"/>
+          <w:b/>
+          <w:bCs/>
+          <w:color w:val="FFFFFF" w:themeColor="background1"/>
+          <w:sz w:val="24"/>
+          <w:szCs w:val="24"/>
+          <w:lang w:eastAsia="en-US"/>
+        </w:rPr>
+      </w:pPr>
+      <w:r>
+        <w:rPr>
+          <w:rFonts w:ascii="Arial" w:hAnsi="Arial" w:cs="Arial"/>
+          <w:b/>
+          <w:bCs/>
+          <w:color w:val="FFFFFF" w:themeColor="background1"/>
+        </w:rPr>
+        <w:t>Figura 14: Organização no Trello</w:t>
+      </w:r>
+    </w:p>
+    <w:p>
+      <w:pPr>
         <w:pStyle w:val="Ttulo1"/>
         <w:rPr>
           <w:color w:val="FFFFFF" w:themeColor="background1"/>
@@ -7014,39 +6057,7 @@
           <w:rFonts w:ascii="Arial" w:hAnsi="Arial" w:cs="Arial"/>
           <w:color w:val="FFFFFF" w:themeColor="background1"/>
         </w:rPr>
-        <w:t xml:space="preserve">Novos </w:t>
-      </w:r>
-      <w:proofErr w:type="spellStart"/>
-      <w:r>
-        <w:rPr>
-          <w:rFonts w:ascii="Arial" w:hAnsi="Arial" w:cs="Arial"/>
-          <w:color w:val="FFFFFF" w:themeColor="background1"/>
-        </w:rPr>
-        <w:t>quizzes</w:t>
-      </w:r>
-      <w:proofErr w:type="spellEnd"/>
-      <w:r>
-        <w:rPr>
-          <w:rFonts w:ascii="Arial" w:hAnsi="Arial" w:cs="Arial"/>
-          <w:color w:val="FFFFFF" w:themeColor="background1"/>
-        </w:rPr>
-        <w:t xml:space="preserve"> temáticos, por exemplo: “Com qual estética gótica é a sua cara?” ou, “Qual personagem gótico mais te identifica?” </w:t>
-      </w:r>
-      <w:proofErr w:type="spellStart"/>
-      <w:r>
-        <w:rPr>
-          <w:rFonts w:ascii="Arial" w:hAnsi="Arial" w:cs="Arial"/>
-          <w:color w:val="FFFFFF" w:themeColor="background1"/>
-        </w:rPr>
-        <w:t>etc</w:t>
-      </w:r>
-      <w:proofErr w:type="spellEnd"/>
-      <w:r>
-        <w:rPr>
-          <w:rFonts w:ascii="Arial" w:hAnsi="Arial" w:cs="Arial"/>
-          <w:color w:val="FFFFFF" w:themeColor="background1"/>
-        </w:rPr>
-        <w:t>;</w:t>
+        <w:t>Novos quizzes temáticos, por exemplo: “Com qual estética gótica é a sua cara?” ou, “Qual personagem gótico mais te identifica?” etc;</w:t>
       </w:r>
     </w:p>
     <w:p>

</xml_diff>

<commit_message>
correção de linguagem e alguns erros de português na documentação
</commit_message>
<xml_diff>
--- a/Documentação/ALittlePieceOfMySoul.docx
+++ b/Documentação/ALittlePieceOfMySoul.docx
@@ -1,6 +1,6 @@
 
 <file path=word/document.xml><?xml version="1.0" encoding="utf-8"?>
-<w:document xmlns:wpc="http://schemas.microsoft.com/office/word/2010/wordprocessingCanvas" xmlns:cx="http://schemas.microsoft.com/office/drawing/2014/chartex" xmlns:cx1="http://schemas.microsoft.com/office/drawing/2015/9/8/chartex" xmlns:cx2="http://schemas.microsoft.com/office/drawing/2015/10/21/chartex" xmlns:cx3="http://schemas.microsoft.com/office/drawing/2016/5/9/chartex" xmlns:cx4="http://schemas.microsoft.com/office/drawing/2016/5/10/chartex" xmlns:cx5="http://schemas.microsoft.com/office/drawing/2016/5/11/chartex" xmlns:cx6="http://schemas.microsoft.com/office/drawing/2016/5/12/chartex" xmlns:cx7="http://schemas.microsoft.com/office/drawing/2016/5/13/chartex" xmlns:cx8="http://schemas.microsoft.com/office/drawing/2016/5/14/chartex" xmlns:mc="http://schemas.openxmlformats.org/markup-compatibility/2006" xmlns:aink="http://schemas.microsoft.com/office/drawing/2016/ink" xmlns:am3d="http://schemas.microsoft.com/office/drawing/2017/model3d" xmlns:o="urn:schemas-microsoft-com:office:office" xmlns:oel="http://schemas.microsoft.com/office/2019/extlst" xmlns:r="http://schemas.openxmlformats.org/officeDocument/2006/relationships" xmlns:m="http://schemas.openxmlformats.org/officeDocument/2006/math" xmlns:v="urn:schemas-microsoft-com:vml" xmlns:wp14="http://schemas.microsoft.com/office/word/2010/wordprocessingDrawing" xmlns:wp="http://schemas.openxmlformats.org/drawingml/2006/wordprocessingDrawing" xmlns:w10="urn:schemas-microsoft-com:office:word" xmlns:w="http://schemas.openxmlformats.org/wordprocessingml/2006/main" xmlns:w14="http://schemas.microsoft.com/office/word/2010/wordml" xmlns:w15="http://schemas.microsoft.com/office/word/2012/wordml" xmlns:w16cex="http://schemas.microsoft.com/office/word/2018/wordml/cex" xmlns:w16cid="http://schemas.microsoft.com/office/word/2016/wordml/cid" xmlns:w16="http://schemas.microsoft.com/office/word/2018/wordml" xmlns:w16sdtdh="http://schemas.microsoft.com/office/word/2020/wordml/sdtdatahash" xmlns:w16se="http://schemas.microsoft.com/office/word/2015/wordml/symex" xmlns:wpg="http://schemas.microsoft.com/office/word/2010/wordprocessingGroup" xmlns:wpi="http://schemas.microsoft.com/office/word/2010/wordprocessingInk" xmlns:wne="http://schemas.microsoft.com/office/word/2006/wordml" xmlns:wps="http://schemas.microsoft.com/office/word/2010/wordprocessingShape" mc:Ignorable="w14 w15 w16se w16cid w16 w16cex w16sdtdh wp14">
+<w:document xmlns:wpc="http://schemas.microsoft.com/office/word/2010/wordprocessingCanvas" xmlns:cx="http://schemas.microsoft.com/office/drawing/2014/chartex" xmlns:cx1="http://schemas.microsoft.com/office/drawing/2015/9/8/chartex" xmlns:cx2="http://schemas.microsoft.com/office/drawing/2015/10/21/chartex" xmlns:cx3="http://schemas.microsoft.com/office/drawing/2016/5/9/chartex" xmlns:cx4="http://schemas.microsoft.com/office/drawing/2016/5/10/chartex" xmlns:cx5="http://schemas.microsoft.com/office/drawing/2016/5/11/chartex" xmlns:cx6="http://schemas.microsoft.com/office/drawing/2016/5/12/chartex" xmlns:cx7="http://schemas.microsoft.com/office/drawing/2016/5/13/chartex" xmlns:cx8="http://schemas.microsoft.com/office/drawing/2016/5/14/chartex" xmlns:mc="http://schemas.openxmlformats.org/markup-compatibility/2006" xmlns:aink="http://schemas.microsoft.com/office/drawing/2016/ink" xmlns:am3d="http://schemas.microsoft.com/office/drawing/2017/model3d" xmlns:o="urn:schemas-microsoft-com:office:office" xmlns:oel="http://schemas.microsoft.com/office/2019/extlst" xmlns:r="http://schemas.openxmlformats.org/officeDocument/2006/relationships" xmlns:m="http://schemas.openxmlformats.org/officeDocument/2006/math" xmlns:v="urn:schemas-microsoft-com:vml" xmlns:wp14="http://schemas.microsoft.com/office/word/2010/wordprocessingDrawing" xmlns:wp="http://schemas.openxmlformats.org/drawingml/2006/wordprocessingDrawing" xmlns:w10="urn:schemas-microsoft-com:office:word" xmlns:w="http://schemas.openxmlformats.org/wordprocessingml/2006/main" xmlns:w14="http://schemas.microsoft.com/office/word/2010/wordml" xmlns:w15="http://schemas.microsoft.com/office/word/2012/wordml" xmlns:w16cex="http://schemas.microsoft.com/office/word/2018/wordml/cex" xmlns:w16cid="http://schemas.microsoft.com/office/word/2016/wordml/cid" xmlns:w16="http://schemas.microsoft.com/office/word/2018/wordml" xmlns:w16du="http://schemas.microsoft.com/office/word/2023/wordml/word16du" xmlns:w16sdtdh="http://schemas.microsoft.com/office/word/2020/wordml/sdtdatahash" xmlns:w16sdtfl="http://schemas.microsoft.com/office/word/2024/wordml/sdtformatlock" xmlns:w16se="http://schemas.microsoft.com/office/word/2015/wordml/symex" xmlns:wpg="http://schemas.microsoft.com/office/word/2010/wordprocessingGroup" xmlns:wpi="http://schemas.microsoft.com/office/word/2010/wordprocessingInk" xmlns:wne="http://schemas.microsoft.com/office/word/2006/wordml" xmlns:wps="http://schemas.microsoft.com/office/word/2010/wordprocessingShape" mc:Ignorable="w14 w15 w16se w16cid w16 w16cex w16sdtdh w16sdtfl w16du wp14">
   <w:background w:color="000000" w:themeColor="text1"/>
   <w:body>
     <w:p>
@@ -272,7 +272,7 @@
               </wp:inline>
             </w:drawing>
           </mc:Choice>
-          <mc:Fallback xmlns:w16sdtfl="http://schemas.microsoft.com/office/word/2024/wordml/sdtformatlock" xmlns:w16du="http://schemas.microsoft.com/office/word/2023/wordml/word16du">
+          <mc:Fallback>
             <w:pict>
               <v:rect w14:anchorId="72F8005B" id="Retângulo 1" o:spid="_x0000_s1026" alt="logo" style="width:24pt;height:24pt;visibility:visible;mso-wrap-style:square;mso-left-percent:-10001;mso-top-percent:-10001;mso-position-horizontal:absolute;mso-position-horizontal-relative:char;mso-position-vertical:absolute;mso-position-vertical-relative:line;mso-left-percent:-10001;mso-top-percent:-10001;v-text-anchor:top" o:gfxdata="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" filled="f" stroked="f">
                 <o:lock v:ext="edit" aspectratio="t"/>
@@ -2482,7 +2482,27 @@
           <w:szCs w:val="24"/>
           <w:lang w:eastAsia="en-US"/>
         </w:rPr>
-        <w:t xml:space="preserve">Dentre seus pilares, posso citar o apreço por arte, em especial a música, literatura, filosofia que exploram as emoções humanas. </w:t>
+        <w:t>Dentre seus pilares, posso citar o apreço por arte, em especial a música, literatura</w:t>
+      </w:r>
+      <w:r>
+        <w:rPr>
+          <w:rFonts w:ascii="Arial" w:hAnsi="Arial" w:cs="Arial"/>
+          <w:color w:val="FFFFFF" w:themeColor="background1"/>
+          <w:sz w:val="24"/>
+          <w:szCs w:val="24"/>
+          <w:lang w:eastAsia="en-US"/>
+        </w:rPr>
+        <w:t xml:space="preserve"> e a </w:t>
+      </w:r>
+      <w:r>
+        <w:rPr>
+          <w:rFonts w:ascii="Arial" w:hAnsi="Arial" w:cs="Arial"/>
+          <w:color w:val="FFFFFF" w:themeColor="background1"/>
+          <w:sz w:val="24"/>
+          <w:szCs w:val="24"/>
+          <w:lang w:eastAsia="en-US"/>
+        </w:rPr>
+        <w:t xml:space="preserve">filosofia que exploram as emoções humanas. </w:t>
       </w:r>
     </w:p>
     <w:p>
@@ -2621,7 +2641,73 @@
           <w:szCs w:val="24"/>
           <w:lang w:eastAsia="en-US"/>
         </w:rPr>
-        <w:t>Uma das pioneiras no estilo e vestimenta gótica foi Siouxsie Sioux, vocalista do Siouxsie and the Banshees.</w:t>
+        <w:t xml:space="preserve">Uma das pioneiras no estilo e vestimenta gótica foi Siouxsie Sioux, vocalista do Siouxsie </w:t>
+      </w:r>
+      <w:proofErr w:type="spellStart"/>
+      <w:r>
+        <w:rPr>
+          <w:rFonts w:ascii="Arial" w:hAnsi="Arial" w:cs="Arial"/>
+          <w:color w:val="FFFFFF" w:themeColor="background1"/>
+          <w:sz w:val="24"/>
+          <w:szCs w:val="24"/>
+          <w:lang w:eastAsia="en-US"/>
+        </w:rPr>
+        <w:t>and</w:t>
+      </w:r>
+      <w:proofErr w:type="spellEnd"/>
+      <w:r>
+        <w:rPr>
+          <w:rFonts w:ascii="Arial" w:hAnsi="Arial" w:cs="Arial"/>
+          <w:color w:val="FFFFFF" w:themeColor="background1"/>
+          <w:sz w:val="24"/>
+          <w:szCs w:val="24"/>
+          <w:lang w:eastAsia="en-US"/>
+        </w:rPr>
+        <w:t xml:space="preserve"> </w:t>
+      </w:r>
+      <w:proofErr w:type="spellStart"/>
+      <w:r>
+        <w:rPr>
+          <w:rFonts w:ascii="Arial" w:hAnsi="Arial" w:cs="Arial"/>
+          <w:color w:val="FFFFFF" w:themeColor="background1"/>
+          <w:sz w:val="24"/>
+          <w:szCs w:val="24"/>
+          <w:lang w:eastAsia="en-US"/>
+        </w:rPr>
+        <w:t>the</w:t>
+      </w:r>
+      <w:proofErr w:type="spellEnd"/>
+      <w:r>
+        <w:rPr>
+          <w:rFonts w:ascii="Arial" w:hAnsi="Arial" w:cs="Arial"/>
+          <w:color w:val="FFFFFF" w:themeColor="background1"/>
+          <w:sz w:val="24"/>
+          <w:szCs w:val="24"/>
+          <w:lang w:eastAsia="en-US"/>
+        </w:rPr>
+        <w:t xml:space="preserve"> </w:t>
+      </w:r>
+      <w:proofErr w:type="spellStart"/>
+      <w:r>
+        <w:rPr>
+          <w:rFonts w:ascii="Arial" w:hAnsi="Arial" w:cs="Arial"/>
+          <w:color w:val="FFFFFF" w:themeColor="background1"/>
+          <w:sz w:val="24"/>
+          <w:szCs w:val="24"/>
+          <w:lang w:eastAsia="en-US"/>
+        </w:rPr>
+        <w:t>Banshees</w:t>
+      </w:r>
+      <w:proofErr w:type="spellEnd"/>
+      <w:r>
+        <w:rPr>
+          <w:rFonts w:ascii="Arial" w:hAnsi="Arial" w:cs="Arial"/>
+          <w:color w:val="FFFFFF" w:themeColor="background1"/>
+          <w:sz w:val="24"/>
+          <w:szCs w:val="24"/>
+          <w:lang w:eastAsia="en-US"/>
+        </w:rPr>
+        <w:t>.</w:t>
       </w:r>
     </w:p>
     <w:p>
@@ -2639,7 +2725,7 @@
         </w:rPr>
         <w:lastRenderedPageBreak/>
         <w:drawing>
-          <wp:inline distT="0" distB="0" distL="0" distR="0" wp14:anchorId="258DA283" wp14:editId="69A8F6B3">
+          <wp:inline distT="0" distB="0" distL="0" distR="0" wp14:anchorId="258DA283" wp14:editId="2E0074C8">
             <wp:extent cx="2417197" cy="2582629"/>
             <wp:effectExtent l="0" t="0" r="2540" b="8255"/>
             <wp:docPr id="1" name="Imagem 1" descr="O que vcs acham de Siouxsie and the banshees? : r/MusicaBR"/>
@@ -2846,8 +2932,53 @@
           <w:szCs w:val="24"/>
           <w:lang w:eastAsia="en-US"/>
         </w:rPr>
-        <w:t xml:space="preserve">Dos clássicos como Nosferatu (1922) e London After Midnight (1927) ao cinema gótico moderno, como O Corvo (1994) ou as animações em </w:t>
-      </w:r>
+        <w:t xml:space="preserve">Dos clássicos como </w:t>
+      </w:r>
+      <w:proofErr w:type="spellStart"/>
+      <w:r>
+        <w:rPr>
+          <w:rFonts w:ascii="Arial" w:hAnsi="Arial" w:cs="Arial"/>
+          <w:color w:val="FFFFFF" w:themeColor="background1"/>
+          <w:sz w:val="24"/>
+          <w:szCs w:val="24"/>
+          <w:lang w:eastAsia="en-US"/>
+        </w:rPr>
+        <w:t>Nosferatu</w:t>
+      </w:r>
+      <w:proofErr w:type="spellEnd"/>
+      <w:r>
+        <w:rPr>
+          <w:rFonts w:ascii="Arial" w:hAnsi="Arial" w:cs="Arial"/>
+          <w:color w:val="FFFFFF" w:themeColor="background1"/>
+          <w:sz w:val="24"/>
+          <w:szCs w:val="24"/>
+          <w:lang w:eastAsia="en-US"/>
+        </w:rPr>
+        <w:t xml:space="preserve"> (1922) e London </w:t>
+      </w:r>
+      <w:proofErr w:type="spellStart"/>
+      <w:r>
+        <w:rPr>
+          <w:rFonts w:ascii="Arial" w:hAnsi="Arial" w:cs="Arial"/>
+          <w:color w:val="FFFFFF" w:themeColor="background1"/>
+          <w:sz w:val="24"/>
+          <w:szCs w:val="24"/>
+          <w:lang w:eastAsia="en-US"/>
+        </w:rPr>
+        <w:t>After</w:t>
+      </w:r>
+      <w:proofErr w:type="spellEnd"/>
+      <w:r>
+        <w:rPr>
+          <w:rFonts w:ascii="Arial" w:hAnsi="Arial" w:cs="Arial"/>
+          <w:color w:val="FFFFFF" w:themeColor="background1"/>
+          <w:sz w:val="24"/>
+          <w:szCs w:val="24"/>
+          <w:lang w:eastAsia="en-US"/>
+        </w:rPr>
+        <w:t xml:space="preserve"> Midnight (1927) ao cinema gótico moderno, como O Corvo (1994) ou as animações em </w:t>
+      </w:r>
+      <w:proofErr w:type="spellStart"/>
       <w:r>
         <w:rPr>
           <w:rFonts w:ascii="Arial" w:hAnsi="Arial" w:cs="Arial"/>
@@ -2860,6 +2991,7 @@
         </w:rPr>
         <w:t>stop-motion</w:t>
       </w:r>
+      <w:proofErr w:type="spellEnd"/>
       <w:r>
         <w:rPr>
           <w:rFonts w:ascii="Arial" w:hAnsi="Arial" w:cs="Arial"/>
@@ -2940,7 +3072,27 @@
                                 <w:bCs/>
                                 <w:color w:val="FFFFFF" w:themeColor="background1"/>
                               </w:rPr>
-                              <w:t>Figura 3: London After Midnight (1927)</w:t>
+                              <w:t xml:space="preserve">Figura 3: London </w:t>
+                            </w:r>
+                            <w:proofErr w:type="spellStart"/>
+                            <w:r>
+                              <w:rPr>
+                                <w:rFonts w:ascii="Arial" w:hAnsi="Arial" w:cs="Arial"/>
+                                <w:b/>
+                                <w:bCs/>
+                                <w:color w:val="FFFFFF" w:themeColor="background1"/>
+                              </w:rPr>
+                              <w:t>After</w:t>
+                            </w:r>
+                            <w:proofErr w:type="spellEnd"/>
+                            <w:r>
+                              <w:rPr>
+                                <w:rFonts w:ascii="Arial" w:hAnsi="Arial" w:cs="Arial"/>
+                                <w:b/>
+                                <w:bCs/>
+                                <w:color w:val="FFFFFF" w:themeColor="background1"/>
+                              </w:rPr>
+                              <w:t xml:space="preserve"> Midnight (1927)</w:t>
                             </w:r>
                           </w:p>
                         </w:txbxContent>
@@ -2986,7 +3138,27 @@
                           <w:bCs/>
                           <w:color w:val="FFFFFF" w:themeColor="background1"/>
                         </w:rPr>
-                        <w:t>Figura 3: London After Midnight (1927)</w:t>
+                        <w:t xml:space="preserve">Figura 3: London </w:t>
+                      </w:r>
+                      <w:proofErr w:type="spellStart"/>
+                      <w:r>
+                        <w:rPr>
+                          <w:rFonts w:ascii="Arial" w:hAnsi="Arial" w:cs="Arial"/>
+                          <w:b/>
+                          <w:bCs/>
+                          <w:color w:val="FFFFFF" w:themeColor="background1"/>
+                        </w:rPr>
+                        <w:t>After</w:t>
+                      </w:r>
+                      <w:proofErr w:type="spellEnd"/>
+                      <w:r>
+                        <w:rPr>
+                          <w:rFonts w:ascii="Arial" w:hAnsi="Arial" w:cs="Arial"/>
+                          <w:b/>
+                          <w:bCs/>
+                          <w:color w:val="FFFFFF" w:themeColor="background1"/>
+                        </w:rPr>
+                        <w:t xml:space="preserve"> Midnight (1927)</w:t>
                       </w:r>
                     </w:p>
                   </w:txbxContent>
@@ -3137,7 +3309,27 @@
           <w:bCs/>
           <w:color w:val="FFFFFF" w:themeColor="background1"/>
         </w:rPr>
-        <w:t>Figura 2: Nosferatu (1922)</w:t>
+        <w:t xml:space="preserve">Figura 2: </w:t>
+      </w:r>
+      <w:proofErr w:type="spellStart"/>
+      <w:r>
+        <w:rPr>
+          <w:rFonts w:ascii="Arial" w:hAnsi="Arial" w:cs="Arial"/>
+          <w:b/>
+          <w:bCs/>
+          <w:color w:val="FFFFFF" w:themeColor="background1"/>
+        </w:rPr>
+        <w:t>Nosferatu</w:t>
+      </w:r>
+      <w:proofErr w:type="spellEnd"/>
+      <w:r>
+        <w:rPr>
+          <w:rFonts w:ascii="Arial" w:hAnsi="Arial" w:cs="Arial"/>
+          <w:b/>
+          <w:bCs/>
+          <w:color w:val="FFFFFF" w:themeColor="background1"/>
+        </w:rPr>
+        <w:t xml:space="preserve"> (1922)</w:t>
       </w:r>
     </w:p>
     <w:p>
@@ -3473,7 +3665,7 @@
           <w:color w:val="FFFFFF" w:themeColor="background1"/>
         </w:rPr>
         <w:drawing>
-          <wp:anchor distT="0" distB="0" distL="114300" distR="114300" simplePos="0" relativeHeight="251659264" behindDoc="0" locked="0" layoutInCell="1" allowOverlap="1" wp14:anchorId="6D2595A6" wp14:editId="33D76776">
+          <wp:anchor distT="0" distB="0" distL="114300" distR="114300" simplePos="0" relativeHeight="251659264" behindDoc="0" locked="0" layoutInCell="1" allowOverlap="1" wp14:anchorId="6D2595A6" wp14:editId="219D638A">
             <wp:simplePos x="0" y="0"/>
             <wp:positionH relativeFrom="column">
               <wp:posOffset>-698472</wp:posOffset>
@@ -3572,7 +3764,139 @@
           <w:szCs w:val="24"/>
           <w:lang w:eastAsia="en-US"/>
         </w:rPr>
-        <w:t>A música é o coração da subcultura gótica, e a banda pioneira foi o Bauhaus, com seu clássico som experimental Bela Lugosi’s Dead, que conta a morte do ator Bela Lugosi, que interpretou o Drácula. The Cure e Siouxsie and the Banshees consolidaram o gênero, com letras introspectivas, românticas, atmosfera sombria e sonoridade diferente de tudo que havia na época.</w:t>
+        <w:t xml:space="preserve">A música é o coração da subcultura gótica, e a banda pioneira foi o Bauhaus, com seu clássico som experimental Bela </w:t>
+      </w:r>
+      <w:proofErr w:type="spellStart"/>
+      <w:r>
+        <w:rPr>
+          <w:rFonts w:ascii="Arial" w:hAnsi="Arial" w:cs="Arial"/>
+          <w:color w:val="FFFFFF" w:themeColor="background1"/>
+          <w:sz w:val="24"/>
+          <w:szCs w:val="24"/>
+          <w:lang w:eastAsia="en-US"/>
+        </w:rPr>
+        <w:t>Lugosi’s</w:t>
+      </w:r>
+      <w:proofErr w:type="spellEnd"/>
+      <w:r>
+        <w:rPr>
+          <w:rFonts w:ascii="Arial" w:hAnsi="Arial" w:cs="Arial"/>
+          <w:color w:val="FFFFFF" w:themeColor="background1"/>
+          <w:sz w:val="24"/>
+          <w:szCs w:val="24"/>
+          <w:lang w:eastAsia="en-US"/>
+        </w:rPr>
+        <w:t xml:space="preserve"> </w:t>
+      </w:r>
+      <w:proofErr w:type="spellStart"/>
+      <w:r>
+        <w:rPr>
+          <w:rFonts w:ascii="Arial" w:hAnsi="Arial" w:cs="Arial"/>
+          <w:color w:val="FFFFFF" w:themeColor="background1"/>
+          <w:sz w:val="24"/>
+          <w:szCs w:val="24"/>
+          <w:lang w:eastAsia="en-US"/>
+        </w:rPr>
+        <w:t>Dead</w:t>
+      </w:r>
+      <w:proofErr w:type="spellEnd"/>
+      <w:r>
+        <w:rPr>
+          <w:rFonts w:ascii="Arial" w:hAnsi="Arial" w:cs="Arial"/>
+          <w:color w:val="FFFFFF" w:themeColor="background1"/>
+          <w:sz w:val="24"/>
+          <w:szCs w:val="24"/>
+          <w:lang w:eastAsia="en-US"/>
+        </w:rPr>
+        <w:t xml:space="preserve">, que conta a morte do ator Bela </w:t>
+      </w:r>
+      <w:proofErr w:type="spellStart"/>
+      <w:r>
+        <w:rPr>
+          <w:rFonts w:ascii="Arial" w:hAnsi="Arial" w:cs="Arial"/>
+          <w:color w:val="FFFFFF" w:themeColor="background1"/>
+          <w:sz w:val="24"/>
+          <w:szCs w:val="24"/>
+          <w:lang w:eastAsia="en-US"/>
+        </w:rPr>
+        <w:t>Lugosi</w:t>
+      </w:r>
+      <w:proofErr w:type="spellEnd"/>
+      <w:r>
+        <w:rPr>
+          <w:rFonts w:ascii="Arial" w:hAnsi="Arial" w:cs="Arial"/>
+          <w:color w:val="FFFFFF" w:themeColor="background1"/>
+          <w:sz w:val="24"/>
+          <w:szCs w:val="24"/>
+          <w:lang w:eastAsia="en-US"/>
+        </w:rPr>
+        <w:t xml:space="preserve">, que interpretou o Drácula. The Cure e Siouxsie </w:t>
+      </w:r>
+      <w:proofErr w:type="spellStart"/>
+      <w:r>
+        <w:rPr>
+          <w:rFonts w:ascii="Arial" w:hAnsi="Arial" w:cs="Arial"/>
+          <w:color w:val="FFFFFF" w:themeColor="background1"/>
+          <w:sz w:val="24"/>
+          <w:szCs w:val="24"/>
+          <w:lang w:eastAsia="en-US"/>
+        </w:rPr>
+        <w:t>and</w:t>
+      </w:r>
+      <w:proofErr w:type="spellEnd"/>
+      <w:r>
+        <w:rPr>
+          <w:rFonts w:ascii="Arial" w:hAnsi="Arial" w:cs="Arial"/>
+          <w:color w:val="FFFFFF" w:themeColor="background1"/>
+          <w:sz w:val="24"/>
+          <w:szCs w:val="24"/>
+          <w:lang w:eastAsia="en-US"/>
+        </w:rPr>
+        <w:t xml:space="preserve"> </w:t>
+      </w:r>
+      <w:proofErr w:type="spellStart"/>
+      <w:r>
+        <w:rPr>
+          <w:rFonts w:ascii="Arial" w:hAnsi="Arial" w:cs="Arial"/>
+          <w:color w:val="FFFFFF" w:themeColor="background1"/>
+          <w:sz w:val="24"/>
+          <w:szCs w:val="24"/>
+          <w:lang w:eastAsia="en-US"/>
+        </w:rPr>
+        <w:t>the</w:t>
+      </w:r>
+      <w:proofErr w:type="spellEnd"/>
+      <w:r>
+        <w:rPr>
+          <w:rFonts w:ascii="Arial" w:hAnsi="Arial" w:cs="Arial"/>
+          <w:color w:val="FFFFFF" w:themeColor="background1"/>
+          <w:sz w:val="24"/>
+          <w:szCs w:val="24"/>
+          <w:lang w:eastAsia="en-US"/>
+        </w:rPr>
+        <w:t xml:space="preserve"> </w:t>
+      </w:r>
+      <w:proofErr w:type="spellStart"/>
+      <w:r>
+        <w:rPr>
+          <w:rFonts w:ascii="Arial" w:hAnsi="Arial" w:cs="Arial"/>
+          <w:color w:val="FFFFFF" w:themeColor="background1"/>
+          <w:sz w:val="24"/>
+          <w:szCs w:val="24"/>
+          <w:lang w:eastAsia="en-US"/>
+        </w:rPr>
+        <w:t>Banshees</w:t>
+      </w:r>
+      <w:proofErr w:type="spellEnd"/>
+      <w:r>
+        <w:rPr>
+          <w:rFonts w:ascii="Arial" w:hAnsi="Arial" w:cs="Arial"/>
+          <w:color w:val="FFFFFF" w:themeColor="background1"/>
+          <w:sz w:val="24"/>
+          <w:szCs w:val="24"/>
+          <w:lang w:eastAsia="en-US"/>
+        </w:rPr>
+        <w:t xml:space="preserve"> consolidaram o gênero, com letras introspectivas, românticas, atmosfera sombria e sonoridade diferente de tudo que havia na época.</w:t>
       </w:r>
     </w:p>
     <w:p>
@@ -3797,7 +4121,211 @@
           <w:szCs w:val="24"/>
           <w:lang w:eastAsia="en-US"/>
         </w:rPr>
-        <w:t xml:space="preserve">Conforme passar do tempo, gêneros góticos foram surgindo, como Darkwave, Post-Punk, Deathrock e EBM (Electronic Body Music), com muitas bandas nesses gêneros, porém, vale a ressalva para o Sisters Of Mercy, Lebanon Hanover, She Past Away e Twin Tribes. Vale citar a melancolia nas músicas góticas, como por exemplo o mantra “Sadness Is </w:t>
+        <w:t xml:space="preserve">Conforme passar do tempo, gêneros góticos foram surgindo, como </w:t>
+      </w:r>
+      <w:proofErr w:type="spellStart"/>
+      <w:r>
+        <w:rPr>
+          <w:rFonts w:ascii="Arial" w:hAnsi="Arial" w:cs="Arial"/>
+          <w:color w:val="FFFFFF" w:themeColor="background1"/>
+          <w:sz w:val="24"/>
+          <w:szCs w:val="24"/>
+          <w:lang w:eastAsia="en-US"/>
+        </w:rPr>
+        <w:t>Darkwave</w:t>
+      </w:r>
+      <w:proofErr w:type="spellEnd"/>
+      <w:r>
+        <w:rPr>
+          <w:rFonts w:ascii="Arial" w:hAnsi="Arial" w:cs="Arial"/>
+          <w:color w:val="FFFFFF" w:themeColor="background1"/>
+          <w:sz w:val="24"/>
+          <w:szCs w:val="24"/>
+          <w:lang w:eastAsia="en-US"/>
+        </w:rPr>
+        <w:t xml:space="preserve">, Post-Punk, </w:t>
+      </w:r>
+      <w:proofErr w:type="spellStart"/>
+      <w:r>
+        <w:rPr>
+          <w:rFonts w:ascii="Arial" w:hAnsi="Arial" w:cs="Arial"/>
+          <w:color w:val="FFFFFF" w:themeColor="background1"/>
+          <w:sz w:val="24"/>
+          <w:szCs w:val="24"/>
+          <w:lang w:eastAsia="en-US"/>
+        </w:rPr>
+        <w:t>Deathrock</w:t>
+      </w:r>
+      <w:proofErr w:type="spellEnd"/>
+      <w:r>
+        <w:rPr>
+          <w:rFonts w:ascii="Arial" w:hAnsi="Arial" w:cs="Arial"/>
+          <w:color w:val="FFFFFF" w:themeColor="background1"/>
+          <w:sz w:val="24"/>
+          <w:szCs w:val="24"/>
+          <w:lang w:eastAsia="en-US"/>
+        </w:rPr>
+        <w:t xml:space="preserve"> e EBM (</w:t>
+      </w:r>
+      <w:proofErr w:type="spellStart"/>
+      <w:r>
+        <w:rPr>
+          <w:rFonts w:ascii="Arial" w:hAnsi="Arial" w:cs="Arial"/>
+          <w:color w:val="FFFFFF" w:themeColor="background1"/>
+          <w:sz w:val="24"/>
+          <w:szCs w:val="24"/>
+          <w:lang w:eastAsia="en-US"/>
+        </w:rPr>
+        <w:t>Electronic</w:t>
+      </w:r>
+      <w:proofErr w:type="spellEnd"/>
+      <w:r>
+        <w:rPr>
+          <w:rFonts w:ascii="Arial" w:hAnsi="Arial" w:cs="Arial"/>
+          <w:color w:val="FFFFFF" w:themeColor="background1"/>
+          <w:sz w:val="24"/>
+          <w:szCs w:val="24"/>
+          <w:lang w:eastAsia="en-US"/>
+        </w:rPr>
+        <w:t xml:space="preserve"> Body Music), com muitas bandas nesses gêneros, porém, vale a ressalva para o Sisters </w:t>
+      </w:r>
+      <w:proofErr w:type="spellStart"/>
+      <w:r>
+        <w:rPr>
+          <w:rFonts w:ascii="Arial" w:hAnsi="Arial" w:cs="Arial"/>
+          <w:color w:val="FFFFFF" w:themeColor="background1"/>
+          <w:sz w:val="24"/>
+          <w:szCs w:val="24"/>
+          <w:lang w:eastAsia="en-US"/>
+        </w:rPr>
+        <w:t>Of</w:t>
+      </w:r>
+      <w:proofErr w:type="spellEnd"/>
+      <w:r>
+        <w:rPr>
+          <w:rFonts w:ascii="Arial" w:hAnsi="Arial" w:cs="Arial"/>
+          <w:color w:val="FFFFFF" w:themeColor="background1"/>
+          <w:sz w:val="24"/>
+          <w:szCs w:val="24"/>
+          <w:lang w:eastAsia="en-US"/>
+        </w:rPr>
+        <w:t xml:space="preserve"> Mercy, </w:t>
+      </w:r>
+      <w:proofErr w:type="spellStart"/>
+      <w:r>
+        <w:rPr>
+          <w:rFonts w:ascii="Arial" w:hAnsi="Arial" w:cs="Arial"/>
+          <w:color w:val="FFFFFF" w:themeColor="background1"/>
+          <w:sz w:val="24"/>
+          <w:szCs w:val="24"/>
+          <w:lang w:eastAsia="en-US"/>
+        </w:rPr>
+        <w:t>Lebanon</w:t>
+      </w:r>
+      <w:proofErr w:type="spellEnd"/>
+      <w:r>
+        <w:rPr>
+          <w:rFonts w:ascii="Arial" w:hAnsi="Arial" w:cs="Arial"/>
+          <w:color w:val="FFFFFF" w:themeColor="background1"/>
+          <w:sz w:val="24"/>
+          <w:szCs w:val="24"/>
+          <w:lang w:eastAsia="en-US"/>
+        </w:rPr>
+        <w:t xml:space="preserve"> Hanover, She </w:t>
+      </w:r>
+      <w:proofErr w:type="spellStart"/>
+      <w:r>
+        <w:rPr>
+          <w:rFonts w:ascii="Arial" w:hAnsi="Arial" w:cs="Arial"/>
+          <w:color w:val="FFFFFF" w:themeColor="background1"/>
+          <w:sz w:val="24"/>
+          <w:szCs w:val="24"/>
+          <w:lang w:eastAsia="en-US"/>
+        </w:rPr>
+        <w:t>Past</w:t>
+      </w:r>
+      <w:proofErr w:type="spellEnd"/>
+      <w:r>
+        <w:rPr>
+          <w:rFonts w:ascii="Arial" w:hAnsi="Arial" w:cs="Arial"/>
+          <w:color w:val="FFFFFF" w:themeColor="background1"/>
+          <w:sz w:val="24"/>
+          <w:szCs w:val="24"/>
+          <w:lang w:eastAsia="en-US"/>
+        </w:rPr>
+        <w:t xml:space="preserve"> Away e Twin </w:t>
+      </w:r>
+      <w:proofErr w:type="spellStart"/>
+      <w:r>
+        <w:rPr>
+          <w:rFonts w:ascii="Arial" w:hAnsi="Arial" w:cs="Arial"/>
+          <w:color w:val="FFFFFF" w:themeColor="background1"/>
+          <w:sz w:val="24"/>
+          <w:szCs w:val="24"/>
+          <w:lang w:eastAsia="en-US"/>
+        </w:rPr>
+        <w:t>Tribes</w:t>
+      </w:r>
+      <w:proofErr w:type="spellEnd"/>
+      <w:r>
+        <w:rPr>
+          <w:rFonts w:ascii="Arial" w:hAnsi="Arial" w:cs="Arial"/>
+          <w:color w:val="FFFFFF" w:themeColor="background1"/>
+          <w:sz w:val="24"/>
+          <w:szCs w:val="24"/>
+          <w:lang w:eastAsia="en-US"/>
+        </w:rPr>
+        <w:t>.</w:t>
+      </w:r>
+      <w:r>
+        <w:rPr>
+          <w:rFonts w:ascii="Arial" w:hAnsi="Arial" w:cs="Arial"/>
+          <w:color w:val="FFFFFF" w:themeColor="background1"/>
+          <w:sz w:val="24"/>
+          <w:szCs w:val="24"/>
+          <w:lang w:eastAsia="en-US"/>
+        </w:rPr>
+        <w:t xml:space="preserve"> Destacando </w:t>
+      </w:r>
+      <w:r>
+        <w:rPr>
+          <w:rFonts w:ascii="Arial" w:hAnsi="Arial" w:cs="Arial"/>
+          <w:color w:val="FFFFFF" w:themeColor="background1"/>
+          <w:sz w:val="24"/>
+          <w:szCs w:val="24"/>
+          <w:lang w:eastAsia="en-US"/>
+        </w:rPr>
+        <w:t>o pilar de beleza na melancolia, ressalvo</w:t>
+      </w:r>
+      <w:r>
+        <w:rPr>
+          <w:rFonts w:ascii="Arial" w:hAnsi="Arial" w:cs="Arial"/>
+          <w:color w:val="FFFFFF" w:themeColor="background1"/>
+          <w:sz w:val="24"/>
+          <w:szCs w:val="24"/>
+          <w:lang w:eastAsia="en-US"/>
+        </w:rPr>
+        <w:t xml:space="preserve"> citar a melancolia</w:t>
+      </w:r>
+      <w:r>
+        <w:rPr>
+          <w:rFonts w:ascii="Arial" w:hAnsi="Arial" w:cs="Arial"/>
+          <w:color w:val="FFFFFF" w:themeColor="background1"/>
+          <w:sz w:val="24"/>
+          <w:szCs w:val="24"/>
+          <w:lang w:eastAsia="en-US"/>
+        </w:rPr>
+        <w:t xml:space="preserve"> </w:t>
+      </w:r>
+      <w:r>
+        <w:rPr>
+          <w:rFonts w:ascii="Arial" w:hAnsi="Arial" w:cs="Arial"/>
+          <w:color w:val="FFFFFF" w:themeColor="background1"/>
+          <w:sz w:val="24"/>
+          <w:szCs w:val="24"/>
+          <w:lang w:eastAsia="en-US"/>
+        </w:rPr>
+        <w:t xml:space="preserve">o mantra </w:t>
       </w:r>
       <w:r>
         <w:rPr>
@@ -3808,7 +4336,95 @@
           <w:lang w:eastAsia="en-US"/>
         </w:rPr>
         <w:lastRenderedPageBreak/>
-        <w:t>Rebellion”, uma música do Lebanon Hanover, que destaca a superficialidade das pessoas em não buscarem autoconhecimento.</w:t>
+        <w:t>“</w:t>
+      </w:r>
+      <w:proofErr w:type="spellStart"/>
+      <w:r>
+        <w:rPr>
+          <w:rFonts w:ascii="Arial" w:hAnsi="Arial" w:cs="Arial"/>
+          <w:color w:val="FFFFFF" w:themeColor="background1"/>
+          <w:sz w:val="24"/>
+          <w:szCs w:val="24"/>
+          <w:lang w:eastAsia="en-US"/>
+        </w:rPr>
+        <w:t>Sadness</w:t>
+      </w:r>
+      <w:proofErr w:type="spellEnd"/>
+      <w:r>
+        <w:rPr>
+          <w:rFonts w:ascii="Arial" w:hAnsi="Arial" w:cs="Arial"/>
+          <w:color w:val="FFFFFF" w:themeColor="background1"/>
+          <w:sz w:val="24"/>
+          <w:szCs w:val="24"/>
+          <w:lang w:eastAsia="en-US"/>
+        </w:rPr>
+        <w:t xml:space="preserve"> </w:t>
+      </w:r>
+      <w:proofErr w:type="spellStart"/>
+      <w:r>
+        <w:rPr>
+          <w:rFonts w:ascii="Arial" w:hAnsi="Arial" w:cs="Arial"/>
+          <w:color w:val="FFFFFF" w:themeColor="background1"/>
+          <w:sz w:val="24"/>
+          <w:szCs w:val="24"/>
+          <w:lang w:eastAsia="en-US"/>
+        </w:rPr>
+        <w:t>Is</w:t>
+      </w:r>
+      <w:proofErr w:type="spellEnd"/>
+      <w:r>
+        <w:rPr>
+          <w:rFonts w:ascii="Arial" w:hAnsi="Arial" w:cs="Arial"/>
+          <w:color w:val="FFFFFF" w:themeColor="background1"/>
+          <w:sz w:val="24"/>
+          <w:szCs w:val="24"/>
+          <w:lang w:eastAsia="en-US"/>
+        </w:rPr>
+        <w:t xml:space="preserve"> </w:t>
+      </w:r>
+      <w:proofErr w:type="spellStart"/>
+      <w:r>
+        <w:rPr>
+          <w:rFonts w:ascii="Arial" w:hAnsi="Arial" w:cs="Arial"/>
+          <w:color w:val="FFFFFF" w:themeColor="background1"/>
+          <w:sz w:val="24"/>
+          <w:szCs w:val="24"/>
+          <w:lang w:eastAsia="en-US"/>
+        </w:rPr>
+        <w:t>Rebellion</w:t>
+      </w:r>
+      <w:proofErr w:type="spellEnd"/>
+      <w:r>
+        <w:rPr>
+          <w:rFonts w:ascii="Arial" w:hAnsi="Arial" w:cs="Arial"/>
+          <w:color w:val="FFFFFF" w:themeColor="background1"/>
+          <w:sz w:val="24"/>
+          <w:szCs w:val="24"/>
+          <w:lang w:eastAsia="en-US"/>
+        </w:rPr>
+        <w:t xml:space="preserve">”, uma música do </w:t>
+      </w:r>
+      <w:proofErr w:type="spellStart"/>
+      <w:r>
+        <w:rPr>
+          <w:rFonts w:ascii="Arial" w:hAnsi="Arial" w:cs="Arial"/>
+          <w:color w:val="FFFFFF" w:themeColor="background1"/>
+          <w:sz w:val="24"/>
+          <w:szCs w:val="24"/>
+          <w:lang w:eastAsia="en-US"/>
+        </w:rPr>
+        <w:t>Lebanon</w:t>
+      </w:r>
+      <w:proofErr w:type="spellEnd"/>
+      <w:r>
+        <w:rPr>
+          <w:rFonts w:ascii="Arial" w:hAnsi="Arial" w:cs="Arial"/>
+          <w:color w:val="FFFFFF" w:themeColor="background1"/>
+          <w:sz w:val="24"/>
+          <w:szCs w:val="24"/>
+          <w:lang w:eastAsia="en-US"/>
+        </w:rPr>
+        <w:t xml:space="preserve"> Hanover, que destaca a superficialidade das pessoas em não buscarem autoconhecimento.</w:t>
       </w:r>
     </w:p>
     <w:p>
@@ -3892,7 +4508,27 @@
           <w:bCs/>
           <w:color w:val="FFFFFF" w:themeColor="background1"/>
         </w:rPr>
-        <w:t>Figura 7: Sisters Of Mercy</w:t>
+        <w:t xml:space="preserve">Figura 7: Sisters </w:t>
+      </w:r>
+      <w:proofErr w:type="spellStart"/>
+      <w:r>
+        <w:rPr>
+          <w:rFonts w:ascii="Arial" w:hAnsi="Arial" w:cs="Arial"/>
+          <w:b/>
+          <w:bCs/>
+          <w:color w:val="FFFFFF" w:themeColor="background1"/>
+        </w:rPr>
+        <w:t>Of</w:t>
+      </w:r>
+      <w:proofErr w:type="spellEnd"/>
+      <w:r>
+        <w:rPr>
+          <w:rFonts w:ascii="Arial" w:hAnsi="Arial" w:cs="Arial"/>
+          <w:b/>
+          <w:bCs/>
+          <w:color w:val="FFFFFF" w:themeColor="background1"/>
+        </w:rPr>
+        <w:t xml:space="preserve"> Mercy</w:t>
       </w:r>
     </w:p>
     <w:p>
@@ -3982,7 +4618,27 @@
           <w:bCs/>
           <w:color w:val="FFFFFF" w:themeColor="background1"/>
         </w:rPr>
-        <w:t>Figura 8: Lebanon Hanover</w:t>
+        <w:t xml:space="preserve">Figura 8: </w:t>
+      </w:r>
+      <w:proofErr w:type="spellStart"/>
+      <w:r>
+        <w:rPr>
+          <w:rFonts w:ascii="Arial" w:hAnsi="Arial" w:cs="Arial"/>
+          <w:b/>
+          <w:bCs/>
+          <w:color w:val="FFFFFF" w:themeColor="background1"/>
+        </w:rPr>
+        <w:t>Lebanon</w:t>
+      </w:r>
+      <w:proofErr w:type="spellEnd"/>
+      <w:r>
+        <w:rPr>
+          <w:rFonts w:ascii="Arial" w:hAnsi="Arial" w:cs="Arial"/>
+          <w:b/>
+          <w:bCs/>
+          <w:color w:val="FFFFFF" w:themeColor="background1"/>
+        </w:rPr>
+        <w:t xml:space="preserve"> Hanover</w:t>
       </w:r>
     </w:p>
     <w:p>
@@ -4171,7 +4827,51 @@
           <w:szCs w:val="24"/>
           <w:lang w:eastAsia="en-US"/>
         </w:rPr>
-        <w:t>O que me chateia é que há muito estereótipos no meio, falando que góticos são tristes, ou que góticos odeiam todo mundo, e não é verdade, e está longe de ser verdade, é só um jeito diferente de viver que as outras pessoas, e não há nada de errado nisso, portanto, A Little Piece Of My Soul veio para desmistificar alguns mitos e estereótipos sobre a subcultura.</w:t>
+        <w:t xml:space="preserve">O que me chateia é que há muito estereótipos no meio, falando que góticos são tristes, ou que góticos odeiam todo mundo, e não é verdade, e está longe de ser verdade, é só um jeito diferente de viver que as outras pessoas, e não há nada de errado nisso, portanto, A Little Piece </w:t>
+      </w:r>
+      <w:proofErr w:type="spellStart"/>
+      <w:r>
+        <w:rPr>
+          <w:rFonts w:ascii="Arial" w:hAnsi="Arial" w:cs="Arial"/>
+          <w:color w:val="FFFFFF" w:themeColor="background1"/>
+          <w:sz w:val="24"/>
+          <w:szCs w:val="24"/>
+          <w:lang w:eastAsia="en-US"/>
+        </w:rPr>
+        <w:t>Of</w:t>
+      </w:r>
+      <w:proofErr w:type="spellEnd"/>
+      <w:r>
+        <w:rPr>
+          <w:rFonts w:ascii="Arial" w:hAnsi="Arial" w:cs="Arial"/>
+          <w:color w:val="FFFFFF" w:themeColor="background1"/>
+          <w:sz w:val="24"/>
+          <w:szCs w:val="24"/>
+          <w:lang w:eastAsia="en-US"/>
+        </w:rPr>
+        <w:t xml:space="preserve"> </w:t>
+      </w:r>
+      <w:proofErr w:type="spellStart"/>
+      <w:r>
+        <w:rPr>
+          <w:rFonts w:ascii="Arial" w:hAnsi="Arial" w:cs="Arial"/>
+          <w:color w:val="FFFFFF" w:themeColor="background1"/>
+          <w:sz w:val="24"/>
+          <w:szCs w:val="24"/>
+          <w:lang w:eastAsia="en-US"/>
+        </w:rPr>
+        <w:t>My</w:t>
+      </w:r>
+      <w:proofErr w:type="spellEnd"/>
+      <w:r>
+        <w:rPr>
+          <w:rFonts w:ascii="Arial" w:hAnsi="Arial" w:cs="Arial"/>
+          <w:color w:val="FFFFFF" w:themeColor="background1"/>
+          <w:sz w:val="24"/>
+          <w:szCs w:val="24"/>
+          <w:lang w:eastAsia="en-US"/>
+        </w:rPr>
+        <w:t xml:space="preserve"> Soul veio para desmistificar alguns mitos e estereótipos sobre a subcultura.</w:t>
       </w:r>
     </w:p>
     <w:p>
@@ -4194,7 +4894,73 @@
           <w:szCs w:val="24"/>
           <w:lang w:eastAsia="en-US"/>
         </w:rPr>
-        <w:t>O nome A Little Piece Of My Soul surgiu através da minha playlist do Spotify, de mesmo nome do projeto.</w:t>
+        <w:t xml:space="preserve">O nome A Little Piece </w:t>
+      </w:r>
+      <w:proofErr w:type="spellStart"/>
+      <w:r>
+        <w:rPr>
+          <w:rFonts w:ascii="Arial" w:hAnsi="Arial" w:cs="Arial"/>
+          <w:color w:val="FFFFFF" w:themeColor="background1"/>
+          <w:sz w:val="24"/>
+          <w:szCs w:val="24"/>
+          <w:lang w:eastAsia="en-US"/>
+        </w:rPr>
+        <w:t>Of</w:t>
+      </w:r>
+      <w:proofErr w:type="spellEnd"/>
+      <w:r>
+        <w:rPr>
+          <w:rFonts w:ascii="Arial" w:hAnsi="Arial" w:cs="Arial"/>
+          <w:color w:val="FFFFFF" w:themeColor="background1"/>
+          <w:sz w:val="24"/>
+          <w:szCs w:val="24"/>
+          <w:lang w:eastAsia="en-US"/>
+        </w:rPr>
+        <w:t xml:space="preserve"> </w:t>
+      </w:r>
+      <w:proofErr w:type="spellStart"/>
+      <w:r>
+        <w:rPr>
+          <w:rFonts w:ascii="Arial" w:hAnsi="Arial" w:cs="Arial"/>
+          <w:color w:val="FFFFFF" w:themeColor="background1"/>
+          <w:sz w:val="24"/>
+          <w:szCs w:val="24"/>
+          <w:lang w:eastAsia="en-US"/>
+        </w:rPr>
+        <w:t>My</w:t>
+      </w:r>
+      <w:proofErr w:type="spellEnd"/>
+      <w:r>
+        <w:rPr>
+          <w:rFonts w:ascii="Arial" w:hAnsi="Arial" w:cs="Arial"/>
+          <w:color w:val="FFFFFF" w:themeColor="background1"/>
+          <w:sz w:val="24"/>
+          <w:szCs w:val="24"/>
+          <w:lang w:eastAsia="en-US"/>
+        </w:rPr>
+        <w:t xml:space="preserve"> Soul surgiu através da minha </w:t>
+      </w:r>
+      <w:proofErr w:type="gramStart"/>
+      <w:r>
+        <w:rPr>
+          <w:rFonts w:ascii="Arial" w:hAnsi="Arial" w:cs="Arial"/>
+          <w:color w:val="FFFFFF" w:themeColor="background1"/>
+          <w:sz w:val="24"/>
+          <w:szCs w:val="24"/>
+          <w:lang w:eastAsia="en-US"/>
+        </w:rPr>
+        <w:t>playlist</w:t>
+      </w:r>
+      <w:proofErr w:type="gramEnd"/>
+      <w:r>
+        <w:rPr>
+          <w:rFonts w:ascii="Arial" w:hAnsi="Arial" w:cs="Arial"/>
+          <w:color w:val="FFFFFF" w:themeColor="background1"/>
+          <w:sz w:val="24"/>
+          <w:szCs w:val="24"/>
+          <w:lang w:eastAsia="en-US"/>
+        </w:rPr>
+        <w:t xml:space="preserve"> do Spotify, de mesmo nome do projeto.</w:t>
       </w:r>
     </w:p>
     <w:p>
@@ -4266,7 +5032,27 @@
           <w:bCs/>
           <w:color w:val="FFFFFF" w:themeColor="background1"/>
         </w:rPr>
-        <w:t>Figura 9: Playlist do Spotify</w:t>
+        <w:t xml:space="preserve">Figura 9: </w:t>
+      </w:r>
+      <w:proofErr w:type="gramStart"/>
+      <w:r>
+        <w:rPr>
+          <w:rFonts w:ascii="Arial" w:hAnsi="Arial" w:cs="Arial"/>
+          <w:b/>
+          <w:bCs/>
+          <w:color w:val="FFFFFF" w:themeColor="background1"/>
+        </w:rPr>
+        <w:t>Playlist</w:t>
+      </w:r>
+      <w:proofErr w:type="gramEnd"/>
+      <w:r>
+        <w:rPr>
+          <w:rFonts w:ascii="Arial" w:hAnsi="Arial" w:cs="Arial"/>
+          <w:b/>
+          <w:bCs/>
+          <w:color w:val="FFFFFF" w:themeColor="background1"/>
+        </w:rPr>
+        <w:t xml:space="preserve"> do Spotify</w:t>
       </w:r>
     </w:p>
     <w:p>
@@ -4911,7 +5697,23 @@
           <w:rFonts w:ascii="Arial" w:hAnsi="Arial" w:cs="Arial"/>
           <w:color w:val="FFFFFF" w:themeColor="background1"/>
         </w:rPr>
-        <w:t>Os usuários terão acesso a internet para visualização do site.</w:t>
+        <w:t xml:space="preserve">Os usuários terão acesso </w:t>
+      </w:r>
+      <w:proofErr w:type="spellStart"/>
+      <w:r>
+        <w:rPr>
+          <w:rFonts w:ascii="Arial" w:hAnsi="Arial" w:cs="Arial"/>
+          <w:color w:val="FFFFFF" w:themeColor="background1"/>
+        </w:rPr>
+        <w:t>a</w:t>
+      </w:r>
+      <w:proofErr w:type="spellEnd"/>
+      <w:r>
+        <w:rPr>
+          <w:rFonts w:ascii="Arial" w:hAnsi="Arial" w:cs="Arial"/>
+          <w:color w:val="FFFFFF" w:themeColor="background1"/>
+        </w:rPr>
+        <w:t xml:space="preserve"> internet para visualização do site.</w:t>
       </w:r>
     </w:p>
     <w:p>
@@ -5000,7 +5802,32 @@
           <w:rFonts w:ascii="Arial" w:hAnsi="Arial" w:cs="Arial"/>
           <w:color w:val="FFFFFF" w:themeColor="background1"/>
         </w:rPr>
-        <w:t>Não haverá APIs externas para música, como Youtube, Spotify, Soundcloud etc;</w:t>
+        <w:t xml:space="preserve">Não haverá APIs externas para música, como Youtube, Spotify, </w:t>
+      </w:r>
+      <w:proofErr w:type="gramStart"/>
+      <w:r>
+        <w:rPr>
+          <w:rFonts w:ascii="Arial" w:hAnsi="Arial" w:cs="Arial"/>
+          <w:color w:val="FFFFFF" w:themeColor="background1"/>
+        </w:rPr>
+        <w:t xml:space="preserve">Soundcloud </w:t>
+      </w:r>
+      <w:proofErr w:type="spellStart"/>
+      <w:r>
+        <w:rPr>
+          <w:rFonts w:ascii="Arial" w:hAnsi="Arial" w:cs="Arial"/>
+          <w:color w:val="FFFFFF" w:themeColor="background1"/>
+        </w:rPr>
+        <w:t>etc</w:t>
+      </w:r>
+      <w:proofErr w:type="spellEnd"/>
+      <w:proofErr w:type="gramEnd"/>
+      <w:r>
+        <w:rPr>
+          <w:rFonts w:ascii="Arial" w:hAnsi="Arial" w:cs="Arial"/>
+          <w:color w:val="FFFFFF" w:themeColor="background1"/>
+        </w:rPr>
+        <w:t>;</w:t>
       </w:r>
     </w:p>
     <w:p>
@@ -5084,7 +5911,23 @@
           <w:rFonts w:ascii="Arial" w:hAnsi="Arial" w:cs="Arial"/>
           <w:color w:val="FFFFFF" w:themeColor="background1"/>
         </w:rPr>
-        <w:t>O banco de dados armazenará apenas informações essenciais para o funcionamento, como nome, email, resultados do Quiz, gênero e banda favorita</w:t>
+        <w:t xml:space="preserve">O banco de dados armazenará apenas informações essenciais para o funcionamento, como nome, </w:t>
+      </w:r>
+      <w:proofErr w:type="spellStart"/>
+      <w:r>
+        <w:rPr>
+          <w:rFonts w:ascii="Arial" w:hAnsi="Arial" w:cs="Arial"/>
+          <w:color w:val="FFFFFF" w:themeColor="background1"/>
+        </w:rPr>
+        <w:t>email</w:t>
+      </w:r>
+      <w:proofErr w:type="spellEnd"/>
+      <w:r>
+        <w:rPr>
+          <w:rFonts w:ascii="Arial" w:hAnsi="Arial" w:cs="Arial"/>
+          <w:color w:val="FFFFFF" w:themeColor="background1"/>
+        </w:rPr>
+        <w:t>, resultados do Quiz, gênero e banda favorita</w:t>
       </w:r>
       <w:r>
         <w:rPr>
@@ -5112,7 +5955,32 @@
           <w:rFonts w:ascii="Arial" w:hAnsi="Arial" w:cs="Arial"/>
           <w:color w:val="FFFFFF" w:themeColor="background1"/>
         </w:rPr>
-        <w:t>As imagens do criador (foto do rosto, foto em shows etc) não devem ser utilizadas por terceiros com quaisquer objetivos, sejam eles lucrativos ou não</w:t>
+        <w:t xml:space="preserve">As imagens do criador (foto do rosto, foto em </w:t>
+      </w:r>
+      <w:proofErr w:type="gramStart"/>
+      <w:r>
+        <w:rPr>
+          <w:rFonts w:ascii="Arial" w:hAnsi="Arial" w:cs="Arial"/>
+          <w:color w:val="FFFFFF" w:themeColor="background1"/>
+        </w:rPr>
+        <w:t xml:space="preserve">shows </w:t>
+      </w:r>
+      <w:proofErr w:type="spellStart"/>
+      <w:r>
+        <w:rPr>
+          <w:rFonts w:ascii="Arial" w:hAnsi="Arial" w:cs="Arial"/>
+          <w:color w:val="FFFFFF" w:themeColor="background1"/>
+        </w:rPr>
+        <w:t>etc</w:t>
+      </w:r>
+      <w:proofErr w:type="spellEnd"/>
+      <w:proofErr w:type="gramEnd"/>
+      <w:r>
+        <w:rPr>
+          <w:rFonts w:ascii="Arial" w:hAnsi="Arial" w:cs="Arial"/>
+          <w:color w:val="FFFFFF" w:themeColor="background1"/>
+        </w:rPr>
+        <w:t>) não devem ser utilizadas por terceiros com quaisquer objetivos, sejam eles lucrativos ou não</w:t>
       </w:r>
       <w:r>
         <w:rPr>
@@ -5398,7 +6266,67 @@
           <w:szCs w:val="24"/>
           <w:lang w:eastAsia="en-US"/>
         </w:rPr>
-        <w:t>do Hypervisor VirtualBox, uma máquina virtual com o sistema operacional Lubuntu Linux foi instalada, visando maior segurança e isolamento do ambiente do projeto.</w:t>
+        <w:t xml:space="preserve">do </w:t>
+      </w:r>
+      <w:proofErr w:type="spellStart"/>
+      <w:r>
+        <w:rPr>
+          <w:rFonts w:ascii="Arial" w:hAnsi="Arial" w:cs="Arial"/>
+          <w:sz w:val="24"/>
+          <w:szCs w:val="24"/>
+          <w:lang w:eastAsia="en-US"/>
+        </w:rPr>
+        <w:t>Hypervisor</w:t>
+      </w:r>
+      <w:proofErr w:type="spellEnd"/>
+      <w:r>
+        <w:rPr>
+          <w:rFonts w:ascii="Arial" w:hAnsi="Arial" w:cs="Arial"/>
+          <w:sz w:val="24"/>
+          <w:szCs w:val="24"/>
+          <w:lang w:eastAsia="en-US"/>
+        </w:rPr>
+        <w:t xml:space="preserve"> </w:t>
+      </w:r>
+      <w:proofErr w:type="spellStart"/>
+      <w:r>
+        <w:rPr>
+          <w:rFonts w:ascii="Arial" w:hAnsi="Arial" w:cs="Arial"/>
+          <w:sz w:val="24"/>
+          <w:szCs w:val="24"/>
+          <w:lang w:eastAsia="en-US"/>
+        </w:rPr>
+        <w:t>VirtualBox</w:t>
+      </w:r>
+      <w:proofErr w:type="spellEnd"/>
+      <w:r>
+        <w:rPr>
+          <w:rFonts w:ascii="Arial" w:hAnsi="Arial" w:cs="Arial"/>
+          <w:sz w:val="24"/>
+          <w:szCs w:val="24"/>
+          <w:lang w:eastAsia="en-US"/>
+        </w:rPr>
+        <w:t xml:space="preserve">, uma máquina virtual com o sistema operacional </w:t>
+      </w:r>
+      <w:proofErr w:type="spellStart"/>
+      <w:r>
+        <w:rPr>
+          <w:rFonts w:ascii="Arial" w:hAnsi="Arial" w:cs="Arial"/>
+          <w:sz w:val="24"/>
+          <w:szCs w:val="24"/>
+          <w:lang w:eastAsia="en-US"/>
+        </w:rPr>
+        <w:t>Lubuntu</w:t>
+      </w:r>
+      <w:proofErr w:type="spellEnd"/>
+      <w:r>
+        <w:rPr>
+          <w:rFonts w:ascii="Arial" w:hAnsi="Arial" w:cs="Arial"/>
+          <w:sz w:val="24"/>
+          <w:szCs w:val="24"/>
+          <w:lang w:eastAsia="en-US"/>
+        </w:rPr>
+        <w:t xml:space="preserve"> Linux foi instalada, visando maior segurança e isolamento do ambiente do projeto.</w:t>
       </w:r>
     </w:p>
     <w:p>
@@ -5426,25 +6354,125 @@
           <w:szCs w:val="24"/>
           <w:lang w:eastAsia="en-US"/>
         </w:rPr>
-        <w:t xml:space="preserve">o servidor de banco de dados MySQL Server foi instalado e configurado, o site A Little Piece Of My Soul foi hospedado nessa máquina virtual </w:t>
-      </w:r>
-      <w:r>
-        <w:rPr>
-          <w:rFonts w:ascii="Arial" w:hAnsi="Arial" w:cs="Arial"/>
-          <w:sz w:val="24"/>
-          <w:szCs w:val="24"/>
-          <w:lang w:eastAsia="en-US"/>
-        </w:rPr>
-        <w:t xml:space="preserve">e através da API Web Data Viz os dados do site são atualizados conforme dados do banco, </w:t>
-      </w:r>
-      <w:r>
-        <w:rPr>
-          <w:rFonts w:ascii="Arial" w:hAnsi="Arial" w:cs="Arial"/>
-          <w:sz w:val="24"/>
-          <w:szCs w:val="24"/>
-          <w:lang w:eastAsia="en-US"/>
-        </w:rPr>
-        <w:t>na qual ela realiza operações de insert e select no banco. E por último, o usuário acessa sua dashboard após realização do Quiz.</w:t>
+        <w:t xml:space="preserve">o servidor de banco de dados MySQL Server foi instalado e configurado, o site A Little Piece </w:t>
+      </w:r>
+      <w:proofErr w:type="spellStart"/>
+      <w:r>
+        <w:rPr>
+          <w:rFonts w:ascii="Arial" w:hAnsi="Arial" w:cs="Arial"/>
+          <w:sz w:val="24"/>
+          <w:szCs w:val="24"/>
+          <w:lang w:eastAsia="en-US"/>
+        </w:rPr>
+        <w:t>Of</w:t>
+      </w:r>
+      <w:proofErr w:type="spellEnd"/>
+      <w:r>
+        <w:rPr>
+          <w:rFonts w:ascii="Arial" w:hAnsi="Arial" w:cs="Arial"/>
+          <w:sz w:val="24"/>
+          <w:szCs w:val="24"/>
+          <w:lang w:eastAsia="en-US"/>
+        </w:rPr>
+        <w:t xml:space="preserve"> </w:t>
+      </w:r>
+      <w:proofErr w:type="spellStart"/>
+      <w:r>
+        <w:rPr>
+          <w:rFonts w:ascii="Arial" w:hAnsi="Arial" w:cs="Arial"/>
+          <w:sz w:val="24"/>
+          <w:szCs w:val="24"/>
+          <w:lang w:eastAsia="en-US"/>
+        </w:rPr>
+        <w:t>My</w:t>
+      </w:r>
+      <w:proofErr w:type="spellEnd"/>
+      <w:r>
+        <w:rPr>
+          <w:rFonts w:ascii="Arial" w:hAnsi="Arial" w:cs="Arial"/>
+          <w:sz w:val="24"/>
+          <w:szCs w:val="24"/>
+          <w:lang w:eastAsia="en-US"/>
+        </w:rPr>
+        <w:t xml:space="preserve"> Soul foi hospedado nessa máquina virtual </w:t>
+      </w:r>
+      <w:r>
+        <w:rPr>
+          <w:rFonts w:ascii="Arial" w:hAnsi="Arial" w:cs="Arial"/>
+          <w:sz w:val="24"/>
+          <w:szCs w:val="24"/>
+          <w:lang w:eastAsia="en-US"/>
+        </w:rPr>
+        <w:t xml:space="preserve">e através da API Web Data </w:t>
+      </w:r>
+      <w:proofErr w:type="spellStart"/>
+      <w:r>
+        <w:rPr>
+          <w:rFonts w:ascii="Arial" w:hAnsi="Arial" w:cs="Arial"/>
+          <w:sz w:val="24"/>
+          <w:szCs w:val="24"/>
+          <w:lang w:eastAsia="en-US"/>
+        </w:rPr>
+        <w:t>Viz</w:t>
+      </w:r>
+      <w:proofErr w:type="spellEnd"/>
+      <w:r>
+        <w:rPr>
+          <w:rFonts w:ascii="Arial" w:hAnsi="Arial" w:cs="Arial"/>
+          <w:sz w:val="24"/>
+          <w:szCs w:val="24"/>
+          <w:lang w:eastAsia="en-US"/>
+        </w:rPr>
+        <w:t xml:space="preserve"> os dados do site são atualizados conforme dados do banco, </w:t>
+      </w:r>
+      <w:r>
+        <w:rPr>
+          <w:rFonts w:ascii="Arial" w:hAnsi="Arial" w:cs="Arial"/>
+          <w:sz w:val="24"/>
+          <w:szCs w:val="24"/>
+          <w:lang w:eastAsia="en-US"/>
+        </w:rPr>
+        <w:t xml:space="preserve">na qual ela realiza operações de </w:t>
+      </w:r>
+      <w:proofErr w:type="spellStart"/>
+      <w:r>
+        <w:rPr>
+          <w:rFonts w:ascii="Arial" w:hAnsi="Arial" w:cs="Arial"/>
+          <w:sz w:val="24"/>
+          <w:szCs w:val="24"/>
+          <w:lang w:eastAsia="en-US"/>
+        </w:rPr>
+        <w:t>insert</w:t>
+      </w:r>
+      <w:proofErr w:type="spellEnd"/>
+      <w:r>
+        <w:rPr>
+          <w:rFonts w:ascii="Arial" w:hAnsi="Arial" w:cs="Arial"/>
+          <w:sz w:val="24"/>
+          <w:szCs w:val="24"/>
+          <w:lang w:eastAsia="en-US"/>
+        </w:rPr>
+        <w:t xml:space="preserve"> e </w:t>
+      </w:r>
+      <w:proofErr w:type="spellStart"/>
+      <w:r>
+        <w:rPr>
+          <w:rFonts w:ascii="Arial" w:hAnsi="Arial" w:cs="Arial"/>
+          <w:sz w:val="24"/>
+          <w:szCs w:val="24"/>
+          <w:lang w:eastAsia="en-US"/>
+        </w:rPr>
+        <w:t>select</w:t>
+      </w:r>
+      <w:proofErr w:type="spellEnd"/>
+      <w:r>
+        <w:rPr>
+          <w:rFonts w:ascii="Arial" w:hAnsi="Arial" w:cs="Arial"/>
+          <w:sz w:val="24"/>
+          <w:szCs w:val="24"/>
+          <w:lang w:eastAsia="en-US"/>
+        </w:rPr>
+        <w:t xml:space="preserve"> no banco. E por último, o usuário acessa sua dashboard após realização do Quiz.</w:t>
       </w:r>
     </w:p>
     <w:p>
@@ -5858,8 +6886,19 @@
           <w:bCs/>
           <w:color w:val="FFFFFF" w:themeColor="background1"/>
         </w:rPr>
-        <w:t>: Gráfico de BurnDown</w:t>
-      </w:r>
+        <w:t xml:space="preserve">: Gráfico de </w:t>
+      </w:r>
+      <w:proofErr w:type="spellStart"/>
+      <w:r>
+        <w:rPr>
+          <w:rFonts w:ascii="Arial" w:hAnsi="Arial" w:cs="Arial"/>
+          <w:b/>
+          <w:bCs/>
+          <w:color w:val="FFFFFF" w:themeColor="background1"/>
+        </w:rPr>
+        <w:t>BurnDown</w:t>
+      </w:r>
+      <w:proofErr w:type="spellEnd"/>
     </w:p>
     <w:p>
       <w:pPr>
@@ -5882,7 +6921,29 @@
           <w:lang w:eastAsia="en-US"/>
         </w:rPr>
         <w:lastRenderedPageBreak/>
-        <w:t>Ainda na planilha de backlog, como forma de medir meu desempenho e capacidade de entrega foi realizado um gráfico de BurnDown, com duas métricas: planejado e entregue, métricas as quais foram extraídas da somatória dos pontos Fibonacci totais, o que foi entregue e o que está pendente em cada Sprint, tendo em vista que o item pendente na Sprint foi acumulado para a próxima.</w:t>
+        <w:t xml:space="preserve">Ainda na planilha de backlog, como forma de medir meu desempenho e capacidade de entrega foi realizado um gráfico de </w:t>
+      </w:r>
+      <w:proofErr w:type="spellStart"/>
+      <w:r>
+        <w:rPr>
+          <w:rFonts w:ascii="Arial" w:hAnsi="Arial" w:cs="Arial"/>
+          <w:color w:val="FFFFFF" w:themeColor="background1"/>
+          <w:sz w:val="24"/>
+          <w:szCs w:val="24"/>
+          <w:lang w:eastAsia="en-US"/>
+        </w:rPr>
+        <w:t>BurnDown</w:t>
+      </w:r>
+      <w:proofErr w:type="spellEnd"/>
+      <w:r>
+        <w:rPr>
+          <w:rFonts w:ascii="Arial" w:hAnsi="Arial" w:cs="Arial"/>
+          <w:color w:val="FFFFFF" w:themeColor="background1"/>
+          <w:sz w:val="24"/>
+          <w:szCs w:val="24"/>
+          <w:lang w:eastAsia="en-US"/>
+        </w:rPr>
+        <w:t>, com duas métricas: planejado e entregue, métricas as quais foram extraídas da somatória dos pontos Fibonacci totais, o que foi entregue e o que está pendente em cada Sprint, tendo em vista que o item pendente na Sprint foi acumulado para a próxima.</w:t>
       </w:r>
     </w:p>
     <w:p>
@@ -5905,7 +6966,29 @@
           <w:szCs w:val="24"/>
           <w:lang w:eastAsia="en-US"/>
         </w:rPr>
-        <w:t xml:space="preserve">Todos os requisitos no backlog foram transferidos para outra plataforma de gestão, o Trello, nele, separei em 3 colunas: “A Fazer”, “Em Andamento” e “Concluído”, </w:t>
+        <w:t xml:space="preserve">Todos os requisitos no backlog foram transferidos para outra plataforma de gestão, o </w:t>
+      </w:r>
+      <w:proofErr w:type="spellStart"/>
+      <w:r>
+        <w:rPr>
+          <w:rFonts w:ascii="Arial" w:hAnsi="Arial" w:cs="Arial"/>
+          <w:color w:val="FFFFFF" w:themeColor="background1"/>
+          <w:sz w:val="24"/>
+          <w:szCs w:val="24"/>
+          <w:lang w:eastAsia="en-US"/>
+        </w:rPr>
+        <w:t>Trello</w:t>
+      </w:r>
+      <w:proofErr w:type="spellEnd"/>
+      <w:r>
+        <w:rPr>
+          <w:rFonts w:ascii="Arial" w:hAnsi="Arial" w:cs="Arial"/>
+          <w:color w:val="FFFFFF" w:themeColor="background1"/>
+          <w:sz w:val="24"/>
+          <w:szCs w:val="24"/>
+          <w:lang w:eastAsia="en-US"/>
+        </w:rPr>
+        <w:t xml:space="preserve">, nele, separei em 3 colunas: “A Fazer”, “Em Andamento” e “Concluído”, </w:t>
       </w:r>
       <w:r>
         <w:rPr>
@@ -5991,8 +7074,19 @@
           <w:bCs/>
           <w:color w:val="FFFFFF" w:themeColor="background1"/>
         </w:rPr>
-        <w:t>Figura 14: Organização no Trello</w:t>
-      </w:r>
+        <w:t xml:space="preserve">Figura 14: Organização no </w:t>
+      </w:r>
+      <w:proofErr w:type="spellStart"/>
+      <w:r>
+        <w:rPr>
+          <w:rFonts w:ascii="Arial" w:hAnsi="Arial" w:cs="Arial"/>
+          <w:b/>
+          <w:bCs/>
+          <w:color w:val="FFFFFF" w:themeColor="background1"/>
+        </w:rPr>
+        <w:t>Trello</w:t>
+      </w:r>
+      <w:proofErr w:type="spellEnd"/>
     </w:p>
     <w:p>
       <w:pPr>
@@ -6057,7 +7151,39 @@
           <w:rFonts w:ascii="Arial" w:hAnsi="Arial" w:cs="Arial"/>
           <w:color w:val="FFFFFF" w:themeColor="background1"/>
         </w:rPr>
-        <w:t>Novos quizzes temáticos, por exemplo: “Com qual estética gótica é a sua cara?” ou, “Qual personagem gótico mais te identifica?” etc;</w:t>
+        <w:t xml:space="preserve">Novos </w:t>
+      </w:r>
+      <w:proofErr w:type="spellStart"/>
+      <w:r>
+        <w:rPr>
+          <w:rFonts w:ascii="Arial" w:hAnsi="Arial" w:cs="Arial"/>
+          <w:color w:val="FFFFFF" w:themeColor="background1"/>
+        </w:rPr>
+        <w:t>quizzes</w:t>
+      </w:r>
+      <w:proofErr w:type="spellEnd"/>
+      <w:r>
+        <w:rPr>
+          <w:rFonts w:ascii="Arial" w:hAnsi="Arial" w:cs="Arial"/>
+          <w:color w:val="FFFFFF" w:themeColor="background1"/>
+        </w:rPr>
+        <w:t xml:space="preserve"> temáticos, por exemplo: “Com qual estética gótica é a sua cara?” ou, “Qual personagem gótico mais te identifica?” </w:t>
+      </w:r>
+      <w:proofErr w:type="spellStart"/>
+      <w:r>
+        <w:rPr>
+          <w:rFonts w:ascii="Arial" w:hAnsi="Arial" w:cs="Arial"/>
+          <w:color w:val="FFFFFF" w:themeColor="background1"/>
+        </w:rPr>
+        <w:t>etc</w:t>
+      </w:r>
+      <w:proofErr w:type="spellEnd"/>
+      <w:r>
+        <w:rPr>
+          <w:rFonts w:ascii="Arial" w:hAnsi="Arial" w:cs="Arial"/>
+          <w:color w:val="FFFFFF" w:themeColor="background1"/>
+        </w:rPr>
+        <w:t>;</w:t>
       </w:r>
     </w:p>
     <w:p>
@@ -6694,7 +7820,7 @@
 </file>
 
 <file path=word/endnotes.xml><?xml version="1.0" encoding="utf-8"?>
-<w:endnotes xmlns:wpc="http://schemas.microsoft.com/office/word/2010/wordprocessingCanvas" xmlns:cx="http://schemas.microsoft.com/office/drawing/2014/chartex" xmlns:cx1="http://schemas.microsoft.com/office/drawing/2015/9/8/chartex" xmlns:cx2="http://schemas.microsoft.com/office/drawing/2015/10/21/chartex" xmlns:cx3="http://schemas.microsoft.com/office/drawing/2016/5/9/chartex" xmlns:cx4="http://schemas.microsoft.com/office/drawing/2016/5/10/chartex" xmlns:cx5="http://schemas.microsoft.com/office/drawing/2016/5/11/chartex" xmlns:cx6="http://schemas.microsoft.com/office/drawing/2016/5/12/chartex" xmlns:cx7="http://schemas.microsoft.com/office/drawing/2016/5/13/chartex" xmlns:cx8="http://schemas.microsoft.com/office/drawing/2016/5/14/chartex" xmlns:mc="http://schemas.openxmlformats.org/markup-compatibility/2006" xmlns:aink="http://schemas.microsoft.com/office/drawing/2016/ink" xmlns:am3d="http://schemas.microsoft.com/office/drawing/2017/model3d" xmlns:o="urn:schemas-microsoft-com:office:office" xmlns:oel="http://schemas.microsoft.com/office/2019/extlst" xmlns:r="http://schemas.openxmlformats.org/officeDocument/2006/relationships" xmlns:m="http://schemas.openxmlformats.org/officeDocument/2006/math" xmlns:v="urn:schemas-microsoft-com:vml" xmlns:wp14="http://schemas.microsoft.com/office/word/2010/wordprocessingDrawing" xmlns:wp="http://schemas.openxmlformats.org/drawingml/2006/wordprocessingDrawing" xmlns:w10="urn:schemas-microsoft-com:office:word" xmlns:w="http://schemas.openxmlformats.org/wordprocessingml/2006/main" xmlns:w14="http://schemas.microsoft.com/office/word/2010/wordml" xmlns:w15="http://schemas.microsoft.com/office/word/2012/wordml" xmlns:w16cex="http://schemas.microsoft.com/office/word/2018/wordml/cex" xmlns:w16cid="http://schemas.microsoft.com/office/word/2016/wordml/cid" xmlns:w16="http://schemas.microsoft.com/office/word/2018/wordml" xmlns:w16sdtdh="http://schemas.microsoft.com/office/word/2020/wordml/sdtdatahash" xmlns:w16se="http://schemas.microsoft.com/office/word/2015/wordml/symex" xmlns:wpg="http://schemas.microsoft.com/office/word/2010/wordprocessingGroup" xmlns:wpi="http://schemas.microsoft.com/office/word/2010/wordprocessingInk" xmlns:wne="http://schemas.microsoft.com/office/word/2006/wordml" xmlns:wps="http://schemas.microsoft.com/office/word/2010/wordprocessingShape" mc:Ignorable="w14 w15 w16se w16cid w16 w16cex w16sdtdh wp14">
+<w:endnotes xmlns:wpc="http://schemas.microsoft.com/office/word/2010/wordprocessingCanvas" xmlns:cx="http://schemas.microsoft.com/office/drawing/2014/chartex" xmlns:cx1="http://schemas.microsoft.com/office/drawing/2015/9/8/chartex" xmlns:cx2="http://schemas.microsoft.com/office/drawing/2015/10/21/chartex" xmlns:cx3="http://schemas.microsoft.com/office/drawing/2016/5/9/chartex" xmlns:cx4="http://schemas.microsoft.com/office/drawing/2016/5/10/chartex" xmlns:cx5="http://schemas.microsoft.com/office/drawing/2016/5/11/chartex" xmlns:cx6="http://schemas.microsoft.com/office/drawing/2016/5/12/chartex" xmlns:cx7="http://schemas.microsoft.com/office/drawing/2016/5/13/chartex" xmlns:cx8="http://schemas.microsoft.com/office/drawing/2016/5/14/chartex" xmlns:mc="http://schemas.openxmlformats.org/markup-compatibility/2006" xmlns:aink="http://schemas.microsoft.com/office/drawing/2016/ink" xmlns:am3d="http://schemas.microsoft.com/office/drawing/2017/model3d" xmlns:o="urn:schemas-microsoft-com:office:office" xmlns:oel="http://schemas.microsoft.com/office/2019/extlst" xmlns:r="http://schemas.openxmlformats.org/officeDocument/2006/relationships" xmlns:m="http://schemas.openxmlformats.org/officeDocument/2006/math" xmlns:v="urn:schemas-microsoft-com:vml" xmlns:wp14="http://schemas.microsoft.com/office/word/2010/wordprocessingDrawing" xmlns:wp="http://schemas.openxmlformats.org/drawingml/2006/wordprocessingDrawing" xmlns:w10="urn:schemas-microsoft-com:office:word" xmlns:w="http://schemas.openxmlformats.org/wordprocessingml/2006/main" xmlns:w14="http://schemas.microsoft.com/office/word/2010/wordml" xmlns:w15="http://schemas.microsoft.com/office/word/2012/wordml" xmlns:w16cex="http://schemas.microsoft.com/office/word/2018/wordml/cex" xmlns:w16cid="http://schemas.microsoft.com/office/word/2016/wordml/cid" xmlns:w16="http://schemas.microsoft.com/office/word/2018/wordml" xmlns:w16du="http://schemas.microsoft.com/office/word/2023/wordml/word16du" xmlns:w16sdtdh="http://schemas.microsoft.com/office/word/2020/wordml/sdtdatahash" xmlns:w16sdtfl="http://schemas.microsoft.com/office/word/2024/wordml/sdtformatlock" xmlns:w16se="http://schemas.microsoft.com/office/word/2015/wordml/symex" xmlns:wpg="http://schemas.microsoft.com/office/word/2010/wordprocessingGroup" xmlns:wpi="http://schemas.microsoft.com/office/word/2010/wordprocessingInk" xmlns:wne="http://schemas.microsoft.com/office/word/2006/wordml" xmlns:wps="http://schemas.microsoft.com/office/word/2010/wordprocessingShape" mc:Ignorable="w14 w15 w16se w16cid w16 w16cex w16sdtdh w16sdtfl w16du wp14">
   <w:endnote w:type="separator" w:id="-1">
     <w:p>
       <w:pPr>
@@ -6719,7 +7845,7 @@
 </file>
 
 <file path=word/footer1.xml><?xml version="1.0" encoding="utf-8"?>
-<w:ftr xmlns:wpc="http://schemas.microsoft.com/office/word/2010/wordprocessingCanvas" xmlns:cx="http://schemas.microsoft.com/office/drawing/2014/chartex" xmlns:cx1="http://schemas.microsoft.com/office/drawing/2015/9/8/chartex" xmlns:cx2="http://schemas.microsoft.com/office/drawing/2015/10/21/chartex" xmlns:cx3="http://schemas.microsoft.com/office/drawing/2016/5/9/chartex" xmlns:cx4="http://schemas.microsoft.com/office/drawing/2016/5/10/chartex" xmlns:cx5="http://schemas.microsoft.com/office/drawing/2016/5/11/chartex" xmlns:cx6="http://schemas.microsoft.com/office/drawing/2016/5/12/chartex" xmlns:cx7="http://schemas.microsoft.com/office/drawing/2016/5/13/chartex" xmlns:cx8="http://schemas.microsoft.com/office/drawing/2016/5/14/chartex" xmlns:mc="http://schemas.openxmlformats.org/markup-compatibility/2006" xmlns:aink="http://schemas.microsoft.com/office/drawing/2016/ink" xmlns:am3d="http://schemas.microsoft.com/office/drawing/2017/model3d" xmlns:o="urn:schemas-microsoft-com:office:office" xmlns:oel="http://schemas.microsoft.com/office/2019/extlst" xmlns:r="http://schemas.openxmlformats.org/officeDocument/2006/relationships" xmlns:m="http://schemas.openxmlformats.org/officeDocument/2006/math" xmlns:v="urn:schemas-microsoft-com:vml" xmlns:wp14="http://schemas.microsoft.com/office/word/2010/wordprocessingDrawing" xmlns:wp="http://schemas.openxmlformats.org/drawingml/2006/wordprocessingDrawing" xmlns:w10="urn:schemas-microsoft-com:office:word" xmlns:w="http://schemas.openxmlformats.org/wordprocessingml/2006/main" xmlns:w14="http://schemas.microsoft.com/office/word/2010/wordml" xmlns:w15="http://schemas.microsoft.com/office/word/2012/wordml" xmlns:w16cex="http://schemas.microsoft.com/office/word/2018/wordml/cex" xmlns:w16cid="http://schemas.microsoft.com/office/word/2016/wordml/cid" xmlns:w16="http://schemas.microsoft.com/office/word/2018/wordml" xmlns:w16sdtdh="http://schemas.microsoft.com/office/word/2020/wordml/sdtdatahash" xmlns:w16se="http://schemas.microsoft.com/office/word/2015/wordml/symex" xmlns:wpg="http://schemas.microsoft.com/office/word/2010/wordprocessingGroup" xmlns:wpi="http://schemas.microsoft.com/office/word/2010/wordprocessingInk" xmlns:wne="http://schemas.microsoft.com/office/word/2006/wordml" xmlns:wps="http://schemas.microsoft.com/office/word/2010/wordprocessingShape" mc:Ignorable="w14 w15 w16se w16cid w16 w16cex w16sdtdh wp14">
+<w:ftr xmlns:wpc="http://schemas.microsoft.com/office/word/2010/wordprocessingCanvas" xmlns:cx="http://schemas.microsoft.com/office/drawing/2014/chartex" xmlns:cx1="http://schemas.microsoft.com/office/drawing/2015/9/8/chartex" xmlns:cx2="http://schemas.microsoft.com/office/drawing/2015/10/21/chartex" xmlns:cx3="http://schemas.microsoft.com/office/drawing/2016/5/9/chartex" xmlns:cx4="http://schemas.microsoft.com/office/drawing/2016/5/10/chartex" xmlns:cx5="http://schemas.microsoft.com/office/drawing/2016/5/11/chartex" xmlns:cx6="http://schemas.microsoft.com/office/drawing/2016/5/12/chartex" xmlns:cx7="http://schemas.microsoft.com/office/drawing/2016/5/13/chartex" xmlns:cx8="http://schemas.microsoft.com/office/drawing/2016/5/14/chartex" xmlns:mc="http://schemas.openxmlformats.org/markup-compatibility/2006" xmlns:aink="http://schemas.microsoft.com/office/drawing/2016/ink" xmlns:am3d="http://schemas.microsoft.com/office/drawing/2017/model3d" xmlns:o="urn:schemas-microsoft-com:office:office" xmlns:oel="http://schemas.microsoft.com/office/2019/extlst" xmlns:r="http://schemas.openxmlformats.org/officeDocument/2006/relationships" xmlns:m="http://schemas.openxmlformats.org/officeDocument/2006/math" xmlns:v="urn:schemas-microsoft-com:vml" xmlns:wp14="http://schemas.microsoft.com/office/word/2010/wordprocessingDrawing" xmlns:wp="http://schemas.openxmlformats.org/drawingml/2006/wordprocessingDrawing" xmlns:w10="urn:schemas-microsoft-com:office:word" xmlns:w="http://schemas.openxmlformats.org/wordprocessingml/2006/main" xmlns:w14="http://schemas.microsoft.com/office/word/2010/wordml" xmlns:w15="http://schemas.microsoft.com/office/word/2012/wordml" xmlns:w16cex="http://schemas.microsoft.com/office/word/2018/wordml/cex" xmlns:w16cid="http://schemas.microsoft.com/office/word/2016/wordml/cid" xmlns:w16="http://schemas.microsoft.com/office/word/2018/wordml" xmlns:w16du="http://schemas.microsoft.com/office/word/2023/wordml/word16du" xmlns:w16sdtdh="http://schemas.microsoft.com/office/word/2020/wordml/sdtdatahash" xmlns:w16sdtfl="http://schemas.microsoft.com/office/word/2024/wordml/sdtformatlock" xmlns:w16se="http://schemas.microsoft.com/office/word/2015/wordml/symex" xmlns:wpg="http://schemas.microsoft.com/office/word/2010/wordprocessingGroup" xmlns:wpi="http://schemas.microsoft.com/office/word/2010/wordprocessingInk" xmlns:wne="http://schemas.microsoft.com/office/word/2006/wordml" xmlns:wps="http://schemas.microsoft.com/office/word/2010/wordprocessingShape" mc:Ignorable="w14 w15 w16se w16cid w16 w16cex w16sdtdh w16sdtfl w16du wp14">
   <w:p>
     <w:pPr>
       <w:pStyle w:val="Rodap"/>
@@ -6735,7 +7861,7 @@
 </file>
 
 <file path=word/footer2.xml><?xml version="1.0" encoding="utf-8"?>
-<w:ftr xmlns:wpc="http://schemas.microsoft.com/office/word/2010/wordprocessingCanvas" xmlns:cx="http://schemas.microsoft.com/office/drawing/2014/chartex" xmlns:cx1="http://schemas.microsoft.com/office/drawing/2015/9/8/chartex" xmlns:cx2="http://schemas.microsoft.com/office/drawing/2015/10/21/chartex" xmlns:cx3="http://schemas.microsoft.com/office/drawing/2016/5/9/chartex" xmlns:cx4="http://schemas.microsoft.com/office/drawing/2016/5/10/chartex" xmlns:cx5="http://schemas.microsoft.com/office/drawing/2016/5/11/chartex" xmlns:cx6="http://schemas.microsoft.com/office/drawing/2016/5/12/chartex" xmlns:cx7="http://schemas.microsoft.com/office/drawing/2016/5/13/chartex" xmlns:cx8="http://schemas.microsoft.com/office/drawing/2016/5/14/chartex" xmlns:mc="http://schemas.openxmlformats.org/markup-compatibility/2006" xmlns:aink="http://schemas.microsoft.com/office/drawing/2016/ink" xmlns:am3d="http://schemas.microsoft.com/office/drawing/2017/model3d" xmlns:o="urn:schemas-microsoft-com:office:office" xmlns:oel="http://schemas.microsoft.com/office/2019/extlst" xmlns:r="http://schemas.openxmlformats.org/officeDocument/2006/relationships" xmlns:m="http://schemas.openxmlformats.org/officeDocument/2006/math" xmlns:v="urn:schemas-microsoft-com:vml" xmlns:wp14="http://schemas.microsoft.com/office/word/2010/wordprocessingDrawing" xmlns:wp="http://schemas.openxmlformats.org/drawingml/2006/wordprocessingDrawing" xmlns:w10="urn:schemas-microsoft-com:office:word" xmlns:w="http://schemas.openxmlformats.org/wordprocessingml/2006/main" xmlns:w14="http://schemas.microsoft.com/office/word/2010/wordml" xmlns:w15="http://schemas.microsoft.com/office/word/2012/wordml" xmlns:w16cex="http://schemas.microsoft.com/office/word/2018/wordml/cex" xmlns:w16cid="http://schemas.microsoft.com/office/word/2016/wordml/cid" xmlns:w16="http://schemas.microsoft.com/office/word/2018/wordml" xmlns:w16sdtdh="http://schemas.microsoft.com/office/word/2020/wordml/sdtdatahash" xmlns:w16se="http://schemas.microsoft.com/office/word/2015/wordml/symex" xmlns:wpg="http://schemas.microsoft.com/office/word/2010/wordprocessingGroup" xmlns:wpi="http://schemas.microsoft.com/office/word/2010/wordprocessingInk" xmlns:wne="http://schemas.microsoft.com/office/word/2006/wordml" xmlns:wps="http://schemas.microsoft.com/office/word/2010/wordprocessingShape" mc:Ignorable="w14 w15 w16se w16cid w16 w16cex w16sdtdh wp14">
+<w:ftr xmlns:wpc="http://schemas.microsoft.com/office/word/2010/wordprocessingCanvas" xmlns:cx="http://schemas.microsoft.com/office/drawing/2014/chartex" xmlns:cx1="http://schemas.microsoft.com/office/drawing/2015/9/8/chartex" xmlns:cx2="http://schemas.microsoft.com/office/drawing/2015/10/21/chartex" xmlns:cx3="http://schemas.microsoft.com/office/drawing/2016/5/9/chartex" xmlns:cx4="http://schemas.microsoft.com/office/drawing/2016/5/10/chartex" xmlns:cx5="http://schemas.microsoft.com/office/drawing/2016/5/11/chartex" xmlns:cx6="http://schemas.microsoft.com/office/drawing/2016/5/12/chartex" xmlns:cx7="http://schemas.microsoft.com/office/drawing/2016/5/13/chartex" xmlns:cx8="http://schemas.microsoft.com/office/drawing/2016/5/14/chartex" xmlns:mc="http://schemas.openxmlformats.org/markup-compatibility/2006" xmlns:aink="http://schemas.microsoft.com/office/drawing/2016/ink" xmlns:am3d="http://schemas.microsoft.com/office/drawing/2017/model3d" xmlns:o="urn:schemas-microsoft-com:office:office" xmlns:oel="http://schemas.microsoft.com/office/2019/extlst" xmlns:r="http://schemas.openxmlformats.org/officeDocument/2006/relationships" xmlns:m="http://schemas.openxmlformats.org/officeDocument/2006/math" xmlns:v="urn:schemas-microsoft-com:vml" xmlns:wp14="http://schemas.microsoft.com/office/word/2010/wordprocessingDrawing" xmlns:wp="http://schemas.openxmlformats.org/drawingml/2006/wordprocessingDrawing" xmlns:w10="urn:schemas-microsoft-com:office:word" xmlns:w="http://schemas.openxmlformats.org/wordprocessingml/2006/main" xmlns:w14="http://schemas.microsoft.com/office/word/2010/wordml" xmlns:w15="http://schemas.microsoft.com/office/word/2012/wordml" xmlns:w16cex="http://schemas.microsoft.com/office/word/2018/wordml/cex" xmlns:w16cid="http://schemas.microsoft.com/office/word/2016/wordml/cid" xmlns:w16="http://schemas.microsoft.com/office/word/2018/wordml" xmlns:w16du="http://schemas.microsoft.com/office/word/2023/wordml/word16du" xmlns:w16sdtdh="http://schemas.microsoft.com/office/word/2020/wordml/sdtdatahash" xmlns:w16sdtfl="http://schemas.microsoft.com/office/word/2024/wordml/sdtformatlock" xmlns:w16se="http://schemas.microsoft.com/office/word/2015/wordml/symex" xmlns:wpg="http://schemas.microsoft.com/office/word/2010/wordprocessingGroup" xmlns:wpi="http://schemas.microsoft.com/office/word/2010/wordprocessingInk" xmlns:wne="http://schemas.microsoft.com/office/word/2006/wordml" xmlns:wps="http://schemas.microsoft.com/office/word/2010/wordprocessingShape" mc:Ignorable="w14 w15 w16se w16cid w16 w16cex w16sdtdh w16sdtfl w16du wp14">
   <w:sdt>
     <w:sdtPr>
       <w:id w:val="1146784156"/>
@@ -6777,7 +7903,7 @@
 </file>
 
 <file path=word/footnotes.xml><?xml version="1.0" encoding="utf-8"?>
-<w:footnotes xmlns:wpc="http://schemas.microsoft.com/office/word/2010/wordprocessingCanvas" xmlns:cx="http://schemas.microsoft.com/office/drawing/2014/chartex" xmlns:cx1="http://schemas.microsoft.com/office/drawing/2015/9/8/chartex" xmlns:cx2="http://schemas.microsoft.com/office/drawing/2015/10/21/chartex" xmlns:cx3="http://schemas.microsoft.com/office/drawing/2016/5/9/chartex" xmlns:cx4="http://schemas.microsoft.com/office/drawing/2016/5/10/chartex" xmlns:cx5="http://schemas.microsoft.com/office/drawing/2016/5/11/chartex" xmlns:cx6="http://schemas.microsoft.com/office/drawing/2016/5/12/chartex" xmlns:cx7="http://schemas.microsoft.com/office/drawing/2016/5/13/chartex" xmlns:cx8="http://schemas.microsoft.com/office/drawing/2016/5/14/chartex" xmlns:mc="http://schemas.openxmlformats.org/markup-compatibility/2006" xmlns:aink="http://schemas.microsoft.com/office/drawing/2016/ink" xmlns:am3d="http://schemas.microsoft.com/office/drawing/2017/model3d" xmlns:o="urn:schemas-microsoft-com:office:office" xmlns:oel="http://schemas.microsoft.com/office/2019/extlst" xmlns:r="http://schemas.openxmlformats.org/officeDocument/2006/relationships" xmlns:m="http://schemas.openxmlformats.org/officeDocument/2006/math" xmlns:v="urn:schemas-microsoft-com:vml" xmlns:wp14="http://schemas.microsoft.com/office/word/2010/wordprocessingDrawing" xmlns:wp="http://schemas.openxmlformats.org/drawingml/2006/wordprocessingDrawing" xmlns:w10="urn:schemas-microsoft-com:office:word" xmlns:w="http://schemas.openxmlformats.org/wordprocessingml/2006/main" xmlns:w14="http://schemas.microsoft.com/office/word/2010/wordml" xmlns:w15="http://schemas.microsoft.com/office/word/2012/wordml" xmlns:w16cex="http://schemas.microsoft.com/office/word/2018/wordml/cex" xmlns:w16cid="http://schemas.microsoft.com/office/word/2016/wordml/cid" xmlns:w16="http://schemas.microsoft.com/office/word/2018/wordml" xmlns:w16sdtdh="http://schemas.microsoft.com/office/word/2020/wordml/sdtdatahash" xmlns:w16se="http://schemas.microsoft.com/office/word/2015/wordml/symex" xmlns:wpg="http://schemas.microsoft.com/office/word/2010/wordprocessingGroup" xmlns:wpi="http://schemas.microsoft.com/office/word/2010/wordprocessingInk" xmlns:wne="http://schemas.microsoft.com/office/word/2006/wordml" xmlns:wps="http://schemas.microsoft.com/office/word/2010/wordprocessingShape" mc:Ignorable="w14 w15 w16se w16cid w16 w16cex w16sdtdh wp14">
+<w:footnotes xmlns:wpc="http://schemas.microsoft.com/office/word/2010/wordprocessingCanvas" xmlns:cx="http://schemas.microsoft.com/office/drawing/2014/chartex" xmlns:cx1="http://schemas.microsoft.com/office/drawing/2015/9/8/chartex" xmlns:cx2="http://schemas.microsoft.com/office/drawing/2015/10/21/chartex" xmlns:cx3="http://schemas.microsoft.com/office/drawing/2016/5/9/chartex" xmlns:cx4="http://schemas.microsoft.com/office/drawing/2016/5/10/chartex" xmlns:cx5="http://schemas.microsoft.com/office/drawing/2016/5/11/chartex" xmlns:cx6="http://schemas.microsoft.com/office/drawing/2016/5/12/chartex" xmlns:cx7="http://schemas.microsoft.com/office/drawing/2016/5/13/chartex" xmlns:cx8="http://schemas.microsoft.com/office/drawing/2016/5/14/chartex" xmlns:mc="http://schemas.openxmlformats.org/markup-compatibility/2006" xmlns:aink="http://schemas.microsoft.com/office/drawing/2016/ink" xmlns:am3d="http://schemas.microsoft.com/office/drawing/2017/model3d" xmlns:o="urn:schemas-microsoft-com:office:office" xmlns:oel="http://schemas.microsoft.com/office/2019/extlst" xmlns:r="http://schemas.openxmlformats.org/officeDocument/2006/relationships" xmlns:m="http://schemas.openxmlformats.org/officeDocument/2006/math" xmlns:v="urn:schemas-microsoft-com:vml" xmlns:wp14="http://schemas.microsoft.com/office/word/2010/wordprocessingDrawing" xmlns:wp="http://schemas.openxmlformats.org/drawingml/2006/wordprocessingDrawing" xmlns:w10="urn:schemas-microsoft-com:office:word" xmlns:w="http://schemas.openxmlformats.org/wordprocessingml/2006/main" xmlns:w14="http://schemas.microsoft.com/office/word/2010/wordml" xmlns:w15="http://schemas.microsoft.com/office/word/2012/wordml" xmlns:w16cex="http://schemas.microsoft.com/office/word/2018/wordml/cex" xmlns:w16cid="http://schemas.microsoft.com/office/word/2016/wordml/cid" xmlns:w16="http://schemas.microsoft.com/office/word/2018/wordml" xmlns:w16du="http://schemas.microsoft.com/office/word/2023/wordml/word16du" xmlns:w16sdtdh="http://schemas.microsoft.com/office/word/2020/wordml/sdtdatahash" xmlns:w16sdtfl="http://schemas.microsoft.com/office/word/2024/wordml/sdtformatlock" xmlns:w16se="http://schemas.microsoft.com/office/word/2015/wordml/symex" xmlns:wpg="http://schemas.microsoft.com/office/word/2010/wordprocessingGroup" xmlns:wpi="http://schemas.microsoft.com/office/word/2010/wordprocessingInk" xmlns:wne="http://schemas.microsoft.com/office/word/2006/wordml" xmlns:wps="http://schemas.microsoft.com/office/word/2010/wordprocessingShape" mc:Ignorable="w14 w15 w16se w16cid w16 w16cex w16sdtdh w16sdtfl w16du wp14">
   <w:footnote w:type="separator" w:id="-1">
     <w:p>
       <w:pPr>
@@ -6802,7 +7928,7 @@
 </file>
 
 <file path=word/header1.xml><?xml version="1.0" encoding="utf-8"?>
-<w:hdr xmlns:wpc="http://schemas.microsoft.com/office/word/2010/wordprocessingCanvas" xmlns:cx="http://schemas.microsoft.com/office/drawing/2014/chartex" xmlns:cx1="http://schemas.microsoft.com/office/drawing/2015/9/8/chartex" xmlns:cx2="http://schemas.microsoft.com/office/drawing/2015/10/21/chartex" xmlns:cx3="http://schemas.microsoft.com/office/drawing/2016/5/9/chartex" xmlns:cx4="http://schemas.microsoft.com/office/drawing/2016/5/10/chartex" xmlns:cx5="http://schemas.microsoft.com/office/drawing/2016/5/11/chartex" xmlns:cx6="http://schemas.microsoft.com/office/drawing/2016/5/12/chartex" xmlns:cx7="http://schemas.microsoft.com/office/drawing/2016/5/13/chartex" xmlns:cx8="http://schemas.microsoft.com/office/drawing/2016/5/14/chartex" xmlns:mc="http://schemas.openxmlformats.org/markup-compatibility/2006" xmlns:aink="http://schemas.microsoft.com/office/drawing/2016/ink" xmlns:am3d="http://schemas.microsoft.com/office/drawing/2017/model3d" xmlns:o="urn:schemas-microsoft-com:office:office" xmlns:oel="http://schemas.microsoft.com/office/2019/extlst" xmlns:r="http://schemas.openxmlformats.org/officeDocument/2006/relationships" xmlns:m="http://schemas.openxmlformats.org/officeDocument/2006/math" xmlns:v="urn:schemas-microsoft-com:vml" xmlns:wp14="http://schemas.microsoft.com/office/word/2010/wordprocessingDrawing" xmlns:wp="http://schemas.openxmlformats.org/drawingml/2006/wordprocessingDrawing" xmlns:w10="urn:schemas-microsoft-com:office:word" xmlns:w="http://schemas.openxmlformats.org/wordprocessingml/2006/main" xmlns:w14="http://schemas.microsoft.com/office/word/2010/wordml" xmlns:w15="http://schemas.microsoft.com/office/word/2012/wordml" xmlns:w16cex="http://schemas.microsoft.com/office/word/2018/wordml/cex" xmlns:w16cid="http://schemas.microsoft.com/office/word/2016/wordml/cid" xmlns:w16="http://schemas.microsoft.com/office/word/2018/wordml" xmlns:w16sdtdh="http://schemas.microsoft.com/office/word/2020/wordml/sdtdatahash" xmlns:w16se="http://schemas.microsoft.com/office/word/2015/wordml/symex" xmlns:wpg="http://schemas.microsoft.com/office/word/2010/wordprocessingGroup" xmlns:wpi="http://schemas.microsoft.com/office/word/2010/wordprocessingInk" xmlns:wne="http://schemas.microsoft.com/office/word/2006/wordml" xmlns:wps="http://schemas.microsoft.com/office/word/2010/wordprocessingShape" mc:Ignorable="w14 w15 w16se w16cid w16 w16cex w16sdtdh wp14">
+<w:hdr xmlns:wpc="http://schemas.microsoft.com/office/word/2010/wordprocessingCanvas" xmlns:cx="http://schemas.microsoft.com/office/drawing/2014/chartex" xmlns:cx1="http://schemas.microsoft.com/office/drawing/2015/9/8/chartex" xmlns:cx2="http://schemas.microsoft.com/office/drawing/2015/10/21/chartex" xmlns:cx3="http://schemas.microsoft.com/office/drawing/2016/5/9/chartex" xmlns:cx4="http://schemas.microsoft.com/office/drawing/2016/5/10/chartex" xmlns:cx5="http://schemas.microsoft.com/office/drawing/2016/5/11/chartex" xmlns:cx6="http://schemas.microsoft.com/office/drawing/2016/5/12/chartex" xmlns:cx7="http://schemas.microsoft.com/office/drawing/2016/5/13/chartex" xmlns:cx8="http://schemas.microsoft.com/office/drawing/2016/5/14/chartex" xmlns:mc="http://schemas.openxmlformats.org/markup-compatibility/2006" xmlns:aink="http://schemas.microsoft.com/office/drawing/2016/ink" xmlns:am3d="http://schemas.microsoft.com/office/drawing/2017/model3d" xmlns:o="urn:schemas-microsoft-com:office:office" xmlns:oel="http://schemas.microsoft.com/office/2019/extlst" xmlns:r="http://schemas.openxmlformats.org/officeDocument/2006/relationships" xmlns:m="http://schemas.openxmlformats.org/officeDocument/2006/math" xmlns:v="urn:schemas-microsoft-com:vml" xmlns:wp14="http://schemas.microsoft.com/office/word/2010/wordprocessingDrawing" xmlns:wp="http://schemas.openxmlformats.org/drawingml/2006/wordprocessingDrawing" xmlns:w10="urn:schemas-microsoft-com:office:word" xmlns:w="http://schemas.openxmlformats.org/wordprocessingml/2006/main" xmlns:w14="http://schemas.microsoft.com/office/word/2010/wordml" xmlns:w15="http://schemas.microsoft.com/office/word/2012/wordml" xmlns:w16cex="http://schemas.microsoft.com/office/word/2018/wordml/cex" xmlns:w16cid="http://schemas.microsoft.com/office/word/2016/wordml/cid" xmlns:w16="http://schemas.microsoft.com/office/word/2018/wordml" xmlns:w16du="http://schemas.microsoft.com/office/word/2023/wordml/word16du" xmlns:w16sdtdh="http://schemas.microsoft.com/office/word/2020/wordml/sdtdatahash" xmlns:w16sdtfl="http://schemas.microsoft.com/office/word/2024/wordml/sdtformatlock" xmlns:w16se="http://schemas.microsoft.com/office/word/2015/wordml/symex" xmlns:wpg="http://schemas.microsoft.com/office/word/2010/wordprocessingGroup" xmlns:wpi="http://schemas.microsoft.com/office/word/2010/wordprocessingInk" xmlns:wne="http://schemas.microsoft.com/office/word/2006/wordml" xmlns:wps="http://schemas.microsoft.com/office/word/2010/wordprocessingShape" mc:Ignorable="w14 w15 w16se w16cid w16 w16cex w16sdtdh w16sdtfl w16du wp14">
   <w:p>
     <w:pPr>
       <w:pStyle w:val="Cabealho"/>
@@ -6884,7 +8010,7 @@
 </file>
 
 <file path=word/numbering.xml><?xml version="1.0" encoding="utf-8"?>
-<w:numbering xmlns:wpc="http://schemas.microsoft.com/office/word/2010/wordprocessingCanvas" xmlns:cx="http://schemas.microsoft.com/office/drawing/2014/chartex" xmlns:cx1="http://schemas.microsoft.com/office/drawing/2015/9/8/chartex" xmlns:cx2="http://schemas.microsoft.com/office/drawing/2015/10/21/chartex" xmlns:cx3="http://schemas.microsoft.com/office/drawing/2016/5/9/chartex" xmlns:cx4="http://schemas.microsoft.com/office/drawing/2016/5/10/chartex" xmlns:cx5="http://schemas.microsoft.com/office/drawing/2016/5/11/chartex" xmlns:cx6="http://schemas.microsoft.com/office/drawing/2016/5/12/chartex" xmlns:cx7="http://schemas.microsoft.com/office/drawing/2016/5/13/chartex" xmlns:cx8="http://schemas.microsoft.com/office/drawing/2016/5/14/chartex" xmlns:mc="http://schemas.openxmlformats.org/markup-compatibility/2006" xmlns:aink="http://schemas.microsoft.com/office/drawing/2016/ink" xmlns:am3d="http://schemas.microsoft.com/office/drawing/2017/model3d" xmlns:o="urn:schemas-microsoft-com:office:office" xmlns:oel="http://schemas.microsoft.com/office/2019/extlst" xmlns:r="http://schemas.openxmlformats.org/officeDocument/2006/relationships" xmlns:m="http://schemas.openxmlformats.org/officeDocument/2006/math" xmlns:v="urn:schemas-microsoft-com:vml" xmlns:wp14="http://schemas.microsoft.com/office/word/2010/wordprocessingDrawing" xmlns:wp="http://schemas.openxmlformats.org/drawingml/2006/wordprocessingDrawing" xmlns:w10="urn:schemas-microsoft-com:office:word" xmlns:w="http://schemas.openxmlformats.org/wordprocessingml/2006/main" xmlns:w14="http://schemas.microsoft.com/office/word/2010/wordml" xmlns:w15="http://schemas.microsoft.com/office/word/2012/wordml" xmlns:w16cex="http://schemas.microsoft.com/office/word/2018/wordml/cex" xmlns:w16cid="http://schemas.microsoft.com/office/word/2016/wordml/cid" xmlns:w16="http://schemas.microsoft.com/office/word/2018/wordml" xmlns:w16sdtdh="http://schemas.microsoft.com/office/word/2020/wordml/sdtdatahash" xmlns:w16se="http://schemas.microsoft.com/office/word/2015/wordml/symex" xmlns:wpg="http://schemas.microsoft.com/office/word/2010/wordprocessingGroup" xmlns:wpi="http://schemas.microsoft.com/office/word/2010/wordprocessingInk" xmlns:wne="http://schemas.microsoft.com/office/word/2006/wordml" xmlns:wps="http://schemas.microsoft.com/office/word/2010/wordprocessingShape" mc:Ignorable="w14 w15 w16se w16cid w16 w16cex w16sdtdh wp14">
+<w:numbering xmlns:wpc="http://schemas.microsoft.com/office/word/2010/wordprocessingCanvas" xmlns:cx="http://schemas.microsoft.com/office/drawing/2014/chartex" xmlns:cx1="http://schemas.microsoft.com/office/drawing/2015/9/8/chartex" xmlns:cx2="http://schemas.microsoft.com/office/drawing/2015/10/21/chartex" xmlns:cx3="http://schemas.microsoft.com/office/drawing/2016/5/9/chartex" xmlns:cx4="http://schemas.microsoft.com/office/drawing/2016/5/10/chartex" xmlns:cx5="http://schemas.microsoft.com/office/drawing/2016/5/11/chartex" xmlns:cx6="http://schemas.microsoft.com/office/drawing/2016/5/12/chartex" xmlns:cx7="http://schemas.microsoft.com/office/drawing/2016/5/13/chartex" xmlns:cx8="http://schemas.microsoft.com/office/drawing/2016/5/14/chartex" xmlns:mc="http://schemas.openxmlformats.org/markup-compatibility/2006" xmlns:aink="http://schemas.microsoft.com/office/drawing/2016/ink" xmlns:am3d="http://schemas.microsoft.com/office/drawing/2017/model3d" xmlns:o="urn:schemas-microsoft-com:office:office" xmlns:oel="http://schemas.microsoft.com/office/2019/extlst" xmlns:r="http://schemas.openxmlformats.org/officeDocument/2006/relationships" xmlns:m="http://schemas.openxmlformats.org/officeDocument/2006/math" xmlns:v="urn:schemas-microsoft-com:vml" xmlns:wp14="http://schemas.microsoft.com/office/word/2010/wordprocessingDrawing" xmlns:wp="http://schemas.openxmlformats.org/drawingml/2006/wordprocessingDrawing" xmlns:w10="urn:schemas-microsoft-com:office:word" xmlns:w="http://schemas.openxmlformats.org/wordprocessingml/2006/main" xmlns:w14="http://schemas.microsoft.com/office/word/2010/wordml" xmlns:w15="http://schemas.microsoft.com/office/word/2012/wordml" xmlns:w16cex="http://schemas.microsoft.com/office/word/2018/wordml/cex" xmlns:w16cid="http://schemas.microsoft.com/office/word/2016/wordml/cid" xmlns:w16="http://schemas.microsoft.com/office/word/2018/wordml" xmlns:w16du="http://schemas.microsoft.com/office/word/2023/wordml/word16du" xmlns:w16sdtdh="http://schemas.microsoft.com/office/word/2020/wordml/sdtdatahash" xmlns:w16sdtfl="http://schemas.microsoft.com/office/word/2024/wordml/sdtformatlock" xmlns:w16se="http://schemas.microsoft.com/office/word/2015/wordml/symex" xmlns:wpg="http://schemas.microsoft.com/office/word/2010/wordprocessingGroup" xmlns:wpi="http://schemas.microsoft.com/office/word/2010/wordprocessingInk" xmlns:wne="http://schemas.microsoft.com/office/word/2006/wordml" xmlns:wps="http://schemas.microsoft.com/office/word/2010/wordprocessingShape" mc:Ignorable="w14 w15 w16se w16cid w16 w16cex w16sdtdh w16sdtfl w16du wp14">
   <w:abstractNum w:abstractNumId="0" w15:restartNumberingAfterBreak="0">
     <w:nsid w:val="32D9745D"/>
     <w:multiLevelType w:val="multilevel"/>
@@ -7567,7 +8693,7 @@
 </file>
 
 <file path=word/styles.xml><?xml version="1.0" encoding="utf-8"?>
-<w:styles xmlns:mc="http://schemas.openxmlformats.org/markup-compatibility/2006" xmlns:r="http://schemas.openxmlformats.org/officeDocument/2006/relationships" xmlns:w="http://schemas.openxmlformats.org/wordprocessingml/2006/main" xmlns:w14="http://schemas.microsoft.com/office/word/2010/wordml" xmlns:w15="http://schemas.microsoft.com/office/word/2012/wordml" xmlns:w16cex="http://schemas.microsoft.com/office/word/2018/wordml/cex" xmlns:w16cid="http://schemas.microsoft.com/office/word/2016/wordml/cid" xmlns:w16="http://schemas.microsoft.com/office/word/2018/wordml" xmlns:w16sdtdh="http://schemas.microsoft.com/office/word/2020/wordml/sdtdatahash" xmlns:w16se="http://schemas.microsoft.com/office/word/2015/wordml/symex" mc:Ignorable="w14 w15 w16se w16cid w16 w16cex w16sdtdh">
+<w:styles xmlns:mc="http://schemas.openxmlformats.org/markup-compatibility/2006" xmlns:r="http://schemas.openxmlformats.org/officeDocument/2006/relationships" xmlns:w="http://schemas.openxmlformats.org/wordprocessingml/2006/main" xmlns:w14="http://schemas.microsoft.com/office/word/2010/wordml" xmlns:w15="http://schemas.microsoft.com/office/word/2012/wordml" xmlns:w16cex="http://schemas.microsoft.com/office/word/2018/wordml/cex" xmlns:w16cid="http://schemas.microsoft.com/office/word/2016/wordml/cid" xmlns:w16="http://schemas.microsoft.com/office/word/2018/wordml" xmlns:w16du="http://schemas.microsoft.com/office/word/2023/wordml/word16du" xmlns:w16sdtdh="http://schemas.microsoft.com/office/word/2020/wordml/sdtdatahash" xmlns:w16sdtfl="http://schemas.microsoft.com/office/word/2024/wordml/sdtformatlock" xmlns:w16se="http://schemas.microsoft.com/office/word/2015/wordml/symex" mc:Ignorable="w14 w15 w16se w16cid w16 w16cex w16sdtdh w16sdtfl w16du">
   <w:docDefaults>
     <w:rPrDefault>
       <w:rPr>

</xml_diff>

<commit_message>
Atualização do diagrama técnico na documentação
</commit_message>
<xml_diff>
--- a/Documentação/ALittlePieceOfMySoul.docx
+++ b/Documentação/ALittlePieceOfMySoul.docx
@@ -2206,7 +2206,7 @@
                 <w:noProof/>
                 <w:webHidden/>
               </w:rPr>
-              <w:t>14</w:t>
+              <w:t>13</w:t>
             </w:r>
             <w:r>
               <w:rPr>
@@ -2641,73 +2641,7 @@
           <w:szCs w:val="24"/>
           <w:lang w:eastAsia="en-US"/>
         </w:rPr>
-        <w:t xml:space="preserve">Uma das pioneiras no estilo e vestimenta gótica foi Siouxsie Sioux, vocalista do Siouxsie </w:t>
-      </w:r>
-      <w:proofErr w:type="spellStart"/>
-      <w:r>
-        <w:rPr>
-          <w:rFonts w:ascii="Arial" w:hAnsi="Arial" w:cs="Arial"/>
-          <w:color w:val="FFFFFF" w:themeColor="background1"/>
-          <w:sz w:val="24"/>
-          <w:szCs w:val="24"/>
-          <w:lang w:eastAsia="en-US"/>
-        </w:rPr>
-        <w:t>and</w:t>
-      </w:r>
-      <w:proofErr w:type="spellEnd"/>
-      <w:r>
-        <w:rPr>
-          <w:rFonts w:ascii="Arial" w:hAnsi="Arial" w:cs="Arial"/>
-          <w:color w:val="FFFFFF" w:themeColor="background1"/>
-          <w:sz w:val="24"/>
-          <w:szCs w:val="24"/>
-          <w:lang w:eastAsia="en-US"/>
-        </w:rPr>
-        <w:t xml:space="preserve"> </w:t>
-      </w:r>
-      <w:proofErr w:type="spellStart"/>
-      <w:r>
-        <w:rPr>
-          <w:rFonts w:ascii="Arial" w:hAnsi="Arial" w:cs="Arial"/>
-          <w:color w:val="FFFFFF" w:themeColor="background1"/>
-          <w:sz w:val="24"/>
-          <w:szCs w:val="24"/>
-          <w:lang w:eastAsia="en-US"/>
-        </w:rPr>
-        <w:t>the</w:t>
-      </w:r>
-      <w:proofErr w:type="spellEnd"/>
-      <w:r>
-        <w:rPr>
-          <w:rFonts w:ascii="Arial" w:hAnsi="Arial" w:cs="Arial"/>
-          <w:color w:val="FFFFFF" w:themeColor="background1"/>
-          <w:sz w:val="24"/>
-          <w:szCs w:val="24"/>
-          <w:lang w:eastAsia="en-US"/>
-        </w:rPr>
-        <w:t xml:space="preserve"> </w:t>
-      </w:r>
-      <w:proofErr w:type="spellStart"/>
-      <w:r>
-        <w:rPr>
-          <w:rFonts w:ascii="Arial" w:hAnsi="Arial" w:cs="Arial"/>
-          <w:color w:val="FFFFFF" w:themeColor="background1"/>
-          <w:sz w:val="24"/>
-          <w:szCs w:val="24"/>
-          <w:lang w:eastAsia="en-US"/>
-        </w:rPr>
-        <w:t>Banshees</w:t>
-      </w:r>
-      <w:proofErr w:type="spellEnd"/>
-      <w:r>
-        <w:rPr>
-          <w:rFonts w:ascii="Arial" w:hAnsi="Arial" w:cs="Arial"/>
-          <w:color w:val="FFFFFF" w:themeColor="background1"/>
-          <w:sz w:val="24"/>
-          <w:szCs w:val="24"/>
-          <w:lang w:eastAsia="en-US"/>
-        </w:rPr>
-        <w:t>.</w:t>
+        <w:t>Uma das pioneiras no estilo e vestimenta gótica foi Siouxsie Sioux, vocalista do Siouxsie and the Banshees.</w:t>
       </w:r>
     </w:p>
     <w:p>
@@ -2725,7 +2659,7 @@
         </w:rPr>
         <w:lastRenderedPageBreak/>
         <w:drawing>
-          <wp:inline distT="0" distB="0" distL="0" distR="0" wp14:anchorId="258DA283" wp14:editId="2E0074C8">
+          <wp:inline distT="0" distB="0" distL="0" distR="0" wp14:anchorId="258DA283" wp14:editId="04BC94CF">
             <wp:extent cx="2417197" cy="2582629"/>
             <wp:effectExtent l="0" t="0" r="2540" b="8255"/>
             <wp:docPr id="1" name="Imagem 1" descr="O que vcs acham de Siouxsie and the banshees? : r/MusicaBR"/>
@@ -2932,53 +2866,8 @@
           <w:szCs w:val="24"/>
           <w:lang w:eastAsia="en-US"/>
         </w:rPr>
-        <w:t xml:space="preserve">Dos clássicos como </w:t>
-      </w:r>
-      <w:proofErr w:type="spellStart"/>
-      <w:r>
-        <w:rPr>
-          <w:rFonts w:ascii="Arial" w:hAnsi="Arial" w:cs="Arial"/>
-          <w:color w:val="FFFFFF" w:themeColor="background1"/>
-          <w:sz w:val="24"/>
-          <w:szCs w:val="24"/>
-          <w:lang w:eastAsia="en-US"/>
-        </w:rPr>
-        <w:t>Nosferatu</w:t>
-      </w:r>
-      <w:proofErr w:type="spellEnd"/>
-      <w:r>
-        <w:rPr>
-          <w:rFonts w:ascii="Arial" w:hAnsi="Arial" w:cs="Arial"/>
-          <w:color w:val="FFFFFF" w:themeColor="background1"/>
-          <w:sz w:val="24"/>
-          <w:szCs w:val="24"/>
-          <w:lang w:eastAsia="en-US"/>
-        </w:rPr>
-        <w:t xml:space="preserve"> (1922) e London </w:t>
-      </w:r>
-      <w:proofErr w:type="spellStart"/>
-      <w:r>
-        <w:rPr>
-          <w:rFonts w:ascii="Arial" w:hAnsi="Arial" w:cs="Arial"/>
-          <w:color w:val="FFFFFF" w:themeColor="background1"/>
-          <w:sz w:val="24"/>
-          <w:szCs w:val="24"/>
-          <w:lang w:eastAsia="en-US"/>
-        </w:rPr>
-        <w:t>After</w:t>
-      </w:r>
-      <w:proofErr w:type="spellEnd"/>
-      <w:r>
-        <w:rPr>
-          <w:rFonts w:ascii="Arial" w:hAnsi="Arial" w:cs="Arial"/>
-          <w:color w:val="FFFFFF" w:themeColor="background1"/>
-          <w:sz w:val="24"/>
-          <w:szCs w:val="24"/>
-          <w:lang w:eastAsia="en-US"/>
-        </w:rPr>
-        <w:t xml:space="preserve"> Midnight (1927) ao cinema gótico moderno, como O Corvo (1994) ou as animações em </w:t>
-      </w:r>
-      <w:proofErr w:type="spellStart"/>
+        <w:t xml:space="preserve">Dos clássicos como Nosferatu (1922) e London After Midnight (1927) ao cinema gótico moderno, como O Corvo (1994) ou as animações em </w:t>
+      </w:r>
       <w:r>
         <w:rPr>
           <w:rFonts w:ascii="Arial" w:hAnsi="Arial" w:cs="Arial"/>
@@ -2991,7 +2880,6 @@
         </w:rPr>
         <w:t>stop-motion</w:t>
       </w:r>
-      <w:proofErr w:type="spellEnd"/>
       <w:r>
         <w:rPr>
           <w:rFonts w:ascii="Arial" w:hAnsi="Arial" w:cs="Arial"/>
@@ -3072,27 +2960,7 @@
                                 <w:bCs/>
                                 <w:color w:val="FFFFFF" w:themeColor="background1"/>
                               </w:rPr>
-                              <w:t xml:space="preserve">Figura 3: London </w:t>
-                            </w:r>
-                            <w:proofErr w:type="spellStart"/>
-                            <w:r>
-                              <w:rPr>
-                                <w:rFonts w:ascii="Arial" w:hAnsi="Arial" w:cs="Arial"/>
-                                <w:b/>
-                                <w:bCs/>
-                                <w:color w:val="FFFFFF" w:themeColor="background1"/>
-                              </w:rPr>
-                              <w:t>After</w:t>
-                            </w:r>
-                            <w:proofErr w:type="spellEnd"/>
-                            <w:r>
-                              <w:rPr>
-                                <w:rFonts w:ascii="Arial" w:hAnsi="Arial" w:cs="Arial"/>
-                                <w:b/>
-                                <w:bCs/>
-                                <w:color w:val="FFFFFF" w:themeColor="background1"/>
-                              </w:rPr>
-                              <w:t xml:space="preserve"> Midnight (1927)</w:t>
+                              <w:t>Figura 3: London After Midnight (1927)</w:t>
                             </w:r>
                           </w:p>
                         </w:txbxContent>
@@ -3138,27 +3006,7 @@
                           <w:bCs/>
                           <w:color w:val="FFFFFF" w:themeColor="background1"/>
                         </w:rPr>
-                        <w:t xml:space="preserve">Figura 3: London </w:t>
-                      </w:r>
-                      <w:proofErr w:type="spellStart"/>
-                      <w:r>
-                        <w:rPr>
-                          <w:rFonts w:ascii="Arial" w:hAnsi="Arial" w:cs="Arial"/>
-                          <w:b/>
-                          <w:bCs/>
-                          <w:color w:val="FFFFFF" w:themeColor="background1"/>
-                        </w:rPr>
-                        <w:t>After</w:t>
-                      </w:r>
-                      <w:proofErr w:type="spellEnd"/>
-                      <w:r>
-                        <w:rPr>
-                          <w:rFonts w:ascii="Arial" w:hAnsi="Arial" w:cs="Arial"/>
-                          <w:b/>
-                          <w:bCs/>
-                          <w:color w:val="FFFFFF" w:themeColor="background1"/>
-                        </w:rPr>
-                        <w:t xml:space="preserve"> Midnight (1927)</w:t>
+                        <w:t>Figura 3: London After Midnight (1927)</w:t>
                       </w:r>
                     </w:p>
                   </w:txbxContent>
@@ -3309,27 +3157,7 @@
           <w:bCs/>
           <w:color w:val="FFFFFF" w:themeColor="background1"/>
         </w:rPr>
-        <w:t xml:space="preserve">Figura 2: </w:t>
-      </w:r>
-      <w:proofErr w:type="spellStart"/>
-      <w:r>
-        <w:rPr>
-          <w:rFonts w:ascii="Arial" w:hAnsi="Arial" w:cs="Arial"/>
-          <w:b/>
-          <w:bCs/>
-          <w:color w:val="FFFFFF" w:themeColor="background1"/>
-        </w:rPr>
-        <w:t>Nosferatu</w:t>
-      </w:r>
-      <w:proofErr w:type="spellEnd"/>
-      <w:r>
-        <w:rPr>
-          <w:rFonts w:ascii="Arial" w:hAnsi="Arial" w:cs="Arial"/>
-          <w:b/>
-          <w:bCs/>
-          <w:color w:val="FFFFFF" w:themeColor="background1"/>
-        </w:rPr>
-        <w:t xml:space="preserve"> (1922)</w:t>
+        <w:t>Figura 2: Nosferatu (1922)</w:t>
       </w:r>
     </w:p>
     <w:p>
@@ -3665,7 +3493,7 @@
           <w:color w:val="FFFFFF" w:themeColor="background1"/>
         </w:rPr>
         <w:drawing>
-          <wp:anchor distT="0" distB="0" distL="114300" distR="114300" simplePos="0" relativeHeight="251659264" behindDoc="0" locked="0" layoutInCell="1" allowOverlap="1" wp14:anchorId="6D2595A6" wp14:editId="219D638A">
+          <wp:anchor distT="0" distB="0" distL="114300" distR="114300" simplePos="0" relativeHeight="251659264" behindDoc="0" locked="0" layoutInCell="1" allowOverlap="1" wp14:anchorId="6D2595A6" wp14:editId="2C6DA0BF">
             <wp:simplePos x="0" y="0"/>
             <wp:positionH relativeFrom="column">
               <wp:posOffset>-698472</wp:posOffset>
@@ -3764,139 +3592,7 @@
           <w:szCs w:val="24"/>
           <w:lang w:eastAsia="en-US"/>
         </w:rPr>
-        <w:t xml:space="preserve">A música é o coração da subcultura gótica, e a banda pioneira foi o Bauhaus, com seu clássico som experimental Bela </w:t>
-      </w:r>
-      <w:proofErr w:type="spellStart"/>
-      <w:r>
-        <w:rPr>
-          <w:rFonts w:ascii="Arial" w:hAnsi="Arial" w:cs="Arial"/>
-          <w:color w:val="FFFFFF" w:themeColor="background1"/>
-          <w:sz w:val="24"/>
-          <w:szCs w:val="24"/>
-          <w:lang w:eastAsia="en-US"/>
-        </w:rPr>
-        <w:t>Lugosi’s</w:t>
-      </w:r>
-      <w:proofErr w:type="spellEnd"/>
-      <w:r>
-        <w:rPr>
-          <w:rFonts w:ascii="Arial" w:hAnsi="Arial" w:cs="Arial"/>
-          <w:color w:val="FFFFFF" w:themeColor="background1"/>
-          <w:sz w:val="24"/>
-          <w:szCs w:val="24"/>
-          <w:lang w:eastAsia="en-US"/>
-        </w:rPr>
-        <w:t xml:space="preserve"> </w:t>
-      </w:r>
-      <w:proofErr w:type="spellStart"/>
-      <w:r>
-        <w:rPr>
-          <w:rFonts w:ascii="Arial" w:hAnsi="Arial" w:cs="Arial"/>
-          <w:color w:val="FFFFFF" w:themeColor="background1"/>
-          <w:sz w:val="24"/>
-          <w:szCs w:val="24"/>
-          <w:lang w:eastAsia="en-US"/>
-        </w:rPr>
-        <w:t>Dead</w:t>
-      </w:r>
-      <w:proofErr w:type="spellEnd"/>
-      <w:r>
-        <w:rPr>
-          <w:rFonts w:ascii="Arial" w:hAnsi="Arial" w:cs="Arial"/>
-          <w:color w:val="FFFFFF" w:themeColor="background1"/>
-          <w:sz w:val="24"/>
-          <w:szCs w:val="24"/>
-          <w:lang w:eastAsia="en-US"/>
-        </w:rPr>
-        <w:t xml:space="preserve">, que conta a morte do ator Bela </w:t>
-      </w:r>
-      <w:proofErr w:type="spellStart"/>
-      <w:r>
-        <w:rPr>
-          <w:rFonts w:ascii="Arial" w:hAnsi="Arial" w:cs="Arial"/>
-          <w:color w:val="FFFFFF" w:themeColor="background1"/>
-          <w:sz w:val="24"/>
-          <w:szCs w:val="24"/>
-          <w:lang w:eastAsia="en-US"/>
-        </w:rPr>
-        <w:t>Lugosi</w:t>
-      </w:r>
-      <w:proofErr w:type="spellEnd"/>
-      <w:r>
-        <w:rPr>
-          <w:rFonts w:ascii="Arial" w:hAnsi="Arial" w:cs="Arial"/>
-          <w:color w:val="FFFFFF" w:themeColor="background1"/>
-          <w:sz w:val="24"/>
-          <w:szCs w:val="24"/>
-          <w:lang w:eastAsia="en-US"/>
-        </w:rPr>
-        <w:t xml:space="preserve">, que interpretou o Drácula. The Cure e Siouxsie </w:t>
-      </w:r>
-      <w:proofErr w:type="spellStart"/>
-      <w:r>
-        <w:rPr>
-          <w:rFonts w:ascii="Arial" w:hAnsi="Arial" w:cs="Arial"/>
-          <w:color w:val="FFFFFF" w:themeColor="background1"/>
-          <w:sz w:val="24"/>
-          <w:szCs w:val="24"/>
-          <w:lang w:eastAsia="en-US"/>
-        </w:rPr>
-        <w:t>and</w:t>
-      </w:r>
-      <w:proofErr w:type="spellEnd"/>
-      <w:r>
-        <w:rPr>
-          <w:rFonts w:ascii="Arial" w:hAnsi="Arial" w:cs="Arial"/>
-          <w:color w:val="FFFFFF" w:themeColor="background1"/>
-          <w:sz w:val="24"/>
-          <w:szCs w:val="24"/>
-          <w:lang w:eastAsia="en-US"/>
-        </w:rPr>
-        <w:t xml:space="preserve"> </w:t>
-      </w:r>
-      <w:proofErr w:type="spellStart"/>
-      <w:r>
-        <w:rPr>
-          <w:rFonts w:ascii="Arial" w:hAnsi="Arial" w:cs="Arial"/>
-          <w:color w:val="FFFFFF" w:themeColor="background1"/>
-          <w:sz w:val="24"/>
-          <w:szCs w:val="24"/>
-          <w:lang w:eastAsia="en-US"/>
-        </w:rPr>
-        <w:t>the</w:t>
-      </w:r>
-      <w:proofErr w:type="spellEnd"/>
-      <w:r>
-        <w:rPr>
-          <w:rFonts w:ascii="Arial" w:hAnsi="Arial" w:cs="Arial"/>
-          <w:color w:val="FFFFFF" w:themeColor="background1"/>
-          <w:sz w:val="24"/>
-          <w:szCs w:val="24"/>
-          <w:lang w:eastAsia="en-US"/>
-        </w:rPr>
-        <w:t xml:space="preserve"> </w:t>
-      </w:r>
-      <w:proofErr w:type="spellStart"/>
-      <w:r>
-        <w:rPr>
-          <w:rFonts w:ascii="Arial" w:hAnsi="Arial" w:cs="Arial"/>
-          <w:color w:val="FFFFFF" w:themeColor="background1"/>
-          <w:sz w:val="24"/>
-          <w:szCs w:val="24"/>
-          <w:lang w:eastAsia="en-US"/>
-        </w:rPr>
-        <w:t>Banshees</w:t>
-      </w:r>
-      <w:proofErr w:type="spellEnd"/>
-      <w:r>
-        <w:rPr>
-          <w:rFonts w:ascii="Arial" w:hAnsi="Arial" w:cs="Arial"/>
-          <w:color w:val="FFFFFF" w:themeColor="background1"/>
-          <w:sz w:val="24"/>
-          <w:szCs w:val="24"/>
-          <w:lang w:eastAsia="en-US"/>
-        </w:rPr>
-        <w:t xml:space="preserve"> consolidaram o gênero, com letras introspectivas, românticas, atmosfera sombria e sonoridade diferente de tudo que havia na época.</w:t>
+        <w:t>A música é o coração da subcultura gótica, e a banda pioneira foi o Bauhaus, com seu clássico som experimental Bela Lugosi’s Dead, que conta a morte do ator Bela Lugosi, que interpretou o Drácula. The Cure e Siouxsie and the Banshees consolidaram o gênero, com letras introspectivas, românticas, atmosfera sombria e sonoridade diferente de tudo que havia na época.</w:t>
       </w:r>
     </w:p>
     <w:p>
@@ -4121,161 +3817,7 @@
           <w:szCs w:val="24"/>
           <w:lang w:eastAsia="en-US"/>
         </w:rPr>
-        <w:t xml:space="preserve">Conforme passar do tempo, gêneros góticos foram surgindo, como </w:t>
-      </w:r>
-      <w:proofErr w:type="spellStart"/>
-      <w:r>
-        <w:rPr>
-          <w:rFonts w:ascii="Arial" w:hAnsi="Arial" w:cs="Arial"/>
-          <w:color w:val="FFFFFF" w:themeColor="background1"/>
-          <w:sz w:val="24"/>
-          <w:szCs w:val="24"/>
-          <w:lang w:eastAsia="en-US"/>
-        </w:rPr>
-        <w:t>Darkwave</w:t>
-      </w:r>
-      <w:proofErr w:type="spellEnd"/>
-      <w:r>
-        <w:rPr>
-          <w:rFonts w:ascii="Arial" w:hAnsi="Arial" w:cs="Arial"/>
-          <w:color w:val="FFFFFF" w:themeColor="background1"/>
-          <w:sz w:val="24"/>
-          <w:szCs w:val="24"/>
-          <w:lang w:eastAsia="en-US"/>
-        </w:rPr>
-        <w:t xml:space="preserve">, Post-Punk, </w:t>
-      </w:r>
-      <w:proofErr w:type="spellStart"/>
-      <w:r>
-        <w:rPr>
-          <w:rFonts w:ascii="Arial" w:hAnsi="Arial" w:cs="Arial"/>
-          <w:color w:val="FFFFFF" w:themeColor="background1"/>
-          <w:sz w:val="24"/>
-          <w:szCs w:val="24"/>
-          <w:lang w:eastAsia="en-US"/>
-        </w:rPr>
-        <w:t>Deathrock</w:t>
-      </w:r>
-      <w:proofErr w:type="spellEnd"/>
-      <w:r>
-        <w:rPr>
-          <w:rFonts w:ascii="Arial" w:hAnsi="Arial" w:cs="Arial"/>
-          <w:color w:val="FFFFFF" w:themeColor="background1"/>
-          <w:sz w:val="24"/>
-          <w:szCs w:val="24"/>
-          <w:lang w:eastAsia="en-US"/>
-        </w:rPr>
-        <w:t xml:space="preserve"> e EBM (</w:t>
-      </w:r>
-      <w:proofErr w:type="spellStart"/>
-      <w:r>
-        <w:rPr>
-          <w:rFonts w:ascii="Arial" w:hAnsi="Arial" w:cs="Arial"/>
-          <w:color w:val="FFFFFF" w:themeColor="background1"/>
-          <w:sz w:val="24"/>
-          <w:szCs w:val="24"/>
-          <w:lang w:eastAsia="en-US"/>
-        </w:rPr>
-        <w:t>Electronic</w:t>
-      </w:r>
-      <w:proofErr w:type="spellEnd"/>
-      <w:r>
-        <w:rPr>
-          <w:rFonts w:ascii="Arial" w:hAnsi="Arial" w:cs="Arial"/>
-          <w:color w:val="FFFFFF" w:themeColor="background1"/>
-          <w:sz w:val="24"/>
-          <w:szCs w:val="24"/>
-          <w:lang w:eastAsia="en-US"/>
-        </w:rPr>
-        <w:t xml:space="preserve"> Body Music), com muitas bandas nesses gêneros, porém, vale a ressalva para o Sisters </w:t>
-      </w:r>
-      <w:proofErr w:type="spellStart"/>
-      <w:r>
-        <w:rPr>
-          <w:rFonts w:ascii="Arial" w:hAnsi="Arial" w:cs="Arial"/>
-          <w:color w:val="FFFFFF" w:themeColor="background1"/>
-          <w:sz w:val="24"/>
-          <w:szCs w:val="24"/>
-          <w:lang w:eastAsia="en-US"/>
-        </w:rPr>
-        <w:t>Of</w:t>
-      </w:r>
-      <w:proofErr w:type="spellEnd"/>
-      <w:r>
-        <w:rPr>
-          <w:rFonts w:ascii="Arial" w:hAnsi="Arial" w:cs="Arial"/>
-          <w:color w:val="FFFFFF" w:themeColor="background1"/>
-          <w:sz w:val="24"/>
-          <w:szCs w:val="24"/>
-          <w:lang w:eastAsia="en-US"/>
-        </w:rPr>
-        <w:t xml:space="preserve"> Mercy, </w:t>
-      </w:r>
-      <w:proofErr w:type="spellStart"/>
-      <w:r>
-        <w:rPr>
-          <w:rFonts w:ascii="Arial" w:hAnsi="Arial" w:cs="Arial"/>
-          <w:color w:val="FFFFFF" w:themeColor="background1"/>
-          <w:sz w:val="24"/>
-          <w:szCs w:val="24"/>
-          <w:lang w:eastAsia="en-US"/>
-        </w:rPr>
-        <w:t>Lebanon</w:t>
-      </w:r>
-      <w:proofErr w:type="spellEnd"/>
-      <w:r>
-        <w:rPr>
-          <w:rFonts w:ascii="Arial" w:hAnsi="Arial" w:cs="Arial"/>
-          <w:color w:val="FFFFFF" w:themeColor="background1"/>
-          <w:sz w:val="24"/>
-          <w:szCs w:val="24"/>
-          <w:lang w:eastAsia="en-US"/>
-        </w:rPr>
-        <w:t xml:space="preserve"> Hanover, She </w:t>
-      </w:r>
-      <w:proofErr w:type="spellStart"/>
-      <w:r>
-        <w:rPr>
-          <w:rFonts w:ascii="Arial" w:hAnsi="Arial" w:cs="Arial"/>
-          <w:color w:val="FFFFFF" w:themeColor="background1"/>
-          <w:sz w:val="24"/>
-          <w:szCs w:val="24"/>
-          <w:lang w:eastAsia="en-US"/>
-        </w:rPr>
-        <w:t>Past</w:t>
-      </w:r>
-      <w:proofErr w:type="spellEnd"/>
-      <w:r>
-        <w:rPr>
-          <w:rFonts w:ascii="Arial" w:hAnsi="Arial" w:cs="Arial"/>
-          <w:color w:val="FFFFFF" w:themeColor="background1"/>
-          <w:sz w:val="24"/>
-          <w:szCs w:val="24"/>
-          <w:lang w:eastAsia="en-US"/>
-        </w:rPr>
-        <w:t xml:space="preserve"> Away e Twin </w:t>
-      </w:r>
-      <w:proofErr w:type="spellStart"/>
-      <w:r>
-        <w:rPr>
-          <w:rFonts w:ascii="Arial" w:hAnsi="Arial" w:cs="Arial"/>
-          <w:color w:val="FFFFFF" w:themeColor="background1"/>
-          <w:sz w:val="24"/>
-          <w:szCs w:val="24"/>
-          <w:lang w:eastAsia="en-US"/>
-        </w:rPr>
-        <w:t>Tribes</w:t>
-      </w:r>
-      <w:proofErr w:type="spellEnd"/>
-      <w:r>
-        <w:rPr>
-          <w:rFonts w:ascii="Arial" w:hAnsi="Arial" w:cs="Arial"/>
-          <w:color w:val="FFFFFF" w:themeColor="background1"/>
-          <w:sz w:val="24"/>
-          <w:szCs w:val="24"/>
-          <w:lang w:eastAsia="en-US"/>
-        </w:rPr>
-        <w:t>.</w:t>
+        <w:t>Conforme passar do tempo, gêneros góticos foram surgindo, como Darkwave, Post-Punk, Deathrock e EBM (Electronic Body Music), com muitas bandas nesses gêneros, porém, vale a ressalva para o Sisters Of Mercy, Lebanon Hanover, She Past Away e Twin Tribes.</w:t>
       </w:r>
       <w:r>
         <w:rPr>
@@ -4336,95 +3878,7 @@
           <w:lang w:eastAsia="en-US"/>
         </w:rPr>
         <w:lastRenderedPageBreak/>
-        <w:t>“</w:t>
-      </w:r>
-      <w:proofErr w:type="spellStart"/>
-      <w:r>
-        <w:rPr>
-          <w:rFonts w:ascii="Arial" w:hAnsi="Arial" w:cs="Arial"/>
-          <w:color w:val="FFFFFF" w:themeColor="background1"/>
-          <w:sz w:val="24"/>
-          <w:szCs w:val="24"/>
-          <w:lang w:eastAsia="en-US"/>
-        </w:rPr>
-        <w:t>Sadness</w:t>
-      </w:r>
-      <w:proofErr w:type="spellEnd"/>
-      <w:r>
-        <w:rPr>
-          <w:rFonts w:ascii="Arial" w:hAnsi="Arial" w:cs="Arial"/>
-          <w:color w:val="FFFFFF" w:themeColor="background1"/>
-          <w:sz w:val="24"/>
-          <w:szCs w:val="24"/>
-          <w:lang w:eastAsia="en-US"/>
-        </w:rPr>
-        <w:t xml:space="preserve"> </w:t>
-      </w:r>
-      <w:proofErr w:type="spellStart"/>
-      <w:r>
-        <w:rPr>
-          <w:rFonts w:ascii="Arial" w:hAnsi="Arial" w:cs="Arial"/>
-          <w:color w:val="FFFFFF" w:themeColor="background1"/>
-          <w:sz w:val="24"/>
-          <w:szCs w:val="24"/>
-          <w:lang w:eastAsia="en-US"/>
-        </w:rPr>
-        <w:t>Is</w:t>
-      </w:r>
-      <w:proofErr w:type="spellEnd"/>
-      <w:r>
-        <w:rPr>
-          <w:rFonts w:ascii="Arial" w:hAnsi="Arial" w:cs="Arial"/>
-          <w:color w:val="FFFFFF" w:themeColor="background1"/>
-          <w:sz w:val="24"/>
-          <w:szCs w:val="24"/>
-          <w:lang w:eastAsia="en-US"/>
-        </w:rPr>
-        <w:t xml:space="preserve"> </w:t>
-      </w:r>
-      <w:proofErr w:type="spellStart"/>
-      <w:r>
-        <w:rPr>
-          <w:rFonts w:ascii="Arial" w:hAnsi="Arial" w:cs="Arial"/>
-          <w:color w:val="FFFFFF" w:themeColor="background1"/>
-          <w:sz w:val="24"/>
-          <w:szCs w:val="24"/>
-          <w:lang w:eastAsia="en-US"/>
-        </w:rPr>
-        <w:t>Rebellion</w:t>
-      </w:r>
-      <w:proofErr w:type="spellEnd"/>
-      <w:r>
-        <w:rPr>
-          <w:rFonts w:ascii="Arial" w:hAnsi="Arial" w:cs="Arial"/>
-          <w:color w:val="FFFFFF" w:themeColor="background1"/>
-          <w:sz w:val="24"/>
-          <w:szCs w:val="24"/>
-          <w:lang w:eastAsia="en-US"/>
-        </w:rPr>
-        <w:t xml:space="preserve">”, uma música do </w:t>
-      </w:r>
-      <w:proofErr w:type="spellStart"/>
-      <w:r>
-        <w:rPr>
-          <w:rFonts w:ascii="Arial" w:hAnsi="Arial" w:cs="Arial"/>
-          <w:color w:val="FFFFFF" w:themeColor="background1"/>
-          <w:sz w:val="24"/>
-          <w:szCs w:val="24"/>
-          <w:lang w:eastAsia="en-US"/>
-        </w:rPr>
-        <w:t>Lebanon</w:t>
-      </w:r>
-      <w:proofErr w:type="spellEnd"/>
-      <w:r>
-        <w:rPr>
-          <w:rFonts w:ascii="Arial" w:hAnsi="Arial" w:cs="Arial"/>
-          <w:color w:val="FFFFFF" w:themeColor="background1"/>
-          <w:sz w:val="24"/>
-          <w:szCs w:val="24"/>
-          <w:lang w:eastAsia="en-US"/>
-        </w:rPr>
-        <w:t xml:space="preserve"> Hanover, que destaca a superficialidade das pessoas em não buscarem autoconhecimento.</w:t>
+        <w:t>“Sadness Is Rebellion”, uma música do Lebanon Hanover, que destaca a superficialidade das pessoas em não buscarem autoconhecimento.</w:t>
       </w:r>
     </w:p>
     <w:p>
@@ -4508,27 +3962,7 @@
           <w:bCs/>
           <w:color w:val="FFFFFF" w:themeColor="background1"/>
         </w:rPr>
-        <w:t xml:space="preserve">Figura 7: Sisters </w:t>
-      </w:r>
-      <w:proofErr w:type="spellStart"/>
-      <w:r>
-        <w:rPr>
-          <w:rFonts w:ascii="Arial" w:hAnsi="Arial" w:cs="Arial"/>
-          <w:b/>
-          <w:bCs/>
-          <w:color w:val="FFFFFF" w:themeColor="background1"/>
-        </w:rPr>
-        <w:t>Of</w:t>
-      </w:r>
-      <w:proofErr w:type="spellEnd"/>
-      <w:r>
-        <w:rPr>
-          <w:rFonts w:ascii="Arial" w:hAnsi="Arial" w:cs="Arial"/>
-          <w:b/>
-          <w:bCs/>
-          <w:color w:val="FFFFFF" w:themeColor="background1"/>
-        </w:rPr>
-        <w:t xml:space="preserve"> Mercy</w:t>
+        <w:t>Figura 7: Sisters Of Mercy</w:t>
       </w:r>
     </w:p>
     <w:p>
@@ -4618,27 +4052,7 @@
           <w:bCs/>
           <w:color w:val="FFFFFF" w:themeColor="background1"/>
         </w:rPr>
-        <w:t xml:space="preserve">Figura 8: </w:t>
-      </w:r>
-      <w:proofErr w:type="spellStart"/>
-      <w:r>
-        <w:rPr>
-          <w:rFonts w:ascii="Arial" w:hAnsi="Arial" w:cs="Arial"/>
-          <w:b/>
-          <w:bCs/>
-          <w:color w:val="FFFFFF" w:themeColor="background1"/>
-        </w:rPr>
-        <w:t>Lebanon</w:t>
-      </w:r>
-      <w:proofErr w:type="spellEnd"/>
-      <w:r>
-        <w:rPr>
-          <w:rFonts w:ascii="Arial" w:hAnsi="Arial" w:cs="Arial"/>
-          <w:b/>
-          <w:bCs/>
-          <w:color w:val="FFFFFF" w:themeColor="background1"/>
-        </w:rPr>
-        <w:t xml:space="preserve"> Hanover</w:t>
+        <w:t>Figura 8: Lebanon Hanover</w:t>
       </w:r>
     </w:p>
     <w:p>
@@ -4827,51 +4241,7 @@
           <w:szCs w:val="24"/>
           <w:lang w:eastAsia="en-US"/>
         </w:rPr>
-        <w:t xml:space="preserve">O que me chateia é que há muito estereótipos no meio, falando que góticos são tristes, ou que góticos odeiam todo mundo, e não é verdade, e está longe de ser verdade, é só um jeito diferente de viver que as outras pessoas, e não há nada de errado nisso, portanto, A Little Piece </w:t>
-      </w:r>
-      <w:proofErr w:type="spellStart"/>
-      <w:r>
-        <w:rPr>
-          <w:rFonts w:ascii="Arial" w:hAnsi="Arial" w:cs="Arial"/>
-          <w:color w:val="FFFFFF" w:themeColor="background1"/>
-          <w:sz w:val="24"/>
-          <w:szCs w:val="24"/>
-          <w:lang w:eastAsia="en-US"/>
-        </w:rPr>
-        <w:t>Of</w:t>
-      </w:r>
-      <w:proofErr w:type="spellEnd"/>
-      <w:r>
-        <w:rPr>
-          <w:rFonts w:ascii="Arial" w:hAnsi="Arial" w:cs="Arial"/>
-          <w:color w:val="FFFFFF" w:themeColor="background1"/>
-          <w:sz w:val="24"/>
-          <w:szCs w:val="24"/>
-          <w:lang w:eastAsia="en-US"/>
-        </w:rPr>
-        <w:t xml:space="preserve"> </w:t>
-      </w:r>
-      <w:proofErr w:type="spellStart"/>
-      <w:r>
-        <w:rPr>
-          <w:rFonts w:ascii="Arial" w:hAnsi="Arial" w:cs="Arial"/>
-          <w:color w:val="FFFFFF" w:themeColor="background1"/>
-          <w:sz w:val="24"/>
-          <w:szCs w:val="24"/>
-          <w:lang w:eastAsia="en-US"/>
-        </w:rPr>
-        <w:t>My</w:t>
-      </w:r>
-      <w:proofErr w:type="spellEnd"/>
-      <w:r>
-        <w:rPr>
-          <w:rFonts w:ascii="Arial" w:hAnsi="Arial" w:cs="Arial"/>
-          <w:color w:val="FFFFFF" w:themeColor="background1"/>
-          <w:sz w:val="24"/>
-          <w:szCs w:val="24"/>
-          <w:lang w:eastAsia="en-US"/>
-        </w:rPr>
-        <w:t xml:space="preserve"> Soul veio para desmistificar alguns mitos e estereótipos sobre a subcultura.</w:t>
+        <w:t>O que me chateia é que há muito estereótipos no meio, falando que góticos são tristes, ou que góticos odeiam todo mundo, e não é verdade, e está longe de ser verdade, é só um jeito diferente de viver que as outras pessoas, e não há nada de errado nisso, portanto, A Little Piece Of My Soul veio para desmistificar alguns mitos e estereótipos sobre a subcultura.</w:t>
       </w:r>
     </w:p>
     <w:p>
@@ -4894,73 +4264,7 @@
           <w:szCs w:val="24"/>
           <w:lang w:eastAsia="en-US"/>
         </w:rPr>
-        <w:t xml:space="preserve">O nome A Little Piece </w:t>
-      </w:r>
-      <w:proofErr w:type="spellStart"/>
-      <w:r>
-        <w:rPr>
-          <w:rFonts w:ascii="Arial" w:hAnsi="Arial" w:cs="Arial"/>
-          <w:color w:val="FFFFFF" w:themeColor="background1"/>
-          <w:sz w:val="24"/>
-          <w:szCs w:val="24"/>
-          <w:lang w:eastAsia="en-US"/>
-        </w:rPr>
-        <w:t>Of</w:t>
-      </w:r>
-      <w:proofErr w:type="spellEnd"/>
-      <w:r>
-        <w:rPr>
-          <w:rFonts w:ascii="Arial" w:hAnsi="Arial" w:cs="Arial"/>
-          <w:color w:val="FFFFFF" w:themeColor="background1"/>
-          <w:sz w:val="24"/>
-          <w:szCs w:val="24"/>
-          <w:lang w:eastAsia="en-US"/>
-        </w:rPr>
-        <w:t xml:space="preserve"> </w:t>
-      </w:r>
-      <w:proofErr w:type="spellStart"/>
-      <w:r>
-        <w:rPr>
-          <w:rFonts w:ascii="Arial" w:hAnsi="Arial" w:cs="Arial"/>
-          <w:color w:val="FFFFFF" w:themeColor="background1"/>
-          <w:sz w:val="24"/>
-          <w:szCs w:val="24"/>
-          <w:lang w:eastAsia="en-US"/>
-        </w:rPr>
-        <w:t>My</w:t>
-      </w:r>
-      <w:proofErr w:type="spellEnd"/>
-      <w:r>
-        <w:rPr>
-          <w:rFonts w:ascii="Arial" w:hAnsi="Arial" w:cs="Arial"/>
-          <w:color w:val="FFFFFF" w:themeColor="background1"/>
-          <w:sz w:val="24"/>
-          <w:szCs w:val="24"/>
-          <w:lang w:eastAsia="en-US"/>
-        </w:rPr>
-        <w:t xml:space="preserve"> Soul surgiu através da minha </w:t>
-      </w:r>
-      <w:proofErr w:type="gramStart"/>
-      <w:r>
-        <w:rPr>
-          <w:rFonts w:ascii="Arial" w:hAnsi="Arial" w:cs="Arial"/>
-          <w:color w:val="FFFFFF" w:themeColor="background1"/>
-          <w:sz w:val="24"/>
-          <w:szCs w:val="24"/>
-          <w:lang w:eastAsia="en-US"/>
-        </w:rPr>
-        <w:t>playlist</w:t>
-      </w:r>
-      <w:proofErr w:type="gramEnd"/>
-      <w:r>
-        <w:rPr>
-          <w:rFonts w:ascii="Arial" w:hAnsi="Arial" w:cs="Arial"/>
-          <w:color w:val="FFFFFF" w:themeColor="background1"/>
-          <w:sz w:val="24"/>
-          <w:szCs w:val="24"/>
-          <w:lang w:eastAsia="en-US"/>
-        </w:rPr>
-        <w:t xml:space="preserve"> do Spotify, de mesmo nome do projeto.</w:t>
+        <w:t>O nome A Little Piece Of My Soul surgiu através da minha playlist do Spotify, de mesmo nome do projeto.</w:t>
       </w:r>
     </w:p>
     <w:p>
@@ -5032,27 +4336,7 @@
           <w:bCs/>
           <w:color w:val="FFFFFF" w:themeColor="background1"/>
         </w:rPr>
-        <w:t xml:space="preserve">Figura 9: </w:t>
-      </w:r>
-      <w:proofErr w:type="gramStart"/>
-      <w:r>
-        <w:rPr>
-          <w:rFonts w:ascii="Arial" w:hAnsi="Arial" w:cs="Arial"/>
-          <w:b/>
-          <w:bCs/>
-          <w:color w:val="FFFFFF" w:themeColor="background1"/>
-        </w:rPr>
-        <w:t>Playlist</w:t>
-      </w:r>
-      <w:proofErr w:type="gramEnd"/>
-      <w:r>
-        <w:rPr>
-          <w:rFonts w:ascii="Arial" w:hAnsi="Arial" w:cs="Arial"/>
-          <w:b/>
-          <w:bCs/>
-          <w:color w:val="FFFFFF" w:themeColor="background1"/>
-        </w:rPr>
-        <w:t xml:space="preserve"> do Spotify</w:t>
+        <w:t>Figura 9: Playlist do Spotify</w:t>
       </w:r>
     </w:p>
     <w:p>
@@ -5697,23 +4981,7 @@
           <w:rFonts w:ascii="Arial" w:hAnsi="Arial" w:cs="Arial"/>
           <w:color w:val="FFFFFF" w:themeColor="background1"/>
         </w:rPr>
-        <w:t xml:space="preserve">Os usuários terão acesso </w:t>
-      </w:r>
-      <w:proofErr w:type="spellStart"/>
-      <w:r>
-        <w:rPr>
-          <w:rFonts w:ascii="Arial" w:hAnsi="Arial" w:cs="Arial"/>
-          <w:color w:val="FFFFFF" w:themeColor="background1"/>
-        </w:rPr>
-        <w:t>a</w:t>
-      </w:r>
-      <w:proofErr w:type="spellEnd"/>
-      <w:r>
-        <w:rPr>
-          <w:rFonts w:ascii="Arial" w:hAnsi="Arial" w:cs="Arial"/>
-          <w:color w:val="FFFFFF" w:themeColor="background1"/>
-        </w:rPr>
-        <w:t xml:space="preserve"> internet para visualização do site.</w:t>
+        <w:t>Os usuários terão acesso a internet para visualização do site.</w:t>
       </w:r>
     </w:p>
     <w:p>
@@ -5802,32 +5070,7 @@
           <w:rFonts w:ascii="Arial" w:hAnsi="Arial" w:cs="Arial"/>
           <w:color w:val="FFFFFF" w:themeColor="background1"/>
         </w:rPr>
-        <w:t xml:space="preserve">Não haverá APIs externas para música, como Youtube, Spotify, </w:t>
-      </w:r>
-      <w:proofErr w:type="gramStart"/>
-      <w:r>
-        <w:rPr>
-          <w:rFonts w:ascii="Arial" w:hAnsi="Arial" w:cs="Arial"/>
-          <w:color w:val="FFFFFF" w:themeColor="background1"/>
-        </w:rPr>
-        <w:t xml:space="preserve">Soundcloud </w:t>
-      </w:r>
-      <w:proofErr w:type="spellStart"/>
-      <w:r>
-        <w:rPr>
-          <w:rFonts w:ascii="Arial" w:hAnsi="Arial" w:cs="Arial"/>
-          <w:color w:val="FFFFFF" w:themeColor="background1"/>
-        </w:rPr>
-        <w:t>etc</w:t>
-      </w:r>
-      <w:proofErr w:type="spellEnd"/>
-      <w:proofErr w:type="gramEnd"/>
-      <w:r>
-        <w:rPr>
-          <w:rFonts w:ascii="Arial" w:hAnsi="Arial" w:cs="Arial"/>
-          <w:color w:val="FFFFFF" w:themeColor="background1"/>
-        </w:rPr>
-        <w:t>;</w:t>
+        <w:t>Não haverá APIs externas para música, como Youtube, Spotify, Soundcloud etc;</w:t>
       </w:r>
     </w:p>
     <w:p>
@@ -5911,23 +5154,7 @@
           <w:rFonts w:ascii="Arial" w:hAnsi="Arial" w:cs="Arial"/>
           <w:color w:val="FFFFFF" w:themeColor="background1"/>
         </w:rPr>
-        <w:t xml:space="preserve">O banco de dados armazenará apenas informações essenciais para o funcionamento, como nome, </w:t>
-      </w:r>
-      <w:proofErr w:type="spellStart"/>
-      <w:r>
-        <w:rPr>
-          <w:rFonts w:ascii="Arial" w:hAnsi="Arial" w:cs="Arial"/>
-          <w:color w:val="FFFFFF" w:themeColor="background1"/>
-        </w:rPr>
-        <w:t>email</w:t>
-      </w:r>
-      <w:proofErr w:type="spellEnd"/>
-      <w:r>
-        <w:rPr>
-          <w:rFonts w:ascii="Arial" w:hAnsi="Arial" w:cs="Arial"/>
-          <w:color w:val="FFFFFF" w:themeColor="background1"/>
-        </w:rPr>
-        <w:t>, resultados do Quiz, gênero e banda favorita</w:t>
+        <w:t>O banco de dados armazenará apenas informações essenciais para o funcionamento, como nome, email, resultados do Quiz, gênero e banda favorita</w:t>
       </w:r>
       <w:r>
         <w:rPr>
@@ -5955,32 +5182,7 @@
           <w:rFonts w:ascii="Arial" w:hAnsi="Arial" w:cs="Arial"/>
           <w:color w:val="FFFFFF" w:themeColor="background1"/>
         </w:rPr>
-        <w:t xml:space="preserve">As imagens do criador (foto do rosto, foto em </w:t>
-      </w:r>
-      <w:proofErr w:type="gramStart"/>
-      <w:r>
-        <w:rPr>
-          <w:rFonts w:ascii="Arial" w:hAnsi="Arial" w:cs="Arial"/>
-          <w:color w:val="FFFFFF" w:themeColor="background1"/>
-        </w:rPr>
-        <w:t xml:space="preserve">shows </w:t>
-      </w:r>
-      <w:proofErr w:type="spellStart"/>
-      <w:r>
-        <w:rPr>
-          <w:rFonts w:ascii="Arial" w:hAnsi="Arial" w:cs="Arial"/>
-          <w:color w:val="FFFFFF" w:themeColor="background1"/>
-        </w:rPr>
-        <w:t>etc</w:t>
-      </w:r>
-      <w:proofErr w:type="spellEnd"/>
-      <w:proofErr w:type="gramEnd"/>
-      <w:r>
-        <w:rPr>
-          <w:rFonts w:ascii="Arial" w:hAnsi="Arial" w:cs="Arial"/>
-          <w:color w:val="FFFFFF" w:themeColor="background1"/>
-        </w:rPr>
-        <w:t>) não devem ser utilizadas por terceiros com quaisquer objetivos, sejam eles lucrativos ou não</w:t>
+        <w:t>As imagens do criador (foto do rosto, foto em shows etc) não devem ser utilizadas por terceiros com quaisquer objetivos, sejam eles lucrativos ou não</w:t>
       </w:r>
       <w:r>
         <w:rPr>
@@ -6266,67 +5468,7 @@
           <w:szCs w:val="24"/>
           <w:lang w:eastAsia="en-US"/>
         </w:rPr>
-        <w:t xml:space="preserve">do </w:t>
-      </w:r>
-      <w:proofErr w:type="spellStart"/>
-      <w:r>
-        <w:rPr>
-          <w:rFonts w:ascii="Arial" w:hAnsi="Arial" w:cs="Arial"/>
-          <w:sz w:val="24"/>
-          <w:szCs w:val="24"/>
-          <w:lang w:eastAsia="en-US"/>
-        </w:rPr>
-        <w:t>Hypervisor</w:t>
-      </w:r>
-      <w:proofErr w:type="spellEnd"/>
-      <w:r>
-        <w:rPr>
-          <w:rFonts w:ascii="Arial" w:hAnsi="Arial" w:cs="Arial"/>
-          <w:sz w:val="24"/>
-          <w:szCs w:val="24"/>
-          <w:lang w:eastAsia="en-US"/>
-        </w:rPr>
-        <w:t xml:space="preserve"> </w:t>
-      </w:r>
-      <w:proofErr w:type="spellStart"/>
-      <w:r>
-        <w:rPr>
-          <w:rFonts w:ascii="Arial" w:hAnsi="Arial" w:cs="Arial"/>
-          <w:sz w:val="24"/>
-          <w:szCs w:val="24"/>
-          <w:lang w:eastAsia="en-US"/>
-        </w:rPr>
-        <w:t>VirtualBox</w:t>
-      </w:r>
-      <w:proofErr w:type="spellEnd"/>
-      <w:r>
-        <w:rPr>
-          <w:rFonts w:ascii="Arial" w:hAnsi="Arial" w:cs="Arial"/>
-          <w:sz w:val="24"/>
-          <w:szCs w:val="24"/>
-          <w:lang w:eastAsia="en-US"/>
-        </w:rPr>
-        <w:t xml:space="preserve">, uma máquina virtual com o sistema operacional </w:t>
-      </w:r>
-      <w:proofErr w:type="spellStart"/>
-      <w:r>
-        <w:rPr>
-          <w:rFonts w:ascii="Arial" w:hAnsi="Arial" w:cs="Arial"/>
-          <w:sz w:val="24"/>
-          <w:szCs w:val="24"/>
-          <w:lang w:eastAsia="en-US"/>
-        </w:rPr>
-        <w:t>Lubuntu</w:t>
-      </w:r>
-      <w:proofErr w:type="spellEnd"/>
-      <w:r>
-        <w:rPr>
-          <w:rFonts w:ascii="Arial" w:hAnsi="Arial" w:cs="Arial"/>
-          <w:sz w:val="24"/>
-          <w:szCs w:val="24"/>
-          <w:lang w:eastAsia="en-US"/>
-        </w:rPr>
-        <w:t xml:space="preserve"> Linux foi instalada, visando maior segurança e isolamento do ambiente do projeto.</w:t>
+        <w:t>do Hypervisor VirtualBox, uma máquina virtual com o sistema operacional Lubuntu Linux foi instalada, visando maior segurança e isolamento do ambiente do projeto.</w:t>
       </w:r>
     </w:p>
     <w:p>
@@ -6354,125 +5496,25 @@
           <w:szCs w:val="24"/>
           <w:lang w:eastAsia="en-US"/>
         </w:rPr>
-        <w:t xml:space="preserve">o servidor de banco de dados MySQL Server foi instalado e configurado, o site A Little Piece </w:t>
-      </w:r>
-      <w:proofErr w:type="spellStart"/>
-      <w:r>
-        <w:rPr>
-          <w:rFonts w:ascii="Arial" w:hAnsi="Arial" w:cs="Arial"/>
-          <w:sz w:val="24"/>
-          <w:szCs w:val="24"/>
-          <w:lang w:eastAsia="en-US"/>
-        </w:rPr>
-        <w:t>Of</w:t>
-      </w:r>
-      <w:proofErr w:type="spellEnd"/>
-      <w:r>
-        <w:rPr>
-          <w:rFonts w:ascii="Arial" w:hAnsi="Arial" w:cs="Arial"/>
-          <w:sz w:val="24"/>
-          <w:szCs w:val="24"/>
-          <w:lang w:eastAsia="en-US"/>
-        </w:rPr>
-        <w:t xml:space="preserve"> </w:t>
-      </w:r>
-      <w:proofErr w:type="spellStart"/>
-      <w:r>
-        <w:rPr>
-          <w:rFonts w:ascii="Arial" w:hAnsi="Arial" w:cs="Arial"/>
-          <w:sz w:val="24"/>
-          <w:szCs w:val="24"/>
-          <w:lang w:eastAsia="en-US"/>
-        </w:rPr>
-        <w:t>My</w:t>
-      </w:r>
-      <w:proofErr w:type="spellEnd"/>
-      <w:r>
-        <w:rPr>
-          <w:rFonts w:ascii="Arial" w:hAnsi="Arial" w:cs="Arial"/>
-          <w:sz w:val="24"/>
-          <w:szCs w:val="24"/>
-          <w:lang w:eastAsia="en-US"/>
-        </w:rPr>
-        <w:t xml:space="preserve"> Soul foi hospedado nessa máquina virtual </w:t>
-      </w:r>
-      <w:r>
-        <w:rPr>
-          <w:rFonts w:ascii="Arial" w:hAnsi="Arial" w:cs="Arial"/>
-          <w:sz w:val="24"/>
-          <w:szCs w:val="24"/>
-          <w:lang w:eastAsia="en-US"/>
-        </w:rPr>
-        <w:t xml:space="preserve">e através da API Web Data </w:t>
-      </w:r>
-      <w:proofErr w:type="spellStart"/>
-      <w:r>
-        <w:rPr>
-          <w:rFonts w:ascii="Arial" w:hAnsi="Arial" w:cs="Arial"/>
-          <w:sz w:val="24"/>
-          <w:szCs w:val="24"/>
-          <w:lang w:eastAsia="en-US"/>
-        </w:rPr>
-        <w:t>Viz</w:t>
-      </w:r>
-      <w:proofErr w:type="spellEnd"/>
-      <w:r>
-        <w:rPr>
-          <w:rFonts w:ascii="Arial" w:hAnsi="Arial" w:cs="Arial"/>
-          <w:sz w:val="24"/>
-          <w:szCs w:val="24"/>
-          <w:lang w:eastAsia="en-US"/>
-        </w:rPr>
-        <w:t xml:space="preserve"> os dados do site são atualizados conforme dados do banco, </w:t>
-      </w:r>
-      <w:r>
-        <w:rPr>
-          <w:rFonts w:ascii="Arial" w:hAnsi="Arial" w:cs="Arial"/>
-          <w:sz w:val="24"/>
-          <w:szCs w:val="24"/>
-          <w:lang w:eastAsia="en-US"/>
-        </w:rPr>
-        <w:t xml:space="preserve">na qual ela realiza operações de </w:t>
-      </w:r>
-      <w:proofErr w:type="spellStart"/>
-      <w:r>
-        <w:rPr>
-          <w:rFonts w:ascii="Arial" w:hAnsi="Arial" w:cs="Arial"/>
-          <w:sz w:val="24"/>
-          <w:szCs w:val="24"/>
-          <w:lang w:eastAsia="en-US"/>
-        </w:rPr>
-        <w:t>insert</w:t>
-      </w:r>
-      <w:proofErr w:type="spellEnd"/>
-      <w:r>
-        <w:rPr>
-          <w:rFonts w:ascii="Arial" w:hAnsi="Arial" w:cs="Arial"/>
-          <w:sz w:val="24"/>
-          <w:szCs w:val="24"/>
-          <w:lang w:eastAsia="en-US"/>
-        </w:rPr>
-        <w:t xml:space="preserve"> e </w:t>
-      </w:r>
-      <w:proofErr w:type="spellStart"/>
-      <w:r>
-        <w:rPr>
-          <w:rFonts w:ascii="Arial" w:hAnsi="Arial" w:cs="Arial"/>
-          <w:sz w:val="24"/>
-          <w:szCs w:val="24"/>
-          <w:lang w:eastAsia="en-US"/>
-        </w:rPr>
-        <w:t>select</w:t>
-      </w:r>
-      <w:proofErr w:type="spellEnd"/>
-      <w:r>
-        <w:rPr>
-          <w:rFonts w:ascii="Arial" w:hAnsi="Arial" w:cs="Arial"/>
-          <w:sz w:val="24"/>
-          <w:szCs w:val="24"/>
-          <w:lang w:eastAsia="en-US"/>
-        </w:rPr>
-        <w:t xml:space="preserve"> no banco. E por último, o usuário acessa sua dashboard após realização do Quiz.</w:t>
+        <w:t xml:space="preserve">o servidor de banco de dados MySQL Server foi instalado e configurado, o site A Little Piece Of My Soul foi hospedado nessa máquina virtual </w:t>
+      </w:r>
+      <w:r>
+        <w:rPr>
+          <w:rFonts w:ascii="Arial" w:hAnsi="Arial" w:cs="Arial"/>
+          <w:sz w:val="24"/>
+          <w:szCs w:val="24"/>
+          <w:lang w:eastAsia="en-US"/>
+        </w:rPr>
+        <w:t xml:space="preserve">e através da API Web Data Viz os dados do site são atualizados conforme dados do banco, </w:t>
+      </w:r>
+      <w:r>
+        <w:rPr>
+          <w:rFonts w:ascii="Arial" w:hAnsi="Arial" w:cs="Arial"/>
+          <w:sz w:val="24"/>
+          <w:szCs w:val="24"/>
+          <w:lang w:eastAsia="en-US"/>
+        </w:rPr>
+        <w:t>na qual ela realiza operações de insert e select no banco. E por último, o usuário acessa sua dashboard após realização do Quiz.</w:t>
       </w:r>
     </w:p>
     <w:p>
@@ -6485,19 +5527,15 @@
     <w:p>
       <w:pPr>
         <w:keepNext/>
-        <w:jc w:val="both"/>
-      </w:pPr>
-      <w:r>
-        <w:rPr>
-          <w:noProof/>
-          <w14:ligatures w14:val="standardContextual"/>
-        </w:rPr>
+        <w:jc w:val="center"/>
+      </w:pPr>
+      <w:r>
         <w:lastRenderedPageBreak/>
         <w:drawing>
-          <wp:inline distT="0" distB="0" distL="0" distR="0" wp14:anchorId="6C7DE708" wp14:editId="09509841">
-            <wp:extent cx="5996387" cy="3867613"/>
-            <wp:effectExtent l="0" t="0" r="4445" b="0"/>
-            <wp:docPr id="19" name="Imagem 19"/>
+          <wp:inline distT="0" distB="0" distL="0" distR="0" wp14:anchorId="32EBBD60" wp14:editId="39F84776">
+            <wp:extent cx="5400040" cy="3034030"/>
+            <wp:effectExtent l="0" t="0" r="0" b="0"/>
+            <wp:docPr id="403191890" name="Imagem 1" descr="Tela de jogo de vídeo game&#10;&#10;O conteúdo gerado por IA pode estar incorreto."/>
             <wp:cNvGraphicFramePr>
               <a:graphicFrameLocks xmlns:a="http://schemas.openxmlformats.org/drawingml/2006/main" noChangeAspect="1"/>
             </wp:cNvGraphicFramePr>
@@ -6505,7 +5543,7 @@
               <a:graphicData uri="http://schemas.openxmlformats.org/drawingml/2006/picture">
                 <pic:pic xmlns:pic="http://schemas.openxmlformats.org/drawingml/2006/picture">
                   <pic:nvPicPr>
-                    <pic:cNvPr id="1" name=""/>
+                    <pic:cNvPr id="403191890" name="Imagem 1" descr="Tela de jogo de vídeo game&#10;&#10;O conteúdo gerado por IA pode estar incorreto."/>
                     <pic:cNvPicPr/>
                   </pic:nvPicPr>
                   <pic:blipFill>
@@ -6517,7 +5555,7 @@
                   <pic:spPr>
                     <a:xfrm>
                       <a:off x="0" y="0"/>
-                      <a:ext cx="6000947" cy="3870554"/>
+                      <a:ext cx="5400040" cy="3034030"/>
                     </a:xfrm>
                     <a:prstGeom prst="rect">
                       <a:avLst/>
@@ -6673,7 +5711,6 @@
           <w:color w:val="FFFFFF" w:themeColor="background1"/>
           <w:lang w:eastAsia="en-US"/>
         </w:rPr>
-        <w:lastRenderedPageBreak/>
         <w:drawing>
           <wp:inline distT="0" distB="0" distL="0" distR="0" wp14:anchorId="2725E01D" wp14:editId="5394444E">
             <wp:extent cx="5400040" cy="2004695"/>
@@ -6781,7 +5818,18 @@
           <w:szCs w:val="24"/>
           <w:lang w:eastAsia="en-US"/>
         </w:rPr>
-        <w:t>é possível visualizar os requisitos listados, sua descrição, ou seja, o que será feito, classificação dividida em essencial, importante e desejável, tamanho do P ao GG junto do tamanho Fibonacci que indica o nível de dificuldade de cada tarefa</w:t>
+        <w:t xml:space="preserve">é possível visualizar os requisitos listados, sua descrição, ou seja, o que será feito, classificação dividida em essencial, </w:t>
+      </w:r>
+      <w:r>
+        <w:rPr>
+          <w:rFonts w:ascii="Arial" w:hAnsi="Arial" w:cs="Arial"/>
+          <w:color w:val="FFFFFF" w:themeColor="background1"/>
+          <w:sz w:val="24"/>
+          <w:szCs w:val="24"/>
+          <w:lang w:eastAsia="en-US"/>
+        </w:rPr>
+        <w:lastRenderedPageBreak/>
+        <w:t>importante e desejável, tamanho do P ao GG junto do tamanho Fibonacci que indica o nível de dificuldade de cada tarefa</w:t>
       </w:r>
       <w:r>
         <w:rPr>
@@ -6886,19 +5934,8 @@
           <w:bCs/>
           <w:color w:val="FFFFFF" w:themeColor="background1"/>
         </w:rPr>
-        <w:t xml:space="preserve">: Gráfico de </w:t>
-      </w:r>
-      <w:proofErr w:type="spellStart"/>
-      <w:r>
-        <w:rPr>
-          <w:rFonts w:ascii="Arial" w:hAnsi="Arial" w:cs="Arial"/>
-          <w:b/>
-          <w:bCs/>
-          <w:color w:val="FFFFFF" w:themeColor="background1"/>
-        </w:rPr>
-        <w:t>BurnDown</w:t>
-      </w:r>
-      <w:proofErr w:type="spellEnd"/>
+        <w:t>: Gráfico de BurnDown</w:t>
+      </w:r>
     </w:p>
     <w:p>
       <w:pPr>
@@ -6920,30 +5957,7 @@
           <w:szCs w:val="24"/>
           <w:lang w:eastAsia="en-US"/>
         </w:rPr>
-        <w:lastRenderedPageBreak/>
-        <w:t xml:space="preserve">Ainda na planilha de backlog, como forma de medir meu desempenho e capacidade de entrega foi realizado um gráfico de </w:t>
-      </w:r>
-      <w:proofErr w:type="spellStart"/>
-      <w:r>
-        <w:rPr>
-          <w:rFonts w:ascii="Arial" w:hAnsi="Arial" w:cs="Arial"/>
-          <w:color w:val="FFFFFF" w:themeColor="background1"/>
-          <w:sz w:val="24"/>
-          <w:szCs w:val="24"/>
-          <w:lang w:eastAsia="en-US"/>
-        </w:rPr>
-        <w:t>BurnDown</w:t>
-      </w:r>
-      <w:proofErr w:type="spellEnd"/>
-      <w:r>
-        <w:rPr>
-          <w:rFonts w:ascii="Arial" w:hAnsi="Arial" w:cs="Arial"/>
-          <w:color w:val="FFFFFF" w:themeColor="background1"/>
-          <w:sz w:val="24"/>
-          <w:szCs w:val="24"/>
-          <w:lang w:eastAsia="en-US"/>
-        </w:rPr>
-        <w:t>, com duas métricas: planejado e entregue, métricas as quais foram extraídas da somatória dos pontos Fibonacci totais, o que foi entregue e o que está pendente em cada Sprint, tendo em vista que o item pendente na Sprint foi acumulado para a próxima.</w:t>
+        <w:t>Ainda na planilha de backlog, como forma de medir meu desempenho e capacidade de entrega foi realizado um gráfico de BurnDown, com duas métricas: planejado e entregue, métricas as quais foram extraídas da somatória dos pontos Fibonacci totais, o que foi entregue e o que está pendente em cada Sprint, tendo em vista que o item pendente na Sprint foi acumulado para a próxima.</w:t>
       </w:r>
     </w:p>
     <w:p>
@@ -6966,29 +5980,7 @@
           <w:szCs w:val="24"/>
           <w:lang w:eastAsia="en-US"/>
         </w:rPr>
-        <w:t xml:space="preserve">Todos os requisitos no backlog foram transferidos para outra plataforma de gestão, o </w:t>
-      </w:r>
-      <w:proofErr w:type="spellStart"/>
-      <w:r>
-        <w:rPr>
-          <w:rFonts w:ascii="Arial" w:hAnsi="Arial" w:cs="Arial"/>
-          <w:color w:val="FFFFFF" w:themeColor="background1"/>
-          <w:sz w:val="24"/>
-          <w:szCs w:val="24"/>
-          <w:lang w:eastAsia="en-US"/>
-        </w:rPr>
-        <w:t>Trello</w:t>
-      </w:r>
-      <w:proofErr w:type="spellEnd"/>
-      <w:r>
-        <w:rPr>
-          <w:rFonts w:ascii="Arial" w:hAnsi="Arial" w:cs="Arial"/>
-          <w:color w:val="FFFFFF" w:themeColor="background1"/>
-          <w:sz w:val="24"/>
-          <w:szCs w:val="24"/>
-          <w:lang w:eastAsia="en-US"/>
-        </w:rPr>
-        <w:t xml:space="preserve">, nele, separei em 3 colunas: “A Fazer”, “Em Andamento” e “Concluído”, </w:t>
+        <w:t xml:space="preserve">Todos os requisitos no backlog foram transferidos para outra plataforma de gestão, o Trello, nele, separei em 3 colunas: “A Fazer”, “Em Andamento” e “Concluído”, </w:t>
       </w:r>
       <w:r>
         <w:rPr>
@@ -7016,6 +6008,7 @@
           <w:szCs w:val="24"/>
           <w:lang w:eastAsia="en-US"/>
         </w:rPr>
+        <w:lastRenderedPageBreak/>
         <w:drawing>
           <wp:inline distT="0" distB="0" distL="0" distR="0" wp14:anchorId="07E417FD" wp14:editId="1762D886">
             <wp:extent cx="5400040" cy="2480310"/>
@@ -7074,19 +6067,8 @@
           <w:bCs/>
           <w:color w:val="FFFFFF" w:themeColor="background1"/>
         </w:rPr>
-        <w:t xml:space="preserve">Figura 14: Organização no </w:t>
-      </w:r>
-      <w:proofErr w:type="spellStart"/>
-      <w:r>
-        <w:rPr>
-          <w:rFonts w:ascii="Arial" w:hAnsi="Arial" w:cs="Arial"/>
-          <w:b/>
-          <w:bCs/>
-          <w:color w:val="FFFFFF" w:themeColor="background1"/>
-        </w:rPr>
-        <w:t>Trello</w:t>
-      </w:r>
-      <w:proofErr w:type="spellEnd"/>
+        <w:t>Figura 14: Organização no Trello</w:t>
+      </w:r>
     </w:p>
     <w:p>
       <w:pPr>
@@ -7151,39 +6133,7 @@
           <w:rFonts w:ascii="Arial" w:hAnsi="Arial" w:cs="Arial"/>
           <w:color w:val="FFFFFF" w:themeColor="background1"/>
         </w:rPr>
-        <w:t xml:space="preserve">Novos </w:t>
-      </w:r>
-      <w:proofErr w:type="spellStart"/>
-      <w:r>
-        <w:rPr>
-          <w:rFonts w:ascii="Arial" w:hAnsi="Arial" w:cs="Arial"/>
-          <w:color w:val="FFFFFF" w:themeColor="background1"/>
-        </w:rPr>
-        <w:t>quizzes</w:t>
-      </w:r>
-      <w:proofErr w:type="spellEnd"/>
-      <w:r>
-        <w:rPr>
-          <w:rFonts w:ascii="Arial" w:hAnsi="Arial" w:cs="Arial"/>
-          <w:color w:val="FFFFFF" w:themeColor="background1"/>
-        </w:rPr>
-        <w:t xml:space="preserve"> temáticos, por exemplo: “Com qual estética gótica é a sua cara?” ou, “Qual personagem gótico mais te identifica?” </w:t>
-      </w:r>
-      <w:proofErr w:type="spellStart"/>
-      <w:r>
-        <w:rPr>
-          <w:rFonts w:ascii="Arial" w:hAnsi="Arial" w:cs="Arial"/>
-          <w:color w:val="FFFFFF" w:themeColor="background1"/>
-        </w:rPr>
-        <w:t>etc</w:t>
-      </w:r>
-      <w:proofErr w:type="spellEnd"/>
-      <w:r>
-        <w:rPr>
-          <w:rFonts w:ascii="Arial" w:hAnsi="Arial" w:cs="Arial"/>
-          <w:color w:val="FFFFFF" w:themeColor="background1"/>
-        </w:rPr>
-        <w:t>;</w:t>
+        <w:t>Novos quizzes temáticos, por exemplo: “Com qual estética gótica é a sua cara?” ou, “Qual personagem gótico mais te identifica?” etc;</w:t>
       </w:r>
     </w:p>
     <w:p>
@@ -7321,7 +6271,6 @@
         <w:rPr>
           <w:color w:val="FFFFFF" w:themeColor="background1"/>
         </w:rPr>
-        <w:lastRenderedPageBreak/>
         <w:t>BIBLIOGRAFIA</w:t>
       </w:r>
       <w:bookmarkEnd w:id="18"/>
@@ -7472,6 +6421,7 @@
           <w:rStyle w:val="Forte"/>
           <w:rFonts w:ascii="Arial" w:eastAsiaTheme="majorEastAsia" w:hAnsi="Arial" w:cs="Arial"/>
         </w:rPr>
+        <w:lastRenderedPageBreak/>
         <w:t>O QUE É A SUBCULTURA GÓTICA.</w:t>
       </w:r>
       <w:r>

</xml_diff>

<commit_message>
A bibliografia não estava separada por uma página, fiz  uma quebra de página para ela
</commit_message>
<xml_diff>
--- a/Documentação/ALittlePieceOfMySoul.docx
+++ b/Documentação/ALittlePieceOfMySoul.docx
@@ -2206,7 +2206,7 @@
                 <w:noProof/>
                 <w:webHidden/>
               </w:rPr>
-              <w:t>13</w:t>
+              <w:t>14</w:t>
             </w:r>
             <w:r>
               <w:rPr>
@@ -2641,7 +2641,73 @@
           <w:szCs w:val="24"/>
           <w:lang w:eastAsia="en-US"/>
         </w:rPr>
-        <w:t>Uma das pioneiras no estilo e vestimenta gótica foi Siouxsie Sioux, vocalista do Siouxsie and the Banshees.</w:t>
+        <w:t xml:space="preserve">Uma das pioneiras no estilo e vestimenta gótica foi Siouxsie Sioux, vocalista do Siouxsie </w:t>
+      </w:r>
+      <w:proofErr w:type="spellStart"/>
+      <w:r>
+        <w:rPr>
+          <w:rFonts w:ascii="Arial" w:hAnsi="Arial" w:cs="Arial"/>
+          <w:color w:val="FFFFFF" w:themeColor="background1"/>
+          <w:sz w:val="24"/>
+          <w:szCs w:val="24"/>
+          <w:lang w:eastAsia="en-US"/>
+        </w:rPr>
+        <w:t>and</w:t>
+      </w:r>
+      <w:proofErr w:type="spellEnd"/>
+      <w:r>
+        <w:rPr>
+          <w:rFonts w:ascii="Arial" w:hAnsi="Arial" w:cs="Arial"/>
+          <w:color w:val="FFFFFF" w:themeColor="background1"/>
+          <w:sz w:val="24"/>
+          <w:szCs w:val="24"/>
+          <w:lang w:eastAsia="en-US"/>
+        </w:rPr>
+        <w:t xml:space="preserve"> </w:t>
+      </w:r>
+      <w:proofErr w:type="spellStart"/>
+      <w:r>
+        <w:rPr>
+          <w:rFonts w:ascii="Arial" w:hAnsi="Arial" w:cs="Arial"/>
+          <w:color w:val="FFFFFF" w:themeColor="background1"/>
+          <w:sz w:val="24"/>
+          <w:szCs w:val="24"/>
+          <w:lang w:eastAsia="en-US"/>
+        </w:rPr>
+        <w:t>the</w:t>
+      </w:r>
+      <w:proofErr w:type="spellEnd"/>
+      <w:r>
+        <w:rPr>
+          <w:rFonts w:ascii="Arial" w:hAnsi="Arial" w:cs="Arial"/>
+          <w:color w:val="FFFFFF" w:themeColor="background1"/>
+          <w:sz w:val="24"/>
+          <w:szCs w:val="24"/>
+          <w:lang w:eastAsia="en-US"/>
+        </w:rPr>
+        <w:t xml:space="preserve"> </w:t>
+      </w:r>
+      <w:proofErr w:type="spellStart"/>
+      <w:r>
+        <w:rPr>
+          <w:rFonts w:ascii="Arial" w:hAnsi="Arial" w:cs="Arial"/>
+          <w:color w:val="FFFFFF" w:themeColor="background1"/>
+          <w:sz w:val="24"/>
+          <w:szCs w:val="24"/>
+          <w:lang w:eastAsia="en-US"/>
+        </w:rPr>
+        <w:t>Banshees</w:t>
+      </w:r>
+      <w:proofErr w:type="spellEnd"/>
+      <w:r>
+        <w:rPr>
+          <w:rFonts w:ascii="Arial" w:hAnsi="Arial" w:cs="Arial"/>
+          <w:color w:val="FFFFFF" w:themeColor="background1"/>
+          <w:sz w:val="24"/>
+          <w:szCs w:val="24"/>
+          <w:lang w:eastAsia="en-US"/>
+        </w:rPr>
+        <w:t>.</w:t>
       </w:r>
     </w:p>
     <w:p>
@@ -2659,7 +2725,7 @@
         </w:rPr>
         <w:lastRenderedPageBreak/>
         <w:drawing>
-          <wp:inline distT="0" distB="0" distL="0" distR="0" wp14:anchorId="258DA283" wp14:editId="04BC94CF">
+          <wp:inline distT="0" distB="0" distL="0" distR="0" wp14:anchorId="258DA283" wp14:editId="2909D835">
             <wp:extent cx="2417197" cy="2582629"/>
             <wp:effectExtent l="0" t="0" r="2540" b="8255"/>
             <wp:docPr id="1" name="Imagem 1" descr="O que vcs acham de Siouxsie and the banshees? : r/MusicaBR"/>
@@ -2866,8 +2932,53 @@
           <w:szCs w:val="24"/>
           <w:lang w:eastAsia="en-US"/>
         </w:rPr>
-        <w:t xml:space="preserve">Dos clássicos como Nosferatu (1922) e London After Midnight (1927) ao cinema gótico moderno, como O Corvo (1994) ou as animações em </w:t>
-      </w:r>
+        <w:t xml:space="preserve">Dos clássicos como </w:t>
+      </w:r>
+      <w:proofErr w:type="spellStart"/>
+      <w:r>
+        <w:rPr>
+          <w:rFonts w:ascii="Arial" w:hAnsi="Arial" w:cs="Arial"/>
+          <w:color w:val="FFFFFF" w:themeColor="background1"/>
+          <w:sz w:val="24"/>
+          <w:szCs w:val="24"/>
+          <w:lang w:eastAsia="en-US"/>
+        </w:rPr>
+        <w:t>Nosferatu</w:t>
+      </w:r>
+      <w:proofErr w:type="spellEnd"/>
+      <w:r>
+        <w:rPr>
+          <w:rFonts w:ascii="Arial" w:hAnsi="Arial" w:cs="Arial"/>
+          <w:color w:val="FFFFFF" w:themeColor="background1"/>
+          <w:sz w:val="24"/>
+          <w:szCs w:val="24"/>
+          <w:lang w:eastAsia="en-US"/>
+        </w:rPr>
+        <w:t xml:space="preserve"> (1922) e London </w:t>
+      </w:r>
+      <w:proofErr w:type="spellStart"/>
+      <w:r>
+        <w:rPr>
+          <w:rFonts w:ascii="Arial" w:hAnsi="Arial" w:cs="Arial"/>
+          <w:color w:val="FFFFFF" w:themeColor="background1"/>
+          <w:sz w:val="24"/>
+          <w:szCs w:val="24"/>
+          <w:lang w:eastAsia="en-US"/>
+        </w:rPr>
+        <w:t>After</w:t>
+      </w:r>
+      <w:proofErr w:type="spellEnd"/>
+      <w:r>
+        <w:rPr>
+          <w:rFonts w:ascii="Arial" w:hAnsi="Arial" w:cs="Arial"/>
+          <w:color w:val="FFFFFF" w:themeColor="background1"/>
+          <w:sz w:val="24"/>
+          <w:szCs w:val="24"/>
+          <w:lang w:eastAsia="en-US"/>
+        </w:rPr>
+        <w:t xml:space="preserve"> Midnight (1927) ao cinema gótico moderno, como O Corvo (1994) ou as animações em </w:t>
+      </w:r>
+      <w:proofErr w:type="spellStart"/>
       <w:r>
         <w:rPr>
           <w:rFonts w:ascii="Arial" w:hAnsi="Arial" w:cs="Arial"/>
@@ -2880,6 +2991,7 @@
         </w:rPr>
         <w:t>stop-motion</w:t>
       </w:r>
+      <w:proofErr w:type="spellEnd"/>
       <w:r>
         <w:rPr>
           <w:rFonts w:ascii="Arial" w:hAnsi="Arial" w:cs="Arial"/>
@@ -2960,7 +3072,27 @@
                                 <w:bCs/>
                                 <w:color w:val="FFFFFF" w:themeColor="background1"/>
                               </w:rPr>
-                              <w:t>Figura 3: London After Midnight (1927)</w:t>
+                              <w:t xml:space="preserve">Figura 3: London </w:t>
+                            </w:r>
+                            <w:proofErr w:type="spellStart"/>
+                            <w:r>
+                              <w:rPr>
+                                <w:rFonts w:ascii="Arial" w:hAnsi="Arial" w:cs="Arial"/>
+                                <w:b/>
+                                <w:bCs/>
+                                <w:color w:val="FFFFFF" w:themeColor="background1"/>
+                              </w:rPr>
+                              <w:t>After</w:t>
+                            </w:r>
+                            <w:proofErr w:type="spellEnd"/>
+                            <w:r>
+                              <w:rPr>
+                                <w:rFonts w:ascii="Arial" w:hAnsi="Arial" w:cs="Arial"/>
+                                <w:b/>
+                                <w:bCs/>
+                                <w:color w:val="FFFFFF" w:themeColor="background1"/>
+                              </w:rPr>
+                              <w:t xml:space="preserve"> Midnight (1927)</w:t>
                             </w:r>
                           </w:p>
                         </w:txbxContent>
@@ -3006,7 +3138,27 @@
                           <w:bCs/>
                           <w:color w:val="FFFFFF" w:themeColor="background1"/>
                         </w:rPr>
-                        <w:t>Figura 3: London After Midnight (1927)</w:t>
+                        <w:t xml:space="preserve">Figura 3: London </w:t>
+                      </w:r>
+                      <w:proofErr w:type="spellStart"/>
+                      <w:r>
+                        <w:rPr>
+                          <w:rFonts w:ascii="Arial" w:hAnsi="Arial" w:cs="Arial"/>
+                          <w:b/>
+                          <w:bCs/>
+                          <w:color w:val="FFFFFF" w:themeColor="background1"/>
+                        </w:rPr>
+                        <w:t>After</w:t>
+                      </w:r>
+                      <w:proofErr w:type="spellEnd"/>
+                      <w:r>
+                        <w:rPr>
+                          <w:rFonts w:ascii="Arial" w:hAnsi="Arial" w:cs="Arial"/>
+                          <w:b/>
+                          <w:bCs/>
+                          <w:color w:val="FFFFFF" w:themeColor="background1"/>
+                        </w:rPr>
+                        <w:t xml:space="preserve"> Midnight (1927)</w:t>
                       </w:r>
                     </w:p>
                   </w:txbxContent>
@@ -3157,7 +3309,27 @@
           <w:bCs/>
           <w:color w:val="FFFFFF" w:themeColor="background1"/>
         </w:rPr>
-        <w:t>Figura 2: Nosferatu (1922)</w:t>
+        <w:t xml:space="preserve">Figura 2: </w:t>
+      </w:r>
+      <w:proofErr w:type="spellStart"/>
+      <w:r>
+        <w:rPr>
+          <w:rFonts w:ascii="Arial" w:hAnsi="Arial" w:cs="Arial"/>
+          <w:b/>
+          <w:bCs/>
+          <w:color w:val="FFFFFF" w:themeColor="background1"/>
+        </w:rPr>
+        <w:t>Nosferatu</w:t>
+      </w:r>
+      <w:proofErr w:type="spellEnd"/>
+      <w:r>
+        <w:rPr>
+          <w:rFonts w:ascii="Arial" w:hAnsi="Arial" w:cs="Arial"/>
+          <w:b/>
+          <w:bCs/>
+          <w:color w:val="FFFFFF" w:themeColor="background1"/>
+        </w:rPr>
+        <w:t xml:space="preserve"> (1922)</w:t>
       </w:r>
     </w:p>
     <w:p>
@@ -3493,7 +3665,7 @@
           <w:color w:val="FFFFFF" w:themeColor="background1"/>
         </w:rPr>
         <w:drawing>
-          <wp:anchor distT="0" distB="0" distL="114300" distR="114300" simplePos="0" relativeHeight="251659264" behindDoc="0" locked="0" layoutInCell="1" allowOverlap="1" wp14:anchorId="6D2595A6" wp14:editId="2C6DA0BF">
+          <wp:anchor distT="0" distB="0" distL="114300" distR="114300" simplePos="0" relativeHeight="251659264" behindDoc="0" locked="0" layoutInCell="1" allowOverlap="1" wp14:anchorId="6D2595A6" wp14:editId="7A1F97A7">
             <wp:simplePos x="0" y="0"/>
             <wp:positionH relativeFrom="column">
               <wp:posOffset>-698472</wp:posOffset>
@@ -3592,7 +3764,139 @@
           <w:szCs w:val="24"/>
           <w:lang w:eastAsia="en-US"/>
         </w:rPr>
-        <w:t>A música é o coração da subcultura gótica, e a banda pioneira foi o Bauhaus, com seu clássico som experimental Bela Lugosi’s Dead, que conta a morte do ator Bela Lugosi, que interpretou o Drácula. The Cure e Siouxsie and the Banshees consolidaram o gênero, com letras introspectivas, românticas, atmosfera sombria e sonoridade diferente de tudo que havia na época.</w:t>
+        <w:t xml:space="preserve">A música é o coração da subcultura gótica, e a banda pioneira foi o Bauhaus, com seu clássico som experimental Bela </w:t>
+      </w:r>
+      <w:proofErr w:type="spellStart"/>
+      <w:r>
+        <w:rPr>
+          <w:rFonts w:ascii="Arial" w:hAnsi="Arial" w:cs="Arial"/>
+          <w:color w:val="FFFFFF" w:themeColor="background1"/>
+          <w:sz w:val="24"/>
+          <w:szCs w:val="24"/>
+          <w:lang w:eastAsia="en-US"/>
+        </w:rPr>
+        <w:t>Lugosi’s</w:t>
+      </w:r>
+      <w:proofErr w:type="spellEnd"/>
+      <w:r>
+        <w:rPr>
+          <w:rFonts w:ascii="Arial" w:hAnsi="Arial" w:cs="Arial"/>
+          <w:color w:val="FFFFFF" w:themeColor="background1"/>
+          <w:sz w:val="24"/>
+          <w:szCs w:val="24"/>
+          <w:lang w:eastAsia="en-US"/>
+        </w:rPr>
+        <w:t xml:space="preserve"> </w:t>
+      </w:r>
+      <w:proofErr w:type="spellStart"/>
+      <w:r>
+        <w:rPr>
+          <w:rFonts w:ascii="Arial" w:hAnsi="Arial" w:cs="Arial"/>
+          <w:color w:val="FFFFFF" w:themeColor="background1"/>
+          <w:sz w:val="24"/>
+          <w:szCs w:val="24"/>
+          <w:lang w:eastAsia="en-US"/>
+        </w:rPr>
+        <w:t>Dead</w:t>
+      </w:r>
+      <w:proofErr w:type="spellEnd"/>
+      <w:r>
+        <w:rPr>
+          <w:rFonts w:ascii="Arial" w:hAnsi="Arial" w:cs="Arial"/>
+          <w:color w:val="FFFFFF" w:themeColor="background1"/>
+          <w:sz w:val="24"/>
+          <w:szCs w:val="24"/>
+          <w:lang w:eastAsia="en-US"/>
+        </w:rPr>
+        <w:t xml:space="preserve">, que conta a morte do ator Bela </w:t>
+      </w:r>
+      <w:proofErr w:type="spellStart"/>
+      <w:r>
+        <w:rPr>
+          <w:rFonts w:ascii="Arial" w:hAnsi="Arial" w:cs="Arial"/>
+          <w:color w:val="FFFFFF" w:themeColor="background1"/>
+          <w:sz w:val="24"/>
+          <w:szCs w:val="24"/>
+          <w:lang w:eastAsia="en-US"/>
+        </w:rPr>
+        <w:t>Lugosi</w:t>
+      </w:r>
+      <w:proofErr w:type="spellEnd"/>
+      <w:r>
+        <w:rPr>
+          <w:rFonts w:ascii="Arial" w:hAnsi="Arial" w:cs="Arial"/>
+          <w:color w:val="FFFFFF" w:themeColor="background1"/>
+          <w:sz w:val="24"/>
+          <w:szCs w:val="24"/>
+          <w:lang w:eastAsia="en-US"/>
+        </w:rPr>
+        <w:t xml:space="preserve">, que interpretou o Drácula. The Cure e Siouxsie </w:t>
+      </w:r>
+      <w:proofErr w:type="spellStart"/>
+      <w:r>
+        <w:rPr>
+          <w:rFonts w:ascii="Arial" w:hAnsi="Arial" w:cs="Arial"/>
+          <w:color w:val="FFFFFF" w:themeColor="background1"/>
+          <w:sz w:val="24"/>
+          <w:szCs w:val="24"/>
+          <w:lang w:eastAsia="en-US"/>
+        </w:rPr>
+        <w:t>and</w:t>
+      </w:r>
+      <w:proofErr w:type="spellEnd"/>
+      <w:r>
+        <w:rPr>
+          <w:rFonts w:ascii="Arial" w:hAnsi="Arial" w:cs="Arial"/>
+          <w:color w:val="FFFFFF" w:themeColor="background1"/>
+          <w:sz w:val="24"/>
+          <w:szCs w:val="24"/>
+          <w:lang w:eastAsia="en-US"/>
+        </w:rPr>
+        <w:t xml:space="preserve"> </w:t>
+      </w:r>
+      <w:proofErr w:type="spellStart"/>
+      <w:r>
+        <w:rPr>
+          <w:rFonts w:ascii="Arial" w:hAnsi="Arial" w:cs="Arial"/>
+          <w:color w:val="FFFFFF" w:themeColor="background1"/>
+          <w:sz w:val="24"/>
+          <w:szCs w:val="24"/>
+          <w:lang w:eastAsia="en-US"/>
+        </w:rPr>
+        <w:t>the</w:t>
+      </w:r>
+      <w:proofErr w:type="spellEnd"/>
+      <w:r>
+        <w:rPr>
+          <w:rFonts w:ascii="Arial" w:hAnsi="Arial" w:cs="Arial"/>
+          <w:color w:val="FFFFFF" w:themeColor="background1"/>
+          <w:sz w:val="24"/>
+          <w:szCs w:val="24"/>
+          <w:lang w:eastAsia="en-US"/>
+        </w:rPr>
+        <w:t xml:space="preserve"> </w:t>
+      </w:r>
+      <w:proofErr w:type="spellStart"/>
+      <w:r>
+        <w:rPr>
+          <w:rFonts w:ascii="Arial" w:hAnsi="Arial" w:cs="Arial"/>
+          <w:color w:val="FFFFFF" w:themeColor="background1"/>
+          <w:sz w:val="24"/>
+          <w:szCs w:val="24"/>
+          <w:lang w:eastAsia="en-US"/>
+        </w:rPr>
+        <w:t>Banshees</w:t>
+      </w:r>
+      <w:proofErr w:type="spellEnd"/>
+      <w:r>
+        <w:rPr>
+          <w:rFonts w:ascii="Arial" w:hAnsi="Arial" w:cs="Arial"/>
+          <w:color w:val="FFFFFF" w:themeColor="background1"/>
+          <w:sz w:val="24"/>
+          <w:szCs w:val="24"/>
+          <w:lang w:eastAsia="en-US"/>
+        </w:rPr>
+        <w:t xml:space="preserve"> consolidaram o gênero, com letras introspectivas, românticas, atmosfera sombria e sonoridade diferente de tudo que havia na época.</w:t>
       </w:r>
     </w:p>
     <w:p>
@@ -3817,7 +4121,161 @@
           <w:szCs w:val="24"/>
           <w:lang w:eastAsia="en-US"/>
         </w:rPr>
-        <w:t>Conforme passar do tempo, gêneros góticos foram surgindo, como Darkwave, Post-Punk, Deathrock e EBM (Electronic Body Music), com muitas bandas nesses gêneros, porém, vale a ressalva para o Sisters Of Mercy, Lebanon Hanover, She Past Away e Twin Tribes.</w:t>
+        <w:t xml:space="preserve">Conforme passar do tempo, gêneros góticos foram surgindo, como </w:t>
+      </w:r>
+      <w:proofErr w:type="spellStart"/>
+      <w:r>
+        <w:rPr>
+          <w:rFonts w:ascii="Arial" w:hAnsi="Arial" w:cs="Arial"/>
+          <w:color w:val="FFFFFF" w:themeColor="background1"/>
+          <w:sz w:val="24"/>
+          <w:szCs w:val="24"/>
+          <w:lang w:eastAsia="en-US"/>
+        </w:rPr>
+        <w:t>Darkwave</w:t>
+      </w:r>
+      <w:proofErr w:type="spellEnd"/>
+      <w:r>
+        <w:rPr>
+          <w:rFonts w:ascii="Arial" w:hAnsi="Arial" w:cs="Arial"/>
+          <w:color w:val="FFFFFF" w:themeColor="background1"/>
+          <w:sz w:val="24"/>
+          <w:szCs w:val="24"/>
+          <w:lang w:eastAsia="en-US"/>
+        </w:rPr>
+        <w:t xml:space="preserve">, Post-Punk, </w:t>
+      </w:r>
+      <w:proofErr w:type="spellStart"/>
+      <w:r>
+        <w:rPr>
+          <w:rFonts w:ascii="Arial" w:hAnsi="Arial" w:cs="Arial"/>
+          <w:color w:val="FFFFFF" w:themeColor="background1"/>
+          <w:sz w:val="24"/>
+          <w:szCs w:val="24"/>
+          <w:lang w:eastAsia="en-US"/>
+        </w:rPr>
+        <w:t>Deathrock</w:t>
+      </w:r>
+      <w:proofErr w:type="spellEnd"/>
+      <w:r>
+        <w:rPr>
+          <w:rFonts w:ascii="Arial" w:hAnsi="Arial" w:cs="Arial"/>
+          <w:color w:val="FFFFFF" w:themeColor="background1"/>
+          <w:sz w:val="24"/>
+          <w:szCs w:val="24"/>
+          <w:lang w:eastAsia="en-US"/>
+        </w:rPr>
+        <w:t xml:space="preserve"> e EBM (</w:t>
+      </w:r>
+      <w:proofErr w:type="spellStart"/>
+      <w:r>
+        <w:rPr>
+          <w:rFonts w:ascii="Arial" w:hAnsi="Arial" w:cs="Arial"/>
+          <w:color w:val="FFFFFF" w:themeColor="background1"/>
+          <w:sz w:val="24"/>
+          <w:szCs w:val="24"/>
+          <w:lang w:eastAsia="en-US"/>
+        </w:rPr>
+        <w:t>Electronic</w:t>
+      </w:r>
+      <w:proofErr w:type="spellEnd"/>
+      <w:r>
+        <w:rPr>
+          <w:rFonts w:ascii="Arial" w:hAnsi="Arial" w:cs="Arial"/>
+          <w:color w:val="FFFFFF" w:themeColor="background1"/>
+          <w:sz w:val="24"/>
+          <w:szCs w:val="24"/>
+          <w:lang w:eastAsia="en-US"/>
+        </w:rPr>
+        <w:t xml:space="preserve"> Body Music), com muitas bandas nesses gêneros, porém, vale a ressalva para o Sisters </w:t>
+      </w:r>
+      <w:proofErr w:type="spellStart"/>
+      <w:r>
+        <w:rPr>
+          <w:rFonts w:ascii="Arial" w:hAnsi="Arial" w:cs="Arial"/>
+          <w:color w:val="FFFFFF" w:themeColor="background1"/>
+          <w:sz w:val="24"/>
+          <w:szCs w:val="24"/>
+          <w:lang w:eastAsia="en-US"/>
+        </w:rPr>
+        <w:t>Of</w:t>
+      </w:r>
+      <w:proofErr w:type="spellEnd"/>
+      <w:r>
+        <w:rPr>
+          <w:rFonts w:ascii="Arial" w:hAnsi="Arial" w:cs="Arial"/>
+          <w:color w:val="FFFFFF" w:themeColor="background1"/>
+          <w:sz w:val="24"/>
+          <w:szCs w:val="24"/>
+          <w:lang w:eastAsia="en-US"/>
+        </w:rPr>
+        <w:t xml:space="preserve"> Mercy, </w:t>
+      </w:r>
+      <w:proofErr w:type="spellStart"/>
+      <w:r>
+        <w:rPr>
+          <w:rFonts w:ascii="Arial" w:hAnsi="Arial" w:cs="Arial"/>
+          <w:color w:val="FFFFFF" w:themeColor="background1"/>
+          <w:sz w:val="24"/>
+          <w:szCs w:val="24"/>
+          <w:lang w:eastAsia="en-US"/>
+        </w:rPr>
+        <w:t>Lebanon</w:t>
+      </w:r>
+      <w:proofErr w:type="spellEnd"/>
+      <w:r>
+        <w:rPr>
+          <w:rFonts w:ascii="Arial" w:hAnsi="Arial" w:cs="Arial"/>
+          <w:color w:val="FFFFFF" w:themeColor="background1"/>
+          <w:sz w:val="24"/>
+          <w:szCs w:val="24"/>
+          <w:lang w:eastAsia="en-US"/>
+        </w:rPr>
+        <w:t xml:space="preserve"> Hanover, She </w:t>
+      </w:r>
+      <w:proofErr w:type="spellStart"/>
+      <w:r>
+        <w:rPr>
+          <w:rFonts w:ascii="Arial" w:hAnsi="Arial" w:cs="Arial"/>
+          <w:color w:val="FFFFFF" w:themeColor="background1"/>
+          <w:sz w:val="24"/>
+          <w:szCs w:val="24"/>
+          <w:lang w:eastAsia="en-US"/>
+        </w:rPr>
+        <w:t>Past</w:t>
+      </w:r>
+      <w:proofErr w:type="spellEnd"/>
+      <w:r>
+        <w:rPr>
+          <w:rFonts w:ascii="Arial" w:hAnsi="Arial" w:cs="Arial"/>
+          <w:color w:val="FFFFFF" w:themeColor="background1"/>
+          <w:sz w:val="24"/>
+          <w:szCs w:val="24"/>
+          <w:lang w:eastAsia="en-US"/>
+        </w:rPr>
+        <w:t xml:space="preserve"> Away e Twin </w:t>
+      </w:r>
+      <w:proofErr w:type="spellStart"/>
+      <w:r>
+        <w:rPr>
+          <w:rFonts w:ascii="Arial" w:hAnsi="Arial" w:cs="Arial"/>
+          <w:color w:val="FFFFFF" w:themeColor="background1"/>
+          <w:sz w:val="24"/>
+          <w:szCs w:val="24"/>
+          <w:lang w:eastAsia="en-US"/>
+        </w:rPr>
+        <w:t>Tribes</w:t>
+      </w:r>
+      <w:proofErr w:type="spellEnd"/>
+      <w:r>
+        <w:rPr>
+          <w:rFonts w:ascii="Arial" w:hAnsi="Arial" w:cs="Arial"/>
+          <w:color w:val="FFFFFF" w:themeColor="background1"/>
+          <w:sz w:val="24"/>
+          <w:szCs w:val="24"/>
+          <w:lang w:eastAsia="en-US"/>
+        </w:rPr>
+        <w:t>.</w:t>
       </w:r>
       <w:r>
         <w:rPr>
@@ -3878,7 +4336,95 @@
           <w:lang w:eastAsia="en-US"/>
         </w:rPr>
         <w:lastRenderedPageBreak/>
-        <w:t>“Sadness Is Rebellion”, uma música do Lebanon Hanover, que destaca a superficialidade das pessoas em não buscarem autoconhecimento.</w:t>
+        <w:t>“</w:t>
+      </w:r>
+      <w:proofErr w:type="spellStart"/>
+      <w:r>
+        <w:rPr>
+          <w:rFonts w:ascii="Arial" w:hAnsi="Arial" w:cs="Arial"/>
+          <w:color w:val="FFFFFF" w:themeColor="background1"/>
+          <w:sz w:val="24"/>
+          <w:szCs w:val="24"/>
+          <w:lang w:eastAsia="en-US"/>
+        </w:rPr>
+        <w:t>Sadness</w:t>
+      </w:r>
+      <w:proofErr w:type="spellEnd"/>
+      <w:r>
+        <w:rPr>
+          <w:rFonts w:ascii="Arial" w:hAnsi="Arial" w:cs="Arial"/>
+          <w:color w:val="FFFFFF" w:themeColor="background1"/>
+          <w:sz w:val="24"/>
+          <w:szCs w:val="24"/>
+          <w:lang w:eastAsia="en-US"/>
+        </w:rPr>
+        <w:t xml:space="preserve"> </w:t>
+      </w:r>
+      <w:proofErr w:type="spellStart"/>
+      <w:r>
+        <w:rPr>
+          <w:rFonts w:ascii="Arial" w:hAnsi="Arial" w:cs="Arial"/>
+          <w:color w:val="FFFFFF" w:themeColor="background1"/>
+          <w:sz w:val="24"/>
+          <w:szCs w:val="24"/>
+          <w:lang w:eastAsia="en-US"/>
+        </w:rPr>
+        <w:t>Is</w:t>
+      </w:r>
+      <w:proofErr w:type="spellEnd"/>
+      <w:r>
+        <w:rPr>
+          <w:rFonts w:ascii="Arial" w:hAnsi="Arial" w:cs="Arial"/>
+          <w:color w:val="FFFFFF" w:themeColor="background1"/>
+          <w:sz w:val="24"/>
+          <w:szCs w:val="24"/>
+          <w:lang w:eastAsia="en-US"/>
+        </w:rPr>
+        <w:t xml:space="preserve"> </w:t>
+      </w:r>
+      <w:proofErr w:type="spellStart"/>
+      <w:r>
+        <w:rPr>
+          <w:rFonts w:ascii="Arial" w:hAnsi="Arial" w:cs="Arial"/>
+          <w:color w:val="FFFFFF" w:themeColor="background1"/>
+          <w:sz w:val="24"/>
+          <w:szCs w:val="24"/>
+          <w:lang w:eastAsia="en-US"/>
+        </w:rPr>
+        <w:t>Rebellion</w:t>
+      </w:r>
+      <w:proofErr w:type="spellEnd"/>
+      <w:r>
+        <w:rPr>
+          <w:rFonts w:ascii="Arial" w:hAnsi="Arial" w:cs="Arial"/>
+          <w:color w:val="FFFFFF" w:themeColor="background1"/>
+          <w:sz w:val="24"/>
+          <w:szCs w:val="24"/>
+          <w:lang w:eastAsia="en-US"/>
+        </w:rPr>
+        <w:t xml:space="preserve">”, uma música do </w:t>
+      </w:r>
+      <w:proofErr w:type="spellStart"/>
+      <w:r>
+        <w:rPr>
+          <w:rFonts w:ascii="Arial" w:hAnsi="Arial" w:cs="Arial"/>
+          <w:color w:val="FFFFFF" w:themeColor="background1"/>
+          <w:sz w:val="24"/>
+          <w:szCs w:val="24"/>
+          <w:lang w:eastAsia="en-US"/>
+        </w:rPr>
+        <w:t>Lebanon</w:t>
+      </w:r>
+      <w:proofErr w:type="spellEnd"/>
+      <w:r>
+        <w:rPr>
+          <w:rFonts w:ascii="Arial" w:hAnsi="Arial" w:cs="Arial"/>
+          <w:color w:val="FFFFFF" w:themeColor="background1"/>
+          <w:sz w:val="24"/>
+          <w:szCs w:val="24"/>
+          <w:lang w:eastAsia="en-US"/>
+        </w:rPr>
+        <w:t xml:space="preserve"> Hanover, que destaca a superficialidade das pessoas em não buscarem autoconhecimento.</w:t>
       </w:r>
     </w:p>
     <w:p>
@@ -3962,7 +4508,27 @@
           <w:bCs/>
           <w:color w:val="FFFFFF" w:themeColor="background1"/>
         </w:rPr>
-        <w:t>Figura 7: Sisters Of Mercy</w:t>
+        <w:t xml:space="preserve">Figura 7: Sisters </w:t>
+      </w:r>
+      <w:proofErr w:type="spellStart"/>
+      <w:r>
+        <w:rPr>
+          <w:rFonts w:ascii="Arial" w:hAnsi="Arial" w:cs="Arial"/>
+          <w:b/>
+          <w:bCs/>
+          <w:color w:val="FFFFFF" w:themeColor="background1"/>
+        </w:rPr>
+        <w:t>Of</w:t>
+      </w:r>
+      <w:proofErr w:type="spellEnd"/>
+      <w:r>
+        <w:rPr>
+          <w:rFonts w:ascii="Arial" w:hAnsi="Arial" w:cs="Arial"/>
+          <w:b/>
+          <w:bCs/>
+          <w:color w:val="FFFFFF" w:themeColor="background1"/>
+        </w:rPr>
+        <w:t xml:space="preserve"> Mercy</w:t>
       </w:r>
     </w:p>
     <w:p>
@@ -4052,7 +4618,27 @@
           <w:bCs/>
           <w:color w:val="FFFFFF" w:themeColor="background1"/>
         </w:rPr>
-        <w:t>Figura 8: Lebanon Hanover</w:t>
+        <w:t xml:space="preserve">Figura 8: </w:t>
+      </w:r>
+      <w:proofErr w:type="spellStart"/>
+      <w:r>
+        <w:rPr>
+          <w:rFonts w:ascii="Arial" w:hAnsi="Arial" w:cs="Arial"/>
+          <w:b/>
+          <w:bCs/>
+          <w:color w:val="FFFFFF" w:themeColor="background1"/>
+        </w:rPr>
+        <w:t>Lebanon</w:t>
+      </w:r>
+      <w:proofErr w:type="spellEnd"/>
+      <w:r>
+        <w:rPr>
+          <w:rFonts w:ascii="Arial" w:hAnsi="Arial" w:cs="Arial"/>
+          <w:b/>
+          <w:bCs/>
+          <w:color w:val="FFFFFF" w:themeColor="background1"/>
+        </w:rPr>
+        <w:t xml:space="preserve"> Hanover</w:t>
       </w:r>
     </w:p>
     <w:p>
@@ -4241,7 +4827,51 @@
           <w:szCs w:val="24"/>
           <w:lang w:eastAsia="en-US"/>
         </w:rPr>
-        <w:t>O que me chateia é que há muito estereótipos no meio, falando que góticos são tristes, ou que góticos odeiam todo mundo, e não é verdade, e está longe de ser verdade, é só um jeito diferente de viver que as outras pessoas, e não há nada de errado nisso, portanto, A Little Piece Of My Soul veio para desmistificar alguns mitos e estereótipos sobre a subcultura.</w:t>
+        <w:t xml:space="preserve">O que me chateia é que há muito estereótipos no meio, falando que góticos são tristes, ou que góticos odeiam todo mundo, e não é verdade, e está longe de ser verdade, é só um jeito diferente de viver que as outras pessoas, e não há nada de errado nisso, portanto, A Little Piece </w:t>
+      </w:r>
+      <w:proofErr w:type="spellStart"/>
+      <w:r>
+        <w:rPr>
+          <w:rFonts w:ascii="Arial" w:hAnsi="Arial" w:cs="Arial"/>
+          <w:color w:val="FFFFFF" w:themeColor="background1"/>
+          <w:sz w:val="24"/>
+          <w:szCs w:val="24"/>
+          <w:lang w:eastAsia="en-US"/>
+        </w:rPr>
+        <w:t>Of</w:t>
+      </w:r>
+      <w:proofErr w:type="spellEnd"/>
+      <w:r>
+        <w:rPr>
+          <w:rFonts w:ascii="Arial" w:hAnsi="Arial" w:cs="Arial"/>
+          <w:color w:val="FFFFFF" w:themeColor="background1"/>
+          <w:sz w:val="24"/>
+          <w:szCs w:val="24"/>
+          <w:lang w:eastAsia="en-US"/>
+        </w:rPr>
+        <w:t xml:space="preserve"> </w:t>
+      </w:r>
+      <w:proofErr w:type="spellStart"/>
+      <w:r>
+        <w:rPr>
+          <w:rFonts w:ascii="Arial" w:hAnsi="Arial" w:cs="Arial"/>
+          <w:color w:val="FFFFFF" w:themeColor="background1"/>
+          <w:sz w:val="24"/>
+          <w:szCs w:val="24"/>
+          <w:lang w:eastAsia="en-US"/>
+        </w:rPr>
+        <w:t>My</w:t>
+      </w:r>
+      <w:proofErr w:type="spellEnd"/>
+      <w:r>
+        <w:rPr>
+          <w:rFonts w:ascii="Arial" w:hAnsi="Arial" w:cs="Arial"/>
+          <w:color w:val="FFFFFF" w:themeColor="background1"/>
+          <w:sz w:val="24"/>
+          <w:szCs w:val="24"/>
+          <w:lang w:eastAsia="en-US"/>
+        </w:rPr>
+        <w:t xml:space="preserve"> Soul veio para desmistificar alguns mitos e estereótipos sobre a subcultura.</w:t>
       </w:r>
     </w:p>
     <w:p>
@@ -4264,7 +4894,73 @@
           <w:szCs w:val="24"/>
           <w:lang w:eastAsia="en-US"/>
         </w:rPr>
-        <w:t>O nome A Little Piece Of My Soul surgiu através da minha playlist do Spotify, de mesmo nome do projeto.</w:t>
+        <w:t xml:space="preserve">O nome A Little Piece </w:t>
+      </w:r>
+      <w:proofErr w:type="spellStart"/>
+      <w:r>
+        <w:rPr>
+          <w:rFonts w:ascii="Arial" w:hAnsi="Arial" w:cs="Arial"/>
+          <w:color w:val="FFFFFF" w:themeColor="background1"/>
+          <w:sz w:val="24"/>
+          <w:szCs w:val="24"/>
+          <w:lang w:eastAsia="en-US"/>
+        </w:rPr>
+        <w:t>Of</w:t>
+      </w:r>
+      <w:proofErr w:type="spellEnd"/>
+      <w:r>
+        <w:rPr>
+          <w:rFonts w:ascii="Arial" w:hAnsi="Arial" w:cs="Arial"/>
+          <w:color w:val="FFFFFF" w:themeColor="background1"/>
+          <w:sz w:val="24"/>
+          <w:szCs w:val="24"/>
+          <w:lang w:eastAsia="en-US"/>
+        </w:rPr>
+        <w:t xml:space="preserve"> </w:t>
+      </w:r>
+      <w:proofErr w:type="spellStart"/>
+      <w:r>
+        <w:rPr>
+          <w:rFonts w:ascii="Arial" w:hAnsi="Arial" w:cs="Arial"/>
+          <w:color w:val="FFFFFF" w:themeColor="background1"/>
+          <w:sz w:val="24"/>
+          <w:szCs w:val="24"/>
+          <w:lang w:eastAsia="en-US"/>
+        </w:rPr>
+        <w:t>My</w:t>
+      </w:r>
+      <w:proofErr w:type="spellEnd"/>
+      <w:r>
+        <w:rPr>
+          <w:rFonts w:ascii="Arial" w:hAnsi="Arial" w:cs="Arial"/>
+          <w:color w:val="FFFFFF" w:themeColor="background1"/>
+          <w:sz w:val="24"/>
+          <w:szCs w:val="24"/>
+          <w:lang w:eastAsia="en-US"/>
+        </w:rPr>
+        <w:t xml:space="preserve"> Soul surgiu através da minha </w:t>
+      </w:r>
+      <w:proofErr w:type="gramStart"/>
+      <w:r>
+        <w:rPr>
+          <w:rFonts w:ascii="Arial" w:hAnsi="Arial" w:cs="Arial"/>
+          <w:color w:val="FFFFFF" w:themeColor="background1"/>
+          <w:sz w:val="24"/>
+          <w:szCs w:val="24"/>
+          <w:lang w:eastAsia="en-US"/>
+        </w:rPr>
+        <w:t>playlist</w:t>
+      </w:r>
+      <w:proofErr w:type="gramEnd"/>
+      <w:r>
+        <w:rPr>
+          <w:rFonts w:ascii="Arial" w:hAnsi="Arial" w:cs="Arial"/>
+          <w:color w:val="FFFFFF" w:themeColor="background1"/>
+          <w:sz w:val="24"/>
+          <w:szCs w:val="24"/>
+          <w:lang w:eastAsia="en-US"/>
+        </w:rPr>
+        <w:t xml:space="preserve"> do Spotify, de mesmo nome do projeto.</w:t>
       </w:r>
     </w:p>
     <w:p>
@@ -4336,7 +5032,27 @@
           <w:bCs/>
           <w:color w:val="FFFFFF" w:themeColor="background1"/>
         </w:rPr>
-        <w:t>Figura 9: Playlist do Spotify</w:t>
+        <w:t xml:space="preserve">Figura 9: </w:t>
+      </w:r>
+      <w:proofErr w:type="gramStart"/>
+      <w:r>
+        <w:rPr>
+          <w:rFonts w:ascii="Arial" w:hAnsi="Arial" w:cs="Arial"/>
+          <w:b/>
+          <w:bCs/>
+          <w:color w:val="FFFFFF" w:themeColor="background1"/>
+        </w:rPr>
+        <w:t>Playlist</w:t>
+      </w:r>
+      <w:proofErr w:type="gramEnd"/>
+      <w:r>
+        <w:rPr>
+          <w:rFonts w:ascii="Arial" w:hAnsi="Arial" w:cs="Arial"/>
+          <w:b/>
+          <w:bCs/>
+          <w:color w:val="FFFFFF" w:themeColor="background1"/>
+        </w:rPr>
+        <w:t xml:space="preserve"> do Spotify</w:t>
       </w:r>
     </w:p>
     <w:p>
@@ -4981,7 +5697,23 @@
           <w:rFonts w:ascii="Arial" w:hAnsi="Arial" w:cs="Arial"/>
           <w:color w:val="FFFFFF" w:themeColor="background1"/>
         </w:rPr>
-        <w:t>Os usuários terão acesso a internet para visualização do site.</w:t>
+        <w:t xml:space="preserve">Os usuários terão acesso </w:t>
+      </w:r>
+      <w:proofErr w:type="spellStart"/>
+      <w:r>
+        <w:rPr>
+          <w:rFonts w:ascii="Arial" w:hAnsi="Arial" w:cs="Arial"/>
+          <w:color w:val="FFFFFF" w:themeColor="background1"/>
+        </w:rPr>
+        <w:t>a</w:t>
+      </w:r>
+      <w:proofErr w:type="spellEnd"/>
+      <w:r>
+        <w:rPr>
+          <w:rFonts w:ascii="Arial" w:hAnsi="Arial" w:cs="Arial"/>
+          <w:color w:val="FFFFFF" w:themeColor="background1"/>
+        </w:rPr>
+        <w:t xml:space="preserve"> internet para visualização do site.</w:t>
       </w:r>
     </w:p>
     <w:p>
@@ -5070,7 +5802,32 @@
           <w:rFonts w:ascii="Arial" w:hAnsi="Arial" w:cs="Arial"/>
           <w:color w:val="FFFFFF" w:themeColor="background1"/>
         </w:rPr>
-        <w:t>Não haverá APIs externas para música, como Youtube, Spotify, Soundcloud etc;</w:t>
+        <w:t xml:space="preserve">Não haverá APIs externas para música, como Youtube, Spotify, </w:t>
+      </w:r>
+      <w:proofErr w:type="gramStart"/>
+      <w:r>
+        <w:rPr>
+          <w:rFonts w:ascii="Arial" w:hAnsi="Arial" w:cs="Arial"/>
+          <w:color w:val="FFFFFF" w:themeColor="background1"/>
+        </w:rPr>
+        <w:t xml:space="preserve">Soundcloud </w:t>
+      </w:r>
+      <w:proofErr w:type="spellStart"/>
+      <w:r>
+        <w:rPr>
+          <w:rFonts w:ascii="Arial" w:hAnsi="Arial" w:cs="Arial"/>
+          <w:color w:val="FFFFFF" w:themeColor="background1"/>
+        </w:rPr>
+        <w:t>etc</w:t>
+      </w:r>
+      <w:proofErr w:type="spellEnd"/>
+      <w:proofErr w:type="gramEnd"/>
+      <w:r>
+        <w:rPr>
+          <w:rFonts w:ascii="Arial" w:hAnsi="Arial" w:cs="Arial"/>
+          <w:color w:val="FFFFFF" w:themeColor="background1"/>
+        </w:rPr>
+        <w:t>;</w:t>
       </w:r>
     </w:p>
     <w:p>
@@ -5154,7 +5911,23 @@
           <w:rFonts w:ascii="Arial" w:hAnsi="Arial" w:cs="Arial"/>
           <w:color w:val="FFFFFF" w:themeColor="background1"/>
         </w:rPr>
-        <w:t>O banco de dados armazenará apenas informações essenciais para o funcionamento, como nome, email, resultados do Quiz, gênero e banda favorita</w:t>
+        <w:t xml:space="preserve">O banco de dados armazenará apenas informações essenciais para o funcionamento, como nome, </w:t>
+      </w:r>
+      <w:proofErr w:type="spellStart"/>
+      <w:r>
+        <w:rPr>
+          <w:rFonts w:ascii="Arial" w:hAnsi="Arial" w:cs="Arial"/>
+          <w:color w:val="FFFFFF" w:themeColor="background1"/>
+        </w:rPr>
+        <w:t>email</w:t>
+      </w:r>
+      <w:proofErr w:type="spellEnd"/>
+      <w:r>
+        <w:rPr>
+          <w:rFonts w:ascii="Arial" w:hAnsi="Arial" w:cs="Arial"/>
+          <w:color w:val="FFFFFF" w:themeColor="background1"/>
+        </w:rPr>
+        <w:t>, resultados do Quiz, gênero e banda favorita</w:t>
       </w:r>
       <w:r>
         <w:rPr>
@@ -5182,7 +5955,32 @@
           <w:rFonts w:ascii="Arial" w:hAnsi="Arial" w:cs="Arial"/>
           <w:color w:val="FFFFFF" w:themeColor="background1"/>
         </w:rPr>
-        <w:t>As imagens do criador (foto do rosto, foto em shows etc) não devem ser utilizadas por terceiros com quaisquer objetivos, sejam eles lucrativos ou não</w:t>
+        <w:t xml:space="preserve">As imagens do criador (foto do rosto, foto em </w:t>
+      </w:r>
+      <w:proofErr w:type="gramStart"/>
+      <w:r>
+        <w:rPr>
+          <w:rFonts w:ascii="Arial" w:hAnsi="Arial" w:cs="Arial"/>
+          <w:color w:val="FFFFFF" w:themeColor="background1"/>
+        </w:rPr>
+        <w:t xml:space="preserve">shows </w:t>
+      </w:r>
+      <w:proofErr w:type="spellStart"/>
+      <w:r>
+        <w:rPr>
+          <w:rFonts w:ascii="Arial" w:hAnsi="Arial" w:cs="Arial"/>
+          <w:color w:val="FFFFFF" w:themeColor="background1"/>
+        </w:rPr>
+        <w:t>etc</w:t>
+      </w:r>
+      <w:proofErr w:type="spellEnd"/>
+      <w:proofErr w:type="gramEnd"/>
+      <w:r>
+        <w:rPr>
+          <w:rFonts w:ascii="Arial" w:hAnsi="Arial" w:cs="Arial"/>
+          <w:color w:val="FFFFFF" w:themeColor="background1"/>
+        </w:rPr>
+        <w:t>) não devem ser utilizadas por terceiros com quaisquer objetivos, sejam eles lucrativos ou não</w:t>
       </w:r>
       <w:r>
         <w:rPr>
@@ -5468,7 +6266,67 @@
           <w:szCs w:val="24"/>
           <w:lang w:eastAsia="en-US"/>
         </w:rPr>
-        <w:t>do Hypervisor VirtualBox, uma máquina virtual com o sistema operacional Lubuntu Linux foi instalada, visando maior segurança e isolamento do ambiente do projeto.</w:t>
+        <w:t xml:space="preserve">do </w:t>
+      </w:r>
+      <w:proofErr w:type="spellStart"/>
+      <w:r>
+        <w:rPr>
+          <w:rFonts w:ascii="Arial" w:hAnsi="Arial" w:cs="Arial"/>
+          <w:sz w:val="24"/>
+          <w:szCs w:val="24"/>
+          <w:lang w:eastAsia="en-US"/>
+        </w:rPr>
+        <w:t>Hypervisor</w:t>
+      </w:r>
+      <w:proofErr w:type="spellEnd"/>
+      <w:r>
+        <w:rPr>
+          <w:rFonts w:ascii="Arial" w:hAnsi="Arial" w:cs="Arial"/>
+          <w:sz w:val="24"/>
+          <w:szCs w:val="24"/>
+          <w:lang w:eastAsia="en-US"/>
+        </w:rPr>
+        <w:t xml:space="preserve"> </w:t>
+      </w:r>
+      <w:proofErr w:type="spellStart"/>
+      <w:r>
+        <w:rPr>
+          <w:rFonts w:ascii="Arial" w:hAnsi="Arial" w:cs="Arial"/>
+          <w:sz w:val="24"/>
+          <w:szCs w:val="24"/>
+          <w:lang w:eastAsia="en-US"/>
+        </w:rPr>
+        <w:t>VirtualBox</w:t>
+      </w:r>
+      <w:proofErr w:type="spellEnd"/>
+      <w:r>
+        <w:rPr>
+          <w:rFonts w:ascii="Arial" w:hAnsi="Arial" w:cs="Arial"/>
+          <w:sz w:val="24"/>
+          <w:szCs w:val="24"/>
+          <w:lang w:eastAsia="en-US"/>
+        </w:rPr>
+        <w:t xml:space="preserve">, uma máquina virtual com o sistema operacional </w:t>
+      </w:r>
+      <w:proofErr w:type="spellStart"/>
+      <w:r>
+        <w:rPr>
+          <w:rFonts w:ascii="Arial" w:hAnsi="Arial" w:cs="Arial"/>
+          <w:sz w:val="24"/>
+          <w:szCs w:val="24"/>
+          <w:lang w:eastAsia="en-US"/>
+        </w:rPr>
+        <w:t>Lubuntu</w:t>
+      </w:r>
+      <w:proofErr w:type="spellEnd"/>
+      <w:r>
+        <w:rPr>
+          <w:rFonts w:ascii="Arial" w:hAnsi="Arial" w:cs="Arial"/>
+          <w:sz w:val="24"/>
+          <w:szCs w:val="24"/>
+          <w:lang w:eastAsia="en-US"/>
+        </w:rPr>
+        <w:t xml:space="preserve"> Linux foi instalada, visando maior segurança e isolamento do ambiente do projeto.</w:t>
       </w:r>
     </w:p>
     <w:p>
@@ -5496,25 +6354,125 @@
           <w:szCs w:val="24"/>
           <w:lang w:eastAsia="en-US"/>
         </w:rPr>
-        <w:t xml:space="preserve">o servidor de banco de dados MySQL Server foi instalado e configurado, o site A Little Piece Of My Soul foi hospedado nessa máquina virtual </w:t>
-      </w:r>
-      <w:r>
-        <w:rPr>
-          <w:rFonts w:ascii="Arial" w:hAnsi="Arial" w:cs="Arial"/>
-          <w:sz w:val="24"/>
-          <w:szCs w:val="24"/>
-          <w:lang w:eastAsia="en-US"/>
-        </w:rPr>
-        <w:t xml:space="preserve">e através da API Web Data Viz os dados do site são atualizados conforme dados do banco, </w:t>
-      </w:r>
-      <w:r>
-        <w:rPr>
-          <w:rFonts w:ascii="Arial" w:hAnsi="Arial" w:cs="Arial"/>
-          <w:sz w:val="24"/>
-          <w:szCs w:val="24"/>
-          <w:lang w:eastAsia="en-US"/>
-        </w:rPr>
-        <w:t>na qual ela realiza operações de insert e select no banco. E por último, o usuário acessa sua dashboard após realização do Quiz.</w:t>
+        <w:t xml:space="preserve">o servidor de banco de dados MySQL Server foi instalado e configurado, o site A Little Piece </w:t>
+      </w:r>
+      <w:proofErr w:type="spellStart"/>
+      <w:r>
+        <w:rPr>
+          <w:rFonts w:ascii="Arial" w:hAnsi="Arial" w:cs="Arial"/>
+          <w:sz w:val="24"/>
+          <w:szCs w:val="24"/>
+          <w:lang w:eastAsia="en-US"/>
+        </w:rPr>
+        <w:t>Of</w:t>
+      </w:r>
+      <w:proofErr w:type="spellEnd"/>
+      <w:r>
+        <w:rPr>
+          <w:rFonts w:ascii="Arial" w:hAnsi="Arial" w:cs="Arial"/>
+          <w:sz w:val="24"/>
+          <w:szCs w:val="24"/>
+          <w:lang w:eastAsia="en-US"/>
+        </w:rPr>
+        <w:t xml:space="preserve"> </w:t>
+      </w:r>
+      <w:proofErr w:type="spellStart"/>
+      <w:r>
+        <w:rPr>
+          <w:rFonts w:ascii="Arial" w:hAnsi="Arial" w:cs="Arial"/>
+          <w:sz w:val="24"/>
+          <w:szCs w:val="24"/>
+          <w:lang w:eastAsia="en-US"/>
+        </w:rPr>
+        <w:t>My</w:t>
+      </w:r>
+      <w:proofErr w:type="spellEnd"/>
+      <w:r>
+        <w:rPr>
+          <w:rFonts w:ascii="Arial" w:hAnsi="Arial" w:cs="Arial"/>
+          <w:sz w:val="24"/>
+          <w:szCs w:val="24"/>
+          <w:lang w:eastAsia="en-US"/>
+        </w:rPr>
+        <w:t xml:space="preserve"> Soul foi hospedado nessa máquina virtual </w:t>
+      </w:r>
+      <w:r>
+        <w:rPr>
+          <w:rFonts w:ascii="Arial" w:hAnsi="Arial" w:cs="Arial"/>
+          <w:sz w:val="24"/>
+          <w:szCs w:val="24"/>
+          <w:lang w:eastAsia="en-US"/>
+        </w:rPr>
+        <w:t xml:space="preserve">e através da API Web Data </w:t>
+      </w:r>
+      <w:proofErr w:type="spellStart"/>
+      <w:r>
+        <w:rPr>
+          <w:rFonts w:ascii="Arial" w:hAnsi="Arial" w:cs="Arial"/>
+          <w:sz w:val="24"/>
+          <w:szCs w:val="24"/>
+          <w:lang w:eastAsia="en-US"/>
+        </w:rPr>
+        <w:t>Viz</w:t>
+      </w:r>
+      <w:proofErr w:type="spellEnd"/>
+      <w:r>
+        <w:rPr>
+          <w:rFonts w:ascii="Arial" w:hAnsi="Arial" w:cs="Arial"/>
+          <w:sz w:val="24"/>
+          <w:szCs w:val="24"/>
+          <w:lang w:eastAsia="en-US"/>
+        </w:rPr>
+        <w:t xml:space="preserve"> os dados do site são atualizados conforme dados do banco, </w:t>
+      </w:r>
+      <w:r>
+        <w:rPr>
+          <w:rFonts w:ascii="Arial" w:hAnsi="Arial" w:cs="Arial"/>
+          <w:sz w:val="24"/>
+          <w:szCs w:val="24"/>
+          <w:lang w:eastAsia="en-US"/>
+        </w:rPr>
+        <w:t xml:space="preserve">na qual ela realiza operações de </w:t>
+      </w:r>
+      <w:proofErr w:type="spellStart"/>
+      <w:r>
+        <w:rPr>
+          <w:rFonts w:ascii="Arial" w:hAnsi="Arial" w:cs="Arial"/>
+          <w:sz w:val="24"/>
+          <w:szCs w:val="24"/>
+          <w:lang w:eastAsia="en-US"/>
+        </w:rPr>
+        <w:t>insert</w:t>
+      </w:r>
+      <w:proofErr w:type="spellEnd"/>
+      <w:r>
+        <w:rPr>
+          <w:rFonts w:ascii="Arial" w:hAnsi="Arial" w:cs="Arial"/>
+          <w:sz w:val="24"/>
+          <w:szCs w:val="24"/>
+          <w:lang w:eastAsia="en-US"/>
+        </w:rPr>
+        <w:t xml:space="preserve"> e </w:t>
+      </w:r>
+      <w:proofErr w:type="spellStart"/>
+      <w:r>
+        <w:rPr>
+          <w:rFonts w:ascii="Arial" w:hAnsi="Arial" w:cs="Arial"/>
+          <w:sz w:val="24"/>
+          <w:szCs w:val="24"/>
+          <w:lang w:eastAsia="en-US"/>
+        </w:rPr>
+        <w:t>select</w:t>
+      </w:r>
+      <w:proofErr w:type="spellEnd"/>
+      <w:r>
+        <w:rPr>
+          <w:rFonts w:ascii="Arial" w:hAnsi="Arial" w:cs="Arial"/>
+          <w:sz w:val="24"/>
+          <w:szCs w:val="24"/>
+          <w:lang w:eastAsia="en-US"/>
+        </w:rPr>
+        <w:t xml:space="preserve"> no banco. E por último, o usuário acessa sua dashboard após realização do Quiz.</w:t>
       </w:r>
     </w:p>
     <w:p>
@@ -5530,6 +6488,9 @@
         <w:jc w:val="center"/>
       </w:pPr>
       <w:r>
+        <w:rPr>
+          <w:noProof/>
+        </w:rPr>
         <w:lastRenderedPageBreak/>
         <w:drawing>
           <wp:inline distT="0" distB="0" distL="0" distR="0" wp14:anchorId="32EBBD60" wp14:editId="39F84776">
@@ -5934,8 +6895,19 @@
           <w:bCs/>
           <w:color w:val="FFFFFF" w:themeColor="background1"/>
         </w:rPr>
-        <w:t>: Gráfico de BurnDown</w:t>
-      </w:r>
+        <w:t xml:space="preserve">: Gráfico de </w:t>
+      </w:r>
+      <w:proofErr w:type="spellStart"/>
+      <w:r>
+        <w:rPr>
+          <w:rFonts w:ascii="Arial" w:hAnsi="Arial" w:cs="Arial"/>
+          <w:b/>
+          <w:bCs/>
+          <w:color w:val="FFFFFF" w:themeColor="background1"/>
+        </w:rPr>
+        <w:t>BurnDown</w:t>
+      </w:r>
+      <w:proofErr w:type="spellEnd"/>
     </w:p>
     <w:p>
       <w:pPr>
@@ -5957,7 +6929,29 @@
           <w:szCs w:val="24"/>
           <w:lang w:eastAsia="en-US"/>
         </w:rPr>
-        <w:t>Ainda na planilha de backlog, como forma de medir meu desempenho e capacidade de entrega foi realizado um gráfico de BurnDown, com duas métricas: planejado e entregue, métricas as quais foram extraídas da somatória dos pontos Fibonacci totais, o que foi entregue e o que está pendente em cada Sprint, tendo em vista que o item pendente na Sprint foi acumulado para a próxima.</w:t>
+        <w:t xml:space="preserve">Ainda na planilha de backlog, como forma de medir meu desempenho e capacidade de entrega foi realizado um gráfico de </w:t>
+      </w:r>
+      <w:proofErr w:type="spellStart"/>
+      <w:r>
+        <w:rPr>
+          <w:rFonts w:ascii="Arial" w:hAnsi="Arial" w:cs="Arial"/>
+          <w:color w:val="FFFFFF" w:themeColor="background1"/>
+          <w:sz w:val="24"/>
+          <w:szCs w:val="24"/>
+          <w:lang w:eastAsia="en-US"/>
+        </w:rPr>
+        <w:t>BurnDown</w:t>
+      </w:r>
+      <w:proofErr w:type="spellEnd"/>
+      <w:r>
+        <w:rPr>
+          <w:rFonts w:ascii="Arial" w:hAnsi="Arial" w:cs="Arial"/>
+          <w:color w:val="FFFFFF" w:themeColor="background1"/>
+          <w:sz w:val="24"/>
+          <w:szCs w:val="24"/>
+          <w:lang w:eastAsia="en-US"/>
+        </w:rPr>
+        <w:t>, com duas métricas: planejado e entregue, métricas as quais foram extraídas da somatória dos pontos Fibonacci totais, o que foi entregue e o que está pendente em cada Sprint, tendo em vista que o item pendente na Sprint foi acumulado para a próxima.</w:t>
       </w:r>
     </w:p>
     <w:p>
@@ -5980,7 +6974,29 @@
           <w:szCs w:val="24"/>
           <w:lang w:eastAsia="en-US"/>
         </w:rPr>
-        <w:t xml:space="preserve">Todos os requisitos no backlog foram transferidos para outra plataforma de gestão, o Trello, nele, separei em 3 colunas: “A Fazer”, “Em Andamento” e “Concluído”, </w:t>
+        <w:t xml:space="preserve">Todos os requisitos no backlog foram transferidos para outra plataforma de gestão, o </w:t>
+      </w:r>
+      <w:proofErr w:type="spellStart"/>
+      <w:r>
+        <w:rPr>
+          <w:rFonts w:ascii="Arial" w:hAnsi="Arial" w:cs="Arial"/>
+          <w:color w:val="FFFFFF" w:themeColor="background1"/>
+          <w:sz w:val="24"/>
+          <w:szCs w:val="24"/>
+          <w:lang w:eastAsia="en-US"/>
+        </w:rPr>
+        <w:t>Trello</w:t>
+      </w:r>
+      <w:proofErr w:type="spellEnd"/>
+      <w:r>
+        <w:rPr>
+          <w:rFonts w:ascii="Arial" w:hAnsi="Arial" w:cs="Arial"/>
+          <w:color w:val="FFFFFF" w:themeColor="background1"/>
+          <w:sz w:val="24"/>
+          <w:szCs w:val="24"/>
+          <w:lang w:eastAsia="en-US"/>
+        </w:rPr>
+        <w:t xml:space="preserve">, nele, separei em 3 colunas: “A Fazer”, “Em Andamento” e “Concluído”, </w:t>
       </w:r>
       <w:r>
         <w:rPr>
@@ -6067,8 +7083,19 @@
           <w:bCs/>
           <w:color w:val="FFFFFF" w:themeColor="background1"/>
         </w:rPr>
-        <w:t>Figura 14: Organização no Trello</w:t>
-      </w:r>
+        <w:t xml:space="preserve">Figura 14: Organização no </w:t>
+      </w:r>
+      <w:proofErr w:type="spellStart"/>
+      <w:r>
+        <w:rPr>
+          <w:rFonts w:ascii="Arial" w:hAnsi="Arial" w:cs="Arial"/>
+          <w:b/>
+          <w:bCs/>
+          <w:color w:val="FFFFFF" w:themeColor="background1"/>
+        </w:rPr>
+        <w:t>Trello</w:t>
+      </w:r>
+      <w:proofErr w:type="spellEnd"/>
     </w:p>
     <w:p>
       <w:pPr>
@@ -6133,7 +7160,39 @@
           <w:rFonts w:ascii="Arial" w:hAnsi="Arial" w:cs="Arial"/>
           <w:color w:val="FFFFFF" w:themeColor="background1"/>
         </w:rPr>
-        <w:t>Novos quizzes temáticos, por exemplo: “Com qual estética gótica é a sua cara?” ou, “Qual personagem gótico mais te identifica?” etc;</w:t>
+        <w:t xml:space="preserve">Novos </w:t>
+      </w:r>
+      <w:proofErr w:type="spellStart"/>
+      <w:r>
+        <w:rPr>
+          <w:rFonts w:ascii="Arial" w:hAnsi="Arial" w:cs="Arial"/>
+          <w:color w:val="FFFFFF" w:themeColor="background1"/>
+        </w:rPr>
+        <w:t>quizzes</w:t>
+      </w:r>
+      <w:proofErr w:type="spellEnd"/>
+      <w:r>
+        <w:rPr>
+          <w:rFonts w:ascii="Arial" w:hAnsi="Arial" w:cs="Arial"/>
+          <w:color w:val="FFFFFF" w:themeColor="background1"/>
+        </w:rPr>
+        <w:t xml:space="preserve"> temáticos, por exemplo: “Com qual estética gótica é a sua cara?” ou, “Qual personagem gótico mais te identifica?” </w:t>
+      </w:r>
+      <w:proofErr w:type="spellStart"/>
+      <w:r>
+        <w:rPr>
+          <w:rFonts w:ascii="Arial" w:hAnsi="Arial" w:cs="Arial"/>
+          <w:color w:val="FFFFFF" w:themeColor="background1"/>
+        </w:rPr>
+        <w:t>etc</w:t>
+      </w:r>
+      <w:proofErr w:type="spellEnd"/>
+      <w:r>
+        <w:rPr>
+          <w:rFonts w:ascii="Arial" w:hAnsi="Arial" w:cs="Arial"/>
+          <w:color w:val="FFFFFF" w:themeColor="background1"/>
+        </w:rPr>
+        <w:t>;</w:t>
       </w:r>
     </w:p>
     <w:p>
@@ -6261,6 +7320,70 @@
     </w:p>
     <w:p>
       <w:pPr>
+        <w:jc w:val="both"/>
+        <w:rPr>
+          <w:rFonts w:ascii="Arial" w:hAnsi="Arial" w:cs="Arial"/>
+        </w:rPr>
+      </w:pPr>
+    </w:p>
+    <w:p>
+      <w:pPr>
+        <w:jc w:val="both"/>
+        <w:rPr>
+          <w:rFonts w:ascii="Arial" w:hAnsi="Arial" w:cs="Arial"/>
+        </w:rPr>
+      </w:pPr>
+    </w:p>
+    <w:p>
+      <w:pPr>
+        <w:jc w:val="both"/>
+        <w:rPr>
+          <w:rFonts w:ascii="Arial" w:hAnsi="Arial" w:cs="Arial"/>
+        </w:rPr>
+      </w:pPr>
+    </w:p>
+    <w:p>
+      <w:pPr>
+        <w:jc w:val="both"/>
+        <w:rPr>
+          <w:rFonts w:ascii="Arial" w:hAnsi="Arial" w:cs="Arial"/>
+        </w:rPr>
+      </w:pPr>
+    </w:p>
+    <w:p>
+      <w:pPr>
+        <w:jc w:val="both"/>
+        <w:rPr>
+          <w:rFonts w:ascii="Arial" w:hAnsi="Arial" w:cs="Arial"/>
+        </w:rPr>
+      </w:pPr>
+    </w:p>
+    <w:p>
+      <w:pPr>
+        <w:jc w:val="both"/>
+        <w:rPr>
+          <w:rFonts w:ascii="Arial" w:hAnsi="Arial" w:cs="Arial"/>
+        </w:rPr>
+      </w:pPr>
+    </w:p>
+    <w:p>
+      <w:pPr>
+        <w:jc w:val="both"/>
+        <w:rPr>
+          <w:rFonts w:ascii="Arial" w:hAnsi="Arial" w:cs="Arial"/>
+        </w:rPr>
+      </w:pPr>
+    </w:p>
+    <w:p>
+      <w:pPr>
+        <w:jc w:val="both"/>
+        <w:rPr>
+          <w:rFonts w:ascii="Arial" w:hAnsi="Arial" w:cs="Arial"/>
+        </w:rPr>
+      </w:pPr>
+    </w:p>
+    <w:p>
+      <w:pPr>
         <w:pStyle w:val="Ttulo1"/>
         <w:rPr>
           <w:color w:val="FFFFFF" w:themeColor="background1"/>
@@ -6271,6 +7394,7 @@
         <w:rPr>
           <w:color w:val="FFFFFF" w:themeColor="background1"/>
         </w:rPr>
+        <w:lastRenderedPageBreak/>
         <w:t>BIBLIOGRAFIA</w:t>
       </w:r>
       <w:bookmarkEnd w:id="18"/>
@@ -6421,7 +7545,6 @@
           <w:rStyle w:val="Forte"/>
           <w:rFonts w:ascii="Arial" w:eastAsiaTheme="majorEastAsia" w:hAnsi="Arial" w:cs="Arial"/>
         </w:rPr>
-        <w:lastRenderedPageBreak/>
         <w:t>O QUE É A SUBCULTURA GÓTICA.</w:t>
       </w:r>
       <w:r>

</xml_diff>